<commit_message>
Updated task 6 with Manasse and Musa contribution (sequence and state diagrams)
</commit_message>
<xml_diff>
--- a/docs/214 PDF document.docx
+++ b/docs/214 PDF document.docx
@@ -234,12 +234,28 @@
     </w:p>
     <w:p>
       <w:r>
-        <w:t xml:space="preserve">IBM defines a workflow as [1] a system for managing repetitive processes and tasks which occur in a particular order. They are the mechanism by which people and enterprises accomplish their work. Simply, a workflow is a repeatable sequence of steps that moves a process from start to finish. Workflow management systems are [2] systems designed to assist groups of people in carrying out work processes, and contain organizational knowledge of where work flows in the default case. </w:t>
-      </w:r>
-    </w:p>
-    <w:p>
-      <w:r>
-        <w:t xml:space="preserve">A workflow definition is [3] a template or blueprint for a process and a running workflow instance is [4] a single active execution of the template. Activities and work items are typically represented as [5] distinct nodes, data structures or objects that define and track how work moves in the system. Work items are generally assigned on a hierarchical basis where a “principal” (usually a customer or a boss) assigns a work item which are received can be passed down the hierarchy [6]. Approvals, rejections and escalations are usually based on human interaction, algorithms, timers or escalation events [7]. </w:t>
+        <w:t xml:space="preserve">IBM defines a workflow as [1] a system for managing repetitive processes and tasks which occur in a particular order. They are the mechanism by which people and enterprises accomplish their work. Simply, a workflow is a repeatable sequence of steps that moves a process from start to finish. Workflow management systems are [2] systems designed to assist groups of people in carrying out work </w:t>
+      </w:r>
+      <w:proofErr w:type="gramStart"/>
+      <w:r>
+        <w:t>processes, and</w:t>
+      </w:r>
+      <w:proofErr w:type="gramEnd"/>
+      <w:r>
+        <w:t xml:space="preserve"> contain organizational knowledge of where work flows in the default case. </w:t>
+      </w:r>
+    </w:p>
+    <w:p>
+      <w:r>
+        <w:t xml:space="preserve">A workflow definition is [3] a template or blueprint for a </w:t>
+      </w:r>
+      <w:proofErr w:type="gramStart"/>
+      <w:r>
+        <w:t>process</w:t>
+      </w:r>
+      <w:proofErr w:type="gramEnd"/>
+      <w:r>
+        <w:t xml:space="preserve"> and a running workflow instance is [4] a single active execution of the template. Activities and work items are typically represented as [5] distinct nodes, data structures or objects that define and track how work moves in the system. Work items are generally assigned on a hierarchical basis where a “principal” (usually a customer or a boss) assigns a work item which are received can be passed down the hierarchy [6]. Approvals, rejections and escalations are usually based on human interaction, algorithms, timers or escalation events [7]. </w:t>
       </w:r>
     </w:p>
     <w:p>
@@ -254,12 +270,44 @@
     </w:p>
     <w:p>
       <w:r>
-        <w:t xml:space="preserve">The workflow definition is static and therefore holds information about the structure of the workflow such as conditions, assigned roles and rules. A running instance holds information about one specific workflow such as its unique ID, current state and completed and pending tasks [3]. Real workflows model nested activities and sub-processes using hierarchies and rules where the parents execution is paused until the child completes their task [6]. In a workflow system, business decisions are usually configurable (able to be changed to meet specific requirements) such as routing decisions, approval rules, time limits, etc. Finally, changes can be made to workflow definitions while work is in progress by “workflow versioning” [12], this involves creating a branch from the public version, and publishing the new branch and storing the outdated branch in a version history. </w:t>
-      </w:r>
-    </w:p>
-    <w:p>
-      <w:r>
-        <w:t xml:space="preserve">The research indicates that TIVIDY should provide a generic mechanism for defining and executing workflows rather than implementing one fixed problem-solving process. It’s core concepts should include WorkItems, workflow definitions and instances, activities, participants roles, routing, states, events escalation, history and monitoring. These capabilities can then be used in different scenarios such as complaints, IT problems and work-task management, while the underlying system remains the same. </w:t>
+        <w:t xml:space="preserve">The workflow definition is static and therefore holds information about the structure of the workflow such as conditions, assigned roles and rules. A running instance holds information about one specific workflow such as its unique ID, current state and completed and pending tasks [3]. Real workflows model nested activities and sub-processes using hierarchies and rules where the </w:t>
+      </w:r>
+      <w:proofErr w:type="gramStart"/>
+      <w:r>
+        <w:t>parents</w:t>
+      </w:r>
+      <w:proofErr w:type="gramEnd"/>
+      <w:r>
+        <w:t xml:space="preserve"> execution is paused until the child completes their task [6]. In a workflow system, business decisions are usually configurable (able to be changed to meet specific requirements) such as routing decisions, approval rules, time limits, etc. Finally, changes can be made to workflow definitions while work is in progress by “workflow versioning” [12], this involves creating a branch from the public </w:t>
+      </w:r>
+      <w:proofErr w:type="gramStart"/>
+      <w:r>
+        <w:t>version, and</w:t>
+      </w:r>
+      <w:proofErr w:type="gramEnd"/>
+      <w:r>
+        <w:t xml:space="preserve"> publishing the new branch and storing the outdated branch in a version history. </w:t>
+      </w:r>
+    </w:p>
+    <w:p>
+      <w:r>
+        <w:t xml:space="preserve">The research indicates that TIVIDY should provide a generic mechanism for defining and executing workflows rather than implementing one fixed problem-solving process. </w:t>
+      </w:r>
+      <w:proofErr w:type="gramStart"/>
+      <w:r>
+        <w:t>It’s</w:t>
+      </w:r>
+      <w:proofErr w:type="gramEnd"/>
+      <w:r>
+        <w:t xml:space="preserve"> core concepts should include </w:t>
+      </w:r>
+      <w:proofErr w:type="spellStart"/>
+      <w:r>
+        <w:t>WorkItems</w:t>
+      </w:r>
+      <w:proofErr w:type="spellEnd"/>
+      <w:r>
+        <w:t xml:space="preserve">, workflow definitions and instances, activities, participants roles, routing, states, events escalation, history and monitoring. These capabilities can then be used in different scenarios such as complaints, IT problems and work-task management, while the underlying system remains the same. </w:t>
       </w:r>
     </w:p>
     <w:p>
@@ -429,8 +477,13 @@
           <w:numId w:val="38"/>
         </w:numPr>
       </w:pPr>
-      <w:r>
-        <w:t>Hyperbots (2026) Workflow history. Available at: https://www.hyperbots.com/glossary/workflow-history (Accessed: 2 October 2026).</w:t>
+      <w:proofErr w:type="spellStart"/>
+      <w:r>
+        <w:t>Hyperbots</w:t>
+      </w:r>
+      <w:proofErr w:type="spellEnd"/>
+      <w:r>
+        <w:t xml:space="preserve"> (2026) Workflow history. Available at: https://www.hyperbots.com/glossary/workflow-history (Accessed: 2 October 2026).</w:t>
       </w:r>
     </w:p>
     <w:p>
@@ -441,8 +494,13 @@
           <w:numId w:val="38"/>
         </w:numPr>
       </w:pPr>
-      <w:r>
-        <w:t xml:space="preserve">SearchInform (2026) Workflow management: Monitoring. Available at: https://searchinform.com/articles/cybersecurity/measures/security-monitoring/workflow management/monitoring/ (Accessed: 2 October 2026).  </w:t>
+      <w:proofErr w:type="spellStart"/>
+      <w:r>
+        <w:t>SearchInform</w:t>
+      </w:r>
+      <w:proofErr w:type="spellEnd"/>
+      <w:r>
+        <w:t xml:space="preserve"> (2026) Workflow management: Monitoring. Available at: https://searchinform.com/articles/cybersecurity/measures/security-monitoring/workflow management/monitoring/ (Accessed: 2 October 2026).  </w:t>
       </w:r>
     </w:p>
     <w:p>
@@ -465,8 +523,21 @@
           <w:numId w:val="38"/>
         </w:numPr>
       </w:pPr>
-      <w:r>
-        <w:t>JetAdmin (2026) Workflow versioning. Available at: https://www.jetadmin.io/ (IBM, 2026)blog/workflow-versioning/amp/ (Accessed: 2 October 2026).</w:t>
+      <w:proofErr w:type="spellStart"/>
+      <w:r>
+        <w:t>JetAdmin</w:t>
+      </w:r>
+      <w:proofErr w:type="spellEnd"/>
+      <w:r>
+        <w:t xml:space="preserve"> (2026) Workflow versioning. Available at: https://www.jetadmin.io/ (IBM, </w:t>
+      </w:r>
+      <w:proofErr w:type="gramStart"/>
+      <w:r>
+        <w:t>2026)blog</w:t>
+      </w:r>
+      <w:proofErr w:type="gramEnd"/>
+      <w:r>
+        <w:t>/workflow-versioning/amp/ (Accessed: 2 October 2026).</w:t>
       </w:r>
     </w:p>
     <w:p/>
@@ -933,12 +1004,12 @@
     </w:p>
     <w:p>
       <w:r>
-        <w:t>Once a decision has been made, the student may accept the outcome or appeal the decision. If the student appeals, the appeal is reviewed and the complaint is then closed.</w:t>
-      </w:r>
-    </w:p>
-    <w:p>
-      <w:r>
-        <w:t>The workflow eventually ends when the complaint has been resolved, rejected, withdrawn or closed.</w:t>
+        <w:t>Once a decision has been made, the student may accept the outcome or appeal the decision. If the student accepts the outcome, the complaint is resolved. If the student appeals, the appeal is reviewed. If the appeal is upheld, the complaint returns for further processing. If the appeal is denied, the complaint is closed.</w:t>
+      </w:r>
+    </w:p>
+    <w:p>
+      <w:r>
+        <w:t>The workflow eventually ends when the complaint has been resolved or closed. A complaint is closed if the student retracts it or if a final appeal is denied.</w:t>
       </w:r>
     </w:p>
     <w:p>
@@ -1008,7 +1079,6 @@
           <w:sz w:val="22"/>
           <w:szCs w:val="22"/>
         </w:rPr>
-        <w:lastRenderedPageBreak/>
         <w:t>Major Pieces of Work:</w:t>
       </w:r>
     </w:p>
@@ -1449,6 +1519,7 @@
     </w:p>
     <w:p>
       <w:r>
+        <w:lastRenderedPageBreak/>
         <w:t>For example, when a complaint is submitted, the student then receives a confirmation email. When the complaint is assigned, the staff member is then notified. If the complaint is escalated, the Department Head is notified. When the complaint is resolved, the student is informed.</w:t>
       </w:r>
     </w:p>
@@ -1503,7 +1574,7 @@
         </w:numPr>
       </w:pPr>
       <w:r>
-        <w:t>Rejected</w:t>
+        <w:t>Closed after the student retracts the complaint</w:t>
       </w:r>
     </w:p>
     <w:p>
@@ -1515,19 +1586,7 @@
         </w:numPr>
       </w:pPr>
       <w:r>
-        <w:t>Withdrawn</w:t>
-      </w:r>
-    </w:p>
-    <w:p>
-      <w:pPr>
-        <w:pStyle w:val="ListParagraph"/>
-        <w:numPr>
-          <w:ilvl w:val="0"/>
-          <w:numId w:val="30"/>
-        </w:numPr>
-      </w:pPr>
-      <w:r>
-        <w:t>Closed after appeal</w:t>
+        <w:t>Closed after a final appeal is denied</w:t>
       </w:r>
     </w:p>
     <w:p>
@@ -1536,16 +1595,6 @@
       </w:r>
     </w:p>
     <w:p/>
-    <w:p>
-      <w:pPr>
-        <w:rPr>
-          <w:b/>
-          <w:bCs/>
-          <w:sz w:val="22"/>
-          <w:szCs w:val="22"/>
-        </w:rPr>
-      </w:pPr>
-    </w:p>
     <w:p>
       <w:pPr>
         <w:rPr>
@@ -1911,14 +1960,18 @@
       </w:r>
     </w:p>
     <w:p>
+      <w:proofErr w:type="spellStart"/>
       <w:r>
         <w:t>WorkflowInstance</w:t>
       </w:r>
-    </w:p>
-    <w:p>
+      <w:proofErr w:type="spellEnd"/>
+    </w:p>
+    <w:p>
+      <w:proofErr w:type="spellStart"/>
       <w:r>
         <w:t>WorkItem</w:t>
       </w:r>
+      <w:proofErr w:type="spellEnd"/>
     </w:p>
     <w:p/>
     <w:p>
@@ -1927,19 +1980,25 @@
       </w:r>
     </w:p>
     <w:p>
+      <w:proofErr w:type="spellStart"/>
       <w:r>
         <w:t>NotificationObserver</w:t>
       </w:r>
-    </w:p>
-    <w:p>
+      <w:proofErr w:type="spellEnd"/>
+    </w:p>
+    <w:p>
+      <w:proofErr w:type="spellStart"/>
       <w:r>
         <w:t>HistoryObserver</w:t>
       </w:r>
-    </w:p>
-    <w:p>
+      <w:proofErr w:type="spellEnd"/>
+    </w:p>
+    <w:p>
+      <w:proofErr w:type="spellStart"/>
       <w:r>
         <w:t>ProgressObserver</w:t>
       </w:r>
+      <w:proofErr w:type="spellEnd"/>
     </w:p>
     <w:p>
       <w:pPr>
@@ -1958,7 +2017,23 @@
     </w:p>
     <w:p>
       <w:r>
-        <w:t>The WorkflowInstance or WorkItem notifies its registered observers when an important event or state change occurs.</w:t>
+        <w:t xml:space="preserve">The </w:t>
+      </w:r>
+      <w:proofErr w:type="spellStart"/>
+      <w:r>
+        <w:t>WorkflowInstance</w:t>
+      </w:r>
+      <w:proofErr w:type="spellEnd"/>
+      <w:r>
+        <w:t xml:space="preserve"> or </w:t>
+      </w:r>
+      <w:proofErr w:type="spellStart"/>
+      <w:r>
+        <w:t>WorkItem</w:t>
+      </w:r>
+      <w:proofErr w:type="spellEnd"/>
+      <w:r>
+        <w:t xml:space="preserve"> notifies its registered observers when an important event or state change occurs.</w:t>
       </w:r>
     </w:p>
     <w:p>
@@ -2003,7 +2078,23 @@
     </w:p>
     <w:p>
       <w:r>
-        <w:t>Observer prevents the WorkflowInstance or WorkItem from directly depending on every object that needs to react to workflow events.</w:t>
+        <w:t xml:space="preserve">Observer prevents the </w:t>
+      </w:r>
+      <w:proofErr w:type="spellStart"/>
+      <w:r>
+        <w:t>WorkflowInstance</w:t>
+      </w:r>
+      <w:proofErr w:type="spellEnd"/>
+      <w:r>
+        <w:t xml:space="preserve"> or </w:t>
+      </w:r>
+      <w:proofErr w:type="spellStart"/>
+      <w:r>
+        <w:t>WorkItem</w:t>
+      </w:r>
+      <w:proofErr w:type="spellEnd"/>
+      <w:r>
+        <w:t xml:space="preserve"> from directly depending on every object that needs to react to workflow events.</w:t>
       </w:r>
     </w:p>
     <w:p>
@@ -2023,7 +2114,23 @@
     </w:p>
     <w:p>
       <w:r>
-        <w:t>In TIVIDY, completing one work item can make the next one available, notify a participant, update the history and refresh progress. The set of interested parties differs between organisations, so none of these reactions can be hard-wired into WorkItem or WorkflowInstance. A new concern, such as a monitoring view or another notification channel, subscribes as an observer without touching the source of the event.</w:t>
+        <w:t xml:space="preserve">In TIVIDY, completing one work item can make the next one available, notify a participant, update the history and refresh progress. The set of interested parties differs between organisations, so none of these reactions can be hard-wired into </w:t>
+      </w:r>
+      <w:proofErr w:type="spellStart"/>
+      <w:r>
+        <w:t>WorkItem</w:t>
+      </w:r>
+      <w:proofErr w:type="spellEnd"/>
+      <w:r>
+        <w:t xml:space="preserve"> or </w:t>
+      </w:r>
+      <w:proofErr w:type="spellStart"/>
+      <w:r>
+        <w:t>WorkflowInstance</w:t>
+      </w:r>
+      <w:proofErr w:type="spellEnd"/>
+      <w:r>
+        <w:t>. A new concern, such as a monitoring view or another notification channel, subscribes as an observer without touching the source of the event.</w:t>
       </w:r>
     </w:p>
     <w:p>
@@ -2043,7 +2150,23 @@
     </w:p>
     <w:p>
       <w:r>
-        <w:t>Observer is triggered by State transitions. Command execution also notifies observers so the history is always current, and the EmailAdapter can register as an observer so the external email system is told about workflow events without the engine knowing its interface.</w:t>
+        <w:t xml:space="preserve">Observer is triggered by State transitions. Command execution also notifies observers so the history is always current, and the </w:t>
+      </w:r>
+      <w:proofErr w:type="spellStart"/>
+      <w:r>
+        <w:t>EmailAdapter</w:t>
+      </w:r>
+      <w:proofErr w:type="spellEnd"/>
+      <w:r>
+        <w:t xml:space="preserve"> can register as an </w:t>
+      </w:r>
+      <w:proofErr w:type="gramStart"/>
+      <w:r>
+        <w:t>observer</w:t>
+      </w:r>
+      <w:proofErr w:type="gramEnd"/>
+      <w:r>
+        <w:t xml:space="preserve"> so the external email system is told about workflow events without the engine knowing its interface.</w:t>
       </w:r>
     </w:p>
     <w:p/>
@@ -2238,19 +2361,25 @@
       </w:r>
     </w:p>
     <w:p>
+      <w:proofErr w:type="spellStart"/>
       <w:r>
         <w:t>WorkflowBuilder</w:t>
       </w:r>
-    </w:p>
-    <w:p>
+      <w:proofErr w:type="spellEnd"/>
+    </w:p>
+    <w:p>
+      <w:proofErr w:type="spellStart"/>
       <w:r>
         <w:t>ConcreteWorkflowBuilder</w:t>
       </w:r>
-    </w:p>
-    <w:p>
+      <w:proofErr w:type="spellEnd"/>
+    </w:p>
+    <w:p>
+      <w:proofErr w:type="spellStart"/>
       <w:r>
         <w:t>WorkflowDefinition</w:t>
       </w:r>
+      <w:proofErr w:type="spellEnd"/>
     </w:p>
     <w:p>
       <w:r>
@@ -2258,33 +2387,88 @@
       </w:r>
     </w:p>
     <w:p>
-      <w:r>
-        <w:t>addWorkItem()</w:t>
-      </w:r>
-    </w:p>
-    <w:p>
-      <w:r>
-        <w:t>addRole()</w:t>
-      </w:r>
-    </w:p>
-    <w:p>
-      <w:r>
-        <w:t>addDependency()</w:t>
-      </w:r>
-    </w:p>
-    <w:p>
-      <w:r>
-        <w:t>addRoutingRule()</w:t>
-      </w:r>
-    </w:p>
-    <w:p>
-      <w:r>
-        <w:t>addEscalationRule()</w:t>
-      </w:r>
-    </w:p>
-    <w:p>
-      <w:r>
-        <w:t>build()</w:t>
+      <w:proofErr w:type="spellStart"/>
+      <w:proofErr w:type="gramStart"/>
+      <w:r>
+        <w:t>addWorkItem</w:t>
+      </w:r>
+      <w:proofErr w:type="spellEnd"/>
+      <w:r>
+        <w:t>(</w:t>
+      </w:r>
+      <w:proofErr w:type="gramEnd"/>
+      <w:r>
+        <w:t>)</w:t>
+      </w:r>
+    </w:p>
+    <w:p>
+      <w:proofErr w:type="spellStart"/>
+      <w:proofErr w:type="gramStart"/>
+      <w:r>
+        <w:t>addRole</w:t>
+      </w:r>
+      <w:proofErr w:type="spellEnd"/>
+      <w:r>
+        <w:t>(</w:t>
+      </w:r>
+      <w:proofErr w:type="gramEnd"/>
+      <w:r>
+        <w:t>)</w:t>
+      </w:r>
+    </w:p>
+    <w:p>
+      <w:proofErr w:type="spellStart"/>
+      <w:proofErr w:type="gramStart"/>
+      <w:r>
+        <w:t>addDependency</w:t>
+      </w:r>
+      <w:proofErr w:type="spellEnd"/>
+      <w:r>
+        <w:t>(</w:t>
+      </w:r>
+      <w:proofErr w:type="gramEnd"/>
+      <w:r>
+        <w:t>)</w:t>
+      </w:r>
+    </w:p>
+    <w:p>
+      <w:proofErr w:type="spellStart"/>
+      <w:proofErr w:type="gramStart"/>
+      <w:r>
+        <w:t>addRoutingRule</w:t>
+      </w:r>
+      <w:proofErr w:type="spellEnd"/>
+      <w:r>
+        <w:t>(</w:t>
+      </w:r>
+      <w:proofErr w:type="gramEnd"/>
+      <w:r>
+        <w:t>)</w:t>
+      </w:r>
+    </w:p>
+    <w:p>
+      <w:proofErr w:type="spellStart"/>
+      <w:proofErr w:type="gramStart"/>
+      <w:r>
+        <w:t>addEscalationRule</w:t>
+      </w:r>
+      <w:proofErr w:type="spellEnd"/>
+      <w:r>
+        <w:t>(</w:t>
+      </w:r>
+      <w:proofErr w:type="gramEnd"/>
+      <w:r>
+        <w:t>)</w:t>
+      </w:r>
+    </w:p>
+    <w:p>
+      <w:proofErr w:type="gramStart"/>
+      <w:r>
+        <w:t>build(</w:t>
+      </w:r>
+      <w:proofErr w:type="gramEnd"/>
+      <w:r>
+        <w:t>)</w:t>
       </w:r>
     </w:p>
     <w:p>
@@ -2304,7 +2488,15 @@
     </w:p>
     <w:p>
       <w:r>
-        <w:t>The builder constructs a WorkflowDefinition step by step.</w:t>
+        <w:t xml:space="preserve">The builder constructs a </w:t>
+      </w:r>
+      <w:proofErr w:type="spellStart"/>
+      <w:r>
+        <w:t>WorkflowDefinition</w:t>
+      </w:r>
+      <w:proofErr w:type="spellEnd"/>
+      <w:r>
+        <w:t xml:space="preserve"> step by step.</w:t>
       </w:r>
     </w:p>
     <w:p>
@@ -2364,7 +2556,23 @@
     </w:p>
     <w:p>
       <w:r>
-        <w:t>A WorkflowDefinition holds work items, roles, dependencies, routing rules and escalation rules. Creating that in one constructor does not scale across organisations. Builder lets the same construction steps produce a short linear process or a multi-step approval process, and keeps the definition separate from the running instances created from it.</w:t>
+        <w:t xml:space="preserve">A </w:t>
+      </w:r>
+      <w:proofErr w:type="spellStart"/>
+      <w:r>
+        <w:t>WorkflowDefinition</w:t>
+      </w:r>
+      <w:proofErr w:type="spellEnd"/>
+      <w:r>
+        <w:t xml:space="preserve"> holds work items, roles, dependencies, routing rules and escalation rules. Creating that in one constructor does not scale across organisations. Builder lets the same construction steps produce a short linear process or a multi-step approval </w:t>
+      </w:r>
+      <w:proofErr w:type="gramStart"/>
+      <w:r>
+        <w:t>process, and</w:t>
+      </w:r>
+      <w:proofErr w:type="gramEnd"/>
+      <w:r>
+        <w:t xml:space="preserve"> keeps the definition separate from the running instances created from it.</w:t>
       </w:r>
     </w:p>
     <w:p>
@@ -2385,7 +2593,53 @@
     </w:p>
     <w:p>
       <w:r>
-        <w:t>The Builder assembles the WorkflowComponent structure, sets the AssignmentStrategy, links the escalation Handler chain and applies any Decorators when a definition is built, so routing and escalation behaviour belongs to the definition and is not hard-coded in the engine. TIVIDYFacade triggers the Builder for outside callers.</w:t>
+        <w:t xml:space="preserve">The Builder assembles the </w:t>
+      </w:r>
+      <w:proofErr w:type="spellStart"/>
+      <w:r>
+        <w:t>WorkflowComponent</w:t>
+      </w:r>
+      <w:proofErr w:type="spellEnd"/>
+      <w:r>
+        <w:t xml:space="preserve"> structure, sets the </w:t>
+      </w:r>
+      <w:proofErr w:type="spellStart"/>
+      <w:r>
+        <w:t>AssignmentStrategy</w:t>
+      </w:r>
+      <w:proofErr w:type="spellEnd"/>
+      <w:r>
+        <w:t xml:space="preserve">, links the escalation Handler chain and </w:t>
+      </w:r>
+      <w:r>
+        <w:t xml:space="preserve">applies a </w:t>
+      </w:r>
+      <w:proofErr w:type="spellStart"/>
+      <w:r>
+        <w:t>PriorityDecorator</w:t>
+      </w:r>
+      <w:proofErr w:type="spellEnd"/>
+      <w:r>
+        <w:t xml:space="preserve"> where required when a definition is built</w:t>
+      </w:r>
+      <w:r>
+        <w:t xml:space="preserve">, so routing and escalation behaviour belongs to the definition and is not </w:t>
+      </w:r>
+      <w:proofErr w:type="gramStart"/>
+      <w:r>
+        <w:t>hard-coded</w:t>
+      </w:r>
+      <w:proofErr w:type="gramEnd"/>
+      <w:r>
+        <w:t xml:space="preserve"> in the engine. </w:t>
+      </w:r>
+      <w:proofErr w:type="spellStart"/>
+      <w:r>
+        <w:t>TIVIDYFacade</w:t>
+      </w:r>
+      <w:proofErr w:type="spellEnd"/>
+      <w:r>
+        <w:t xml:space="preserve"> triggers the Builder for outside callers.</w:t>
       </w:r>
     </w:p>
     <w:p/>
@@ -2425,7 +2679,10 @@
     </w:p>
     <w:p>
       <w:r>
-        <w:t>A work item behaves differently depending on its current state.</w:t>
+        <w:t>A running workflow behaves differently depending on its current stat</w:t>
+      </w:r>
+      <w:r>
+        <w:t>e.</w:t>
       </w:r>
     </w:p>
     <w:p>
@@ -2438,11 +2695,11 @@
         <w:pStyle w:val="ListParagraph"/>
         <w:numPr>
           <w:ilvl w:val="0"/>
-          <w:numId w:val="34"/>
+          <w:numId w:val="33"/>
         </w:numPr>
       </w:pPr>
       <w:r>
-        <w:t>Created</w:t>
+        <w:t>Submitted</w:t>
       </w:r>
     </w:p>
     <w:p>
@@ -2450,11 +2707,11 @@
         <w:pStyle w:val="ListParagraph"/>
         <w:numPr>
           <w:ilvl w:val="0"/>
-          <w:numId w:val="34"/>
+          <w:numId w:val="33"/>
         </w:numPr>
       </w:pPr>
       <w:r>
-        <w:t>Available</w:t>
+        <w:t>Active</w:t>
       </w:r>
     </w:p>
     <w:p>
@@ -2462,11 +2719,11 @@
         <w:pStyle w:val="ListParagraph"/>
         <w:numPr>
           <w:ilvl w:val="0"/>
-          <w:numId w:val="34"/>
+          <w:numId w:val="33"/>
         </w:numPr>
       </w:pPr>
       <w:r>
-        <w:t>Assigned</w:t>
+        <w:t>In Progress</w:t>
       </w:r>
     </w:p>
     <w:p>
@@ -2474,11 +2731,11 @@
         <w:pStyle w:val="ListParagraph"/>
         <w:numPr>
           <w:ilvl w:val="0"/>
-          <w:numId w:val="34"/>
+          <w:numId w:val="33"/>
         </w:numPr>
       </w:pPr>
       <w:r>
-        <w:t>In Progress</w:t>
+        <w:t>Escalated</w:t>
       </w:r>
     </w:p>
     <w:p>
@@ -2486,11 +2743,11 @@
         <w:pStyle w:val="ListParagraph"/>
         <w:numPr>
           <w:ilvl w:val="0"/>
-          <w:numId w:val="34"/>
+          <w:numId w:val="33"/>
         </w:numPr>
       </w:pPr>
       <w:r>
-        <w:t>Completed</w:t>
+        <w:t>Resolved</w:t>
       </w:r>
     </w:p>
     <w:p>
@@ -2498,40 +2755,16 @@
         <w:pStyle w:val="ListParagraph"/>
         <w:numPr>
           <w:ilvl w:val="0"/>
-          <w:numId w:val="34"/>
+          <w:numId w:val="33"/>
         </w:numPr>
       </w:pPr>
       <w:r>
-        <w:t>Escalated</w:t>
-      </w:r>
-    </w:p>
-    <w:p>
-      <w:pPr>
-        <w:pStyle w:val="ListParagraph"/>
-        <w:numPr>
-          <w:ilvl w:val="0"/>
-          <w:numId w:val="34"/>
-        </w:numPr>
-      </w:pPr>
-      <w:r>
-        <w:t>Rejected</w:t>
-      </w:r>
-    </w:p>
-    <w:p>
-      <w:pPr>
-        <w:pStyle w:val="ListParagraph"/>
-        <w:numPr>
-          <w:ilvl w:val="0"/>
-          <w:numId w:val="34"/>
-        </w:numPr>
-      </w:pPr>
-      <w:r>
         <w:t>Closed</w:t>
       </w:r>
     </w:p>
     <w:p>
       <w:r>
-        <w:t>For example, a completed work item should not be started again.</w:t>
+        <w:t>For example, a resolved or closed workflow should not continue processing new work.</w:t>
       </w:r>
     </w:p>
     <w:p>
@@ -2550,50 +2783,61 @@
       </w:r>
     </w:p>
     <w:p>
-      <w:r>
-        <w:t>WorkItem</w:t>
-      </w:r>
+      <w:proofErr w:type="spellStart"/>
+      <w:r>
+        <w:t>WorkflowInstance</w:t>
+      </w:r>
+      <w:proofErr w:type="spellEnd"/>
     </w:p>
     <w:p/>
     <w:p>
-      <w:r>
-        <w:t>WorkItemState</w:t>
-      </w:r>
-    </w:p>
-    <w:p>
-      <w:r>
-        <w:t>CreatedState</w:t>
-      </w:r>
-    </w:p>
-    <w:p>
-      <w:r>
-        <w:t>AvailableState</w:t>
-      </w:r>
-    </w:p>
-    <w:p>
-      <w:r>
-        <w:t>AssignedState</w:t>
-      </w:r>
-    </w:p>
-    <w:p>
+      <w:proofErr w:type="spellStart"/>
+      <w:r>
+        <w:t>WorkflowState</w:t>
+      </w:r>
+      <w:proofErr w:type="spellEnd"/>
+    </w:p>
+    <w:p>
+      <w:proofErr w:type="spellStart"/>
+      <w:r>
+        <w:t>SubmittedState</w:t>
+      </w:r>
+      <w:proofErr w:type="spellEnd"/>
+    </w:p>
+    <w:p>
+      <w:proofErr w:type="spellStart"/>
+      <w:r>
+        <w:t>ActiveState</w:t>
+      </w:r>
+      <w:proofErr w:type="spellEnd"/>
+    </w:p>
+    <w:p>
+      <w:proofErr w:type="spellStart"/>
       <w:r>
         <w:t>InProgressState</w:t>
       </w:r>
-    </w:p>
-    <w:p>
-      <w:r>
-        <w:t>CompletedState</w:t>
-      </w:r>
-    </w:p>
-    <w:p>
+      <w:proofErr w:type="spellEnd"/>
+    </w:p>
+    <w:p>
+      <w:proofErr w:type="spellStart"/>
       <w:r>
         <w:t>EscalatedState</w:t>
       </w:r>
-    </w:p>
-    <w:p>
+      <w:proofErr w:type="spellEnd"/>
+    </w:p>
+    <w:p>
+      <w:proofErr w:type="spellStart"/>
+      <w:r>
+        <w:t>ResolvedState</w:t>
+      </w:r>
+      <w:proofErr w:type="spellEnd"/>
+    </w:p>
+    <w:p>
+      <w:proofErr w:type="spellStart"/>
       <w:r>
         <w:t>ClosedState</w:t>
       </w:r>
+      <w:proofErr w:type="spellEnd"/>
     </w:p>
     <w:p>
       <w:pPr>
@@ -2611,13 +2855,26 @@
       </w:r>
     </w:p>
     <w:p>
-      <w:r>
-        <w:t>WorkItem stores a current WorkItemState.</w:t>
-      </w:r>
-    </w:p>
-    <w:p>
-      <w:r>
-        <w:t>The state object controls which operations are valid and how the work item reacts.</w:t>
+      <w:proofErr w:type="spellStart"/>
+      <w:r>
+        <w:t>WorkflowInstance</w:t>
+      </w:r>
+      <w:proofErr w:type="spellEnd"/>
+      <w:r>
+        <w:t xml:space="preserve"> stores a current </w:t>
+      </w:r>
+      <w:proofErr w:type="spellStart"/>
+      <w:r>
+        <w:t>WorkflowState</w:t>
+      </w:r>
+      <w:proofErr w:type="spellEnd"/>
+      <w:r>
+        <w:t>.</w:t>
+      </w:r>
+    </w:p>
+    <w:p>
+      <w:r>
+        <w:t>The state object controls how the workflow behaves and which transitions are allowed.</w:t>
       </w:r>
     </w:p>
     <w:p>
@@ -2637,7 +2894,7 @@
     </w:p>
     <w:p>
       <w:r>
-        <w:t>The behaviour of the work item changes depending on its current state.</w:t>
+        <w:t>The behaviour of the workflow changes depending on its current state.</w:t>
       </w:r>
     </w:p>
     <w:p>
@@ -2657,7 +2914,7 @@
     </w:p>
     <w:p>
       <w:r>
-        <w:t>State avoids large if/else or switch statements that repeatedly check the current status of a work item.</w:t>
+        <w:t>State avoids large if/else or switch statements that repeatedly check the current workflow status.</w:t>
       </w:r>
     </w:p>
     <w:p>
@@ -2677,8 +2934,24 @@
     </w:p>
     <w:p>
       <w:r>
+        <w:t xml:space="preserve">A running case behaves differently depending on where it is in its lifecycle. A newly submitted case can be reviewed and assigned, an active case can be processed, an </w:t>
+      </w:r>
+      <w:r>
         <w:lastRenderedPageBreak/>
-        <w:t>A work item's valid operations depend on its lifecycle phase: a Completed item cannot be assigned again and a Cancelled one cannot be completed. Without State this logic becomes large conditional blocks that check the current status, which the project rules do not allow. Adding a state later, such as OnHold, only needs a new state class.</w:t>
+        <w:t>escalated case requires higher-level handling, and a resolved or closed case should no longer continue through the workflow.</w:t>
+      </w:r>
+    </w:p>
+    <w:p>
+      <w:r>
+        <w:t xml:space="preserve">Using the State pattern keeps this behaviour separate from </w:t>
+      </w:r>
+      <w:proofErr w:type="spellStart"/>
+      <w:r>
+        <w:t>WorkflowInstance</w:t>
+      </w:r>
+      <w:proofErr w:type="spellEnd"/>
+      <w:r>
+        <w:t xml:space="preserve"> and makes it easier to add new states later if needed.</w:t>
       </w:r>
     </w:p>
     <w:p>
@@ -2698,7 +2971,15 @@
     </w:p>
     <w:p>
       <w:r>
-        <w:t>State transitions trigger Observer notifications. Command records each transition so Memento can restore an earlier state, and a work item entering the Escalated state starts the Chain of Responsibility.</w:t>
+        <w:t xml:space="preserve">State transitions can trigger Observer notifications. Commands can cause state changes, and Memento can preserve earlier workflow states for rollback where appropriate. When a workflow enters </w:t>
+      </w:r>
+      <w:proofErr w:type="spellStart"/>
+      <w:r>
+        <w:t>EscalatedState</w:t>
+      </w:r>
+      <w:proofErr w:type="spellEnd"/>
+      <w:r>
+        <w:t>, the Chain of Responsibility can be used to determine the next handler.</w:t>
       </w:r>
     </w:p>
     <w:p/>
@@ -2772,7 +3053,15 @@
     </w:p>
     <w:p>
       <w:r>
-        <w:t>The assignment method should be able to change without changing the WorkItem class.</w:t>
+        <w:t xml:space="preserve">The assignment method should be able to change without changing the </w:t>
+      </w:r>
+      <w:proofErr w:type="spellStart"/>
+      <w:r>
+        <w:t>WorkItem</w:t>
+      </w:r>
+      <w:proofErr w:type="spellEnd"/>
+      <w:r>
+        <w:t xml:space="preserve"> class.</w:t>
       </w:r>
     </w:p>
     <w:p>
@@ -2791,20 +3080,26 @@
       </w:r>
     </w:p>
     <w:p>
+      <w:proofErr w:type="spellStart"/>
       <w:r>
         <w:t>AssignmentStrategy</w:t>
       </w:r>
+      <w:proofErr w:type="spellEnd"/>
     </w:p>
     <w:p/>
     <w:p>
+      <w:proofErr w:type="spellStart"/>
       <w:r>
         <w:t>RoleBasedAssignment</w:t>
       </w:r>
-    </w:p>
-    <w:p>
+      <w:proofErr w:type="spellEnd"/>
+    </w:p>
+    <w:p>
+      <w:proofErr w:type="spellStart"/>
       <w:r>
         <w:t>WorkloadBasedAssignment</w:t>
       </w:r>
+      <w:proofErr w:type="spellEnd"/>
     </w:p>
     <w:p>
       <w:pPr>
@@ -2823,7 +3118,15 @@
     </w:p>
     <w:p>
       <w:r>
-        <w:t>TIVIDY stores an AssignmentStrategy and asks it to determine which participant should receive a work item.</w:t>
+        <w:t xml:space="preserve">TIVIDY stores an </w:t>
+      </w:r>
+      <w:proofErr w:type="spellStart"/>
+      <w:r>
+        <w:t>AssignmentStrategy</w:t>
+      </w:r>
+      <w:proofErr w:type="spellEnd"/>
+      <w:r>
+        <w:t xml:space="preserve"> and asks it to determine which participant should receive a work item.</w:t>
       </w:r>
     </w:p>
     <w:p>
@@ -2883,7 +3186,15 @@
     </w:p>
     <w:p>
       <w:r>
-        <w:t>Organisations route work differently: by participant role or by current workload, or by a rule calculated from the workflow's own data. Each rule becomes its own class, so the choice is configuration and not a change to WorkItem or the engine.</w:t>
+        <w:t xml:space="preserve">Organisations route work differently: by participant role or by current workload, or by a rule calculated from the workflow's own data. Each rule becomes its own class, so the choice is configuration and not a change to </w:t>
+      </w:r>
+      <w:proofErr w:type="spellStart"/>
+      <w:r>
+        <w:t>WorkItem</w:t>
+      </w:r>
+      <w:proofErr w:type="spellEnd"/>
+      <w:r>
+        <w:t xml:space="preserve"> or the engine.</w:t>
       </w:r>
     </w:p>
     <w:p>
@@ -2903,7 +3214,31 @@
     </w:p>
     <w:p>
       <w:r>
-        <w:t>The configured AssignmentStrategy is used when a work item becomes Available or a routing decision point is reached. It is set on the WorkflowDefinition through the Builder. Priority handling is not part of Strategy; it is covered by the Decorator pattern, and a strategy can read a work item's priority when selecting a participant.</w:t>
+        <w:t xml:space="preserve">The configured </w:t>
+      </w:r>
+      <w:proofErr w:type="spellStart"/>
+      <w:r>
+        <w:t>AssignmentStrategy</w:t>
+      </w:r>
+      <w:proofErr w:type="spellEnd"/>
+      <w:r>
+        <w:t xml:space="preserve"> is used when a work item becomes </w:t>
+      </w:r>
+      <w:proofErr w:type="gramStart"/>
+      <w:r>
+        <w:t>Available</w:t>
+      </w:r>
+      <w:proofErr w:type="gramEnd"/>
+      <w:r>
+        <w:t xml:space="preserve"> or a routing decision point is reached. It is set on the </w:t>
+      </w:r>
+      <w:proofErr w:type="spellStart"/>
+      <w:r>
+        <w:t>WorkflowDefinition</w:t>
+      </w:r>
+      <w:proofErr w:type="spellEnd"/>
+      <w:r>
+        <w:t xml:space="preserve"> through the Builder. Priority handling is not part of Strategy; it is covered by the Decorator pattern, and a strategy can read a work item's priority when selecting a participant.</w:t>
       </w:r>
     </w:p>
     <w:p/>
@@ -2923,6 +3258,7 @@
           <w:sz w:val="22"/>
           <w:szCs w:val="22"/>
         </w:rPr>
+        <w:lastRenderedPageBreak/>
         <w:t>5. Chain of Responsibility Pattern</w:t>
       </w:r>
     </w:p>
@@ -2938,7 +3274,6 @@
           <w:b/>
           <w:bCs/>
         </w:rPr>
-        <w:lastRenderedPageBreak/>
         <w:t>Design Problem</w:t>
       </w:r>
     </w:p>
@@ -2979,24 +3314,32 @@
     </w:p>
     <w:p/>
     <w:p>
-      <w:r>
-        <w:t>StaffHandler</w:t>
-      </w:r>
-    </w:p>
-    <w:p>
-      <w:r>
-        <w:t>CoordinatorHandler</w:t>
-      </w:r>
-    </w:p>
-    <w:p>
-      <w:r>
-        <w:t>DepartmentHeadHandler</w:t>
-      </w:r>
-    </w:p>
-    <w:p>
-      <w:r>
-        <w:t>FacultyHandler</w:t>
-      </w:r>
+      <w:proofErr w:type="spellStart"/>
+      <w:r>
+        <w:t>WorkHandler</w:t>
+      </w:r>
+      <w:proofErr w:type="spellEnd"/>
+    </w:p>
+    <w:p>
+      <w:proofErr w:type="spellStart"/>
+      <w:r>
+        <w:t>ApprovalHandler</w:t>
+      </w:r>
+      <w:proofErr w:type="spellEnd"/>
+    </w:p>
+    <w:p>
+      <w:proofErr w:type="spellStart"/>
+      <w:r>
+        <w:t>EscalationHandler</w:t>
+      </w:r>
+      <w:proofErr w:type="spellEnd"/>
+    </w:p>
+    <w:p>
+      <w:proofErr w:type="spellStart"/>
+      <w:r>
+        <w:t>FinalDecisionHandler</w:t>
+      </w:r>
+      <w:proofErr w:type="spellEnd"/>
     </w:p>
     <w:p>
       <w:pPr>
@@ -3060,7 +3403,15 @@
     </w:p>
     <w:p>
       <w:r>
-        <w:t>Chain of Responsibility provides a flexible way to manage escalation without hard-coding every escalation level into one class.</w:t>
+        <w:t xml:space="preserve">Chain of Responsibility provides a flexible way to manage escalation without </w:t>
+      </w:r>
+      <w:proofErr w:type="gramStart"/>
+      <w:r>
+        <w:t>hard-coding</w:t>
+      </w:r>
+      <w:proofErr w:type="gramEnd"/>
+      <w:r>
+        <w:t xml:space="preserve"> every escalation level into one class.</w:t>
       </w:r>
     </w:p>
     <w:p>
@@ -3100,7 +3451,31 @@
     </w:p>
     <w:p>
       <w:r>
-        <w:t>The chain is invoked when a work item enters the Escalated state. The Builder constructs it as part of the WorkflowDefinition, each handler corresponds to a participant role, and each approval or escalation outcome is recorded as a Command, with Observer notifying the relevant parties.</w:t>
+        <w:t xml:space="preserve">The chain is invoked when the </w:t>
+      </w:r>
+      <w:proofErr w:type="spellStart"/>
+      <w:r>
+        <w:t>WorkflowInstance</w:t>
+      </w:r>
+      <w:proofErr w:type="spellEnd"/>
+      <w:r>
+        <w:t xml:space="preserve"> enters </w:t>
+      </w:r>
+      <w:proofErr w:type="spellStart"/>
+      <w:r>
+        <w:t>EscalatedState</w:t>
+      </w:r>
+      <w:proofErr w:type="spellEnd"/>
+      <w:r>
+        <w:t xml:space="preserve">. The Builder constructs it as part of the </w:t>
+      </w:r>
+      <w:proofErr w:type="spellStart"/>
+      <w:r>
+        <w:t>WorkflowDefinition</w:t>
+      </w:r>
+      <w:proofErr w:type="spellEnd"/>
+      <w:r>
+        <w:t>, each handler corresponds to a participant role, and each approval or escalation outcome is recorded as a Command, with Observer notifying the relevant parties.</w:t>
       </w:r>
     </w:p>
     <w:p/>
@@ -3169,6 +3544,7 @@
         </w:numPr>
       </w:pPr>
       <w:r>
+        <w:lastRenderedPageBreak/>
         <w:t>Complete work</w:t>
       </w:r>
     </w:p>
@@ -3181,7 +3557,6 @@
         </w:numPr>
       </w:pPr>
       <w:r>
-        <w:lastRenderedPageBreak/>
         <w:t>Escalate work</w:t>
       </w:r>
     </w:p>
@@ -3206,18 +3581,6 @@
         </w:numPr>
       </w:pPr>
       <w:r>
-        <w:t>Reject work</w:t>
-      </w:r>
-    </w:p>
-    <w:p>
-      <w:pPr>
-        <w:pStyle w:val="ListParagraph"/>
-        <w:numPr>
-          <w:ilvl w:val="0"/>
-          <w:numId w:val="36"/>
-        </w:numPr>
-      </w:pPr>
-      <w:r>
         <w:t>Close work</w:t>
       </w:r>
     </w:p>
@@ -3248,39 +3611,46 @@
     </w:p>
     <w:p/>
     <w:p>
+      <w:proofErr w:type="spellStart"/>
       <w:r>
         <w:t>AssignWorkCommand</w:t>
       </w:r>
-    </w:p>
-    <w:p>
+      <w:proofErr w:type="spellEnd"/>
+    </w:p>
+    <w:p>
+      <w:proofErr w:type="spellStart"/>
       <w:r>
         <w:t>CompleteWorkCommand</w:t>
       </w:r>
-    </w:p>
-    <w:p>
+      <w:proofErr w:type="spellEnd"/>
+    </w:p>
+    <w:p>
+      <w:proofErr w:type="spellStart"/>
       <w:r>
         <w:t>EscalateWorkCommand</w:t>
       </w:r>
-    </w:p>
-    <w:p>
+      <w:proofErr w:type="spellEnd"/>
+    </w:p>
+    <w:p>
+      <w:proofErr w:type="spellStart"/>
       <w:r>
         <w:t>ApproveWorkCommand</w:t>
       </w:r>
-    </w:p>
-    <w:p>
-      <w:r>
-        <w:t>RejectWorkCommand</w:t>
-      </w:r>
-    </w:p>
-    <w:p>
+      <w:proofErr w:type="spellEnd"/>
+    </w:p>
+    <w:p>
+      <w:proofErr w:type="spellStart"/>
       <w:r>
         <w:t>CancelWorkCommand</w:t>
       </w:r>
-    </w:p>
-    <w:p>
-      <w:r>
-        <w:t>CloseWorkCommand</w:t>
-      </w:r>
+      <w:proofErr w:type="spellEnd"/>
+    </w:p>
+    <w:p>
+      <w:proofErr w:type="spellStart"/>
+      <w:r>
+        <w:t>CloseWorkflowCommand</w:t>
+      </w:r>
+      <w:proofErr w:type="spellEnd"/>
     </w:p>
     <w:p>
       <w:pPr>
@@ -3304,7 +3674,15 @@
     </w:p>
     <w:p>
       <w:r>
-        <w:t>The workflow system executes the required command when the action must occur.</w:t>
+        <w:t xml:space="preserve">The workflow system executes the required command when the action must occur. </w:t>
+      </w:r>
+      <w:proofErr w:type="spellStart"/>
+      <w:r>
+        <w:t>CloseWorkflowCommand</w:t>
+      </w:r>
+      <w:proofErr w:type="spellEnd"/>
+      <w:r>
+        <w:t xml:space="preserve"> is used when a running case must be formally closed, such as when a student retracts a complaint or when a final appeal is denied.</w:t>
       </w:r>
     </w:p>
     <w:p>
@@ -3364,7 +3742,15 @@
     </w:p>
     <w:p>
       <w:r>
-        <w:t>The system must be able to explain what happened, in what order and by whom, and some actions must be reversible. Placing that inside WorkItem would mix audit responsibility into the work item and make rollback hard. Command objects can be stored, logged, queued and undone independently.</w:t>
+        <w:t xml:space="preserve">The system must be able to explain what happened, in what order and by whom, and some actions must be reversible. Placing that inside </w:t>
+      </w:r>
+      <w:proofErr w:type="spellStart"/>
+      <w:r>
+        <w:t>WorkItem</w:t>
+      </w:r>
+      <w:proofErr w:type="spellEnd"/>
+      <w:r>
+        <w:t xml:space="preserve"> would mix audit responsibility into the work item and make rollback hard. Command objects can be stored, logged, queued and undone independently.</w:t>
       </w:r>
     </w:p>
     <w:p>
@@ -3384,7 +3770,23 @@
     </w:p>
     <w:p>
       <w:r>
-        <w:t>Before a reversible action, a Command can request a WorkflowMemento and use it on undo. Command execution fires Observer notifications so the history stays current, Commands call Adapters when an action needs an external system, and TIVIDYFacade is the entry point through which commands are submitted.</w:t>
+        <w:t xml:space="preserve">Before a reversible action, a Command can request a </w:t>
+      </w:r>
+      <w:proofErr w:type="spellStart"/>
+      <w:r>
+        <w:t>WorkflowMemento</w:t>
+      </w:r>
+      <w:proofErr w:type="spellEnd"/>
+      <w:r>
+        <w:t xml:space="preserve"> and use it on undo. Command execution fires Observer notifications so the history stays current, Commands call Adapters when an action needs an external system, and </w:t>
+      </w:r>
+      <w:proofErr w:type="spellStart"/>
+      <w:r>
+        <w:t>TIVIDYFacade</w:t>
+      </w:r>
+      <w:proofErr w:type="spellEnd"/>
+      <w:r>
+        <w:t xml:space="preserve"> is the entry point through which commands are submitted.</w:t>
       </w:r>
     </w:p>
     <w:p/>
@@ -3449,25 +3851,33 @@
       </w:r>
     </w:p>
     <w:p>
+      <w:proofErr w:type="spellStart"/>
       <w:r>
         <w:t>WorkflowComponent</w:t>
       </w:r>
+      <w:proofErr w:type="spellEnd"/>
     </w:p>
     <w:p/>
     <w:p>
+      <w:proofErr w:type="spellStart"/>
       <w:r>
         <w:t>WorkItem</w:t>
       </w:r>
-    </w:p>
-    <w:p>
+      <w:proofErr w:type="spellEnd"/>
+    </w:p>
+    <w:p>
+      <w:proofErr w:type="spellStart"/>
       <w:r>
         <w:t>WorkflowStage</w:t>
       </w:r>
-    </w:p>
-    <w:p>
+      <w:proofErr w:type="spellEnd"/>
+    </w:p>
+    <w:p>
+      <w:proofErr w:type="spellStart"/>
       <w:r>
         <w:t>SubProcess</w:t>
       </w:r>
+      <w:proofErr w:type="spellEnd"/>
     </w:p>
     <w:p>
       <w:pPr>
@@ -3485,13 +3895,39 @@
       </w:r>
     </w:p>
     <w:p>
-      <w:r>
-        <w:t>WorkItem represents a simple component.</w:t>
-      </w:r>
-    </w:p>
-    <w:p>
-      <w:r>
-        <w:t>WorkflowStage or SubProcess can contain other WorkflowComponent objects.</w:t>
+      <w:proofErr w:type="spellStart"/>
+      <w:r>
+        <w:t>WorkItem</w:t>
+      </w:r>
+      <w:proofErr w:type="spellEnd"/>
+      <w:r>
+        <w:t xml:space="preserve"> represents a simple component.</w:t>
+      </w:r>
+    </w:p>
+    <w:p>
+      <w:proofErr w:type="spellStart"/>
+      <w:r>
+        <w:t>WorkflowStage</w:t>
+      </w:r>
+      <w:proofErr w:type="spellEnd"/>
+      <w:r>
+        <w:t xml:space="preserve"> or </w:t>
+      </w:r>
+      <w:proofErr w:type="spellStart"/>
+      <w:r>
+        <w:t>SubProcess</w:t>
+      </w:r>
+      <w:proofErr w:type="spellEnd"/>
+      <w:r>
+        <w:t xml:space="preserve"> can contain other </w:t>
+      </w:r>
+      <w:proofErr w:type="spellStart"/>
+      <w:r>
+        <w:t>WorkflowComponent</w:t>
+      </w:r>
+      <w:proofErr w:type="spellEnd"/>
+      <w:r>
+        <w:t xml:space="preserve"> objects.</w:t>
       </w:r>
     </w:p>
     <w:p>
@@ -3551,7 +3987,23 @@
     </w:p>
     <w:p>
       <w:r>
-        <w:t>Work is nested: a stage holds work items, and some work items hold smaller sub-processes. The engine must assign, start, complete and track a single WorkItem or a whole WorkflowStage through the same interface, without needing to know whether it holds one item or many.</w:t>
+        <w:t xml:space="preserve">Work is nested: a stage holds work items, and some work items hold smaller sub-processes. The engine must assign, start, complete and track a single </w:t>
+      </w:r>
+      <w:proofErr w:type="spellStart"/>
+      <w:r>
+        <w:t>WorkItem</w:t>
+      </w:r>
+      <w:proofErr w:type="spellEnd"/>
+      <w:r>
+        <w:t xml:space="preserve"> or a whole </w:t>
+      </w:r>
+      <w:proofErr w:type="spellStart"/>
+      <w:r>
+        <w:t>WorkflowStage</w:t>
+      </w:r>
+      <w:proofErr w:type="spellEnd"/>
+      <w:r>
+        <w:t xml:space="preserve"> through the same interface, without needing to know whether it holds one item or many.</w:t>
       </w:r>
     </w:p>
     <w:p>
@@ -3571,7 +4023,59 @@
     </w:p>
     <w:p>
       <w:r>
-        <w:t>Composite is the structure the Builder assembles for a WorkflowDefinition. Each node carries its own state through the State pattern, Decorators can wrap any WorkflowComponent, and the structure is what gets traversed for reporting and monitoring.</w:t>
+        <w:t xml:space="preserve">Composite is the structure the Builder assembles for a </w:t>
+      </w:r>
+      <w:proofErr w:type="spellStart"/>
+      <w:r>
+        <w:t>WorkflowDefinition</w:t>
+      </w:r>
+      <w:proofErr w:type="spellEnd"/>
+      <w:r>
+        <w:t xml:space="preserve">. </w:t>
+      </w:r>
+      <w:r>
+        <w:t xml:space="preserve">The Composite structure represents the work contained in a </w:t>
+      </w:r>
+      <w:proofErr w:type="spellStart"/>
+      <w:r>
+        <w:t>WorkflowDefinition</w:t>
+      </w:r>
+      <w:proofErr w:type="spellEnd"/>
+      <w:r>
+        <w:t xml:space="preserve">, while the running </w:t>
+      </w:r>
+      <w:proofErr w:type="spellStart"/>
+      <w:r>
+        <w:t>WorkflowInstance</w:t>
+      </w:r>
+      <w:proofErr w:type="spellEnd"/>
+      <w:r>
+        <w:t xml:space="preserve"> is governed by the State pattern</w:t>
+      </w:r>
+      <w:r>
+        <w:t>.</w:t>
+      </w:r>
+      <w:r>
+        <w:t xml:space="preserve"> </w:t>
+      </w:r>
+      <w:proofErr w:type="spellStart"/>
+      <w:r>
+        <w:t>PriorityDecorator</w:t>
+      </w:r>
+      <w:proofErr w:type="spellEnd"/>
+      <w:r>
+        <w:t xml:space="preserve"> can wrap a </w:t>
+      </w:r>
+      <w:proofErr w:type="spellStart"/>
+      <w:r>
+        <w:t>WorkItem</w:t>
+      </w:r>
+      <w:proofErr w:type="spellEnd"/>
+      <w:r>
+        <w:t xml:space="preserve"> that requires priority handling</w:t>
+      </w:r>
+      <w:r>
+        <w:t xml:space="preserve"> and the structure is what gets traversed for reporting and monitoring.</w:t>
       </w:r>
     </w:p>
     <w:p/>
@@ -3630,20 +4134,26 @@
       </w:r>
     </w:p>
     <w:p>
+      <w:proofErr w:type="spellStart"/>
       <w:r>
         <w:t>NotificationService</w:t>
       </w:r>
+      <w:proofErr w:type="spellEnd"/>
     </w:p>
     <w:p/>
     <w:p>
+      <w:proofErr w:type="spellStart"/>
       <w:r>
         <w:t>EmailAdapter</w:t>
       </w:r>
-    </w:p>
-    <w:p>
+      <w:proofErr w:type="spellEnd"/>
+    </w:p>
+    <w:p>
+      <w:proofErr w:type="spellStart"/>
       <w:r>
         <w:t>ExternalEmailService</w:t>
       </w:r>
+      <w:proofErr w:type="spellEnd"/>
     </w:p>
     <w:p>
       <w:pPr>
@@ -3662,26 +4172,40 @@
     </w:p>
     <w:p>
       <w:r>
-        <w:t>TIVIDY communicates with the NotificationService interface.</w:t>
-      </w:r>
-    </w:p>
-    <w:p>
-      <w:r>
-        <w:t>EmailAdapter translates TIVIDY requests into the format required by the external email system.</w:t>
-      </w:r>
-    </w:p>
-    <w:p>
-      <w:pPr>
-        <w:rPr>
-          <w:b/>
-          <w:bCs/>
-        </w:rPr>
-      </w:pPr>
-      <w:r>
-        <w:rPr>
-          <w:b/>
-          <w:bCs/>
-        </w:rPr>
+        <w:t xml:space="preserve">TIVIDY communicates with the </w:t>
+      </w:r>
+      <w:proofErr w:type="spellStart"/>
+      <w:r>
+        <w:t>NotificationService</w:t>
+      </w:r>
+      <w:proofErr w:type="spellEnd"/>
+      <w:r>
+        <w:t xml:space="preserve"> interface.</w:t>
+      </w:r>
+    </w:p>
+    <w:p>
+      <w:proofErr w:type="spellStart"/>
+      <w:r>
+        <w:t>EmailAdapter</w:t>
+      </w:r>
+      <w:proofErr w:type="spellEnd"/>
+      <w:r>
+        <w:t xml:space="preserve"> translates TIVIDY requests into the format required by the external email system.</w:t>
+      </w:r>
+    </w:p>
+    <w:p>
+      <w:pPr>
+        <w:rPr>
+          <w:b/>
+          <w:bCs/>
+        </w:rPr>
+      </w:pPr>
+      <w:r>
+        <w:rPr>
+          <w:b/>
+          <w:bCs/>
+        </w:rPr>
+        <w:lastRenderedPageBreak/>
         <w:t>What Varies</w:t>
       </w:r>
     </w:p>
@@ -3702,7 +4226,6 @@
           <w:b/>
           <w:bCs/>
         </w:rPr>
-        <w:lastRenderedPageBreak/>
         <w:t>Why It Is Appropriate</w:t>
       </w:r>
     </w:p>
@@ -3747,8 +4270,29 @@
       </w:r>
     </w:p>
     <w:p>
-      <w:r>
-        <w:t>EmailAdapter can register as an Observer so notifications go out when workflow events happen, and Commands use it when an action needs external communication. The engine only ever calls NotificationService, never the foreign interface directly.</w:t>
+      <w:proofErr w:type="spellStart"/>
+      <w:r>
+        <w:t>EmailAdapter</w:t>
+      </w:r>
+      <w:proofErr w:type="spellEnd"/>
+      <w:r>
+        <w:t xml:space="preserve"> can register as an </w:t>
+      </w:r>
+      <w:proofErr w:type="gramStart"/>
+      <w:r>
+        <w:t>Observer</w:t>
+      </w:r>
+      <w:proofErr w:type="gramEnd"/>
+      <w:r>
+        <w:t xml:space="preserve"> so notifications go out when workflow events happen, and Commands use it when an action needs external communication. The engine only ever calls </w:t>
+      </w:r>
+      <w:proofErr w:type="spellStart"/>
+      <w:r>
+        <w:t>NotificationService</w:t>
+      </w:r>
+      <w:proofErr w:type="spellEnd"/>
+      <w:r>
+        <w:t>, never the foreign interface directly.</w:t>
       </w:r>
     </w:p>
     <w:p/>
@@ -3804,9 +4348,11 @@
           <w:numId w:val="37"/>
         </w:numPr>
       </w:pPr>
+      <w:proofErr w:type="spellStart"/>
       <w:r>
         <w:t>WorkflowDefinition</w:t>
       </w:r>
+      <w:proofErr w:type="spellEnd"/>
     </w:p>
     <w:p>
       <w:pPr>
@@ -3816,9 +4362,11 @@
           <w:numId w:val="37"/>
         </w:numPr>
       </w:pPr>
+      <w:proofErr w:type="spellStart"/>
       <w:r>
         <w:t>WorkflowInstance</w:t>
       </w:r>
+      <w:proofErr w:type="spellEnd"/>
     </w:p>
     <w:p>
       <w:pPr>
@@ -3828,9 +4376,11 @@
           <w:numId w:val="37"/>
         </w:numPr>
       </w:pPr>
+      <w:proofErr w:type="spellStart"/>
       <w:r>
         <w:t>WorkItem</w:t>
       </w:r>
+      <w:proofErr w:type="spellEnd"/>
     </w:p>
     <w:p>
       <w:pPr>
@@ -3840,9 +4390,11 @@
           <w:numId w:val="37"/>
         </w:numPr>
       </w:pPr>
+      <w:proofErr w:type="spellStart"/>
       <w:r>
         <w:t>AssignmentStrategy</w:t>
       </w:r>
+      <w:proofErr w:type="spellEnd"/>
     </w:p>
     <w:p>
       <w:pPr>
@@ -3882,7 +4434,15 @@
     </w:p>
     <w:p>
       <w:r>
-        <w:t>A user of TIVIDY should not need to interact directly with all of these classes.</w:t>
+        <w:t xml:space="preserve">A user of TIVIDY should not need to interact directly with </w:t>
+      </w:r>
+      <w:proofErr w:type="gramStart"/>
+      <w:r>
+        <w:t>all of</w:t>
+      </w:r>
+      <w:proofErr w:type="gramEnd"/>
+      <w:r>
+        <w:t xml:space="preserve"> these classes.</w:t>
       </w:r>
     </w:p>
     <w:p>
@@ -3901,9 +4461,11 @@
       </w:r>
     </w:p>
     <w:p>
+      <w:proofErr w:type="spellStart"/>
       <w:r>
         <w:t>TIVIDYFacade</w:t>
       </w:r>
+      <w:proofErr w:type="spellEnd"/>
     </w:p>
     <w:p>
       <w:r>
@@ -3911,28 +4473,78 @@
       </w:r>
     </w:p>
     <w:p>
-      <w:r>
-        <w:t>createWorkflow()</w:t>
-      </w:r>
-    </w:p>
-    <w:p>
-      <w:r>
-        <w:t>startWorkflow()</w:t>
-      </w:r>
-    </w:p>
-    <w:p>
-      <w:r>
-        <w:t>assignWork()</w:t>
-      </w:r>
-    </w:p>
-    <w:p>
-      <w:r>
-        <w:t>completeWork()</w:t>
-      </w:r>
-    </w:p>
-    <w:p>
-      <w:r>
-        <w:t>escalateWork()</w:t>
+      <w:proofErr w:type="spellStart"/>
+      <w:proofErr w:type="gramStart"/>
+      <w:r>
+        <w:t>createWorkflow</w:t>
+      </w:r>
+      <w:proofErr w:type="spellEnd"/>
+      <w:r>
+        <w:t>(</w:t>
+      </w:r>
+      <w:proofErr w:type="gramEnd"/>
+      <w:r>
+        <w:t>)</w:t>
+      </w:r>
+    </w:p>
+    <w:p>
+      <w:proofErr w:type="spellStart"/>
+      <w:proofErr w:type="gramStart"/>
+      <w:r>
+        <w:t>startWorkflow</w:t>
+      </w:r>
+      <w:proofErr w:type="spellEnd"/>
+      <w:r>
+        <w:t>(</w:t>
+      </w:r>
+      <w:proofErr w:type="gramEnd"/>
+      <w:r>
+        <w:t>)</w:t>
+      </w:r>
+    </w:p>
+    <w:p>
+      <w:proofErr w:type="spellStart"/>
+      <w:proofErr w:type="gramStart"/>
+      <w:r>
+        <w:t>assignWork</w:t>
+      </w:r>
+      <w:proofErr w:type="spellEnd"/>
+      <w:r>
+        <w:t>(</w:t>
+      </w:r>
+      <w:proofErr w:type="gramEnd"/>
+      <w:r>
+        <w:t>)</w:t>
+      </w:r>
+    </w:p>
+    <w:p>
+      <w:proofErr w:type="spellStart"/>
+      <w:proofErr w:type="gramStart"/>
+      <w:r>
+        <w:t>completeWork</w:t>
+      </w:r>
+      <w:proofErr w:type="spellEnd"/>
+      <w:r>
+        <w:t>(</w:t>
+      </w:r>
+      <w:proofErr w:type="gramEnd"/>
+      <w:r>
+        <w:t>)</w:t>
+      </w:r>
+    </w:p>
+    <w:p>
+      <w:proofErr w:type="spellStart"/>
+      <w:proofErr w:type="gramStart"/>
+      <w:r>
+        <w:t>escalateWork</w:t>
+      </w:r>
+      <w:proofErr w:type="spellEnd"/>
+      <w:r>
+        <w:t>(</w:t>
+      </w:r>
+      <w:proofErr w:type="gramEnd"/>
+      <w:r>
+        <w:t>)</w:t>
       </w:r>
     </w:p>
     <w:p>
@@ -3951,8 +4563,13 @@
       </w:r>
     </w:p>
     <w:p>
-      <w:r>
-        <w:t>TIVIDYFacade provides a simple interface and delegates requests to the appropriate internal workflow objects.</w:t>
+      <w:proofErr w:type="spellStart"/>
+      <w:r>
+        <w:t>TIVIDYFacade</w:t>
+      </w:r>
+      <w:proofErr w:type="spellEnd"/>
+      <w:r>
+        <w:t xml:space="preserve"> provides a simple interface and delegates requests to the appropriate internal workflow objects.</w:t>
       </w:r>
     </w:p>
     <w:p>
@@ -3987,12 +4604,12 @@
           <w:b/>
           <w:bCs/>
         </w:rPr>
+        <w:lastRenderedPageBreak/>
         <w:t>Why It Is Appropriate</w:t>
       </w:r>
     </w:p>
     <w:p>
       <w:r>
-        <w:lastRenderedPageBreak/>
         <w:t>Facade reduces the complexity of using the workflow system and hides unnecessary internal details.</w:t>
       </w:r>
     </w:p>
@@ -4032,8 +4649,52 @@
       </w:r>
     </w:p>
     <w:p>
-      <w:r>
-        <w:t>TIVIDYFacade is the outermost layer. Calls such as createWorkflow(), assignWork() and completeWork() are delegated to the Builder, the Command objects, the State machine and the Observer system. The scenario layer talks to the engine only through the Facade.</w:t>
+      <w:proofErr w:type="spellStart"/>
+      <w:r>
+        <w:t>TIVIDYFacade</w:t>
+      </w:r>
+      <w:proofErr w:type="spellEnd"/>
+      <w:r>
+        <w:t xml:space="preserve"> is the outermost layer. Calls such as </w:t>
+      </w:r>
+      <w:proofErr w:type="spellStart"/>
+      <w:proofErr w:type="gramStart"/>
+      <w:r>
+        <w:t>createWorkflow</w:t>
+      </w:r>
+      <w:proofErr w:type="spellEnd"/>
+      <w:r>
+        <w:t>(</w:t>
+      </w:r>
+      <w:proofErr w:type="gramEnd"/>
+      <w:r>
+        <w:t xml:space="preserve">), </w:t>
+      </w:r>
+      <w:proofErr w:type="spellStart"/>
+      <w:proofErr w:type="gramStart"/>
+      <w:r>
+        <w:t>assignWork</w:t>
+      </w:r>
+      <w:proofErr w:type="spellEnd"/>
+      <w:r>
+        <w:t>(</w:t>
+      </w:r>
+      <w:proofErr w:type="gramEnd"/>
+      <w:r>
+        <w:t xml:space="preserve">) and </w:t>
+      </w:r>
+      <w:proofErr w:type="spellStart"/>
+      <w:proofErr w:type="gramStart"/>
+      <w:r>
+        <w:t>completeWork</w:t>
+      </w:r>
+      <w:proofErr w:type="spellEnd"/>
+      <w:r>
+        <w:t>(</w:t>
+      </w:r>
+      <w:proofErr w:type="gramEnd"/>
+      <w:r>
+        <w:t>) are delegated to the Builder, the Command objects, the State machine and the Observer system. The scenario layer talks to the engine only through the Facade.</w:t>
       </w:r>
     </w:p>
     <w:p/>
@@ -4078,22 +4739,31 @@
     </w:p>
     <w:p>
       <w:r>
-        <w:t>For example, before escalation a work item may have been:</w:t>
-      </w:r>
-    </w:p>
-    <w:p>
-      <w:r>
-        <w:t>State = In Progress</w:t>
-      </w:r>
-    </w:p>
-    <w:p>
-      <w:r>
-        <w:t>Assigned To = Staff Member</w:t>
-      </w:r>
-    </w:p>
-    <w:p>
-      <w:r>
-        <w:t>If a rollback is required, the system may need to restore that earlier state.</w:t>
+        <w:t xml:space="preserve">For example, </w:t>
+      </w:r>
+      <w:proofErr w:type="gramStart"/>
+      <w:r>
+        <w:t>Before</w:t>
+      </w:r>
+      <w:proofErr w:type="gramEnd"/>
+      <w:r>
+        <w:t xml:space="preserve"> escalation, a </w:t>
+      </w:r>
+      <w:proofErr w:type="spellStart"/>
+      <w:r>
+        <w:t>WorkflowInstance</w:t>
+      </w:r>
+      <w:proofErr w:type="spellEnd"/>
+      <w:r>
+        <w:t xml:space="preserve"> may have been in </w:t>
+      </w:r>
+      <w:proofErr w:type="spellStart"/>
+      <w:r>
+        <w:t>InProgressState</w:t>
+      </w:r>
+      <w:proofErr w:type="spellEnd"/>
+      <w:r>
+        <w:t xml:space="preserve"> with a particular assignment and workflow position.</w:t>
       </w:r>
     </w:p>
     <w:p>
@@ -4112,19 +4782,25 @@
       </w:r>
     </w:p>
     <w:p>
+      <w:proofErr w:type="spellStart"/>
       <w:r>
         <w:t>WorkflowInstance</w:t>
       </w:r>
-    </w:p>
-    <w:p>
+      <w:proofErr w:type="spellEnd"/>
+    </w:p>
+    <w:p>
+      <w:proofErr w:type="spellStart"/>
       <w:r>
         <w:t>WorkflowMemento</w:t>
       </w:r>
-    </w:p>
-    <w:p>
+      <w:proofErr w:type="spellEnd"/>
+    </w:p>
+    <w:p>
+      <w:proofErr w:type="spellStart"/>
       <w:r>
         <w:t>WorkflowHistory</w:t>
       </w:r>
+      <w:proofErr w:type="spellEnd"/>
     </w:p>
     <w:p>
       <w:pPr>
@@ -4142,13 +4818,31 @@
       </w:r>
     </w:p>
     <w:p>
-      <w:r>
-        <w:t>WorkflowInstance creates a WorkflowMemento containing its current state.</w:t>
-      </w:r>
-    </w:p>
-    <w:p>
-      <w:r>
-        <w:t>WorkflowHistory stores the mementos and can provide an earlier state when required.</w:t>
+      <w:proofErr w:type="spellStart"/>
+      <w:r>
+        <w:t>WorkflowInstance</w:t>
+      </w:r>
+      <w:proofErr w:type="spellEnd"/>
+      <w:r>
+        <w:t xml:space="preserve"> creates a </w:t>
+      </w:r>
+      <w:proofErr w:type="spellStart"/>
+      <w:r>
+        <w:t>WorkflowMemento</w:t>
+      </w:r>
+      <w:proofErr w:type="spellEnd"/>
+      <w:r>
+        <w:t xml:space="preserve"> containing its current state.</w:t>
+      </w:r>
+    </w:p>
+    <w:p>
+      <w:proofErr w:type="spellStart"/>
+      <w:r>
+        <w:t>WorkflowHistory</w:t>
+      </w:r>
+      <w:proofErr w:type="spellEnd"/>
+      <w:r>
+        <w:t xml:space="preserve"> stores the mementos and can provide an earlier state when required.</w:t>
       </w:r>
     </w:p>
     <w:p>
@@ -4168,7 +4862,15 @@
     </w:p>
     <w:p>
       <w:r>
-        <w:t>The stored state of a workflow or work item over time.</w:t>
+        <w:t xml:space="preserve">The stored state of a </w:t>
+      </w:r>
+      <w:proofErr w:type="spellStart"/>
+      <w:r>
+        <w:t>WorkflowInstance</w:t>
+      </w:r>
+      <w:proofErr w:type="spellEnd"/>
+      <w:r>
+        <w:t xml:space="preserve"> over time.</w:t>
       </w:r>
     </w:p>
     <w:p>
@@ -4208,7 +4910,18 @@
     </w:p>
     <w:p>
       <w:r>
-        <w:t>Workflow actions can be wrong: an item completed by mistake, a routing decision made on bad data, a failed email integration. Restoring a known-good state needs a snapshot taken without exposing the internals of WorkItem or WorkflowInstance.</w:t>
+        <w:t xml:space="preserve">Workflow actions can be wrong: an item completed by mistake, a routing decision made on bad data, a failed email integration. Restoring a known-good state needs a snapshot taken </w:t>
+      </w:r>
+      <w:r>
+        <w:t xml:space="preserve">without exposing the internal state of </w:t>
+      </w:r>
+      <w:proofErr w:type="spellStart"/>
+      <w:r>
+        <w:t>WorkflowInstance</w:t>
+      </w:r>
+      <w:proofErr w:type="spellEnd"/>
+      <w:r>
+        <w:t>.</w:t>
       </w:r>
     </w:p>
     <w:p>
@@ -4228,7 +4941,23 @@
     </w:p>
     <w:p>
       <w:r>
-        <w:t>Memento is created and used through Command: before a reversible action the Command asks for a WorkflowMemento, and on undo passes it back to restore the earlier state. WorkflowHistory stores the snapshots, so the audit trail can point to them.</w:t>
+        <w:t xml:space="preserve">Memento is created and used through Command: before a reversible action the Command asks for a </w:t>
+      </w:r>
+      <w:proofErr w:type="spellStart"/>
+      <w:r>
+        <w:t>WorkflowMemento</w:t>
+      </w:r>
+      <w:proofErr w:type="spellEnd"/>
+      <w:r>
+        <w:t xml:space="preserve">, and on undo passes it back to restore the earlier state. </w:t>
+      </w:r>
+      <w:proofErr w:type="spellStart"/>
+      <w:r>
+        <w:t>WorkflowHistory</w:t>
+      </w:r>
+      <w:proofErr w:type="spellEnd"/>
+      <w:r>
+        <w:t xml:space="preserve"> stores the snapshots, so the audit trail can point to them.</w:t>
       </w:r>
     </w:p>
     <w:p>
@@ -4262,71 +4991,40 @@
           <w:b/>
           <w:bCs/>
         </w:rPr>
+        <w:t>Design Problem</w:t>
+      </w:r>
+    </w:p>
+    <w:p>
+      <w:r>
         <w:lastRenderedPageBreak/>
-        <w:t>Design Problem</w:t>
-      </w:r>
-    </w:p>
-    <w:p>
-      <w:r>
         <w:t>Work items sometimes need extra behaviour without becoming a different kind of work item.</w:t>
       </w:r>
     </w:p>
     <w:p>
       <w:r>
-        <w:t>For example, a work item may need to:</w:t>
-      </w:r>
-    </w:p>
-    <w:p>
-      <w:pPr>
-        <w:pStyle w:val="ListParagraph"/>
-        <w:numPr>
-          <w:ilvl w:val="0"/>
-          <w:numId w:val="31"/>
-        </w:numPr>
-      </w:pPr>
-      <w:r>
-        <w:t>Be treated as urgent (priority handling)</w:t>
-      </w:r>
-    </w:p>
-    <w:p>
-      <w:pPr>
-        <w:pStyle w:val="ListParagraph"/>
-        <w:numPr>
-          <w:ilvl w:val="0"/>
-          <w:numId w:val="31"/>
-        </w:numPr>
-      </w:pPr>
-      <w:r>
-        <w:t>Have every action written to an audit trail</w:t>
-      </w:r>
-    </w:p>
-    <w:p>
-      <w:pPr>
-        <w:pStyle w:val="ListParagraph"/>
-        <w:numPr>
-          <w:ilvl w:val="0"/>
-          <w:numId w:val="31"/>
-        </w:numPr>
-      </w:pPr>
-      <w:r>
-        <w:t>Notify a participant when it changes</w:t>
-      </w:r>
-    </w:p>
-    <w:p>
-      <w:pPr>
-        <w:pStyle w:val="ListParagraph"/>
-        <w:numPr>
-          <w:ilvl w:val="0"/>
-          <w:numId w:val="31"/>
-        </w:numPr>
-      </w:pPr>
-      <w:r>
-        <w:t>Validate its data before it can be completed</w:t>
-      </w:r>
-    </w:p>
-    <w:p>
-      <w:r>
-        <w:t>Creating a separate subclass for every combination of these behaviours would quickly become unmanageable.</w:t>
+        <w:t>For example, a work item may need to</w:t>
+      </w:r>
+      <w:r>
+        <w:t xml:space="preserve"> be </w:t>
+      </w:r>
+      <w:r>
+        <w:t>treated as urgent (priority handling)</w:t>
+      </w:r>
+      <w:r>
+        <w:t>.</w:t>
+      </w:r>
+    </w:p>
+    <w:p>
+      <w:r>
+        <w:t xml:space="preserve">Creating a separate </w:t>
+      </w:r>
+      <w:proofErr w:type="spellStart"/>
+      <w:r>
+        <w:t>WorkItem</w:t>
+      </w:r>
+      <w:proofErr w:type="spellEnd"/>
+      <w:r>
+        <w:t xml:space="preserve"> subclass only to represent priority would unnecessarily increase the number of classes.</w:t>
       </w:r>
     </w:p>
     <w:p>
@@ -4345,19 +5043,32 @@
       </w:r>
     </w:p>
     <w:p>
+      <w:proofErr w:type="spellStart"/>
       <w:r>
         <w:t>WorkflowComponent</w:t>
       </w:r>
-    </w:p>
-    <w:p>
+      <w:proofErr w:type="spellEnd"/>
+    </w:p>
+    <w:p>
+      <w:proofErr w:type="spellStart"/>
       <w:r>
         <w:t>WorkItem</w:t>
       </w:r>
-    </w:p>
-    <w:p>
+      <w:proofErr w:type="spellEnd"/>
+    </w:p>
+    <w:p>
+      <w:proofErr w:type="spellStart"/>
       <w:r>
         <w:t>WorkItemDecorator</w:t>
       </w:r>
+      <w:proofErr w:type="spellEnd"/>
+    </w:p>
+    <w:p>
+      <w:proofErr w:type="spellStart"/>
+      <w:r>
+        <w:t>PriorityDecorator</w:t>
+      </w:r>
+      <w:proofErr w:type="spellEnd"/>
     </w:p>
     <w:p>
       <w:pPr>
@@ -4376,7 +5087,42 @@
     </w:p>
     <w:p>
       <w:r>
-        <w:t>A WorkItemDecorator holds a WorkflowComponent and implements the same interface. It adds its own behaviour before or after passing the request to the wrapped component. Decorators can be stacked, so one work item may be wrapped by priority, audit and notification behaviour at the same time.</w:t>
+        <w:t xml:space="preserve">A </w:t>
+      </w:r>
+      <w:proofErr w:type="spellStart"/>
+      <w:r>
+        <w:t>WorkItemDecorator</w:t>
+      </w:r>
+      <w:proofErr w:type="spellEnd"/>
+      <w:r>
+        <w:t xml:space="preserve"> holds a </w:t>
+      </w:r>
+      <w:proofErr w:type="spellStart"/>
+      <w:r>
+        <w:t>WorkflowComponent</w:t>
+      </w:r>
+      <w:proofErr w:type="spellEnd"/>
+      <w:r>
+        <w:t xml:space="preserve"> and implements the same interface. It adds its own behaviour before or after passing the request to the wrapped component. </w:t>
+      </w:r>
+      <w:r>
+        <w:t xml:space="preserve">A </w:t>
+      </w:r>
+      <w:proofErr w:type="spellStart"/>
+      <w:r>
+        <w:t>PriorityDecorator</w:t>
+      </w:r>
+      <w:proofErr w:type="spellEnd"/>
+      <w:r>
+        <w:t xml:space="preserve"> wraps a work item and adds priority behaviour without changing the original </w:t>
+      </w:r>
+      <w:proofErr w:type="spellStart"/>
+      <w:r>
+        <w:t>WorkItem</w:t>
+      </w:r>
+      <w:proofErr w:type="spellEnd"/>
+      <w:r>
+        <w:t xml:space="preserve"> class.</w:t>
       </w:r>
     </w:p>
     <w:p>
@@ -4396,7 +5142,7 @@
     </w:p>
     <w:p>
       <w:r>
-        <w:t>Which extra behaviours are attached to which work items, and in what combination.</w:t>
+        <w:t>Which work items require priority behaviour.</w:t>
       </w:r>
     </w:p>
     <w:p>
@@ -4416,7 +5162,15 @@
     </w:p>
     <w:p>
       <w:r>
-        <w:t>Decorator lets behaviour be added to a work item without changing the WorkItem class or creating a new task type for every combination.</w:t>
+        <w:t xml:space="preserve">Decorator allows priority behaviour to be added to a work item without changing the </w:t>
+      </w:r>
+      <w:proofErr w:type="spellStart"/>
+      <w:r>
+        <w:t>WorkItem</w:t>
+      </w:r>
+      <w:proofErr w:type="spellEnd"/>
+      <w:r>
+        <w:t xml:space="preserve"> class or creating a separate priority-specific work item class.</w:t>
       </w:r>
     </w:p>
     <w:p>
@@ -4436,7 +5190,23 @@
     </w:p>
     <w:p>
       <w:r>
-        <w:t>In the complaint scenario, a complaint that affects an upcoming exam may need priority handling, while a finance complaint may need extra auditing. Which behaviours apply depends on the workflow definition, so they are attached as wrappers on the work item and not coded into it. Priority handling lives here and not in Strategy, because it adds behaviour to a work item and does not choose a participant.</w:t>
+        <w:t xml:space="preserve">In the complaint scenario, a complaint that affects an upcoming exam may need priority handling. Rather than creating a special type of </w:t>
+      </w:r>
+      <w:proofErr w:type="spellStart"/>
+      <w:r>
+        <w:t>WorkItem</w:t>
+      </w:r>
+      <w:proofErr w:type="spellEnd"/>
+      <w:r>
+        <w:t xml:space="preserve">, </w:t>
+      </w:r>
+      <w:proofErr w:type="spellStart"/>
+      <w:r>
+        <w:t>PriorityDecorator</w:t>
+      </w:r>
+      <w:proofErr w:type="spellEnd"/>
+      <w:r>
+        <w:t xml:space="preserve"> can add priority behaviour to the existing work item. Priority handling belongs here rather than in Strategy because it adds behaviour to a work item instead of deciding who receives it.</w:t>
       </w:r>
     </w:p>
     <w:p>
@@ -4455,8 +5225,45 @@
       </w:r>
     </w:p>
     <w:p>
-      <w:r>
-        <w:t>Decorators use the same WorkflowComponent interface as Composite, so a whole WorkflowStage can be decorated as well as a single WorkItem. AuditDecorator works alongside Command and Observer to keep the history complete, PriorityDecorator exposes a priority that AssignmentStrategy can read, and the Builder applies decorators when it constructs the WorkflowDefinition.</w:t>
+      <w:proofErr w:type="spellStart"/>
+      <w:r>
+        <w:t>PriorityDecorator</w:t>
+      </w:r>
+      <w:proofErr w:type="spellEnd"/>
+      <w:r>
+        <w:t xml:space="preserve"> uses the same </w:t>
+      </w:r>
+      <w:proofErr w:type="spellStart"/>
+      <w:r>
+        <w:t>WorkflowComponent</w:t>
+      </w:r>
+      <w:proofErr w:type="spellEnd"/>
+      <w:r>
+        <w:t xml:space="preserve"> interface as the wrapped </w:t>
+      </w:r>
+      <w:proofErr w:type="spellStart"/>
+      <w:r>
+        <w:t>WorkItem</w:t>
+      </w:r>
+      <w:proofErr w:type="spellEnd"/>
+      <w:r>
+        <w:t xml:space="preserve">. It exposes priority information that the </w:t>
+      </w:r>
+      <w:proofErr w:type="spellStart"/>
+      <w:r>
+        <w:t>AssignmentStrategy</w:t>
+      </w:r>
+      <w:proofErr w:type="spellEnd"/>
+      <w:r>
+        <w:t xml:space="preserve"> can consider when selecting a participant, and the Builder can apply the decorator when constructing the </w:t>
+      </w:r>
+      <w:proofErr w:type="spellStart"/>
+      <w:r>
+        <w:t>WorkflowDefinition</w:t>
+      </w:r>
+      <w:proofErr w:type="spellEnd"/>
+      <w:r>
+        <w:t>.</w:t>
       </w:r>
     </w:p>
     <w:p>
@@ -4480,37 +5287,930 @@
     </w:p>
     <w:p>
       <w:r>
-        <w:t>The patterns above form one connected engine and not eleven separate demonstrations.</w:t>
-      </w:r>
-    </w:p>
-    <w:p>
-      <w:r>
-        <w:t>The Builder assembles a WorkflowDefinition containing a Composite structure of work, an AssignmentStrategy, an escalation Chain of Responsibility and any Decorators. When a workflow is run, the definition is used to create an independent WorkflowInstance whose WorkItems are each governed by the State pattern.</w:t>
+        <w:t xml:space="preserve">The patterns above form one connected engine rather than eleven separate demonstrations. The Builder assembles a </w:t>
+      </w:r>
+      <w:proofErr w:type="spellStart"/>
+      <w:r>
+        <w:t>WorkflowDefinition</w:t>
+      </w:r>
+      <w:proofErr w:type="spellEnd"/>
+      <w:r>
+        <w:t xml:space="preserve"> containing a Composite structure of work, an </w:t>
+      </w:r>
+      <w:proofErr w:type="spellStart"/>
+      <w:r>
+        <w:t>AssignmentStrategy</w:t>
+      </w:r>
+      <w:proofErr w:type="spellEnd"/>
+      <w:r>
+        <w:t xml:space="preserve">, </w:t>
+      </w:r>
+      <w:r>
+        <w:t xml:space="preserve">an escalation Chain of Responsibility and a </w:t>
+      </w:r>
+      <w:proofErr w:type="spellStart"/>
+      <w:r>
+        <w:t>PriorityDecorator</w:t>
+      </w:r>
+      <w:proofErr w:type="spellEnd"/>
+      <w:r>
+        <w:t xml:space="preserve"> where required</w:t>
+      </w:r>
+      <w:r>
+        <w:t xml:space="preserve">. When a workflow is run, the definition is used to create an independent </w:t>
+      </w:r>
+      <w:proofErr w:type="spellStart"/>
+      <w:r>
+        <w:t>WorkflowInstance</w:t>
+      </w:r>
+      <w:proofErr w:type="spellEnd"/>
+      <w:r>
+        <w:t>, which is governed by the State pattern.</w:t>
+      </w:r>
+    </w:p>
+    <w:p>
+      <w:r>
+        <w:t xml:space="preserve">Every action on a running instance is represented as a Command. Before a reversible action, the Command can create a Memento, and execution may change the state of the </w:t>
+      </w:r>
+      <w:proofErr w:type="spellStart"/>
+      <w:r>
+        <w:t>WorkflowInstance</w:t>
+      </w:r>
+      <w:proofErr w:type="spellEnd"/>
+      <w:r>
+        <w:t xml:space="preserve">. State changes can notify Observers such as the history recorder, notification system and next-work-item activator. When routing is needed, the </w:t>
+      </w:r>
+      <w:proofErr w:type="spellStart"/>
+      <w:r>
+        <w:t>AssignmentStrategy</w:t>
+      </w:r>
+      <w:proofErr w:type="spellEnd"/>
+      <w:r>
+        <w:t xml:space="preserve"> is used, and when escalation is needed, the Chain of Responsibility is used. External communication is handled through the Adapter pattern, while the </w:t>
+      </w:r>
+      <w:proofErr w:type="spellStart"/>
+      <w:r>
+        <w:t>TIVIDYFacade</w:t>
+      </w:r>
+      <w:proofErr w:type="spellEnd"/>
+      <w:r>
+        <w:t xml:space="preserve"> provides the main interface to the system.</w:t>
       </w:r>
     </w:p>
     <w:p>
       <w:r>
         <w:lastRenderedPageBreak/>
-        <w:t>Every action on a running instance is a Command. Before a reversible action the Command takes a Memento, and on execution it changes the State of the work item, which notifies Observers: the history recorder, the notification system, the next-work-item activator and the EmailAdapter. When routing is needed the AssignmentStrategy is used, when escalation is needed the Chain of Responsibility is used, and all of it sits behind the TIVIDYFacade, which is the only interface the scenario layer sees.</w:t>
-      </w:r>
-    </w:p>
-    <w:p>
-      <w:r>
-        <w:t>In short: Builder constructs, Composite structures, State governs, Strategy routes, Decorator adds behaviour, Observer reacts, Command records, Memento restores, Adapter integrates, Chain of Responsibility escalates and Facade unifies.</w:t>
-      </w:r>
-    </w:p>
-    <w:p>
-      <w:pPr>
-        <w:rPr>
-          <w:b/>
-          <w:bCs/>
-          <w:sz w:val="22"/>
-          <w:szCs w:val="22"/>
-        </w:rPr>
-      </w:pPr>
-    </w:p>
+        <w:t>In short: Builder constructs, Composite structures, State governs, Strategy routes, Decorator adds behaviour, Observer reacts, Command performs actions, Memento restores, Adapter integrates, Chain of Responsibility escalates and Facade unifies.</w:t>
+      </w:r>
+    </w:p>
+    <w:p>
+      <w:pPr>
+        <w:pStyle w:val="Heading1"/>
+        <w:rPr>
+          <w:color w:val="0070C0"/>
+        </w:rPr>
+      </w:pPr>
+      <w:r>
+        <w:rPr>
+          <w:color w:val="0070C0"/>
+        </w:rPr>
+        <w:t xml:space="preserve">TASK </w:t>
+      </w:r>
+      <w:r>
+        <w:rPr>
+          <w:color w:val="0070C0"/>
+        </w:rPr>
+        <w:t>6:</w:t>
+      </w:r>
+    </w:p>
+    <w:p/>
+    <w:p>
+      <w:r>
+        <w:rPr>
+          <w:noProof/>
+        </w:rPr>
+        <w:drawing>
+          <wp:inline distT="0" distB="0" distL="0" distR="0" wp14:anchorId="70D25404" wp14:editId="4FEE1EA1">
+            <wp:extent cx="5731510" cy="3020695"/>
+            <wp:effectExtent l="0" t="0" r="2540" b="8255"/>
+            <wp:docPr id="962002448" name="Picture 1"/>
+            <wp:cNvGraphicFramePr>
+              <a:graphicFrameLocks xmlns:a="http://schemas.openxmlformats.org/drawingml/2006/main" noChangeAspect="1"/>
+            </wp:cNvGraphicFramePr>
+            <a:graphic xmlns:a="http://schemas.openxmlformats.org/drawingml/2006/main">
+              <a:graphicData uri="http://schemas.openxmlformats.org/drawingml/2006/picture">
+                <pic:pic xmlns:pic="http://schemas.openxmlformats.org/drawingml/2006/picture">
+                  <pic:nvPicPr>
+                    <pic:cNvPr id="962002448" name=""/>
+                    <pic:cNvPicPr/>
+                  </pic:nvPicPr>
+                  <pic:blipFill>
+                    <a:blip r:embed="rId9"/>
+                    <a:stretch>
+                      <a:fillRect/>
+                    </a:stretch>
+                  </pic:blipFill>
+                  <pic:spPr>
+                    <a:xfrm>
+                      <a:off x="0" y="0"/>
+                      <a:ext cx="5731510" cy="3020695"/>
+                    </a:xfrm>
+                    <a:prstGeom prst="rect">
+                      <a:avLst/>
+                    </a:prstGeom>
+                  </pic:spPr>
+                </pic:pic>
+              </a:graphicData>
+            </a:graphic>
+          </wp:inline>
+        </w:drawing>
+      </w:r>
+    </w:p>
+    <w:p>
+      <w:pPr>
+        <w:rPr>
+          <w:sz w:val="28"/>
+          <w:szCs w:val="28"/>
+        </w:rPr>
+      </w:pPr>
+      <w:r>
+        <w:rPr>
+          <w:b/>
+          <w:bCs/>
+          <w:sz w:val="28"/>
+          <w:szCs w:val="28"/>
+        </w:rPr>
+        <w:t>Sequence Diagram: Completing a Work Item and Determining What Happens Next</w:t>
+      </w:r>
+    </w:p>
+    <w:p>
+      <w:pPr>
+        <w:jc w:val="both"/>
+        <w:rPr>
+          <w:sz w:val="24"/>
+          <w:szCs w:val="24"/>
+        </w:rPr>
+      </w:pPr>
+      <w:r>
+        <w:rPr>
+          <w:sz w:val="24"/>
+          <w:szCs w:val="24"/>
+        </w:rPr>
+        <w:t xml:space="preserve">This sequence diagram illustrates how TIVIDY processes the completion of a </w:t>
+      </w:r>
+      <w:proofErr w:type="spellStart"/>
+      <w:r>
+        <w:rPr>
+          <w:sz w:val="24"/>
+          <w:szCs w:val="24"/>
+        </w:rPr>
+        <w:t>WorkItem</w:t>
+      </w:r>
+      <w:proofErr w:type="spellEnd"/>
+      <w:r>
+        <w:rPr>
+          <w:sz w:val="24"/>
+          <w:szCs w:val="24"/>
+        </w:rPr>
+        <w:t xml:space="preserve"> and determines what happens next in the workflow. A staff member completes the work item through the </w:t>
+      </w:r>
+      <w:proofErr w:type="spellStart"/>
+      <w:r>
+        <w:rPr>
+          <w:sz w:val="24"/>
+          <w:szCs w:val="24"/>
+        </w:rPr>
+        <w:t>TIVIDYFacade</w:t>
+      </w:r>
+      <w:proofErr w:type="spellEnd"/>
+      <w:r>
+        <w:rPr>
+          <w:sz w:val="24"/>
+          <w:szCs w:val="24"/>
+        </w:rPr>
+        <w:t xml:space="preserve">, which creates and executes a </w:t>
+      </w:r>
+      <w:proofErr w:type="spellStart"/>
+      <w:r>
+        <w:rPr>
+          <w:sz w:val="24"/>
+          <w:szCs w:val="24"/>
+        </w:rPr>
+        <w:t>CompleteWorkCommand</w:t>
+      </w:r>
+      <w:proofErr w:type="spellEnd"/>
+      <w:r>
+        <w:rPr>
+          <w:sz w:val="24"/>
+          <w:szCs w:val="24"/>
+        </w:rPr>
+        <w:t xml:space="preserve">. The command completes the </w:t>
+      </w:r>
+      <w:proofErr w:type="spellStart"/>
+      <w:r>
+        <w:rPr>
+          <w:sz w:val="24"/>
+          <w:szCs w:val="24"/>
+        </w:rPr>
+        <w:t>WorkItem</w:t>
+      </w:r>
+      <w:proofErr w:type="spellEnd"/>
+      <w:r>
+        <w:rPr>
+          <w:sz w:val="24"/>
+          <w:szCs w:val="24"/>
+        </w:rPr>
+        <w:t xml:space="preserve"> and then notifies the </w:t>
+      </w:r>
+      <w:proofErr w:type="spellStart"/>
+      <w:r>
+        <w:rPr>
+          <w:sz w:val="24"/>
+          <w:szCs w:val="24"/>
+        </w:rPr>
+        <w:t>WorkflowInstance</w:t>
+      </w:r>
+      <w:proofErr w:type="spellEnd"/>
+      <w:r>
+        <w:rPr>
+          <w:sz w:val="24"/>
+          <w:szCs w:val="24"/>
+        </w:rPr>
+        <w:t xml:space="preserve"> that the work item has been completed. The </w:t>
+      </w:r>
+      <w:proofErr w:type="spellStart"/>
+      <w:r>
+        <w:rPr>
+          <w:sz w:val="24"/>
+          <w:szCs w:val="24"/>
+        </w:rPr>
+        <w:t>WorkflowInstance</w:t>
+      </w:r>
+      <w:proofErr w:type="spellEnd"/>
+      <w:r>
+        <w:rPr>
+          <w:sz w:val="24"/>
+          <w:szCs w:val="24"/>
+        </w:rPr>
+        <w:t xml:space="preserve"> consults the </w:t>
+      </w:r>
+      <w:proofErr w:type="spellStart"/>
+      <w:r>
+        <w:rPr>
+          <w:sz w:val="24"/>
+          <w:szCs w:val="24"/>
+        </w:rPr>
+        <w:t>WorkflowDefinition</w:t>
+      </w:r>
+      <w:proofErr w:type="spellEnd"/>
+      <w:r>
+        <w:rPr>
+          <w:sz w:val="24"/>
+          <w:szCs w:val="24"/>
+        </w:rPr>
+        <w:t xml:space="preserve"> to determine the next work item and checks whether its dependencies have been satisfied. If the dependencies are satisfied, the next work item is made available and the </w:t>
+      </w:r>
+      <w:proofErr w:type="spellStart"/>
+      <w:r>
+        <w:rPr>
+          <w:sz w:val="24"/>
+          <w:szCs w:val="24"/>
+        </w:rPr>
+        <w:t>AssignmentStrategy</w:t>
+      </w:r>
+      <w:proofErr w:type="spellEnd"/>
+      <w:r>
+        <w:rPr>
+          <w:sz w:val="24"/>
+          <w:szCs w:val="24"/>
+        </w:rPr>
+        <w:t xml:space="preserve"> selects an appropriate participant. The </w:t>
+      </w:r>
+      <w:proofErr w:type="spellStart"/>
+      <w:r>
+        <w:rPr>
+          <w:sz w:val="24"/>
+          <w:szCs w:val="24"/>
+        </w:rPr>
+        <w:t>NotificationObserver</w:t>
+      </w:r>
+      <w:proofErr w:type="spellEnd"/>
+      <w:r>
+        <w:rPr>
+          <w:sz w:val="24"/>
+          <w:szCs w:val="24"/>
+        </w:rPr>
+        <w:t xml:space="preserve"> is then notified of the assignment. If the dependencies are not satisfied, the workflow remains waiting and the event is recorded. This demonstrates the collaboration between the </w:t>
+      </w:r>
+      <w:r>
+        <w:rPr>
+          <w:b/>
+          <w:bCs/>
+          <w:sz w:val="24"/>
+          <w:szCs w:val="24"/>
+        </w:rPr>
+        <w:t>Command, Strategy, and Observer patterns</w:t>
+      </w:r>
+      <w:r>
+        <w:rPr>
+          <w:sz w:val="24"/>
+          <w:szCs w:val="24"/>
+        </w:rPr>
+        <w:t xml:space="preserve"> within TIVIDY's workflow execution process.</w:t>
+      </w:r>
+    </w:p>
+    <w:p>
+      <w:pPr>
+        <w:rPr>
+          <w:sz w:val="28"/>
+          <w:szCs w:val="28"/>
+        </w:rPr>
+        <w:sectPr>
+          <w:pgSz w:w="11906" w:h="16838"/>
+          <w:pgMar w:top="1440" w:right="1440" w:bottom="1440" w:left="1440" w:header="708" w:footer="708" w:gutter="0"/>
+          <w:cols w:space="708"/>
+          <w:docGrid w:linePitch="360"/>
+        </w:sectPr>
+      </w:pPr>
+    </w:p>
+    <w:p>
+      <w:pPr>
+        <w:keepNext/>
+      </w:pPr>
+      <w:r>
+        <w:rPr>
+          <w:b/>
+          <w:bCs/>
+          <w:sz w:val="28"/>
+          <w:szCs w:val="28"/>
+        </w:rPr>
+        <w:lastRenderedPageBreak/>
+        <w:t>Sequence Diagram: Escalating a Complaint</w:t>
+      </w:r>
+    </w:p>
+    <w:p>
+      <w:pPr>
+        <w:keepNext/>
+      </w:pPr>
+      <w:r>
+        <w:rPr>
+          <w:noProof/>
+        </w:rPr>
+        <w:drawing>
+          <wp:inline distT="0" distB="0" distL="0" distR="0" wp14:anchorId="7D19E605" wp14:editId="659A3E5B">
+            <wp:extent cx="7200000" cy="3415863"/>
+            <wp:effectExtent l="0" t="0" r="0" b="0"/>
+            <wp:docPr id="962002449" name="Picture 3" descr="Sequence diagram: escalating a complaint in TIVIDY"/>
+            <wp:cNvGraphicFramePr>
+              <a:graphicFrameLocks xmlns:a="http://schemas.openxmlformats.org/drawingml/2006/main" noChangeAspect="1"/>
+            </wp:cNvGraphicFramePr>
+            <a:graphic xmlns:a="http://schemas.openxmlformats.org/drawingml/2006/main">
+              <a:graphicData uri="http://schemas.openxmlformats.org/drawingml/2006/picture">
+                <pic:pic xmlns:pic="http://schemas.openxmlformats.org/drawingml/2006/picture">
+                  <pic:nvPicPr>
+                    <pic:cNvPr id="962002449" name="image3.png"/>
+                    <pic:cNvPicPr/>
+                  </pic:nvPicPr>
+                  <pic:blipFill>
+                    <a:blip r:embed="rId10"/>
+                    <a:stretch>
+                      <a:fillRect/>
+                    </a:stretch>
+                  </pic:blipFill>
+                  <pic:spPr>
+                    <a:xfrm>
+                      <a:off x="0" y="0"/>
+                      <a:ext cx="7200000" cy="3415863"/>
+                    </a:xfrm>
+                    <a:prstGeom prst="rect">
+                      <a:avLst/>
+                    </a:prstGeom>
+                  </pic:spPr>
+                </pic:pic>
+              </a:graphicData>
+            </a:graphic>
+          </wp:inline>
+        </w:drawing>
+      </w:r>
+    </w:p>
+    <w:p>
+      <w:pPr>
+        <w:jc w:val="both"/>
+        <w:rPr>
+          <w:sz w:val="24"/>
+          <w:szCs w:val="24"/>
+        </w:rPr>
+        <w:sectPr>
+          <w:pgSz w:w="16838" w:h="11906" w:orient="landscape"/>
+          <w:pgMar w:top="900" w:right="1440" w:bottom="900" w:left="1440" w:header="708" w:footer="708" w:gutter="0"/>
+          <w:cols w:space="708"/>
+          <w:docGrid w:linePitch="360"/>
+        </w:sectPr>
+      </w:pPr>
+      <w:r>
+        <w:rPr>
+          <w:sz w:val="24"/>
+          <w:szCs w:val="24"/>
+        </w:rPr>
+        <w:t xml:space="preserve">This sequence diagram illustrates how TIVIDY processes the escalation of a complaint that cannot be resolved at the current level. A staff member calls </w:t>
+      </w:r>
+      <w:proofErr w:type="spellStart"/>
+      <w:proofErr w:type="gramStart"/>
+      <w:r>
+        <w:rPr>
+          <w:sz w:val="24"/>
+          <w:szCs w:val="24"/>
+        </w:rPr>
+        <w:t>escalateWork</w:t>
+      </w:r>
+      <w:proofErr w:type="spellEnd"/>
+      <w:r>
+        <w:rPr>
+          <w:sz w:val="24"/>
+          <w:szCs w:val="24"/>
+        </w:rPr>
+        <w:t>(</w:t>
+      </w:r>
+      <w:proofErr w:type="gramEnd"/>
+      <w:r>
+        <w:rPr>
+          <w:sz w:val="24"/>
+          <w:szCs w:val="24"/>
+        </w:rPr>
+        <w:t xml:space="preserve">) on the </w:t>
+      </w:r>
+      <w:proofErr w:type="spellStart"/>
+      <w:r>
+        <w:rPr>
+          <w:sz w:val="24"/>
+          <w:szCs w:val="24"/>
+        </w:rPr>
+        <w:t>TIVIDYFacade</w:t>
+      </w:r>
+      <w:proofErr w:type="spellEnd"/>
+      <w:r>
+        <w:rPr>
+          <w:sz w:val="24"/>
+          <w:szCs w:val="24"/>
+        </w:rPr>
+        <w:t xml:space="preserve">, which creates and executes an </w:t>
+      </w:r>
+      <w:proofErr w:type="spellStart"/>
+      <w:r>
+        <w:rPr>
+          <w:sz w:val="24"/>
+          <w:szCs w:val="24"/>
+        </w:rPr>
+        <w:t>EscalateWorkCommand</w:t>
+      </w:r>
+      <w:proofErr w:type="spellEnd"/>
+      <w:r>
+        <w:rPr>
+          <w:sz w:val="24"/>
+          <w:szCs w:val="24"/>
+        </w:rPr>
+        <w:t xml:space="preserve">. Before anything changes, the command asks the </w:t>
+      </w:r>
+      <w:proofErr w:type="spellStart"/>
+      <w:r>
+        <w:rPr>
+          <w:sz w:val="24"/>
+          <w:szCs w:val="24"/>
+        </w:rPr>
+        <w:t>WorkflowInstance</w:t>
+      </w:r>
+      <w:proofErr w:type="spellEnd"/>
+      <w:r>
+        <w:rPr>
+          <w:sz w:val="24"/>
+          <w:szCs w:val="24"/>
+        </w:rPr>
+        <w:t xml:space="preserve"> for a </w:t>
+      </w:r>
+      <w:proofErr w:type="spellStart"/>
+      <w:r>
+        <w:rPr>
+          <w:sz w:val="24"/>
+          <w:szCs w:val="24"/>
+        </w:rPr>
+        <w:t>WorkflowMemento</w:t>
+      </w:r>
+      <w:proofErr w:type="spellEnd"/>
+      <w:r>
+        <w:rPr>
+          <w:sz w:val="24"/>
+          <w:szCs w:val="24"/>
+        </w:rPr>
+        <w:t xml:space="preserve"> and stores it in the </w:t>
+      </w:r>
+      <w:proofErr w:type="spellStart"/>
+      <w:r>
+        <w:rPr>
+          <w:sz w:val="24"/>
+          <w:szCs w:val="24"/>
+        </w:rPr>
+        <w:t>WorkflowHistory</w:t>
+      </w:r>
+      <w:proofErr w:type="spellEnd"/>
+      <w:r>
+        <w:rPr>
+          <w:sz w:val="24"/>
+          <w:szCs w:val="24"/>
+        </w:rPr>
+        <w:t xml:space="preserve"> so the escalation can be undone. The command then asks the </w:t>
+      </w:r>
+      <w:proofErr w:type="spellStart"/>
+      <w:r>
+        <w:rPr>
+          <w:sz w:val="24"/>
+          <w:szCs w:val="24"/>
+        </w:rPr>
+        <w:t>WorkflowInstance</w:t>
+      </w:r>
+      <w:proofErr w:type="spellEnd"/>
+      <w:r>
+        <w:rPr>
+          <w:sz w:val="24"/>
+          <w:szCs w:val="24"/>
+        </w:rPr>
+        <w:t xml:space="preserve"> to escalate, and the </w:t>
+      </w:r>
+      <w:proofErr w:type="spellStart"/>
+      <w:r>
+        <w:rPr>
+          <w:sz w:val="24"/>
+          <w:szCs w:val="24"/>
+        </w:rPr>
+        <w:t>InProgressState</w:t>
+      </w:r>
+      <w:proofErr w:type="spellEnd"/>
+      <w:r>
+        <w:rPr>
+          <w:sz w:val="24"/>
+          <w:szCs w:val="24"/>
+        </w:rPr>
+        <w:t xml:space="preserve"> replaces itself with an </w:t>
+      </w:r>
+      <w:proofErr w:type="spellStart"/>
+      <w:r>
+        <w:rPr>
+          <w:sz w:val="24"/>
+          <w:szCs w:val="24"/>
+        </w:rPr>
+        <w:t>EscalatedState</w:t>
+      </w:r>
+      <w:proofErr w:type="spellEnd"/>
+      <w:r>
+        <w:rPr>
+          <w:sz w:val="24"/>
+          <w:szCs w:val="24"/>
+        </w:rPr>
+        <w:t xml:space="preserve">. Entering the </w:t>
+      </w:r>
+      <w:proofErr w:type="spellStart"/>
+      <w:r>
+        <w:rPr>
+          <w:sz w:val="24"/>
+          <w:szCs w:val="24"/>
+        </w:rPr>
+        <w:t>EscalatedState</w:t>
+      </w:r>
+      <w:proofErr w:type="spellEnd"/>
+      <w:r>
+        <w:rPr>
+          <w:sz w:val="24"/>
+          <w:szCs w:val="24"/>
+        </w:rPr>
+        <w:t xml:space="preserve"> starts the escalation chain: the </w:t>
+      </w:r>
+      <w:proofErr w:type="spellStart"/>
+      <w:r>
+        <w:rPr>
+          <w:sz w:val="24"/>
+          <w:szCs w:val="24"/>
+        </w:rPr>
+        <w:t>CoordinatorHandler</w:t>
+      </w:r>
+      <w:proofErr w:type="spellEnd"/>
+      <w:r>
+        <w:rPr>
+          <w:sz w:val="24"/>
+          <w:szCs w:val="24"/>
+        </w:rPr>
+        <w:t xml:space="preserve"> cannot handle the request and passes it on, and the </w:t>
+      </w:r>
+      <w:proofErr w:type="spellStart"/>
+      <w:r>
+        <w:rPr>
+          <w:sz w:val="24"/>
+          <w:szCs w:val="24"/>
+        </w:rPr>
+        <w:t>DepartmentHeadHandler</w:t>
+      </w:r>
+      <w:proofErr w:type="spellEnd"/>
+      <w:r>
+        <w:rPr>
+          <w:sz w:val="24"/>
+          <w:szCs w:val="24"/>
+        </w:rPr>
+        <w:t xml:space="preserve"> accepts it, so the Department Head is assigned. The </w:t>
+      </w:r>
+      <w:proofErr w:type="spellStart"/>
+      <w:r>
+        <w:rPr>
+          <w:sz w:val="24"/>
+          <w:szCs w:val="24"/>
+        </w:rPr>
+        <w:t>WorkflowInstance</w:t>
+      </w:r>
+      <w:proofErr w:type="spellEnd"/>
+      <w:r>
+        <w:rPr>
+          <w:sz w:val="24"/>
+          <w:szCs w:val="24"/>
+        </w:rPr>
+        <w:t xml:space="preserve"> then notifies its observers: the </w:t>
+      </w:r>
+      <w:proofErr w:type="spellStart"/>
+      <w:r>
+        <w:rPr>
+          <w:sz w:val="24"/>
+          <w:szCs w:val="24"/>
+        </w:rPr>
+        <w:t>WorkflowHistory</w:t>
+      </w:r>
+      <w:proofErr w:type="spellEnd"/>
+      <w:r>
+        <w:rPr>
+          <w:sz w:val="24"/>
+          <w:szCs w:val="24"/>
+        </w:rPr>
+        <w:t xml:space="preserve"> records the change from In Progress to Escalated, and the </w:t>
+      </w:r>
+      <w:proofErr w:type="spellStart"/>
+      <w:r>
+        <w:rPr>
+          <w:sz w:val="24"/>
+          <w:szCs w:val="24"/>
+        </w:rPr>
+        <w:t>NotificationObserver</w:t>
+      </w:r>
+      <w:proofErr w:type="spellEnd"/>
+      <w:r>
+        <w:rPr>
+          <w:sz w:val="24"/>
+          <w:szCs w:val="24"/>
+        </w:rPr>
+        <w:t xml:space="preserve"> asks the </w:t>
+      </w:r>
+      <w:proofErr w:type="spellStart"/>
+      <w:r>
+        <w:rPr>
+          <w:sz w:val="24"/>
+          <w:szCs w:val="24"/>
+        </w:rPr>
+        <w:t>EmailAdapter</w:t>
+      </w:r>
+      <w:proofErr w:type="spellEnd"/>
+      <w:r>
+        <w:rPr>
+          <w:sz w:val="24"/>
+          <w:szCs w:val="24"/>
+        </w:rPr>
+        <w:t xml:space="preserve"> to email the Department Head through the </w:t>
+      </w:r>
+      <w:proofErr w:type="spellStart"/>
+      <w:r>
+        <w:rPr>
+          <w:sz w:val="24"/>
+          <w:szCs w:val="24"/>
+        </w:rPr>
+        <w:t>ExternalEmailService</w:t>
+      </w:r>
+      <w:proofErr w:type="spellEnd"/>
+      <w:r>
+        <w:rPr>
+          <w:sz w:val="24"/>
+          <w:szCs w:val="24"/>
+        </w:rPr>
+        <w:t xml:space="preserve">. If the email fails, the failure is recorded in the history and the escalation still stands. This demonstrates the collaboration between the </w:t>
+      </w:r>
+      <w:r>
+        <w:rPr>
+          <w:b/>
+          <w:bCs/>
+          <w:sz w:val="24"/>
+          <w:szCs w:val="24"/>
+        </w:rPr>
+        <w:t>Facade, Command, Memento, State, Chain of Responsibility, Observer and Adapter patterns</w:t>
+      </w:r>
+      <w:r>
+        <w:rPr>
+          <w:sz w:val="24"/>
+          <w:szCs w:val="24"/>
+        </w:rPr>
+        <w:t xml:space="preserve"> within TIVIDY.</w:t>
+      </w:r>
+    </w:p>
+    <w:p>
+      <w:pPr>
+        <w:rPr>
+          <w:sz w:val="28"/>
+          <w:szCs w:val="28"/>
+        </w:rPr>
+      </w:pPr>
+      <w:r>
+        <w:rPr>
+          <w:sz w:val="28"/>
+          <w:szCs w:val="28"/>
+        </w:rPr>
+        <w:lastRenderedPageBreak/>
+        <w:t xml:space="preserve">State diagram: </w:t>
+      </w:r>
+      <w:proofErr w:type="spellStart"/>
+      <w:r>
+        <w:rPr>
+          <w:sz w:val="28"/>
+          <w:szCs w:val="28"/>
+        </w:rPr>
+        <w:t>WorkItem</w:t>
+      </w:r>
+      <w:proofErr w:type="spellEnd"/>
+      <w:r>
+        <w:rPr>
+          <w:sz w:val="28"/>
+          <w:szCs w:val="28"/>
+        </w:rPr>
+        <w:t xml:space="preserve"> State Lifecycle</w:t>
+      </w:r>
+    </w:p>
+    <w:p>
+      <w:pPr>
+        <w:rPr>
+          <w:sz w:val="28"/>
+          <w:szCs w:val="28"/>
+        </w:rPr>
+      </w:pPr>
+      <w:r>
+        <w:rPr>
+          <w:noProof/>
+          <w:sz w:val="28"/>
+          <w:szCs w:val="28"/>
+        </w:rPr>
+        <w:drawing>
+          <wp:inline distT="0" distB="0" distL="0" distR="0" wp14:anchorId="695722AA" wp14:editId="4ED9CC64">
+            <wp:extent cx="5731510" cy="2834640"/>
+            <wp:effectExtent l="0" t="0" r="2540" b="3810"/>
+            <wp:docPr id="112777972" name="Picture 1"/>
+            <wp:cNvGraphicFramePr>
+              <a:graphicFrameLocks xmlns:a="http://schemas.openxmlformats.org/drawingml/2006/main" noChangeAspect="1"/>
+            </wp:cNvGraphicFramePr>
+            <a:graphic xmlns:a="http://schemas.openxmlformats.org/drawingml/2006/main">
+              <a:graphicData uri="http://schemas.openxmlformats.org/drawingml/2006/picture">
+                <pic:pic xmlns:pic="http://schemas.openxmlformats.org/drawingml/2006/picture">
+                  <pic:nvPicPr>
+                    <pic:cNvPr id="112777972" name=""/>
+                    <pic:cNvPicPr/>
+                  </pic:nvPicPr>
+                  <pic:blipFill>
+                    <a:blip r:embed="rId11"/>
+                    <a:stretch>
+                      <a:fillRect/>
+                    </a:stretch>
+                  </pic:blipFill>
+                  <pic:spPr>
+                    <a:xfrm>
+                      <a:off x="0" y="0"/>
+                      <a:ext cx="5731510" cy="2834640"/>
+                    </a:xfrm>
+                    <a:prstGeom prst="rect">
+                      <a:avLst/>
+                    </a:prstGeom>
+                  </pic:spPr>
+                </pic:pic>
+              </a:graphicData>
+            </a:graphic>
+          </wp:inline>
+        </w:drawing>
+      </w:r>
+    </w:p>
+    <w:p>
+      <w:pPr>
+        <w:jc w:val="both"/>
+        <w:rPr>
+          <w:sz w:val="24"/>
+          <w:szCs w:val="24"/>
+        </w:rPr>
+      </w:pPr>
+      <w:r>
+        <w:rPr>
+          <w:sz w:val="24"/>
+          <w:szCs w:val="24"/>
+        </w:rPr>
+        <w:t xml:space="preserve">This state diagram illustrates the lifecycle of a TIVIDY </w:t>
+      </w:r>
+      <w:proofErr w:type="spellStart"/>
+      <w:r>
+        <w:rPr>
+          <w:sz w:val="24"/>
+          <w:szCs w:val="24"/>
+        </w:rPr>
+        <w:t>WorkflowInstance</w:t>
+      </w:r>
+      <w:proofErr w:type="spellEnd"/>
+      <w:r>
+        <w:rPr>
+          <w:sz w:val="24"/>
+          <w:szCs w:val="24"/>
+        </w:rPr>
+        <w:t xml:space="preserve"> from submission to completion. A workflow progresses through the states </w:t>
+      </w:r>
+      <w:r>
+        <w:rPr>
+          <w:b/>
+          <w:bCs/>
+          <w:sz w:val="24"/>
+          <w:szCs w:val="24"/>
+        </w:rPr>
+        <w:t>Submitted, Active, and In Progress</w:t>
+      </w:r>
+      <w:r>
+        <w:rPr>
+          <w:sz w:val="24"/>
+          <w:szCs w:val="24"/>
+        </w:rPr>
+        <w:t xml:space="preserve"> as the case is processed. If the case cannot be handled at the current level, it enters the </w:t>
+      </w:r>
+      <w:r>
+        <w:rPr>
+          <w:b/>
+          <w:bCs/>
+          <w:sz w:val="24"/>
+          <w:szCs w:val="24"/>
+        </w:rPr>
+        <w:t>Escalated</w:t>
+      </w:r>
+      <w:r>
+        <w:rPr>
+          <w:sz w:val="24"/>
+          <w:szCs w:val="24"/>
+        </w:rPr>
+        <w:t xml:space="preserve"> state and returns to </w:t>
+      </w:r>
+      <w:r>
+        <w:rPr>
+          <w:b/>
+          <w:bCs/>
+          <w:sz w:val="24"/>
+          <w:szCs w:val="24"/>
+        </w:rPr>
+        <w:t>In Progress</w:t>
+      </w:r>
+      <w:r>
+        <w:rPr>
+          <w:sz w:val="24"/>
+          <w:szCs w:val="24"/>
+        </w:rPr>
+        <w:t xml:space="preserve"> when a handler accepts it. From In Progress, the workflow can either become </w:t>
+      </w:r>
+      <w:r>
+        <w:rPr>
+          <w:b/>
+          <w:bCs/>
+          <w:sz w:val="24"/>
+          <w:szCs w:val="24"/>
+        </w:rPr>
+        <w:t>Resolved</w:t>
+      </w:r>
+      <w:r>
+        <w:rPr>
+          <w:sz w:val="24"/>
+          <w:szCs w:val="24"/>
+        </w:rPr>
+        <w:t xml:space="preserve"> when the case is successfully completed or </w:t>
+      </w:r>
+      <w:proofErr w:type="gramStart"/>
+      <w:r>
+        <w:rPr>
+          <w:b/>
+          <w:bCs/>
+          <w:sz w:val="24"/>
+          <w:szCs w:val="24"/>
+        </w:rPr>
+        <w:t>Closed</w:t>
+      </w:r>
+      <w:proofErr w:type="gramEnd"/>
+      <w:r>
+        <w:rPr>
+          <w:sz w:val="24"/>
+          <w:szCs w:val="24"/>
+        </w:rPr>
+        <w:t xml:space="preserve"> when the workflow ends without resolution. Resolved and Closed represent the final states of the workflow.</w:t>
+      </w:r>
+    </w:p>
+    <w:p/>
     <w:sectPr>
-      <w:headerReference w:type="default" r:id="rId9"/>
+      <w:headerReference w:type="default" r:id="rId12"/>
       <w:pgSz w:w="11906" w:h="16838"/>
       <w:pgMar w:top="1440" w:right="1440" w:bottom="1440" w:left="1440" w:header="708" w:footer="708" w:gutter="0"/>
       <w:cols w:space="708"/>
@@ -8972,6 +10672,119 @@
     </w:lvl>
   </w:abstractNum>
   <w:abstractNum w:abstractNumId="35" w15:restartNumberingAfterBreak="0">
+    <w:nsid w:val="76D22E25"/>
+    <w:multiLevelType w:val="hybridMultilevel"/>
+    <w:tmpl w:val="09763A0E"/>
+    <w:lvl w:ilvl="0" w:tplc="1C090001">
+      <w:start w:val="1"/>
+      <w:numFmt w:val="bullet"/>
+      <w:lvlText w:val=""/>
+      <w:lvlJc w:val="left"/>
+      <w:pPr>
+        <w:ind w:left="720" w:hanging="360"/>
+      </w:pPr>
+      <w:rPr>
+        <w:rFonts w:ascii="Symbol" w:hAnsi="Symbol" w:hint="default"/>
+      </w:rPr>
+    </w:lvl>
+    <w:lvl w:ilvl="1" w:tplc="1C090003" w:tentative="1">
+      <w:start w:val="1"/>
+      <w:numFmt w:val="bullet"/>
+      <w:lvlText w:val="o"/>
+      <w:lvlJc w:val="left"/>
+      <w:pPr>
+        <w:ind w:left="1440" w:hanging="360"/>
+      </w:pPr>
+      <w:rPr>
+        <w:rFonts w:ascii="Courier New" w:hAnsi="Courier New" w:cs="Courier New" w:hint="default"/>
+      </w:rPr>
+    </w:lvl>
+    <w:lvl w:ilvl="2" w:tplc="1C090005" w:tentative="1">
+      <w:start w:val="1"/>
+      <w:numFmt w:val="bullet"/>
+      <w:lvlText w:val=""/>
+      <w:lvlJc w:val="left"/>
+      <w:pPr>
+        <w:ind w:left="2160" w:hanging="360"/>
+      </w:pPr>
+      <w:rPr>
+        <w:rFonts w:ascii="Wingdings" w:hAnsi="Wingdings" w:hint="default"/>
+      </w:rPr>
+    </w:lvl>
+    <w:lvl w:ilvl="3" w:tplc="1C090001" w:tentative="1">
+      <w:start w:val="1"/>
+      <w:numFmt w:val="bullet"/>
+      <w:lvlText w:val=""/>
+      <w:lvlJc w:val="left"/>
+      <w:pPr>
+        <w:ind w:left="2880" w:hanging="360"/>
+      </w:pPr>
+      <w:rPr>
+        <w:rFonts w:ascii="Symbol" w:hAnsi="Symbol" w:hint="default"/>
+      </w:rPr>
+    </w:lvl>
+    <w:lvl w:ilvl="4" w:tplc="1C090003" w:tentative="1">
+      <w:start w:val="1"/>
+      <w:numFmt w:val="bullet"/>
+      <w:lvlText w:val="o"/>
+      <w:lvlJc w:val="left"/>
+      <w:pPr>
+        <w:ind w:left="3600" w:hanging="360"/>
+      </w:pPr>
+      <w:rPr>
+        <w:rFonts w:ascii="Courier New" w:hAnsi="Courier New" w:cs="Courier New" w:hint="default"/>
+      </w:rPr>
+    </w:lvl>
+    <w:lvl w:ilvl="5" w:tplc="1C090005" w:tentative="1">
+      <w:start w:val="1"/>
+      <w:numFmt w:val="bullet"/>
+      <w:lvlText w:val=""/>
+      <w:lvlJc w:val="left"/>
+      <w:pPr>
+        <w:ind w:left="4320" w:hanging="360"/>
+      </w:pPr>
+      <w:rPr>
+        <w:rFonts w:ascii="Wingdings" w:hAnsi="Wingdings" w:hint="default"/>
+      </w:rPr>
+    </w:lvl>
+    <w:lvl w:ilvl="6" w:tplc="1C090001" w:tentative="1">
+      <w:start w:val="1"/>
+      <w:numFmt w:val="bullet"/>
+      <w:lvlText w:val=""/>
+      <w:lvlJc w:val="left"/>
+      <w:pPr>
+        <w:ind w:left="5040" w:hanging="360"/>
+      </w:pPr>
+      <w:rPr>
+        <w:rFonts w:ascii="Symbol" w:hAnsi="Symbol" w:hint="default"/>
+      </w:rPr>
+    </w:lvl>
+    <w:lvl w:ilvl="7" w:tplc="1C090003" w:tentative="1">
+      <w:start w:val="1"/>
+      <w:numFmt w:val="bullet"/>
+      <w:lvlText w:val="o"/>
+      <w:lvlJc w:val="left"/>
+      <w:pPr>
+        <w:ind w:left="5760" w:hanging="360"/>
+      </w:pPr>
+      <w:rPr>
+        <w:rFonts w:ascii="Courier New" w:hAnsi="Courier New" w:cs="Courier New" w:hint="default"/>
+      </w:rPr>
+    </w:lvl>
+    <w:lvl w:ilvl="8" w:tplc="1C090005" w:tentative="1">
+      <w:start w:val="1"/>
+      <w:numFmt w:val="bullet"/>
+      <w:lvlText w:val=""/>
+      <w:lvlJc w:val="left"/>
+      <w:pPr>
+        <w:ind w:left="6480" w:hanging="360"/>
+      </w:pPr>
+      <w:rPr>
+        <w:rFonts w:ascii="Wingdings" w:hAnsi="Wingdings" w:hint="default"/>
+      </w:rPr>
+    </w:lvl>
+  </w:abstractNum>
+  <w:abstractNum w:abstractNumId="36" w15:restartNumberingAfterBreak="0">
     <w:nsid w:val="780C3A60"/>
     <w:multiLevelType w:val="hybridMultilevel"/>
     <w:tmpl w:val="7D188D74"/>
@@ -9057,7 +10870,7 @@
       </w:pPr>
     </w:lvl>
   </w:abstractNum>
-  <w:abstractNum w:abstractNumId="36" w15:restartNumberingAfterBreak="0">
+  <w:abstractNum w:abstractNumId="37" w15:restartNumberingAfterBreak="0">
     <w:nsid w:val="78B349EF"/>
     <w:multiLevelType w:val="multilevel"/>
     <w:tmpl w:val="55C26242"/>
@@ -9206,7 +11019,7 @@
       </w:rPr>
     </w:lvl>
   </w:abstractNum>
-  <w:abstractNum w:abstractNumId="37" w15:restartNumberingAfterBreak="0">
+  <w:abstractNum w:abstractNumId="38" w15:restartNumberingAfterBreak="0">
     <w:nsid w:val="7B8D2FAB"/>
     <w:multiLevelType w:val="hybridMultilevel"/>
     <w:tmpl w:val="D05E61CC"/>
@@ -9356,7 +11169,7 @@
     <w:abstractNumId w:val="21"/>
   </w:num>
   <w:num w:numId="13" w16cid:durableId="1853764828">
-    <w:abstractNumId w:val="36"/>
+    <w:abstractNumId w:val="37"/>
   </w:num>
   <w:num w:numId="14" w16cid:durableId="879898953">
     <w:abstractNumId w:val="24"/>
@@ -9428,9 +11241,12 @@
     <w:abstractNumId w:val="26"/>
   </w:num>
   <w:num w:numId="37" w16cid:durableId="1183133334">
-    <w:abstractNumId w:val="37"/>
+    <w:abstractNumId w:val="38"/>
   </w:num>
   <w:num w:numId="38" w16cid:durableId="1454009777">
+    <w:abstractNumId w:val="36"/>
+  </w:num>
+  <w:num w:numId="39" w16cid:durableId="175771861">
     <w:abstractNumId w:val="35"/>
   </w:num>
 </w:numbering>
@@ -10046,6 +11862,7 @@
   <w:style w:type="character" w:default="1" w:styleId="DefaultParagraphFont">
     <w:name w:val="Default Paragraph Font"/>
     <w:uiPriority w:val="1"/>
+    <w:semiHidden/>
     <w:unhideWhenUsed/>
   </w:style>
   <w:style w:type="table" w:default="1" w:styleId="TableNormal">

</xml_diff>

<commit_message>
Task 3 activity diagrams added to pdf file
</commit_message>
<xml_diff>
--- a/docs/214 PDF document.docx
+++ b/docs/214 PDF document.docx
@@ -1594,6 +1594,85 @@
         <w:t>The workflow should also keep a history of the actions and state changes that occurred during the process.</w:t>
       </w:r>
     </w:p>
+    <w:p>
+      <w:pPr>
+        <w:pStyle w:val="Heading1"/>
+      </w:pPr>
+    </w:p>
+    <w:p>
+      <w:pPr>
+        <w:pStyle w:val="Heading1"/>
+        <w:rPr>
+          <w:color w:val="0070C0"/>
+        </w:rPr>
+      </w:pPr>
+      <w:r>
+        <w:rPr>
+          <w:color w:val="0070C0"/>
+        </w:rPr>
+        <w:t xml:space="preserve">TASK </w:t>
+      </w:r>
+      <w:r>
+        <w:rPr>
+          <w:color w:val="0070C0"/>
+        </w:rPr>
+        <w:t>3</w:t>
+      </w:r>
+    </w:p>
+    <w:p/>
+    <w:p>
+      <w:r>
+        <w:t xml:space="preserve">Activity Diagram 1 </w:t>
+      </w:r>
+    </w:p>
+    <w:p>
+      <w:r>
+        <w:rPr>
+          <w:noProof/>
+        </w:rPr>
+        <w:drawing>
+          <wp:inline distT="0" distB="0" distL="0" distR="0" wp14:anchorId="15CF4E4B" wp14:editId="4125694F">
+            <wp:extent cx="5731510" cy="2695575"/>
+            <wp:effectExtent l="0" t="0" r="2540" b="9525"/>
+            <wp:docPr id="1936357113" name="Picture 2"/>
+            <wp:cNvGraphicFramePr>
+              <a:graphicFrameLocks xmlns:a="http://schemas.openxmlformats.org/drawingml/2006/main" noChangeAspect="1"/>
+            </wp:cNvGraphicFramePr>
+            <a:graphic xmlns:a="http://schemas.openxmlformats.org/drawingml/2006/main">
+              <a:graphicData uri="http://schemas.openxmlformats.org/drawingml/2006/picture">
+                <pic:pic xmlns:pic="http://schemas.openxmlformats.org/drawingml/2006/picture">
+                  <pic:nvPicPr>
+                    <pic:cNvPr id="1936357113" name="Picture 1936357113"/>
+                    <pic:cNvPicPr/>
+                  </pic:nvPicPr>
+                  <pic:blipFill>
+                    <a:blip r:embed="rId9" cstate="print">
+                      <a:extLst>
+                        <a:ext uri="{28A0092B-C50C-407E-A947-70E740481C1C}">
+                          <a14:useLocalDpi xmlns:a14="http://schemas.microsoft.com/office/drawing/2010/main" val="0"/>
+                        </a:ext>
+                      </a:extLst>
+                    </a:blip>
+                    <a:stretch>
+                      <a:fillRect/>
+                    </a:stretch>
+                  </pic:blipFill>
+                  <pic:spPr>
+                    <a:xfrm>
+                      <a:off x="0" y="0"/>
+                      <a:ext cx="5731510" cy="2695575"/>
+                    </a:xfrm>
+                    <a:prstGeom prst="rect">
+                      <a:avLst/>
+                    </a:prstGeom>
+                  </pic:spPr>
+                </pic:pic>
+              </a:graphicData>
+            </a:graphic>
+          </wp:inline>
+        </w:drawing>
+      </w:r>
+    </w:p>
     <w:p/>
     <w:p>
       <w:pPr>
@@ -1664,16 +1743,16 @@
           <w:szCs w:val="22"/>
         </w:rPr>
       </w:pPr>
-    </w:p>
-    <w:p>
-      <w:pPr>
+      <w:r>
         <w:rPr>
           <w:b/>
           <w:bCs/>
           <w:sz w:val="22"/>
           <w:szCs w:val="22"/>
         </w:rPr>
-      </w:pPr>
+        <w:lastRenderedPageBreak/>
+        <w:t>Activity Diagram 2</w:t>
+      </w:r>
     </w:p>
     <w:p>
       <w:pPr>
@@ -1684,16 +1763,56 @@
           <w:szCs w:val="22"/>
         </w:rPr>
       </w:pPr>
-    </w:p>
-    <w:p>
-      <w:pPr>
-        <w:rPr>
-          <w:b/>
-          <w:bCs/>
+      <w:r>
+        <w:rPr>
+          <w:b/>
+          <w:bCs/>
+          <w:noProof/>
           <w:sz w:val="22"/>
           <w:szCs w:val="22"/>
         </w:rPr>
-      </w:pPr>
+        <w:drawing>
+          <wp:inline distT="0" distB="0" distL="0" distR="0" wp14:anchorId="556ED7FD" wp14:editId="1A476CCB">
+            <wp:extent cx="4504517" cy="8549640"/>
+            <wp:effectExtent l="0" t="0" r="0" b="3810"/>
+            <wp:docPr id="113735822" name="Picture 3"/>
+            <wp:cNvGraphicFramePr>
+              <a:graphicFrameLocks xmlns:a="http://schemas.openxmlformats.org/drawingml/2006/main" noChangeAspect="1"/>
+            </wp:cNvGraphicFramePr>
+            <a:graphic xmlns:a="http://schemas.openxmlformats.org/drawingml/2006/main">
+              <a:graphicData uri="http://schemas.openxmlformats.org/drawingml/2006/picture">
+                <pic:pic xmlns:pic="http://schemas.openxmlformats.org/drawingml/2006/picture">
+                  <pic:nvPicPr>
+                    <pic:cNvPr id="113735822" name="Picture 113735822"/>
+                    <pic:cNvPicPr/>
+                  </pic:nvPicPr>
+                  <pic:blipFill>
+                    <a:blip r:embed="rId10" cstate="print">
+                      <a:extLst>
+                        <a:ext uri="{28A0092B-C50C-407E-A947-70E740481C1C}">
+                          <a14:useLocalDpi xmlns:a14="http://schemas.microsoft.com/office/drawing/2010/main" val="0"/>
+                        </a:ext>
+                      </a:extLst>
+                    </a:blip>
+                    <a:stretch>
+                      <a:fillRect/>
+                    </a:stretch>
+                  </pic:blipFill>
+                  <pic:spPr>
+                    <a:xfrm>
+                      <a:off x="0" y="0"/>
+                      <a:ext cx="4506911" cy="8554184"/>
+                    </a:xfrm>
+                    <a:prstGeom prst="rect">
+                      <a:avLst/>
+                    </a:prstGeom>
+                  </pic:spPr>
+                </pic:pic>
+              </a:graphicData>
+            </a:graphic>
+          </wp:inline>
+        </w:drawing>
+      </w:r>
     </w:p>
     <w:p>
       <w:pPr>
@@ -1704,16 +1823,16 @@
           <w:szCs w:val="22"/>
         </w:rPr>
       </w:pPr>
-    </w:p>
-    <w:p>
-      <w:pPr>
+      <w:r>
         <w:rPr>
           <w:b/>
           <w:bCs/>
           <w:sz w:val="22"/>
           <w:szCs w:val="22"/>
         </w:rPr>
-      </w:pPr>
+        <w:lastRenderedPageBreak/>
+        <w:t>Activity Diagram 3</w:t>
+      </w:r>
     </w:p>
     <w:p>
       <w:pPr>
@@ -1724,16 +1843,56 @@
           <w:szCs w:val="22"/>
         </w:rPr>
       </w:pPr>
-    </w:p>
-    <w:p>
-      <w:pPr>
-        <w:rPr>
-          <w:b/>
-          <w:bCs/>
+      <w:r>
+        <w:rPr>
+          <w:b/>
+          <w:bCs/>
+          <w:noProof/>
           <w:sz w:val="22"/>
           <w:szCs w:val="22"/>
         </w:rPr>
-      </w:pPr>
+        <w:drawing>
+          <wp:inline distT="0" distB="0" distL="0" distR="0" wp14:anchorId="6F916732" wp14:editId="1025EED0">
+            <wp:extent cx="4358640" cy="8315732"/>
+            <wp:effectExtent l="0" t="0" r="3810" b="9525"/>
+            <wp:docPr id="102118981" name="Picture 4"/>
+            <wp:cNvGraphicFramePr>
+              <a:graphicFrameLocks xmlns:a="http://schemas.openxmlformats.org/drawingml/2006/main" noChangeAspect="1"/>
+            </wp:cNvGraphicFramePr>
+            <a:graphic xmlns:a="http://schemas.openxmlformats.org/drawingml/2006/main">
+              <a:graphicData uri="http://schemas.openxmlformats.org/drawingml/2006/picture">
+                <pic:pic xmlns:pic="http://schemas.openxmlformats.org/drawingml/2006/picture">
+                  <pic:nvPicPr>
+                    <pic:cNvPr id="102118981" name="Picture 102118981"/>
+                    <pic:cNvPicPr/>
+                  </pic:nvPicPr>
+                  <pic:blipFill>
+                    <a:blip r:embed="rId11" cstate="print">
+                      <a:extLst>
+                        <a:ext uri="{28A0092B-C50C-407E-A947-70E740481C1C}">
+                          <a14:useLocalDpi xmlns:a14="http://schemas.microsoft.com/office/drawing/2010/main" val="0"/>
+                        </a:ext>
+                      </a:extLst>
+                    </a:blip>
+                    <a:stretch>
+                      <a:fillRect/>
+                    </a:stretch>
+                  </pic:blipFill>
+                  <pic:spPr>
+                    <a:xfrm>
+                      <a:off x="0" y="0"/>
+                      <a:ext cx="4364473" cy="8326862"/>
+                    </a:xfrm>
+                    <a:prstGeom prst="rect">
+                      <a:avLst/>
+                    </a:prstGeom>
+                  </pic:spPr>
+                </pic:pic>
+              </a:graphicData>
+            </a:graphic>
+          </wp:inline>
+        </w:drawing>
+      </w:r>
     </w:p>
     <w:p>
       <w:pPr>
@@ -1817,6 +1976,106 @@
     </w:p>
     <w:p>
       <w:pPr>
+        <w:rPr>
+          <w:b/>
+          <w:bCs/>
+          <w:sz w:val="22"/>
+          <w:szCs w:val="22"/>
+        </w:rPr>
+      </w:pPr>
+    </w:p>
+    <w:p>
+      <w:pPr>
+        <w:rPr>
+          <w:b/>
+          <w:bCs/>
+          <w:sz w:val="22"/>
+          <w:szCs w:val="22"/>
+        </w:rPr>
+      </w:pPr>
+    </w:p>
+    <w:p>
+      <w:pPr>
+        <w:rPr>
+          <w:b/>
+          <w:bCs/>
+          <w:sz w:val="22"/>
+          <w:szCs w:val="22"/>
+        </w:rPr>
+      </w:pPr>
+    </w:p>
+    <w:p>
+      <w:pPr>
+        <w:rPr>
+          <w:b/>
+          <w:bCs/>
+          <w:sz w:val="22"/>
+          <w:szCs w:val="22"/>
+        </w:rPr>
+      </w:pPr>
+    </w:p>
+    <w:p>
+      <w:pPr>
+        <w:rPr>
+          <w:b/>
+          <w:bCs/>
+          <w:sz w:val="22"/>
+          <w:szCs w:val="22"/>
+        </w:rPr>
+      </w:pPr>
+    </w:p>
+    <w:p>
+      <w:pPr>
+        <w:rPr>
+          <w:b/>
+          <w:bCs/>
+          <w:sz w:val="22"/>
+          <w:szCs w:val="22"/>
+        </w:rPr>
+      </w:pPr>
+    </w:p>
+    <w:p>
+      <w:pPr>
+        <w:rPr>
+          <w:b/>
+          <w:bCs/>
+          <w:sz w:val="22"/>
+          <w:szCs w:val="22"/>
+        </w:rPr>
+      </w:pPr>
+    </w:p>
+    <w:p>
+      <w:pPr>
+        <w:rPr>
+          <w:b/>
+          <w:bCs/>
+          <w:sz w:val="22"/>
+          <w:szCs w:val="22"/>
+        </w:rPr>
+      </w:pPr>
+    </w:p>
+    <w:p>
+      <w:pPr>
+        <w:rPr>
+          <w:b/>
+          <w:bCs/>
+          <w:sz w:val="22"/>
+          <w:szCs w:val="22"/>
+        </w:rPr>
+      </w:pPr>
+    </w:p>
+    <w:p>
+      <w:pPr>
+        <w:rPr>
+          <w:b/>
+          <w:bCs/>
+          <w:sz w:val="22"/>
+          <w:szCs w:val="22"/>
+        </w:rPr>
+      </w:pPr>
+    </w:p>
+    <w:p>
+      <w:pPr>
         <w:pStyle w:val="Heading1"/>
         <w:rPr>
           <w:color w:val="0070C0"/>
@@ -1826,7 +2085,6 @@
         <w:rPr>
           <w:color w:val="0070C0"/>
         </w:rPr>
-        <w:lastRenderedPageBreak/>
         <w:t>TASK 4</w:t>
       </w:r>
     </w:p>
@@ -1996,6 +2254,7 @@
     <w:p>
       <w:proofErr w:type="spellStart"/>
       <w:r>
+        <w:lastRenderedPageBreak/>
         <w:t>ProgressObserver</w:t>
       </w:r>
       <w:proofErr w:type="spellEnd"/>
@@ -2186,7 +2445,6 @@
           <w:sz w:val="22"/>
           <w:szCs w:val="22"/>
         </w:rPr>
-        <w:lastRenderedPageBreak/>
         <w:t>2. Builder Pattern</w:t>
       </w:r>
     </w:p>
@@ -2383,6 +2641,7 @@
     </w:p>
     <w:p>
       <w:r>
+        <w:lastRenderedPageBreak/>
         <w:t>Possible builder operations:</w:t>
       </w:r>
     </w:p>
@@ -2587,7 +2846,6 @@
           <w:b/>
           <w:bCs/>
         </w:rPr>
-        <w:lastRenderedPageBreak/>
         <w:t>How It Connects</w:t>
       </w:r>
     </w:p>
@@ -2793,6 +3051,7 @@
     <w:p>
       <w:proofErr w:type="spellStart"/>
       <w:r>
+        <w:lastRenderedPageBreak/>
         <w:t>WorkflowState</w:t>
       </w:r>
       <w:proofErr w:type="spellEnd"/>
@@ -2934,11 +3193,7 @@
     </w:p>
     <w:p>
       <w:r>
-        <w:t xml:space="preserve">A running case behaves differently depending on where it is in its lifecycle. A newly submitted case can be reviewed and assigned, an active case can be processed, an </w:t>
-      </w:r>
-      <w:r>
-        <w:lastRenderedPageBreak/>
-        <w:t>escalated case requires higher-level handling, and a resolved or closed case should no longer continue through the workflow.</w:t>
+        <w:t>A running case behaves differently depending on where it is in its lifecycle. A newly submitted case can be reviewed and assigned, an active case can be processed, an escalated case requires higher-level handling, and a resolved or closed case should no longer continue through the workflow.</w:t>
       </w:r>
     </w:p>
     <w:p>
@@ -3090,6 +3345,7 @@
     <w:p>
       <w:proofErr w:type="spellStart"/>
       <w:r>
+        <w:lastRenderedPageBreak/>
         <w:t>RoleBasedAssignment</w:t>
       </w:r>
       <w:proofErr w:type="spellEnd"/>
@@ -3258,131 +3514,131 @@
           <w:sz w:val="22"/>
           <w:szCs w:val="22"/>
         </w:rPr>
+        <w:t>5. Chain of Responsibility Pattern</w:t>
+      </w:r>
+    </w:p>
+    <w:p>
+      <w:pPr>
+        <w:rPr>
+          <w:b/>
+          <w:bCs/>
+        </w:rPr>
+      </w:pPr>
+      <w:r>
+        <w:rPr>
+          <w:b/>
+          <w:bCs/>
+        </w:rPr>
+        <w:t>Design Problem</w:t>
+      </w:r>
+    </w:p>
+    <w:p>
+      <w:r>
+        <w:t>Some work may need to be escalated through several levels until an appropriate participant can handle it.</w:t>
+      </w:r>
+    </w:p>
+    <w:p>
+      <w:r>
+        <w:t>For example, in the university complaint scenario:</w:t>
+      </w:r>
+    </w:p>
+    <w:p>
+      <w:r>
+        <w:t>Staff Member -&gt; Coordinator -&gt; Department Head -&gt; Faculty</w:t>
+      </w:r>
+    </w:p>
+    <w:p>
+      <w:pPr>
+        <w:rPr>
+          <w:b/>
+          <w:bCs/>
+        </w:rPr>
+      </w:pPr>
+      <w:r>
+        <w:rPr>
+          <w:b/>
+          <w:bCs/>
+        </w:rPr>
+        <w:t>Possible Classes</w:t>
+      </w:r>
+    </w:p>
+    <w:p>
+      <w:r>
+        <w:t>Handler</w:t>
+      </w:r>
+    </w:p>
+    <w:p/>
+    <w:p>
+      <w:proofErr w:type="spellStart"/>
+      <w:r>
+        <w:t>WorkHandler</w:t>
+      </w:r>
+      <w:proofErr w:type="spellEnd"/>
+    </w:p>
+    <w:p>
+      <w:proofErr w:type="spellStart"/>
+      <w:r>
+        <w:t>ApprovalHandler</w:t>
+      </w:r>
+      <w:proofErr w:type="spellEnd"/>
+    </w:p>
+    <w:p>
+      <w:proofErr w:type="spellStart"/>
+      <w:r>
+        <w:t>EscalationHandler</w:t>
+      </w:r>
+      <w:proofErr w:type="spellEnd"/>
+    </w:p>
+    <w:p>
+      <w:proofErr w:type="spellStart"/>
+      <w:r>
+        <w:t>FinalDecisionHandler</w:t>
+      </w:r>
+      <w:proofErr w:type="spellEnd"/>
+    </w:p>
+    <w:p>
+      <w:pPr>
+        <w:rPr>
+          <w:b/>
+          <w:bCs/>
+        </w:rPr>
+      </w:pPr>
+      <w:r>
+        <w:rPr>
+          <w:b/>
+          <w:bCs/>
+        </w:rPr>
+        <w:t>Collaboration</w:t>
+      </w:r>
+    </w:p>
+    <w:p>
+      <w:r>
+        <w:t>Each handler attempts to deal with the work.</w:t>
+      </w:r>
+    </w:p>
+    <w:p>
+      <w:r>
+        <w:t>If it cannot handle it, the request is passed to the next handler in the chain.</w:t>
+      </w:r>
+    </w:p>
+    <w:p>
+      <w:pPr>
+        <w:rPr>
+          <w:b/>
+          <w:bCs/>
+        </w:rPr>
+      </w:pPr>
+      <w:r>
+        <w:rPr>
+          <w:b/>
+          <w:bCs/>
+        </w:rPr>
+        <w:t>What Varies</w:t>
+      </w:r>
+    </w:p>
+    <w:p>
+      <w:r>
         <w:lastRenderedPageBreak/>
-        <w:t>5. Chain of Responsibility Pattern</w:t>
-      </w:r>
-    </w:p>
-    <w:p>
-      <w:pPr>
-        <w:rPr>
-          <w:b/>
-          <w:bCs/>
-        </w:rPr>
-      </w:pPr>
-      <w:r>
-        <w:rPr>
-          <w:b/>
-          <w:bCs/>
-        </w:rPr>
-        <w:t>Design Problem</w:t>
-      </w:r>
-    </w:p>
-    <w:p>
-      <w:r>
-        <w:t>Some work may need to be escalated through several levels until an appropriate participant can handle it.</w:t>
-      </w:r>
-    </w:p>
-    <w:p>
-      <w:r>
-        <w:t>For example, in the university complaint scenario:</w:t>
-      </w:r>
-    </w:p>
-    <w:p>
-      <w:r>
-        <w:t>Staff Member -&gt; Coordinator -&gt; Department Head -&gt; Faculty</w:t>
-      </w:r>
-    </w:p>
-    <w:p>
-      <w:pPr>
-        <w:rPr>
-          <w:b/>
-          <w:bCs/>
-        </w:rPr>
-      </w:pPr>
-      <w:r>
-        <w:rPr>
-          <w:b/>
-          <w:bCs/>
-        </w:rPr>
-        <w:t>Possible Classes</w:t>
-      </w:r>
-    </w:p>
-    <w:p>
-      <w:r>
-        <w:t>Handler</w:t>
-      </w:r>
-    </w:p>
-    <w:p/>
-    <w:p>
-      <w:proofErr w:type="spellStart"/>
-      <w:r>
-        <w:t>WorkHandler</w:t>
-      </w:r>
-      <w:proofErr w:type="spellEnd"/>
-    </w:p>
-    <w:p>
-      <w:proofErr w:type="spellStart"/>
-      <w:r>
-        <w:t>ApprovalHandler</w:t>
-      </w:r>
-      <w:proofErr w:type="spellEnd"/>
-    </w:p>
-    <w:p>
-      <w:proofErr w:type="spellStart"/>
-      <w:r>
-        <w:t>EscalationHandler</w:t>
-      </w:r>
-      <w:proofErr w:type="spellEnd"/>
-    </w:p>
-    <w:p>
-      <w:proofErr w:type="spellStart"/>
-      <w:r>
-        <w:t>FinalDecisionHandler</w:t>
-      </w:r>
-      <w:proofErr w:type="spellEnd"/>
-    </w:p>
-    <w:p>
-      <w:pPr>
-        <w:rPr>
-          <w:b/>
-          <w:bCs/>
-        </w:rPr>
-      </w:pPr>
-      <w:r>
-        <w:rPr>
-          <w:b/>
-          <w:bCs/>
-        </w:rPr>
-        <w:t>Collaboration</w:t>
-      </w:r>
-    </w:p>
-    <w:p>
-      <w:r>
-        <w:t>Each handler attempts to deal with the work.</w:t>
-      </w:r>
-    </w:p>
-    <w:p>
-      <w:r>
-        <w:t>If it cannot handle it, the request is passed to the next handler in the chain.</w:t>
-      </w:r>
-    </w:p>
-    <w:p>
-      <w:pPr>
-        <w:rPr>
-          <w:b/>
-          <w:bCs/>
-        </w:rPr>
-      </w:pPr>
-      <w:r>
-        <w:rPr>
-          <w:b/>
-          <w:bCs/>
-        </w:rPr>
-        <w:t>What Varies</w:t>
-      </w:r>
-    </w:p>
-    <w:p>
-      <w:r>
         <w:t>The order of handlers and the rules used to determine whether a handler can deal with the work.</w:t>
       </w:r>
     </w:p>
@@ -3544,7 +3800,6 @@
         </w:numPr>
       </w:pPr>
       <w:r>
-        <w:lastRenderedPageBreak/>
         <w:t>Complete work</w:t>
       </w:r>
     </w:p>
@@ -3674,6 +3929,7 @@
     </w:p>
     <w:p>
       <w:r>
+        <w:lastRenderedPageBreak/>
         <w:t xml:space="preserve">The workflow system executes the required command when the action must occur. </w:t>
       </w:r>
       <w:proofErr w:type="spellStart"/>
@@ -3846,147 +4102,147 @@
           <w:b/>
           <w:bCs/>
         </w:rPr>
+        <w:t>Possible Classes</w:t>
+      </w:r>
+    </w:p>
+    <w:p>
+      <w:proofErr w:type="spellStart"/>
+      <w:r>
+        <w:t>WorkflowComponent</w:t>
+      </w:r>
+      <w:proofErr w:type="spellEnd"/>
+    </w:p>
+    <w:p/>
+    <w:p>
+      <w:proofErr w:type="spellStart"/>
+      <w:r>
+        <w:t>WorkItem</w:t>
+      </w:r>
+      <w:proofErr w:type="spellEnd"/>
+    </w:p>
+    <w:p>
+      <w:proofErr w:type="spellStart"/>
+      <w:r>
+        <w:t>WorkflowStage</w:t>
+      </w:r>
+      <w:proofErr w:type="spellEnd"/>
+    </w:p>
+    <w:p>
+      <w:proofErr w:type="spellStart"/>
+      <w:r>
+        <w:t>SubProcess</w:t>
+      </w:r>
+      <w:proofErr w:type="spellEnd"/>
+    </w:p>
+    <w:p>
+      <w:pPr>
+        <w:rPr>
+          <w:b/>
+          <w:bCs/>
+        </w:rPr>
+      </w:pPr>
+      <w:r>
+        <w:rPr>
+          <w:b/>
+          <w:bCs/>
+        </w:rPr>
+        <w:t>Collaboration</w:t>
+      </w:r>
+    </w:p>
+    <w:p>
+      <w:proofErr w:type="spellStart"/>
+      <w:r>
+        <w:t>WorkItem</w:t>
+      </w:r>
+      <w:proofErr w:type="spellEnd"/>
+      <w:r>
+        <w:t xml:space="preserve"> represents a simple component.</w:t>
+      </w:r>
+    </w:p>
+    <w:p>
+      <w:proofErr w:type="spellStart"/>
+      <w:r>
+        <w:t>WorkflowStage</w:t>
+      </w:r>
+      <w:proofErr w:type="spellEnd"/>
+      <w:r>
+        <w:t xml:space="preserve"> or </w:t>
+      </w:r>
+      <w:proofErr w:type="spellStart"/>
+      <w:r>
+        <w:t>SubProcess</w:t>
+      </w:r>
+      <w:proofErr w:type="spellEnd"/>
+      <w:r>
+        <w:t xml:space="preserve"> can contain other </w:t>
+      </w:r>
+      <w:proofErr w:type="spellStart"/>
+      <w:r>
+        <w:t>WorkflowComponent</w:t>
+      </w:r>
+      <w:proofErr w:type="spellEnd"/>
+      <w:r>
+        <w:t xml:space="preserve"> objects.</w:t>
+      </w:r>
+    </w:p>
+    <w:p>
+      <w:pPr>
+        <w:rPr>
+          <w:b/>
+          <w:bCs/>
+        </w:rPr>
+      </w:pPr>
+      <w:r>
+        <w:rPr>
+          <w:b/>
+          <w:bCs/>
+        </w:rPr>
+        <w:t>What Varies</w:t>
+      </w:r>
+    </w:p>
+    <w:p>
+      <w:r>
+        <w:t>The structure and nesting of workflow activities.</w:t>
+      </w:r>
+    </w:p>
+    <w:p>
+      <w:pPr>
+        <w:rPr>
+          <w:b/>
+          <w:bCs/>
+        </w:rPr>
+      </w:pPr>
+      <w:r>
+        <w:rPr>
+          <w:b/>
+          <w:bCs/>
+        </w:rPr>
+        <w:t>Why It Is Appropriate</w:t>
+      </w:r>
+    </w:p>
+    <w:p>
+      <w:r>
+        <w:t>Composite allows individual tasks and groups of tasks to be treated through a common interface.</w:t>
+      </w:r>
+    </w:p>
+    <w:p>
+      <w:pPr>
+        <w:rPr>
+          <w:b/>
+          <w:bCs/>
+        </w:rPr>
+      </w:pPr>
+      <w:r>
+        <w:rPr>
+          <w:b/>
+          <w:bCs/>
+        </w:rPr>
+        <w:t>Workflow Justification</w:t>
+      </w:r>
+    </w:p>
+    <w:p>
+      <w:r>
         <w:lastRenderedPageBreak/>
-        <w:t>Possible Classes</w:t>
-      </w:r>
-    </w:p>
-    <w:p>
-      <w:proofErr w:type="spellStart"/>
-      <w:r>
-        <w:t>WorkflowComponent</w:t>
-      </w:r>
-      <w:proofErr w:type="spellEnd"/>
-    </w:p>
-    <w:p/>
-    <w:p>
-      <w:proofErr w:type="spellStart"/>
-      <w:r>
-        <w:t>WorkItem</w:t>
-      </w:r>
-      <w:proofErr w:type="spellEnd"/>
-    </w:p>
-    <w:p>
-      <w:proofErr w:type="spellStart"/>
-      <w:r>
-        <w:t>WorkflowStage</w:t>
-      </w:r>
-      <w:proofErr w:type="spellEnd"/>
-    </w:p>
-    <w:p>
-      <w:proofErr w:type="spellStart"/>
-      <w:r>
-        <w:t>SubProcess</w:t>
-      </w:r>
-      <w:proofErr w:type="spellEnd"/>
-    </w:p>
-    <w:p>
-      <w:pPr>
-        <w:rPr>
-          <w:b/>
-          <w:bCs/>
-        </w:rPr>
-      </w:pPr>
-      <w:r>
-        <w:rPr>
-          <w:b/>
-          <w:bCs/>
-        </w:rPr>
-        <w:t>Collaboration</w:t>
-      </w:r>
-    </w:p>
-    <w:p>
-      <w:proofErr w:type="spellStart"/>
-      <w:r>
-        <w:t>WorkItem</w:t>
-      </w:r>
-      <w:proofErr w:type="spellEnd"/>
-      <w:r>
-        <w:t xml:space="preserve"> represents a simple component.</w:t>
-      </w:r>
-    </w:p>
-    <w:p>
-      <w:proofErr w:type="spellStart"/>
-      <w:r>
-        <w:t>WorkflowStage</w:t>
-      </w:r>
-      <w:proofErr w:type="spellEnd"/>
-      <w:r>
-        <w:t xml:space="preserve"> or </w:t>
-      </w:r>
-      <w:proofErr w:type="spellStart"/>
-      <w:r>
-        <w:t>SubProcess</w:t>
-      </w:r>
-      <w:proofErr w:type="spellEnd"/>
-      <w:r>
-        <w:t xml:space="preserve"> can contain other </w:t>
-      </w:r>
-      <w:proofErr w:type="spellStart"/>
-      <w:r>
-        <w:t>WorkflowComponent</w:t>
-      </w:r>
-      <w:proofErr w:type="spellEnd"/>
-      <w:r>
-        <w:t xml:space="preserve"> objects.</w:t>
-      </w:r>
-    </w:p>
-    <w:p>
-      <w:pPr>
-        <w:rPr>
-          <w:b/>
-          <w:bCs/>
-        </w:rPr>
-      </w:pPr>
-      <w:r>
-        <w:rPr>
-          <w:b/>
-          <w:bCs/>
-        </w:rPr>
-        <w:t>What Varies</w:t>
-      </w:r>
-    </w:p>
-    <w:p>
-      <w:r>
-        <w:t>The structure and nesting of workflow activities.</w:t>
-      </w:r>
-    </w:p>
-    <w:p>
-      <w:pPr>
-        <w:rPr>
-          <w:b/>
-          <w:bCs/>
-        </w:rPr>
-      </w:pPr>
-      <w:r>
-        <w:rPr>
-          <w:b/>
-          <w:bCs/>
-        </w:rPr>
-        <w:t>Why It Is Appropriate</w:t>
-      </w:r>
-    </w:p>
-    <w:p>
-      <w:r>
-        <w:t>Composite allows individual tasks and groups of tasks to be treated through a common interface.</w:t>
-      </w:r>
-    </w:p>
-    <w:p>
-      <w:pPr>
-        <w:rPr>
-          <w:b/>
-          <w:bCs/>
-        </w:rPr>
-      </w:pPr>
-      <w:r>
-        <w:rPr>
-          <w:b/>
-          <w:bCs/>
-        </w:rPr>
-        <w:t>Workflow Justification</w:t>
-      </w:r>
-    </w:p>
-    <w:p>
-      <w:r>
         <w:t xml:space="preserve">Work is nested: a stage holds work items, and some work items hold smaller sub-processes. The engine must assign, start, complete and track a single </w:t>
       </w:r>
       <w:proofErr w:type="spellStart"/>
@@ -4205,7 +4461,6 @@
           <w:b/>
           <w:bCs/>
         </w:rPr>
-        <w:lastRenderedPageBreak/>
         <w:t>What Varies</w:t>
       </w:r>
     </w:p>
@@ -4337,6 +4592,7 @@
     </w:p>
     <w:p>
       <w:r>
+        <w:lastRenderedPageBreak/>
         <w:t>For example:</w:t>
       </w:r>
     </w:p>
@@ -4604,13 +4860,573 @@
           <w:b/>
           <w:bCs/>
         </w:rPr>
+        <w:t>Why It Is Appropriate</w:t>
+      </w:r>
+    </w:p>
+    <w:p>
+      <w:r>
+        <w:t>Facade reduces the complexity of using the workflow system and hides unnecessary internal details.</w:t>
+      </w:r>
+    </w:p>
+    <w:p>
+      <w:pPr>
+        <w:rPr>
+          <w:b/>
+          <w:bCs/>
+        </w:rPr>
+      </w:pPr>
+      <w:r>
+        <w:rPr>
+          <w:b/>
+          <w:bCs/>
+        </w:rPr>
+        <w:t>Workflow Justification</w:t>
+      </w:r>
+    </w:p>
+    <w:p>
+      <w:r>
+        <w:t>TIVIDY contains definitions, instances, work items, strategies, event handling, history and notifications. A caller such as a user interface or the scenario layer should not need to know all of them. One entry point means internal refactoring does not ripple outwards.</w:t>
+      </w:r>
+    </w:p>
+    <w:p>
+      <w:pPr>
+        <w:rPr>
+          <w:b/>
+          <w:bCs/>
+        </w:rPr>
+      </w:pPr>
+      <w:r>
+        <w:rPr>
+          <w:b/>
+          <w:bCs/>
+        </w:rPr>
+        <w:t>How It Connects</w:t>
+      </w:r>
+    </w:p>
+    <w:p>
+      <w:proofErr w:type="spellStart"/>
+      <w:r>
+        <w:t>TIVIDYFacade</w:t>
+      </w:r>
+      <w:proofErr w:type="spellEnd"/>
+      <w:r>
+        <w:t xml:space="preserve"> is the outermost layer. Calls such as </w:t>
+      </w:r>
+      <w:proofErr w:type="spellStart"/>
+      <w:proofErr w:type="gramStart"/>
+      <w:r>
+        <w:t>createWorkflow</w:t>
+      </w:r>
+      <w:proofErr w:type="spellEnd"/>
+      <w:r>
+        <w:t>(</w:t>
+      </w:r>
+      <w:proofErr w:type="gramEnd"/>
+      <w:r>
+        <w:t xml:space="preserve">), </w:t>
+      </w:r>
+      <w:proofErr w:type="spellStart"/>
+      <w:proofErr w:type="gramStart"/>
+      <w:r>
+        <w:t>assignWork</w:t>
+      </w:r>
+      <w:proofErr w:type="spellEnd"/>
+      <w:r>
+        <w:t>(</w:t>
+      </w:r>
+      <w:proofErr w:type="gramEnd"/>
+      <w:r>
+        <w:t xml:space="preserve">) and </w:t>
+      </w:r>
+      <w:proofErr w:type="spellStart"/>
+      <w:proofErr w:type="gramStart"/>
+      <w:r>
+        <w:t>completeWork</w:t>
+      </w:r>
+      <w:proofErr w:type="spellEnd"/>
+      <w:r>
+        <w:t>(</w:t>
+      </w:r>
+      <w:proofErr w:type="gramEnd"/>
+      <w:r>
+        <w:t>) are delegated to the Builder, the Command objects, the State machine and the Observer system. The scenario layer talks to the engine only through the Facade.</w:t>
+      </w:r>
+    </w:p>
+    <w:p/>
+    <w:p>
+      <w:pPr>
+        <w:rPr>
+          <w:b/>
+          <w:bCs/>
+          <w:sz w:val="22"/>
+          <w:szCs w:val="22"/>
+        </w:rPr>
+      </w:pPr>
+      <w:r>
+        <w:rPr>
+          <w:b/>
+          <w:bCs/>
+          <w:sz w:val="22"/>
+          <w:szCs w:val="22"/>
+        </w:rPr>
+        <w:t>10. Memento Pattern</w:t>
+      </w:r>
+    </w:p>
+    <w:p>
+      <w:pPr>
+        <w:rPr>
+          <w:b/>
+          <w:bCs/>
+        </w:rPr>
+      </w:pPr>
+      <w:r>
+        <w:rPr>
+          <w:b/>
+          <w:bCs/>
+        </w:rPr>
+        <w:t>Design Problem</w:t>
+      </w:r>
+    </w:p>
+    <w:p>
+      <w:r>
+        <w:t>TIVIDY may need to preserve earlier workflow states for history or rollback.</w:t>
+      </w:r>
+    </w:p>
+    <w:p>
+      <w:r>
+        <w:t xml:space="preserve">For example, </w:t>
+      </w:r>
+      <w:proofErr w:type="gramStart"/>
+      <w:r>
+        <w:t>Before</w:t>
+      </w:r>
+      <w:proofErr w:type="gramEnd"/>
+      <w:r>
+        <w:t xml:space="preserve"> escalation, a </w:t>
+      </w:r>
+      <w:proofErr w:type="spellStart"/>
+      <w:r>
+        <w:t>WorkflowInstance</w:t>
+      </w:r>
+      <w:proofErr w:type="spellEnd"/>
+      <w:r>
+        <w:t xml:space="preserve"> may have been in </w:t>
+      </w:r>
+      <w:proofErr w:type="spellStart"/>
+      <w:r>
+        <w:t>InProgressState</w:t>
+      </w:r>
+      <w:proofErr w:type="spellEnd"/>
+      <w:r>
+        <w:t xml:space="preserve"> with a particular assignment and workflow position.</w:t>
+      </w:r>
+    </w:p>
+    <w:p>
+      <w:pPr>
+        <w:rPr>
+          <w:b/>
+          <w:bCs/>
+        </w:rPr>
+      </w:pPr>
+      <w:r>
+        <w:rPr>
+          <w:b/>
+          <w:bCs/>
+        </w:rPr>
+        <w:lastRenderedPageBreak/>
+        <w:t>Possible Classes</w:t>
+      </w:r>
+    </w:p>
+    <w:p>
+      <w:proofErr w:type="spellStart"/>
+      <w:r>
+        <w:t>WorkflowInstance</w:t>
+      </w:r>
+      <w:proofErr w:type="spellEnd"/>
+    </w:p>
+    <w:p>
+      <w:proofErr w:type="spellStart"/>
+      <w:r>
+        <w:t>WorkflowMemento</w:t>
+      </w:r>
+      <w:proofErr w:type="spellEnd"/>
+    </w:p>
+    <w:p>
+      <w:proofErr w:type="spellStart"/>
+      <w:r>
+        <w:t>WorkflowHistory</w:t>
+      </w:r>
+      <w:proofErr w:type="spellEnd"/>
+    </w:p>
+    <w:p>
+      <w:pPr>
+        <w:rPr>
+          <w:b/>
+          <w:bCs/>
+        </w:rPr>
+      </w:pPr>
+      <w:r>
+        <w:rPr>
+          <w:b/>
+          <w:bCs/>
+        </w:rPr>
+        <w:t>Collaboration</w:t>
+      </w:r>
+    </w:p>
+    <w:p>
+      <w:proofErr w:type="spellStart"/>
+      <w:r>
+        <w:t>WorkflowInstance</w:t>
+      </w:r>
+      <w:proofErr w:type="spellEnd"/>
+      <w:r>
+        <w:t xml:space="preserve"> creates a </w:t>
+      </w:r>
+      <w:proofErr w:type="spellStart"/>
+      <w:r>
+        <w:t>WorkflowMemento</w:t>
+      </w:r>
+      <w:proofErr w:type="spellEnd"/>
+      <w:r>
+        <w:t xml:space="preserve"> containing its current state.</w:t>
+      </w:r>
+    </w:p>
+    <w:p>
+      <w:proofErr w:type="spellStart"/>
+      <w:r>
+        <w:t>WorkflowHistory</w:t>
+      </w:r>
+      <w:proofErr w:type="spellEnd"/>
+      <w:r>
+        <w:t xml:space="preserve"> stores the mementos and can provide an earlier state when required.</w:t>
+      </w:r>
+    </w:p>
+    <w:p>
+      <w:pPr>
+        <w:rPr>
+          <w:b/>
+          <w:bCs/>
+        </w:rPr>
+      </w:pPr>
+      <w:r>
+        <w:rPr>
+          <w:b/>
+          <w:bCs/>
+        </w:rPr>
+        <w:t>What Varies</w:t>
+      </w:r>
+    </w:p>
+    <w:p>
+      <w:r>
+        <w:t xml:space="preserve">The stored state of a </w:t>
+      </w:r>
+      <w:proofErr w:type="spellStart"/>
+      <w:r>
+        <w:t>WorkflowInstance</w:t>
+      </w:r>
+      <w:proofErr w:type="spellEnd"/>
+      <w:r>
+        <w:t xml:space="preserve"> over time.</w:t>
+      </w:r>
+    </w:p>
+    <w:p>
+      <w:pPr>
+        <w:rPr>
+          <w:b/>
+          <w:bCs/>
+        </w:rPr>
+      </w:pPr>
+      <w:r>
+        <w:rPr>
+          <w:b/>
+          <w:bCs/>
+        </w:rPr>
+        <w:t>Why It Is Appropriate</w:t>
+      </w:r>
+    </w:p>
+    <w:p>
+      <w:r>
+        <w:t>Memento allows TIVIDY to preserve previous states without exposing the internal details of the workflow object.</w:t>
+      </w:r>
+    </w:p>
+    <w:p>
+      <w:pPr>
+        <w:rPr>
+          <w:b/>
+          <w:bCs/>
+        </w:rPr>
+      </w:pPr>
+      <w:r>
+        <w:rPr>
+          <w:b/>
+          <w:bCs/>
+        </w:rPr>
+        <w:t>Workflow Justification</w:t>
+      </w:r>
+    </w:p>
+    <w:p>
+      <w:r>
+        <w:t xml:space="preserve">Workflow actions can be wrong: an item completed by mistake, a routing decision made on bad data, a failed email integration. Restoring a known-good state needs a snapshot taken </w:t>
+      </w:r>
+      <w:r>
+        <w:t xml:space="preserve">without exposing the internal state of </w:t>
+      </w:r>
+      <w:proofErr w:type="spellStart"/>
+      <w:r>
+        <w:t>WorkflowInstance</w:t>
+      </w:r>
+      <w:proofErr w:type="spellEnd"/>
+      <w:r>
+        <w:t>.</w:t>
+      </w:r>
+    </w:p>
+    <w:p>
+      <w:pPr>
+        <w:rPr>
+          <w:b/>
+          <w:bCs/>
+        </w:rPr>
+      </w:pPr>
+      <w:r>
+        <w:rPr>
+          <w:b/>
+          <w:bCs/>
+        </w:rPr>
+        <w:t>How It Connects</w:t>
+      </w:r>
+    </w:p>
+    <w:p>
+      <w:r>
+        <w:t xml:space="preserve">Memento is created and used through Command: before a reversible action the Command asks for a </w:t>
+      </w:r>
+      <w:proofErr w:type="spellStart"/>
+      <w:r>
+        <w:t>WorkflowMemento</w:t>
+      </w:r>
+      <w:proofErr w:type="spellEnd"/>
+      <w:r>
+        <w:t xml:space="preserve">, and on undo passes it back to restore the earlier state. </w:t>
+      </w:r>
+      <w:proofErr w:type="spellStart"/>
+      <w:r>
+        <w:t>WorkflowHistory</w:t>
+      </w:r>
+      <w:proofErr w:type="spellEnd"/>
+      <w:r>
+        <w:t xml:space="preserve"> stores the snapshots, so the audit trail can point to them.</w:t>
+      </w:r>
+    </w:p>
+    <w:p>
+      <w:pPr>
+        <w:rPr>
+          <w:b/>
+          <w:bCs/>
+          <w:sz w:val="22"/>
+          <w:szCs w:val="22"/>
+        </w:rPr>
+      </w:pPr>
+      <w:r>
+        <w:rPr>
+          <w:b/>
+          <w:bCs/>
+          <w:sz w:val="22"/>
+          <w:szCs w:val="22"/>
+        </w:rPr>
+        <w:t>11. Decorator Pattern</w:t>
+      </w:r>
+    </w:p>
+    <w:p>
+      <w:pPr>
+        <w:rPr>
+          <w:b/>
+          <w:bCs/>
+        </w:rPr>
+      </w:pPr>
+      <w:r>
+        <w:rPr>
+          <w:b/>
+          <w:bCs/>
+        </w:rPr>
+        <w:t>Design Problem</w:t>
+      </w:r>
+    </w:p>
+    <w:p>
+      <w:r>
+        <w:t>Work items sometimes need extra behaviour without becoming a different kind of work item.</w:t>
+      </w:r>
+    </w:p>
+    <w:p>
+      <w:r>
+        <w:t>For example, a work item may need to</w:t>
+      </w:r>
+      <w:r>
+        <w:t xml:space="preserve"> be </w:t>
+      </w:r>
+      <w:r>
+        <w:t>treated as urgent (priority handling)</w:t>
+      </w:r>
+      <w:r>
+        <w:t>.</w:t>
+      </w:r>
+    </w:p>
+    <w:p>
+      <w:r>
+        <w:t xml:space="preserve">Creating a separate </w:t>
+      </w:r>
+      <w:proofErr w:type="spellStart"/>
+      <w:r>
+        <w:t>WorkItem</w:t>
+      </w:r>
+      <w:proofErr w:type="spellEnd"/>
+      <w:r>
+        <w:t xml:space="preserve"> subclass only to represent priority would unnecessarily increase the number of classes.</w:t>
+      </w:r>
+    </w:p>
+    <w:p>
+      <w:pPr>
+        <w:rPr>
+          <w:b/>
+          <w:bCs/>
+        </w:rPr>
+      </w:pPr>
+      <w:r>
+        <w:rPr>
+          <w:b/>
+          <w:bCs/>
+        </w:rPr>
+        <w:t>Possible Classes</w:t>
+      </w:r>
+    </w:p>
+    <w:p>
+      <w:proofErr w:type="spellStart"/>
+      <w:r>
+        <w:t>WorkflowComponent</w:t>
+      </w:r>
+      <w:proofErr w:type="spellEnd"/>
+    </w:p>
+    <w:p>
+      <w:proofErr w:type="spellStart"/>
+      <w:r>
+        <w:t>WorkItem</w:t>
+      </w:r>
+      <w:proofErr w:type="spellEnd"/>
+    </w:p>
+    <w:p>
+      <w:proofErr w:type="spellStart"/>
+      <w:r>
+        <w:t>WorkItemDecorator</w:t>
+      </w:r>
+      <w:proofErr w:type="spellEnd"/>
+    </w:p>
+    <w:p>
+      <w:proofErr w:type="spellStart"/>
+      <w:r>
+        <w:t>PriorityDecorator</w:t>
+      </w:r>
+      <w:proofErr w:type="spellEnd"/>
+    </w:p>
+    <w:p>
+      <w:pPr>
+        <w:rPr>
+          <w:b/>
+          <w:bCs/>
+        </w:rPr>
+      </w:pPr>
+      <w:r>
+        <w:rPr>
+          <w:b/>
+          <w:bCs/>
+        </w:rPr>
+        <w:t>Collaboration</w:t>
+      </w:r>
+    </w:p>
+    <w:p>
+      <w:r>
+        <w:t xml:space="preserve">A </w:t>
+      </w:r>
+      <w:proofErr w:type="spellStart"/>
+      <w:r>
+        <w:t>WorkItemDecorator</w:t>
+      </w:r>
+      <w:proofErr w:type="spellEnd"/>
+      <w:r>
+        <w:t xml:space="preserve"> holds a </w:t>
+      </w:r>
+      <w:proofErr w:type="spellStart"/>
+      <w:r>
+        <w:t>WorkflowComponent</w:t>
+      </w:r>
+      <w:proofErr w:type="spellEnd"/>
+      <w:r>
+        <w:t xml:space="preserve"> and implements the same interface. It adds its own behaviour before or after passing the request to the wrapped component. </w:t>
+      </w:r>
+      <w:r>
+        <w:t xml:space="preserve">A </w:t>
+      </w:r>
+      <w:proofErr w:type="spellStart"/>
+      <w:r>
+        <w:t>PriorityDecorator</w:t>
+      </w:r>
+      <w:proofErr w:type="spellEnd"/>
+      <w:r>
+        <w:t xml:space="preserve"> wraps a work item and adds priority behaviour without changing the original </w:t>
+      </w:r>
+      <w:proofErr w:type="spellStart"/>
+      <w:r>
+        <w:t>WorkItem</w:t>
+      </w:r>
+      <w:proofErr w:type="spellEnd"/>
+      <w:r>
+        <w:t xml:space="preserve"> class.</w:t>
+      </w:r>
+    </w:p>
+    <w:p>
+      <w:pPr>
+        <w:rPr>
+          <w:b/>
+          <w:bCs/>
+        </w:rPr>
+      </w:pPr>
+      <w:r>
+        <w:rPr>
+          <w:b/>
+          <w:bCs/>
+        </w:rPr>
+        <w:t>What Varies</w:t>
+      </w:r>
+    </w:p>
+    <w:p>
+      <w:r>
+        <w:t>Which work items require priority behaviour.</w:t>
+      </w:r>
+    </w:p>
+    <w:p>
+      <w:pPr>
+        <w:rPr>
+          <w:b/>
+          <w:bCs/>
+        </w:rPr>
+      </w:pPr>
+      <w:r>
+        <w:rPr>
+          <w:b/>
+          <w:bCs/>
+        </w:rPr>
         <w:lastRenderedPageBreak/>
         <w:t>Why It Is Appropriate</w:t>
       </w:r>
     </w:p>
     <w:p>
       <w:r>
-        <w:t>Facade reduces the complexity of using the workflow system and hides unnecessary internal details.</w:t>
+        <w:t xml:space="preserve">Decorator allows priority behaviour to be added to a work item without changing the </w:t>
+      </w:r>
+      <w:proofErr w:type="spellStart"/>
+      <w:r>
+        <w:t>WorkItem</w:t>
+      </w:r>
+      <w:proofErr w:type="spellEnd"/>
+      <w:r>
+        <w:t xml:space="preserve"> class or creating a separate priority-specific work item class.</w:t>
       </w:r>
     </w:p>
     <w:p>
@@ -4630,7 +5446,23 @@
     </w:p>
     <w:p>
       <w:r>
-        <w:t>TIVIDY contains definitions, instances, work items, strategies, event handling, history and notifications. A caller such as a user interface or the scenario layer should not need to know all of them. One entry point means internal refactoring does not ripple outwards.</w:t>
+        <w:t xml:space="preserve">In the complaint scenario, a complaint that affects an upcoming exam may need priority handling. Rather than creating a special type of </w:t>
+      </w:r>
+      <w:proofErr w:type="spellStart"/>
+      <w:r>
+        <w:t>WorkItem</w:t>
+      </w:r>
+      <w:proofErr w:type="spellEnd"/>
+      <w:r>
+        <w:t xml:space="preserve">, </w:t>
+      </w:r>
+      <w:proofErr w:type="spellStart"/>
+      <w:r>
+        <w:t>PriorityDecorator</w:t>
+      </w:r>
+      <w:proofErr w:type="spellEnd"/>
+      <w:r>
+        <w:t xml:space="preserve"> can add priority behaviour to the existing work item. Priority handling belongs here rather than in Strategy because it adds behaviour to a work item instead of deciding who receives it.</w:t>
       </w:r>
     </w:p>
     <w:p>
@@ -4651,53 +5483,45 @@
     <w:p>
       <w:proofErr w:type="spellStart"/>
       <w:r>
-        <w:t>TIVIDYFacade</w:t>
-      </w:r>
-      <w:proofErr w:type="spellEnd"/>
-      <w:r>
-        <w:t xml:space="preserve"> is the outermost layer. Calls such as </w:t>
-      </w:r>
-      <w:proofErr w:type="spellStart"/>
-      <w:proofErr w:type="gramStart"/>
-      <w:r>
-        <w:t>createWorkflow</w:t>
-      </w:r>
-      <w:proofErr w:type="spellEnd"/>
-      <w:r>
-        <w:t>(</w:t>
-      </w:r>
-      <w:proofErr w:type="gramEnd"/>
-      <w:r>
-        <w:t xml:space="preserve">), </w:t>
-      </w:r>
-      <w:proofErr w:type="spellStart"/>
-      <w:proofErr w:type="gramStart"/>
-      <w:r>
-        <w:t>assignWork</w:t>
-      </w:r>
-      <w:proofErr w:type="spellEnd"/>
-      <w:r>
-        <w:t>(</w:t>
-      </w:r>
-      <w:proofErr w:type="gramEnd"/>
-      <w:r>
-        <w:t xml:space="preserve">) and </w:t>
-      </w:r>
-      <w:proofErr w:type="spellStart"/>
-      <w:proofErr w:type="gramStart"/>
-      <w:r>
-        <w:t>completeWork</w:t>
-      </w:r>
-      <w:proofErr w:type="spellEnd"/>
-      <w:r>
-        <w:t>(</w:t>
-      </w:r>
-      <w:proofErr w:type="gramEnd"/>
-      <w:r>
-        <w:t>) are delegated to the Builder, the Command objects, the State machine and the Observer system. The scenario layer talks to the engine only through the Facade.</w:t>
-      </w:r>
-    </w:p>
-    <w:p/>
+        <w:t>PriorityDecorator</w:t>
+      </w:r>
+      <w:proofErr w:type="spellEnd"/>
+      <w:r>
+        <w:t xml:space="preserve"> uses the same </w:t>
+      </w:r>
+      <w:proofErr w:type="spellStart"/>
+      <w:r>
+        <w:t>WorkflowComponent</w:t>
+      </w:r>
+      <w:proofErr w:type="spellEnd"/>
+      <w:r>
+        <w:t xml:space="preserve"> interface as the wrapped </w:t>
+      </w:r>
+      <w:proofErr w:type="spellStart"/>
+      <w:r>
+        <w:t>WorkItem</w:t>
+      </w:r>
+      <w:proofErr w:type="spellEnd"/>
+      <w:r>
+        <w:t xml:space="preserve">. It exposes priority information that the </w:t>
+      </w:r>
+      <w:proofErr w:type="spellStart"/>
+      <w:r>
+        <w:t>AssignmentStrategy</w:t>
+      </w:r>
+      <w:proofErr w:type="spellEnd"/>
+      <w:r>
+        <w:t xml:space="preserve"> can consider when selecting a participant, and the Builder can apply the decorator when constructing the </w:t>
+      </w:r>
+      <w:proofErr w:type="spellStart"/>
+      <w:r>
+        <w:t>WorkflowDefinition</w:t>
+      </w:r>
+      <w:proofErr w:type="spellEnd"/>
+      <w:r>
+        <w:t>.</w:t>
+      </w:r>
+    </w:p>
     <w:p>
       <w:pPr>
         <w:rPr>
@@ -4714,40 +5538,42 @@
           <w:sz w:val="22"/>
           <w:szCs w:val="22"/>
         </w:rPr>
-        <w:t>10. Memento Pattern</w:t>
-      </w:r>
-    </w:p>
-    <w:p>
-      <w:pPr>
-        <w:rPr>
-          <w:b/>
-          <w:bCs/>
-        </w:rPr>
-      </w:pPr>
-      <w:r>
-        <w:rPr>
-          <w:b/>
-          <w:bCs/>
-        </w:rPr>
-        <w:t>Design Problem</w:t>
-      </w:r>
-    </w:p>
-    <w:p>
-      <w:r>
-        <w:t>TIVIDY may need to preserve earlier workflow states for history or rollback.</w:t>
-      </w:r>
-    </w:p>
-    <w:p>
-      <w:r>
-        <w:t xml:space="preserve">For example, </w:t>
-      </w:r>
-      <w:proofErr w:type="gramStart"/>
-      <w:r>
-        <w:t>Before</w:t>
-      </w:r>
-      <w:proofErr w:type="gramEnd"/>
-      <w:r>
-        <w:t xml:space="preserve"> escalation, a </w:t>
+        <w:t>How the Patterns Work Together</w:t>
+      </w:r>
+    </w:p>
+    <w:p>
+      <w:r>
+        <w:t xml:space="preserve">The patterns above form one connected engine rather than eleven separate demonstrations. The Builder assembles a </w:t>
+      </w:r>
+      <w:proofErr w:type="spellStart"/>
+      <w:r>
+        <w:t>WorkflowDefinition</w:t>
+      </w:r>
+      <w:proofErr w:type="spellEnd"/>
+      <w:r>
+        <w:t xml:space="preserve"> containing a Composite structure of work, an </w:t>
+      </w:r>
+      <w:proofErr w:type="spellStart"/>
+      <w:r>
+        <w:t>AssignmentStrategy</w:t>
+      </w:r>
+      <w:proofErr w:type="spellEnd"/>
+      <w:r>
+        <w:t xml:space="preserve">, </w:t>
+      </w:r>
+      <w:r>
+        <w:t xml:space="preserve">an escalation Chain of Responsibility and a </w:t>
+      </w:r>
+      <w:proofErr w:type="spellStart"/>
+      <w:r>
+        <w:t>PriorityDecorator</w:t>
+      </w:r>
+      <w:proofErr w:type="spellEnd"/>
+      <w:r>
+        <w:t xml:space="preserve"> where required</w:t>
+      </w:r>
+      <w:r>
+        <w:t xml:space="preserve">. When a workflow is run, the definition is used to create an independent </w:t>
       </w:r>
       <w:proofErr w:type="spellStart"/>
       <w:r>
@@ -4755,640 +5581,64 @@
       </w:r>
       <w:proofErr w:type="spellEnd"/>
       <w:r>
-        <w:t xml:space="preserve"> may have been in </w:t>
-      </w:r>
-      <w:proofErr w:type="spellStart"/>
-      <w:r>
-        <w:t>InProgressState</w:t>
-      </w:r>
-      <w:proofErr w:type="spellEnd"/>
-      <w:r>
-        <w:t xml:space="preserve"> with a particular assignment and workflow position.</w:t>
-      </w:r>
-    </w:p>
-    <w:p>
-      <w:pPr>
-        <w:rPr>
-          <w:b/>
-          <w:bCs/>
-        </w:rPr>
-      </w:pPr>
-      <w:r>
-        <w:rPr>
-          <w:b/>
-          <w:bCs/>
-        </w:rPr>
-        <w:t>Possible Classes</w:t>
-      </w:r>
-    </w:p>
-    <w:p>
+        <w:t>, which is governed by the State pattern.</w:t>
+      </w:r>
+    </w:p>
+    <w:p>
+      <w:r>
+        <w:t xml:space="preserve">Every action on a running instance is represented as a Command. Before a reversible action, the Command can create a Memento, and execution may change the state of the </w:t>
+      </w:r>
       <w:proofErr w:type="spellStart"/>
       <w:r>
         <w:t>WorkflowInstance</w:t>
       </w:r>
       <w:proofErr w:type="spellEnd"/>
-    </w:p>
-    <w:p>
-      <w:proofErr w:type="spellStart"/>
-      <w:r>
-        <w:t>WorkflowMemento</w:t>
-      </w:r>
-      <w:proofErr w:type="spellEnd"/>
-    </w:p>
-    <w:p>
-      <w:proofErr w:type="spellStart"/>
-      <w:r>
-        <w:t>WorkflowHistory</w:t>
-      </w:r>
-      <w:proofErr w:type="spellEnd"/>
-    </w:p>
-    <w:p>
-      <w:pPr>
-        <w:rPr>
-          <w:b/>
-          <w:bCs/>
-        </w:rPr>
-      </w:pPr>
-      <w:r>
-        <w:rPr>
-          <w:b/>
-          <w:bCs/>
-        </w:rPr>
-        <w:t>Collaboration</w:t>
-      </w:r>
-    </w:p>
-    <w:p>
-      <w:proofErr w:type="spellStart"/>
-      <w:r>
-        <w:t>WorkflowInstance</w:t>
-      </w:r>
-      <w:proofErr w:type="spellEnd"/>
-      <w:r>
-        <w:t xml:space="preserve"> creates a </w:t>
-      </w:r>
-      <w:proofErr w:type="spellStart"/>
-      <w:r>
-        <w:t>WorkflowMemento</w:t>
-      </w:r>
-      <w:proofErr w:type="spellEnd"/>
-      <w:r>
-        <w:t xml:space="preserve"> containing its current state.</w:t>
-      </w:r>
-    </w:p>
-    <w:p>
-      <w:proofErr w:type="spellStart"/>
-      <w:r>
-        <w:t>WorkflowHistory</w:t>
-      </w:r>
-      <w:proofErr w:type="spellEnd"/>
-      <w:r>
-        <w:t xml:space="preserve"> stores the mementos and can provide an earlier state when required.</w:t>
-      </w:r>
-    </w:p>
-    <w:p>
-      <w:pPr>
-        <w:rPr>
-          <w:b/>
-          <w:bCs/>
-        </w:rPr>
-      </w:pPr>
-      <w:r>
-        <w:rPr>
-          <w:b/>
-          <w:bCs/>
-        </w:rPr>
-        <w:t>What Varies</w:t>
-      </w:r>
-    </w:p>
-    <w:p>
-      <w:r>
-        <w:t xml:space="preserve">The stored state of a </w:t>
-      </w:r>
-      <w:proofErr w:type="spellStart"/>
-      <w:r>
-        <w:t>WorkflowInstance</w:t>
-      </w:r>
-      <w:proofErr w:type="spellEnd"/>
-      <w:r>
-        <w:t xml:space="preserve"> over time.</w:t>
-      </w:r>
-    </w:p>
-    <w:p>
-      <w:pPr>
-        <w:rPr>
-          <w:b/>
-          <w:bCs/>
-        </w:rPr>
-      </w:pPr>
-      <w:r>
-        <w:rPr>
-          <w:b/>
-          <w:bCs/>
-        </w:rPr>
-        <w:t>Why It Is Appropriate</w:t>
-      </w:r>
-    </w:p>
-    <w:p>
-      <w:r>
-        <w:t>Memento allows TIVIDY to preserve previous states without exposing the internal details of the workflow object.</w:t>
-      </w:r>
-    </w:p>
-    <w:p>
-      <w:pPr>
-        <w:rPr>
-          <w:b/>
-          <w:bCs/>
-        </w:rPr>
-      </w:pPr>
-      <w:r>
-        <w:rPr>
-          <w:b/>
-          <w:bCs/>
-        </w:rPr>
-        <w:t>Workflow Justification</w:t>
-      </w:r>
-    </w:p>
-    <w:p>
-      <w:r>
-        <w:t xml:space="preserve">Workflow actions can be wrong: an item completed by mistake, a routing decision made on bad data, a failed email integration. Restoring a known-good state needs a snapshot taken </w:t>
-      </w:r>
-      <w:r>
-        <w:t xml:space="preserve">without exposing the internal state of </w:t>
-      </w:r>
-      <w:proofErr w:type="spellStart"/>
-      <w:r>
-        <w:t>WorkflowInstance</w:t>
-      </w:r>
-      <w:proofErr w:type="spellEnd"/>
-      <w:r>
-        <w:t>.</w:t>
-      </w:r>
-    </w:p>
-    <w:p>
-      <w:pPr>
-        <w:rPr>
-          <w:b/>
-          <w:bCs/>
-        </w:rPr>
-      </w:pPr>
-      <w:r>
-        <w:rPr>
-          <w:b/>
-          <w:bCs/>
-        </w:rPr>
-        <w:t>How It Connects</w:t>
-      </w:r>
-    </w:p>
-    <w:p>
-      <w:r>
-        <w:t xml:space="preserve">Memento is created and used through Command: before a reversible action the Command asks for a </w:t>
-      </w:r>
-      <w:proofErr w:type="spellStart"/>
-      <w:r>
-        <w:t>WorkflowMemento</w:t>
-      </w:r>
-      <w:proofErr w:type="spellEnd"/>
-      <w:r>
-        <w:t xml:space="preserve">, and on undo passes it back to restore the earlier state. </w:t>
-      </w:r>
-      <w:proofErr w:type="spellStart"/>
-      <w:r>
-        <w:t>WorkflowHistory</w:t>
-      </w:r>
-      <w:proofErr w:type="spellEnd"/>
-      <w:r>
-        <w:t xml:space="preserve"> stores the snapshots, so the audit trail can point to them.</w:t>
-      </w:r>
-    </w:p>
-    <w:p>
-      <w:pPr>
-        <w:rPr>
-          <w:b/>
-          <w:bCs/>
-          <w:sz w:val="22"/>
-          <w:szCs w:val="22"/>
-        </w:rPr>
-      </w:pPr>
-      <w:r>
-        <w:rPr>
-          <w:b/>
-          <w:bCs/>
-          <w:sz w:val="22"/>
-          <w:szCs w:val="22"/>
-        </w:rPr>
-        <w:t>11. Decorator Pattern</w:t>
-      </w:r>
-    </w:p>
-    <w:p>
-      <w:pPr>
-        <w:rPr>
-          <w:b/>
-          <w:bCs/>
-        </w:rPr>
-      </w:pPr>
-      <w:r>
-        <w:rPr>
-          <w:b/>
-          <w:bCs/>
-        </w:rPr>
-        <w:t>Design Problem</w:t>
-      </w:r>
-    </w:p>
-    <w:p>
-      <w:r>
+      <w:r>
+        <w:t xml:space="preserve">. State changes can notify Observers such as the history recorder, notification system and next-work-item activator. When routing is needed, the </w:t>
+      </w:r>
+      <w:proofErr w:type="spellStart"/>
+      <w:r>
+        <w:t>AssignmentStrategy</w:t>
+      </w:r>
+      <w:proofErr w:type="spellEnd"/>
+      <w:r>
+        <w:t xml:space="preserve"> is used, and when escalation is needed, the Chain of Responsibility is used. External communication is handled through the Adapter pattern, while the </w:t>
+      </w:r>
+      <w:proofErr w:type="spellStart"/>
+      <w:r>
+        <w:t>TIVIDYFacade</w:t>
+      </w:r>
+      <w:proofErr w:type="spellEnd"/>
+      <w:r>
+        <w:t xml:space="preserve"> provides the main interface to the system.</w:t>
+      </w:r>
+    </w:p>
+    <w:p>
+      <w:r>
+        <w:t>In short: Builder constructs, Composite structures, State governs, Strategy routes, Decorator adds behaviour, Observer reacts, Command performs actions, Memento restores, Adapter integrates, Chain of Responsibility escalates and Facade unifies.</w:t>
+      </w:r>
+    </w:p>
+    <w:p>
+      <w:pPr>
+        <w:pStyle w:val="Heading1"/>
+        <w:rPr>
+          <w:color w:val="0070C0"/>
+        </w:rPr>
+      </w:pPr>
+      <w:r>
+        <w:rPr>
+          <w:color w:val="0070C0"/>
+        </w:rPr>
+        <w:t>TASK 6:</w:t>
+      </w:r>
+    </w:p>
+    <w:p/>
+    <w:p>
+      <w:r>
+        <w:rPr>
+          <w:noProof/>
+        </w:rPr>
         <w:lastRenderedPageBreak/>
-        <w:t>Work items sometimes need extra behaviour without becoming a different kind of work item.</w:t>
-      </w:r>
-    </w:p>
-    <w:p>
-      <w:r>
-        <w:t>For example, a work item may need to</w:t>
-      </w:r>
-      <w:r>
-        <w:t xml:space="preserve"> be </w:t>
-      </w:r>
-      <w:r>
-        <w:t>treated as urgent (priority handling)</w:t>
-      </w:r>
-      <w:r>
-        <w:t>.</w:t>
-      </w:r>
-    </w:p>
-    <w:p>
-      <w:r>
-        <w:t xml:space="preserve">Creating a separate </w:t>
-      </w:r>
-      <w:proofErr w:type="spellStart"/>
-      <w:r>
-        <w:t>WorkItem</w:t>
-      </w:r>
-      <w:proofErr w:type="spellEnd"/>
-      <w:r>
-        <w:t xml:space="preserve"> subclass only to represent priority would unnecessarily increase the number of classes.</w:t>
-      </w:r>
-    </w:p>
-    <w:p>
-      <w:pPr>
-        <w:rPr>
-          <w:b/>
-          <w:bCs/>
-        </w:rPr>
-      </w:pPr>
-      <w:r>
-        <w:rPr>
-          <w:b/>
-          <w:bCs/>
-        </w:rPr>
-        <w:t>Possible Classes</w:t>
-      </w:r>
-    </w:p>
-    <w:p>
-      <w:proofErr w:type="spellStart"/>
-      <w:r>
-        <w:t>WorkflowComponent</w:t>
-      </w:r>
-      <w:proofErr w:type="spellEnd"/>
-    </w:p>
-    <w:p>
-      <w:proofErr w:type="spellStart"/>
-      <w:r>
-        <w:t>WorkItem</w:t>
-      </w:r>
-      <w:proofErr w:type="spellEnd"/>
-    </w:p>
-    <w:p>
-      <w:proofErr w:type="spellStart"/>
-      <w:r>
-        <w:t>WorkItemDecorator</w:t>
-      </w:r>
-      <w:proofErr w:type="spellEnd"/>
-    </w:p>
-    <w:p>
-      <w:proofErr w:type="spellStart"/>
-      <w:r>
-        <w:t>PriorityDecorator</w:t>
-      </w:r>
-      <w:proofErr w:type="spellEnd"/>
-    </w:p>
-    <w:p>
-      <w:pPr>
-        <w:rPr>
-          <w:b/>
-          <w:bCs/>
-        </w:rPr>
-      </w:pPr>
-      <w:r>
-        <w:rPr>
-          <w:b/>
-          <w:bCs/>
-        </w:rPr>
-        <w:t>Collaboration</w:t>
-      </w:r>
-    </w:p>
-    <w:p>
-      <w:r>
-        <w:t xml:space="preserve">A </w:t>
-      </w:r>
-      <w:proofErr w:type="spellStart"/>
-      <w:r>
-        <w:t>WorkItemDecorator</w:t>
-      </w:r>
-      <w:proofErr w:type="spellEnd"/>
-      <w:r>
-        <w:t xml:space="preserve"> holds a </w:t>
-      </w:r>
-      <w:proofErr w:type="spellStart"/>
-      <w:r>
-        <w:t>WorkflowComponent</w:t>
-      </w:r>
-      <w:proofErr w:type="spellEnd"/>
-      <w:r>
-        <w:t xml:space="preserve"> and implements the same interface. It adds its own behaviour before or after passing the request to the wrapped component. </w:t>
-      </w:r>
-      <w:r>
-        <w:t xml:space="preserve">A </w:t>
-      </w:r>
-      <w:proofErr w:type="spellStart"/>
-      <w:r>
-        <w:t>PriorityDecorator</w:t>
-      </w:r>
-      <w:proofErr w:type="spellEnd"/>
-      <w:r>
-        <w:t xml:space="preserve"> wraps a work item and adds priority behaviour without changing the original </w:t>
-      </w:r>
-      <w:proofErr w:type="spellStart"/>
-      <w:r>
-        <w:t>WorkItem</w:t>
-      </w:r>
-      <w:proofErr w:type="spellEnd"/>
-      <w:r>
-        <w:t xml:space="preserve"> class.</w:t>
-      </w:r>
-    </w:p>
-    <w:p>
-      <w:pPr>
-        <w:rPr>
-          <w:b/>
-          <w:bCs/>
-        </w:rPr>
-      </w:pPr>
-      <w:r>
-        <w:rPr>
-          <w:b/>
-          <w:bCs/>
-        </w:rPr>
-        <w:t>What Varies</w:t>
-      </w:r>
-    </w:p>
-    <w:p>
-      <w:r>
-        <w:t>Which work items require priority behaviour.</w:t>
-      </w:r>
-    </w:p>
-    <w:p>
-      <w:pPr>
-        <w:rPr>
-          <w:b/>
-          <w:bCs/>
-        </w:rPr>
-      </w:pPr>
-      <w:r>
-        <w:rPr>
-          <w:b/>
-          <w:bCs/>
-        </w:rPr>
-        <w:t>Why It Is Appropriate</w:t>
-      </w:r>
-    </w:p>
-    <w:p>
-      <w:r>
-        <w:t xml:space="preserve">Decorator allows priority behaviour to be added to a work item without changing the </w:t>
-      </w:r>
-      <w:proofErr w:type="spellStart"/>
-      <w:r>
-        <w:t>WorkItem</w:t>
-      </w:r>
-      <w:proofErr w:type="spellEnd"/>
-      <w:r>
-        <w:t xml:space="preserve"> class or creating a separate priority-specific work item class.</w:t>
-      </w:r>
-    </w:p>
-    <w:p>
-      <w:pPr>
-        <w:rPr>
-          <w:b/>
-          <w:bCs/>
-        </w:rPr>
-      </w:pPr>
-      <w:r>
-        <w:rPr>
-          <w:b/>
-          <w:bCs/>
-        </w:rPr>
-        <w:t>Workflow Justification</w:t>
-      </w:r>
-    </w:p>
-    <w:p>
-      <w:r>
-        <w:t xml:space="preserve">In the complaint scenario, a complaint that affects an upcoming exam may need priority handling. Rather than creating a special type of </w:t>
-      </w:r>
-      <w:proofErr w:type="spellStart"/>
-      <w:r>
-        <w:t>WorkItem</w:t>
-      </w:r>
-      <w:proofErr w:type="spellEnd"/>
-      <w:r>
-        <w:t xml:space="preserve">, </w:t>
-      </w:r>
-      <w:proofErr w:type="spellStart"/>
-      <w:r>
-        <w:t>PriorityDecorator</w:t>
-      </w:r>
-      <w:proofErr w:type="spellEnd"/>
-      <w:r>
-        <w:t xml:space="preserve"> can add priority behaviour to the existing work item. Priority handling belongs here rather than in Strategy because it adds behaviour to a work item instead of deciding who receives it.</w:t>
-      </w:r>
-    </w:p>
-    <w:p>
-      <w:pPr>
-        <w:rPr>
-          <w:b/>
-          <w:bCs/>
-        </w:rPr>
-      </w:pPr>
-      <w:r>
-        <w:rPr>
-          <w:b/>
-          <w:bCs/>
-        </w:rPr>
-        <w:t>How It Connects</w:t>
-      </w:r>
-    </w:p>
-    <w:p>
-      <w:proofErr w:type="spellStart"/>
-      <w:r>
-        <w:t>PriorityDecorator</w:t>
-      </w:r>
-      <w:proofErr w:type="spellEnd"/>
-      <w:r>
-        <w:t xml:space="preserve"> uses the same </w:t>
-      </w:r>
-      <w:proofErr w:type="spellStart"/>
-      <w:r>
-        <w:t>WorkflowComponent</w:t>
-      </w:r>
-      <w:proofErr w:type="spellEnd"/>
-      <w:r>
-        <w:t xml:space="preserve"> interface as the wrapped </w:t>
-      </w:r>
-      <w:proofErr w:type="spellStart"/>
-      <w:r>
-        <w:t>WorkItem</w:t>
-      </w:r>
-      <w:proofErr w:type="spellEnd"/>
-      <w:r>
-        <w:t xml:space="preserve">. It exposes priority information that the </w:t>
-      </w:r>
-      <w:proofErr w:type="spellStart"/>
-      <w:r>
-        <w:t>AssignmentStrategy</w:t>
-      </w:r>
-      <w:proofErr w:type="spellEnd"/>
-      <w:r>
-        <w:t xml:space="preserve"> can consider when selecting a participant, and the Builder can apply the decorator when constructing the </w:t>
-      </w:r>
-      <w:proofErr w:type="spellStart"/>
-      <w:r>
-        <w:t>WorkflowDefinition</w:t>
-      </w:r>
-      <w:proofErr w:type="spellEnd"/>
-      <w:r>
-        <w:t>.</w:t>
-      </w:r>
-    </w:p>
-    <w:p>
-      <w:pPr>
-        <w:rPr>
-          <w:b/>
-          <w:bCs/>
-          <w:sz w:val="22"/>
-          <w:szCs w:val="22"/>
-        </w:rPr>
-      </w:pPr>
-      <w:r>
-        <w:rPr>
-          <w:b/>
-          <w:bCs/>
-          <w:sz w:val="22"/>
-          <w:szCs w:val="22"/>
-        </w:rPr>
-        <w:t>How the Patterns Work Together</w:t>
-      </w:r>
-    </w:p>
-    <w:p>
-      <w:r>
-        <w:t xml:space="preserve">The patterns above form one connected engine rather than eleven separate demonstrations. The Builder assembles a </w:t>
-      </w:r>
-      <w:proofErr w:type="spellStart"/>
-      <w:r>
-        <w:t>WorkflowDefinition</w:t>
-      </w:r>
-      <w:proofErr w:type="spellEnd"/>
-      <w:r>
-        <w:t xml:space="preserve"> containing a Composite structure of work, an </w:t>
-      </w:r>
-      <w:proofErr w:type="spellStart"/>
-      <w:r>
-        <w:t>AssignmentStrategy</w:t>
-      </w:r>
-      <w:proofErr w:type="spellEnd"/>
-      <w:r>
-        <w:t xml:space="preserve">, </w:t>
-      </w:r>
-      <w:r>
-        <w:t xml:space="preserve">an escalation Chain of Responsibility and a </w:t>
-      </w:r>
-      <w:proofErr w:type="spellStart"/>
-      <w:r>
-        <w:t>PriorityDecorator</w:t>
-      </w:r>
-      <w:proofErr w:type="spellEnd"/>
-      <w:r>
-        <w:t xml:space="preserve"> where required</w:t>
-      </w:r>
-      <w:r>
-        <w:t xml:space="preserve">. When a workflow is run, the definition is used to create an independent </w:t>
-      </w:r>
-      <w:proofErr w:type="spellStart"/>
-      <w:r>
-        <w:t>WorkflowInstance</w:t>
-      </w:r>
-      <w:proofErr w:type="spellEnd"/>
-      <w:r>
-        <w:t>, which is governed by the State pattern.</w:t>
-      </w:r>
-    </w:p>
-    <w:p>
-      <w:r>
-        <w:t xml:space="preserve">Every action on a running instance is represented as a Command. Before a reversible action, the Command can create a Memento, and execution may change the state of the </w:t>
-      </w:r>
-      <w:proofErr w:type="spellStart"/>
-      <w:r>
-        <w:t>WorkflowInstance</w:t>
-      </w:r>
-      <w:proofErr w:type="spellEnd"/>
-      <w:r>
-        <w:t xml:space="preserve">. State changes can notify Observers such as the history recorder, notification system and next-work-item activator. When routing is needed, the </w:t>
-      </w:r>
-      <w:proofErr w:type="spellStart"/>
-      <w:r>
-        <w:t>AssignmentStrategy</w:t>
-      </w:r>
-      <w:proofErr w:type="spellEnd"/>
-      <w:r>
-        <w:t xml:space="preserve"> is used, and when escalation is needed, the Chain of Responsibility is used. External communication is handled through the Adapter pattern, while the </w:t>
-      </w:r>
-      <w:proofErr w:type="spellStart"/>
-      <w:r>
-        <w:t>TIVIDYFacade</w:t>
-      </w:r>
-      <w:proofErr w:type="spellEnd"/>
-      <w:r>
-        <w:t xml:space="preserve"> provides the main interface to the system.</w:t>
-      </w:r>
-    </w:p>
-    <w:p>
-      <w:r>
-        <w:lastRenderedPageBreak/>
-        <w:t>In short: Builder constructs, Composite structures, State governs, Strategy routes, Decorator adds behaviour, Observer reacts, Command performs actions, Memento restores, Adapter integrates, Chain of Responsibility escalates and Facade unifies.</w:t>
-      </w:r>
-    </w:p>
-    <w:p>
-      <w:pPr>
-        <w:pStyle w:val="Heading1"/>
-        <w:rPr>
-          <w:color w:val="0070C0"/>
-        </w:rPr>
-      </w:pPr>
-      <w:r>
-        <w:rPr>
-          <w:color w:val="0070C0"/>
-        </w:rPr>
-        <w:t xml:space="preserve">TASK </w:t>
-      </w:r>
-      <w:r>
-        <w:rPr>
-          <w:color w:val="0070C0"/>
-        </w:rPr>
-        <w:t>6:</w:t>
-      </w:r>
-    </w:p>
-    <w:p/>
-    <w:p>
-      <w:r>
-        <w:rPr>
-          <w:noProof/>
-        </w:rPr>
         <w:drawing>
           <wp:inline distT="0" distB="0" distL="0" distR="0" wp14:anchorId="70D25404" wp14:editId="4FEE1EA1">
             <wp:extent cx="5731510" cy="3020695"/>
@@ -5405,7 +5655,7 @@
                     <pic:cNvPicPr/>
                   </pic:nvPicPr>
                   <pic:blipFill>
-                    <a:blip r:embed="rId9"/>
+                    <a:blip r:embed="rId12"/>
                     <a:stretch>
                       <a:fillRect/>
                     </a:stretch>
@@ -5672,7 +5922,7 @@
                     <pic:cNvPicPr/>
                   </pic:nvPicPr>
                   <pic:blipFill>
-                    <a:blip r:embed="rId10"/>
+                    <a:blip r:embed="rId13"/>
                     <a:stretch>
                       <a:fillRect/>
                     </a:stretch>
@@ -6073,7 +6323,7 @@
                     <pic:cNvPicPr/>
                   </pic:nvPicPr>
                   <pic:blipFill>
-                    <a:blip r:embed="rId11"/>
+                    <a:blip r:embed="rId14"/>
                     <a:stretch>
                       <a:fillRect/>
                     </a:stretch>
@@ -6210,7 +6460,7 @@
     </w:p>
     <w:p/>
     <w:sectPr>
-      <w:headerReference w:type="default" r:id="rId12"/>
+      <w:headerReference w:type="default" r:id="rId15"/>
       <w:pgSz w:w="11906" w:h="16838"/>
       <w:pgMar w:top="1440" w:right="1440" w:bottom="1440" w:left="1440" w:header="708" w:footer="708" w:gutter="0"/>
       <w:cols w:space="708"/>
@@ -6345,6 +6595,7 @@
                             <w:dataBinding w:prefixMappings="xmlns:ns0='http://purl.org/dc/elements/1.1/' xmlns:ns1='http://schemas.openxmlformats.org/package/2006/metadata/core-properties' " w:xpath="/ns1:coreProperties[1]/ns0:title[1]" w:storeItemID="{6C3C8BC8-F283-45AE-878A-BAB7291924A1}"/>
                             <w:text/>
                           </w:sdtPr>
+                          <w:sdtEndPr/>
                           <w:sdtContent>
                             <w:p>
                               <w:pPr>
@@ -6409,6 +6660,7 @@
                       <w:dataBinding w:prefixMappings="xmlns:ns0='http://purl.org/dc/elements/1.1/' xmlns:ns1='http://schemas.openxmlformats.org/package/2006/metadata/core-properties' " w:xpath="/ns1:coreProperties[1]/ns0:title[1]" w:storeItemID="{6C3C8BC8-F283-45AE-878A-BAB7291924A1}"/>
                       <w:text/>
                     </w:sdtPr>
+                    <w:sdtEndPr/>
                     <w:sdtContent>
                       <w:p>
                         <w:pPr>

</xml_diff>

<commit_message>
Added Task 3 diagrams to pdf
</commit_message>
<xml_diff>
--- a/docs/214 PDF document.docx
+++ b/docs/214 PDF document.docx
@@ -234,15 +234,15 @@
     </w:p>
     <w:p>
       <w:r>
-        <w:t xml:space="preserve">IBM defines a workflow as [1] a system for managing repetitive processes and tasks which occur in a particular order. They are the mechanism by which people and enterprises accomplish their work. Simply, a workflow is a repeatable sequence of steps that moves a process from start to finish. Workflow management systems are [2] systems designed to assist groups of people in carrying out work processes, and contain organizational knowledge of where </w:t>
+        <w:t xml:space="preserve">IBM defines a workflow as [1] a system for managing repetitive processes and tasks which occur in a particular order. They are the mechanism by which people and enterprises accomplish their work. Simply, a workflow is a repeatable sequence of steps that moves a process from start to finish. Workflow management systems are [2] systems designed to assist groups of people in carrying out work </w:t>
       </w:r>
       <w:proofErr w:type="gramStart"/>
       <w:r>
-        <w:t>work flows</w:t>
+        <w:t>processes, and</w:t>
       </w:r>
       <w:proofErr w:type="gramEnd"/>
       <w:r>
-        <w:t xml:space="preserve"> in the default case. </w:t>
+        <w:t xml:space="preserve"> contain organizational knowledge of where work flows in the default case. </w:t>
       </w:r>
     </w:p>
     <w:p>
@@ -1589,6 +1589,80 @@
     <w:p/>
     <w:p>
       <w:pPr>
+        <w:pStyle w:val="Heading1"/>
+        <w:rPr>
+          <w:color w:val="0070C0"/>
+        </w:rPr>
+      </w:pPr>
+      <w:r>
+        <w:rPr>
+          <w:color w:val="0070C0"/>
+        </w:rPr>
+        <w:t xml:space="preserve">TASK </w:t>
+      </w:r>
+      <w:r>
+        <w:rPr>
+          <w:color w:val="0070C0"/>
+        </w:rPr>
+        <w:t>3</w:t>
+      </w:r>
+    </w:p>
+    <w:p/>
+    <w:p>
+      <w:r>
+        <w:t>Activity Diagram 1</w:t>
+      </w:r>
+    </w:p>
+    <w:p>
+      <w:r>
+        <w:rPr>
+          <w:noProof/>
+        </w:rPr>
+        <w:drawing>
+          <wp:inline distT="0" distB="0" distL="0" distR="0" wp14:anchorId="7BBF16BF" wp14:editId="4F50B876">
+            <wp:extent cx="5731510" cy="2695575"/>
+            <wp:effectExtent l="0" t="0" r="2540" b="9525"/>
+            <wp:docPr id="652460828" name="Picture 2"/>
+            <wp:cNvGraphicFramePr>
+              <a:graphicFrameLocks xmlns:a="http://schemas.openxmlformats.org/drawingml/2006/main" noChangeAspect="1"/>
+            </wp:cNvGraphicFramePr>
+            <a:graphic xmlns:a="http://schemas.openxmlformats.org/drawingml/2006/main">
+              <a:graphicData uri="http://schemas.openxmlformats.org/drawingml/2006/picture">
+                <pic:pic xmlns:pic="http://schemas.openxmlformats.org/drawingml/2006/picture">
+                  <pic:nvPicPr>
+                    <pic:cNvPr id="652460828" name="Picture 652460828"/>
+                    <pic:cNvPicPr/>
+                  </pic:nvPicPr>
+                  <pic:blipFill>
+                    <a:blip r:embed="rId9" cstate="print">
+                      <a:extLst>
+                        <a:ext uri="{28A0092B-C50C-407E-A947-70E740481C1C}">
+                          <a14:useLocalDpi xmlns:a14="http://schemas.microsoft.com/office/drawing/2010/main" val="0"/>
+                        </a:ext>
+                      </a:extLst>
+                    </a:blip>
+                    <a:stretch>
+                      <a:fillRect/>
+                    </a:stretch>
+                  </pic:blipFill>
+                  <pic:spPr>
+                    <a:xfrm>
+                      <a:off x="0" y="0"/>
+                      <a:ext cx="5731510" cy="2695575"/>
+                    </a:xfrm>
+                    <a:prstGeom prst="rect">
+                      <a:avLst/>
+                    </a:prstGeom>
+                  </pic:spPr>
+                </pic:pic>
+              </a:graphicData>
+            </a:graphic>
+          </wp:inline>
+        </w:drawing>
+      </w:r>
+    </w:p>
+    <w:p>
+      <w:pPr>
         <w:rPr>
           <w:b/>
           <w:bCs/>
@@ -1676,16 +1750,16 @@
           <w:szCs w:val="22"/>
         </w:rPr>
       </w:pPr>
-    </w:p>
-    <w:p>
-      <w:pPr>
+      <w:r>
         <w:rPr>
           <w:b/>
           <w:bCs/>
           <w:sz w:val="22"/>
           <w:szCs w:val="22"/>
         </w:rPr>
-      </w:pPr>
+        <w:lastRenderedPageBreak/>
+        <w:t>Activity Diagram 2</w:t>
+      </w:r>
     </w:p>
     <w:p>
       <w:pPr>
@@ -1696,16 +1770,56 @@
           <w:szCs w:val="22"/>
         </w:rPr>
       </w:pPr>
-    </w:p>
-    <w:p>
-      <w:pPr>
-        <w:rPr>
-          <w:b/>
-          <w:bCs/>
+      <w:r>
+        <w:rPr>
+          <w:b/>
+          <w:bCs/>
+          <w:noProof/>
           <w:sz w:val="22"/>
           <w:szCs w:val="22"/>
         </w:rPr>
-      </w:pPr>
+        <w:drawing>
+          <wp:inline distT="0" distB="0" distL="0" distR="0" wp14:anchorId="5350054F" wp14:editId="0808A93A">
+            <wp:extent cx="4358640" cy="8272763"/>
+            <wp:effectExtent l="0" t="0" r="3810" b="0"/>
+            <wp:docPr id="7220520" name="Picture 3"/>
+            <wp:cNvGraphicFramePr>
+              <a:graphicFrameLocks xmlns:a="http://schemas.openxmlformats.org/drawingml/2006/main" noChangeAspect="1"/>
+            </wp:cNvGraphicFramePr>
+            <a:graphic xmlns:a="http://schemas.openxmlformats.org/drawingml/2006/main">
+              <a:graphicData uri="http://schemas.openxmlformats.org/drawingml/2006/picture">
+                <pic:pic xmlns:pic="http://schemas.openxmlformats.org/drawingml/2006/picture">
+                  <pic:nvPicPr>
+                    <pic:cNvPr id="7220520" name="Picture 7220520"/>
+                    <pic:cNvPicPr/>
+                  </pic:nvPicPr>
+                  <pic:blipFill>
+                    <a:blip r:embed="rId10" cstate="print">
+                      <a:extLst>
+                        <a:ext uri="{28A0092B-C50C-407E-A947-70E740481C1C}">
+                          <a14:useLocalDpi xmlns:a14="http://schemas.microsoft.com/office/drawing/2010/main" val="0"/>
+                        </a:ext>
+                      </a:extLst>
+                    </a:blip>
+                    <a:stretch>
+                      <a:fillRect/>
+                    </a:stretch>
+                  </pic:blipFill>
+                  <pic:spPr>
+                    <a:xfrm>
+                      <a:off x="0" y="0"/>
+                      <a:ext cx="4365830" cy="8286409"/>
+                    </a:xfrm>
+                    <a:prstGeom prst="rect">
+                      <a:avLst/>
+                    </a:prstGeom>
+                  </pic:spPr>
+                </pic:pic>
+              </a:graphicData>
+            </a:graphic>
+          </wp:inline>
+        </w:drawing>
+      </w:r>
     </w:p>
     <w:p>
       <w:pPr>
@@ -1726,16 +1840,16 @@
           <w:szCs w:val="22"/>
         </w:rPr>
       </w:pPr>
-    </w:p>
-    <w:p>
-      <w:pPr>
+      <w:r>
         <w:rPr>
           <w:b/>
           <w:bCs/>
           <w:sz w:val="22"/>
           <w:szCs w:val="22"/>
         </w:rPr>
-      </w:pPr>
+        <w:lastRenderedPageBreak/>
+        <w:t>Activity Diagram 3</w:t>
+      </w:r>
     </w:p>
     <w:p>
       <w:pPr>
@@ -1746,66 +1860,56 @@
           <w:szCs w:val="22"/>
         </w:rPr>
       </w:pPr>
-    </w:p>
-    <w:p>
-      <w:pPr>
-        <w:rPr>
-          <w:b/>
-          <w:bCs/>
+      <w:r>
+        <w:rPr>
+          <w:b/>
+          <w:bCs/>
+          <w:noProof/>
           <w:sz w:val="22"/>
           <w:szCs w:val="22"/>
         </w:rPr>
-      </w:pPr>
-    </w:p>
-    <w:p>
-      <w:pPr>
-        <w:rPr>
-          <w:b/>
-          <w:bCs/>
-          <w:sz w:val="22"/>
-          <w:szCs w:val="22"/>
-        </w:rPr>
-      </w:pPr>
-    </w:p>
-    <w:p>
-      <w:pPr>
-        <w:rPr>
-          <w:b/>
-          <w:bCs/>
-          <w:sz w:val="22"/>
-          <w:szCs w:val="22"/>
-        </w:rPr>
-      </w:pPr>
-    </w:p>
-    <w:p>
-      <w:pPr>
-        <w:rPr>
-          <w:b/>
-          <w:bCs/>
-          <w:sz w:val="22"/>
-          <w:szCs w:val="22"/>
-        </w:rPr>
-      </w:pPr>
-    </w:p>
-    <w:p>
-      <w:pPr>
-        <w:rPr>
-          <w:b/>
-          <w:bCs/>
-          <w:sz w:val="22"/>
-          <w:szCs w:val="22"/>
-        </w:rPr>
-      </w:pPr>
-    </w:p>
-    <w:p>
-      <w:pPr>
-        <w:rPr>
-          <w:b/>
-          <w:bCs/>
-          <w:sz w:val="22"/>
-          <w:szCs w:val="22"/>
-        </w:rPr>
-      </w:pPr>
+        <w:drawing>
+          <wp:inline distT="0" distB="0" distL="0" distR="0" wp14:anchorId="68A531D1" wp14:editId="61A813B3">
+            <wp:extent cx="4396740" cy="8388423"/>
+            <wp:effectExtent l="0" t="0" r="3810" b="0"/>
+            <wp:docPr id="1189055709" name="Picture 4"/>
+            <wp:cNvGraphicFramePr>
+              <a:graphicFrameLocks xmlns:a="http://schemas.openxmlformats.org/drawingml/2006/main" noChangeAspect="1"/>
+            </wp:cNvGraphicFramePr>
+            <a:graphic xmlns:a="http://schemas.openxmlformats.org/drawingml/2006/main">
+              <a:graphicData uri="http://schemas.openxmlformats.org/drawingml/2006/picture">
+                <pic:pic xmlns:pic="http://schemas.openxmlformats.org/drawingml/2006/picture">
+                  <pic:nvPicPr>
+                    <pic:cNvPr id="1189055709" name="Picture 1189055709"/>
+                    <pic:cNvPicPr/>
+                  </pic:nvPicPr>
+                  <pic:blipFill>
+                    <a:blip r:embed="rId11" cstate="print">
+                      <a:extLst>
+                        <a:ext uri="{28A0092B-C50C-407E-A947-70E740481C1C}">
+                          <a14:useLocalDpi xmlns:a14="http://schemas.microsoft.com/office/drawing/2010/main" val="0"/>
+                        </a:ext>
+                      </a:extLst>
+                    </a:blip>
+                    <a:stretch>
+                      <a:fillRect/>
+                    </a:stretch>
+                  </pic:blipFill>
+                  <pic:spPr>
+                    <a:xfrm>
+                      <a:off x="0" y="0"/>
+                      <a:ext cx="4401152" cy="8396840"/>
+                    </a:xfrm>
+                    <a:prstGeom prst="rect">
+                      <a:avLst/>
+                    </a:prstGeom>
+                  </pic:spPr>
+                </pic:pic>
+              </a:graphicData>
+            </a:graphic>
+          </wp:inline>
+        </w:drawing>
+      </w:r>
     </w:p>
     <w:p>
       <w:pPr>
@@ -5296,19 +5400,7 @@
         <w:rPr>
           <w:color w:val="0070C0"/>
         </w:rPr>
-        <w:t xml:space="preserve">TASK </w:t>
-      </w:r>
-      <w:r>
-        <w:rPr>
-          <w:color w:val="0070C0"/>
-        </w:rPr>
-        <w:t>5</w:t>
-      </w:r>
-      <w:r>
-        <w:rPr>
-          <w:color w:val="0070C0"/>
-        </w:rPr>
-        <w:t>:</w:t>
+        <w:t>TASK 5:</w:t>
       </w:r>
     </w:p>
     <w:p>
@@ -5353,6 +5445,7 @@
         <w:rPr>
           <w:b/>
           <w:bCs/>
+          <w:noProof/>
           <w:sz w:val="22"/>
           <w:szCs w:val="22"/>
         </w:rPr>
@@ -5382,7 +5475,7 @@
                     </pic:cNvPicPr>
                   </pic:nvPicPr>
                   <pic:blipFill>
-                    <a:blip r:embed="rId9" cstate="print">
+                    <a:blip r:embed="rId12" cstate="print">
                       <a:extLst>
                         <a:ext uri="{28A0092B-C50C-407E-A947-70E740481C1C}">
                           <a14:useLocalDpi xmlns:a14="http://schemas.microsoft.com/office/drawing/2010/main" val="0"/>
@@ -5477,7 +5570,7 @@
                     <pic:cNvPicPr/>
                   </pic:nvPicPr>
                   <pic:blipFill>
-                    <a:blip r:embed="rId10"/>
+                    <a:blip r:embed="rId13"/>
                     <a:stretch>
                       <a:fillRect/>
                     </a:stretch>
@@ -5744,7 +5837,7 @@
                     <pic:cNvPicPr/>
                   </pic:nvPicPr>
                   <pic:blipFill>
-                    <a:blip r:embed="rId11"/>
+                    <a:blip r:embed="rId14"/>
                     <a:stretch>
                       <a:fillRect/>
                     </a:stretch>
@@ -6136,7 +6229,7 @@
                     <pic:cNvPicPr/>
                   </pic:nvPicPr>
                   <pic:blipFill>
-                    <a:blip r:embed="rId12"/>
+                    <a:blip r:embed="rId15"/>
                     <a:stretch>
                       <a:fillRect/>
                     </a:stretch>
@@ -6273,7 +6366,7 @@
     </w:p>
     <w:p/>
     <w:sectPr>
-      <w:headerReference w:type="default" r:id="rId13"/>
+      <w:headerReference w:type="default" r:id="rId16"/>
       <w:pgSz w:w="11906" w:h="16838"/>
       <w:pgMar w:top="1440" w:right="1440" w:bottom="1440" w:left="1440" w:header="708" w:footer="708" w:gutter="0"/>
       <w:cols w:space="708"/>
@@ -6408,6 +6501,7 @@
                             <w:dataBinding w:prefixMappings="xmlns:ns0='http://purl.org/dc/elements/1.1/' xmlns:ns1='http://schemas.openxmlformats.org/package/2006/metadata/core-properties' " w:xpath="/ns1:coreProperties[1]/ns0:title[1]" w:storeItemID="{6C3C8BC8-F283-45AE-878A-BAB7291924A1}"/>
                             <w:text/>
                           </w:sdtPr>
+                          <w:sdtEndPr/>
                           <w:sdtContent>
                             <w:p>
                               <w:pPr>
@@ -6472,6 +6566,7 @@
                       <w:dataBinding w:prefixMappings="xmlns:ns0='http://purl.org/dc/elements/1.1/' xmlns:ns1='http://schemas.openxmlformats.org/package/2006/metadata/core-properties' " w:xpath="/ns1:coreProperties[1]/ns0:title[1]" w:storeItemID="{6C3C8BC8-F283-45AE-878A-BAB7291924A1}"/>
                       <w:text/>
                     </w:sdtPr>
+                    <w:sdtEndPr/>
                     <w:sdtContent>
                       <w:p>
                         <w:pPr>
@@ -11925,6 +12020,7 @@
   <w:style w:type="character" w:default="1" w:styleId="DefaultParagraphFont">
     <w:name w:val="Default Paragraph Font"/>
     <w:uiPriority w:val="1"/>
+    <w:semiHidden/>
     <w:unhideWhenUsed/>
   </w:style>
   <w:style w:type="table" w:default="1" w:styleId="TableNormal">

</xml_diff>

<commit_message>
updated the doc with the woork contribution
</commit_message>
<xml_diff>
--- a/docs/214 PDF document.docx
+++ b/docs/214 PDF document.docx
@@ -184,6 +184,33 @@
       <w:pPr>
         <w:pStyle w:val="Heading1"/>
       </w:pPr>
+    </w:p>
+    <w:p>
+      <w:proofErr w:type="spellStart"/>
+      <w:r>
+        <w:rPr>
+          <w:b/>
+          <w:bCs/>
+          <w:sz w:val="24"/>
+          <w:szCs w:val="24"/>
+        </w:rPr>
+        <w:t>Github</w:t>
+      </w:r>
+      <w:proofErr w:type="spellEnd"/>
+      <w:r>
+        <w:rPr>
+          <w:b/>
+          <w:bCs/>
+          <w:sz w:val="24"/>
+          <w:szCs w:val="24"/>
+        </w:rPr>
+        <w:t xml:space="preserve"> repo link: </w:t>
+      </w:r>
+    </w:p>
+    <w:p>
+      <w:r>
+        <w:t>https://github.com/Kristy2005/TIVIDY-Prac6</w:t>
+      </w:r>
     </w:p>
     <w:p/>
     <w:p/>
@@ -197,7 +224,6 @@
     <w:p/>
     <w:p/>
     <w:p/>
-    <w:p/>
     <w:p>
       <w:pPr>
         <w:pStyle w:val="Heading1"/>
@@ -234,28 +260,12 @@
     </w:p>
     <w:p>
       <w:r>
-        <w:t xml:space="preserve">IBM defines a workflow as [1] a system for managing repetitive processes and tasks which occur in a particular order. They are the mechanism by which people and enterprises accomplish their work. Simply, a workflow is a repeatable sequence of steps that moves a process from start to finish. Workflow management systems are [2] systems designed to assist groups of people in carrying out work processes, and contain organizational knowledge of where </w:t>
-      </w:r>
-      <w:proofErr w:type="gramStart"/>
-      <w:r>
-        <w:t>work flows</w:t>
-      </w:r>
-      <w:proofErr w:type="gramEnd"/>
-      <w:r>
-        <w:t xml:space="preserve"> in the default case. </w:t>
-      </w:r>
-    </w:p>
-    <w:p>
-      <w:r>
-        <w:t xml:space="preserve">A workflow definition is [3] a template or blueprint for a </w:t>
-      </w:r>
-      <w:proofErr w:type="gramStart"/>
-      <w:r>
-        <w:t>process</w:t>
-      </w:r>
-      <w:proofErr w:type="gramEnd"/>
-      <w:r>
-        <w:t xml:space="preserve"> and a running workflow instance is [4] a single active execution of the template. Activities and work items are typically represented as [5] distinct nodes, data structures or objects that define and track how work moves in the system. Work items are generally assigned on a hierarchical basis where a “principal” (usually a customer or a boss) assigns a work item which are received can be passed down the hierarchy [6]. Approvals, rejections and escalations are usually based on human interaction, algorithms, timers or escalation events [7]. </w:t>
+        <w:t xml:space="preserve">IBM defines a workflow as [1] a system for managing repetitive processes and tasks which occur in a particular order. They are the mechanism by which people and enterprises accomplish their work. Simply, a workflow is a repeatable sequence of steps that moves a process from start to finish. Workflow management systems are [2] systems designed to assist groups of people in carrying out work processes, and contain organizational knowledge of where work flows in the default case. </w:t>
+      </w:r>
+    </w:p>
+    <w:p>
+      <w:r>
+        <w:t xml:space="preserve">A workflow definition is [3] a template or blueprint for a process and a running workflow instance is [4] a single active execution of the template. Activities and work items are typically represented as [5] distinct nodes, data structures or objects that define and track how work moves in the system. Work items are generally assigned on a hierarchical basis where a “principal” (usually a customer or a boss) assigns a work item which are received can be passed down the hierarchy [6]. Approvals, rejections and escalations are usually based on human interaction, algorithms, timers or escalation events [7]. </w:t>
       </w:r>
     </w:p>
     <w:p>
@@ -270,36 +280,12 @@
     </w:p>
     <w:p>
       <w:r>
-        <w:t xml:space="preserve">The workflow definition is static and therefore holds information about the structure of the workflow such as conditions, assigned roles and rules. A running instance holds information about one specific workflow such as its unique ID, current state and completed and pending tasks [3]. Real workflows model nested activities and sub-processes using hierarchies and rules where the </w:t>
-      </w:r>
-      <w:proofErr w:type="gramStart"/>
-      <w:r>
-        <w:t>parents</w:t>
-      </w:r>
-      <w:proofErr w:type="gramEnd"/>
-      <w:r>
-        <w:t xml:space="preserve"> execution is paused until the child completes their task [6]. In a workflow system, business decisions are usually configurable (able to be changed to meet specific requirements) such as routing decisions, approval rules, time limits, etc. Finally, changes can be made to workflow definitions while work is in progress by “workflow versioning” [12], this involves creating a branch from the public </w:t>
-      </w:r>
-      <w:proofErr w:type="gramStart"/>
-      <w:r>
-        <w:t>version, and</w:t>
-      </w:r>
-      <w:proofErr w:type="gramEnd"/>
-      <w:r>
-        <w:t xml:space="preserve"> publishing the new branch and storing the outdated branch in a version history. </w:t>
-      </w:r>
-    </w:p>
-    <w:p>
-      <w:r>
-        <w:t xml:space="preserve">The research indicates that TIVIDY should provide a generic mechanism for defining and executing workflows rather than implementing one fixed problem-solving process. </w:t>
-      </w:r>
-      <w:proofErr w:type="gramStart"/>
-      <w:r>
-        <w:t>It’s</w:t>
-      </w:r>
-      <w:proofErr w:type="gramEnd"/>
-      <w:r>
-        <w:t xml:space="preserve"> core concepts should include </w:t>
+        <w:t xml:space="preserve">The workflow definition is static and therefore holds information about the structure of the workflow such as conditions, assigned roles and rules. A running instance holds information about one specific workflow such as its unique ID, current state and completed and pending tasks [3]. Real workflows model nested activities and sub-processes using hierarchies and rules where the parents execution is paused until the child completes their task [6]. In a workflow system, business decisions are usually configurable (able to be changed to meet specific requirements) such as routing decisions, approval rules, time limits, etc. Finally, changes can be made to workflow definitions while work is in progress by “workflow versioning” [12], this involves creating a branch from the public version, and publishing the new branch and storing the outdated branch in a version history. </w:t>
+      </w:r>
+    </w:p>
+    <w:p>
+      <w:r>
+        <w:t xml:space="preserve">The research indicates that TIVIDY should provide a generic mechanism for defining and executing workflows rather than implementing one fixed problem-solving process. It’s core concepts should include </w:t>
       </w:r>
       <w:proofErr w:type="spellStart"/>
       <w:r>
@@ -2150,15 +2136,7 @@
       </w:r>
       <w:proofErr w:type="spellEnd"/>
       <w:r>
-        <w:t xml:space="preserve"> can register as an </w:t>
-      </w:r>
-      <w:proofErr w:type="gramStart"/>
-      <w:r>
-        <w:t>observer</w:t>
-      </w:r>
-      <w:proofErr w:type="gramEnd"/>
-      <w:r>
-        <w:t xml:space="preserve"> so the external email system is told about workflow events without the engine knowing its interface.</w:t>
+        <w:t xml:space="preserve"> can register as an observer so the external email system is told about workflow events without the engine knowing its interface.</w:t>
       </w:r>
     </w:p>
     <w:p/>
@@ -2526,15 +2504,7 @@
       </w:r>
       <w:proofErr w:type="spellEnd"/>
       <w:r>
-        <w:t xml:space="preserve"> holds work items, roles, dependencies, routing rules and escalation rules. Creating that in one constructor does not scale across organisations. Builder lets the same construction steps produce a short linear process or a multi-step approval </w:t>
-      </w:r>
-      <w:proofErr w:type="gramStart"/>
-      <w:r>
-        <w:t>process, and</w:t>
-      </w:r>
-      <w:proofErr w:type="gramEnd"/>
-      <w:r>
-        <w:t xml:space="preserve"> keeps the definition separate from the running instances created from it.</w:t>
+        <w:t xml:space="preserve"> holds work items, roles, dependencies, routing rules and escalation rules. Creating that in one constructor does not scale across organisations. Builder lets the same construction steps produce a short linear process or a multi-step approval process, and keeps the definition separate from the running instances created from it.</w:t>
       </w:r>
     </w:p>
     <w:p>
@@ -2585,15 +2555,7 @@
         <w:t xml:space="preserve"> where required when a definition is built</w:t>
       </w:r>
       <w:r>
-        <w:t xml:space="preserve">, so routing and escalation behaviour belongs to the definition and is not </w:t>
-      </w:r>
-      <w:proofErr w:type="gramStart"/>
-      <w:r>
-        <w:t>hard-coded</w:t>
-      </w:r>
-      <w:proofErr w:type="gramEnd"/>
-      <w:r>
-        <w:t xml:space="preserve"> in the engine. </w:t>
+        <w:t xml:space="preserve">, so routing and escalation behaviour belongs to the definition and is not hard-coded in the engine. </w:t>
       </w:r>
       <w:proofErr w:type="spellStart"/>
       <w:r>
@@ -3184,15 +3146,7 @@
       </w:r>
       <w:proofErr w:type="spellEnd"/>
       <w:r>
-        <w:t xml:space="preserve"> is used when a work item becomes </w:t>
-      </w:r>
-      <w:proofErr w:type="gramStart"/>
-      <w:r>
-        <w:t>Available</w:t>
-      </w:r>
-      <w:proofErr w:type="gramEnd"/>
-      <w:r>
-        <w:t xml:space="preserve"> or a routing decision point is reached. It is set on the </w:t>
+        <w:t xml:space="preserve"> is used when a work item becomes Available or a routing decision point is reached. It is set on the </w:t>
       </w:r>
       <w:proofErr w:type="spellStart"/>
       <w:r>
@@ -3365,15 +3319,7 @@
     </w:p>
     <w:p>
       <w:r>
-        <w:t xml:space="preserve">Chain of Responsibility provides a flexible way to manage escalation without </w:t>
-      </w:r>
-      <w:proofErr w:type="gramStart"/>
-      <w:r>
-        <w:t>hard-coding</w:t>
-      </w:r>
-      <w:proofErr w:type="gramEnd"/>
-      <w:r>
-        <w:t xml:space="preserve"> every escalation level into one class.</w:t>
+        <w:t>Chain of Responsibility provides a flexible way to manage escalation without hard-coding every escalation level into one class.</w:t>
       </w:r>
     </w:p>
     <w:p>
@@ -4238,15 +4184,7 @@
       </w:r>
       <w:proofErr w:type="spellEnd"/>
       <w:r>
-        <w:t xml:space="preserve"> can register as an </w:t>
-      </w:r>
-      <w:proofErr w:type="gramStart"/>
-      <w:r>
-        <w:t>Observer</w:t>
-      </w:r>
-      <w:proofErr w:type="gramEnd"/>
-      <w:r>
-        <w:t xml:space="preserve"> so notifications go out when workflow events happen, and Commands use it when an action needs external communication. The engine only ever calls </w:t>
+        <w:t xml:space="preserve"> can register as an Observer so notifications go out when workflow events happen, and Commands use it when an action needs external communication. The engine only ever calls </w:t>
       </w:r>
       <w:proofErr w:type="spellStart"/>
       <w:r>
@@ -4396,15 +4334,7 @@
     </w:p>
     <w:p>
       <w:r>
-        <w:t xml:space="preserve">A user of TIVIDY should not need to interact directly with </w:t>
-      </w:r>
-      <w:proofErr w:type="gramStart"/>
-      <w:r>
-        <w:t>all of</w:t>
-      </w:r>
-      <w:proofErr w:type="gramEnd"/>
-      <w:r>
-        <w:t xml:space="preserve"> these classes.</w:t>
+        <w:t>A user of TIVIDY should not need to interact directly with all of these classes.</w:t>
       </w:r>
     </w:p>
     <w:p>
@@ -4663,13 +4593,8 @@
       <w:r>
         <w:t xml:space="preserve">For example, </w:t>
       </w:r>
-      <w:proofErr w:type="gramStart"/>
-      <w:r>
-        <w:t>Before</w:t>
-      </w:r>
-      <w:proofErr w:type="gramEnd"/>
-      <w:r>
-        <w:t xml:space="preserve"> escalation, a </w:t>
+      <w:r>
+        <w:t xml:space="preserve">Before escalation, a </w:t>
       </w:r>
       <w:proofErr w:type="spellStart"/>
       <w:r>
@@ -5296,19 +5221,7 @@
         <w:rPr>
           <w:color w:val="0070C0"/>
         </w:rPr>
-        <w:t xml:space="preserve">TASK </w:t>
-      </w:r>
-      <w:r>
-        <w:rPr>
-          <w:color w:val="0070C0"/>
-        </w:rPr>
-        <w:t>5</w:t>
-      </w:r>
-      <w:r>
-        <w:rPr>
-          <w:color w:val="0070C0"/>
-        </w:rPr>
-        <w:t>:</w:t>
+        <w:t>TASK 5:</w:t>
       </w:r>
     </w:p>
     <w:p>
@@ -5353,6 +5266,7 @@
         <w:rPr>
           <w:b/>
           <w:bCs/>
+          <w:noProof/>
           <w:sz w:val="22"/>
           <w:szCs w:val="22"/>
         </w:rPr>
@@ -6252,7 +6166,6 @@
         </w:rPr>
         <w:t xml:space="preserve"> when the case is successfully completed or </w:t>
       </w:r>
-      <w:proofErr w:type="gramStart"/>
       <w:r>
         <w:rPr>
           <w:b/>
@@ -6262,7 +6175,6 @@
         </w:rPr>
         <w:t>Closed</w:t>
       </w:r>
-      <w:proofErr w:type="gramEnd"/>
       <w:r>
         <w:rPr>
           <w:sz w:val="24"/>
@@ -6270,6 +6182,927 @@
         </w:rPr>
         <w:t xml:space="preserve"> when the workflow ends without resolution. Resolved and Closed represent the final states of the workflow.</w:t>
       </w:r>
+    </w:p>
+    <w:p>
+      <w:pPr>
+        <w:jc w:val="both"/>
+        <w:rPr>
+          <w:sz w:val="24"/>
+          <w:szCs w:val="24"/>
+        </w:rPr>
+      </w:pPr>
+    </w:p>
+    <w:p>
+      <w:pPr>
+        <w:jc w:val="both"/>
+        <w:rPr>
+          <w:sz w:val="24"/>
+          <w:szCs w:val="24"/>
+        </w:rPr>
+      </w:pPr>
+    </w:p>
+    <w:p>
+      <w:pPr>
+        <w:jc w:val="both"/>
+        <w:rPr>
+          <w:sz w:val="24"/>
+          <w:szCs w:val="24"/>
+        </w:rPr>
+      </w:pPr>
+    </w:p>
+    <w:p>
+      <w:pPr>
+        <w:jc w:val="both"/>
+        <w:rPr>
+          <w:sz w:val="24"/>
+          <w:szCs w:val="24"/>
+        </w:rPr>
+      </w:pPr>
+    </w:p>
+    <w:p>
+      <w:pPr>
+        <w:jc w:val="both"/>
+        <w:rPr>
+          <w:sz w:val="24"/>
+          <w:szCs w:val="24"/>
+        </w:rPr>
+      </w:pPr>
+      <w:r>
+        <w:rPr>
+          <w:b/>
+          <w:bCs/>
+          <w:sz w:val="24"/>
+          <w:szCs w:val="24"/>
+        </w:rPr>
+        <w:t>Team Contributions</w:t>
+      </w:r>
+    </w:p>
+    <w:p>
+      <w:pPr>
+        <w:jc w:val="both"/>
+        <w:rPr>
+          <w:sz w:val="24"/>
+          <w:szCs w:val="24"/>
+        </w:rPr>
+      </w:pPr>
+    </w:p>
+    <w:p>
+      <w:pPr>
+        <w:jc w:val="both"/>
+        <w:rPr>
+          <w:sz w:val="24"/>
+          <w:szCs w:val="24"/>
+        </w:rPr>
+      </w:pPr>
+      <w:r>
+        <w:rPr>
+          <w:b/>
+          <w:bCs/>
+          <w:sz w:val="24"/>
+          <w:szCs w:val="24"/>
+        </w:rPr>
+        <w:t>Task 1</w:t>
+      </w:r>
+      <w:r>
+        <w:rPr>
+          <w:b/>
+          <w:bCs/>
+          <w:sz w:val="24"/>
+          <w:szCs w:val="24"/>
+        </w:rPr>
+        <w:t xml:space="preserve">: </w:t>
+      </w:r>
+      <w:r>
+        <w:rPr>
+          <w:b/>
+          <w:bCs/>
+          <w:sz w:val="24"/>
+          <w:szCs w:val="24"/>
+        </w:rPr>
+        <w:t>Research</w:t>
+      </w:r>
+    </w:p>
+    <w:p>
+      <w:pPr>
+        <w:jc w:val="both"/>
+        <w:rPr>
+          <w:sz w:val="24"/>
+          <w:szCs w:val="24"/>
+        </w:rPr>
+      </w:pPr>
+      <w:r>
+        <w:rPr>
+          <w:b/>
+          <w:bCs/>
+          <w:sz w:val="24"/>
+          <w:szCs w:val="24"/>
+        </w:rPr>
+        <w:t>Contributors:</w:t>
+      </w:r>
+      <w:r>
+        <w:rPr>
+          <w:sz w:val="24"/>
+          <w:szCs w:val="24"/>
+        </w:rPr>
+        <w:t xml:space="preserve"> LM Kabongo, Joshua Peter</w:t>
+      </w:r>
+    </w:p>
+    <w:p>
+      <w:pPr>
+        <w:jc w:val="both"/>
+        <w:rPr>
+          <w:sz w:val="24"/>
+          <w:szCs w:val="24"/>
+        </w:rPr>
+      </w:pPr>
+    </w:p>
+    <w:p>
+      <w:pPr>
+        <w:jc w:val="both"/>
+        <w:rPr>
+          <w:sz w:val="24"/>
+          <w:szCs w:val="24"/>
+        </w:rPr>
+      </w:pPr>
+      <w:r>
+        <w:rPr>
+          <w:sz w:val="24"/>
+          <w:szCs w:val="24"/>
+        </w:rPr>
+        <w:t>LM Kabongo and Joshua Peter worked on the research into workflow management systems and the concepts relevant to TIVIDY. This included workflow definitions and instances, activities, work items, assignment, routing, participants, dependencies, events, auditing, monitoring, reusability and workflow versioning.</w:t>
+      </w:r>
+    </w:p>
+    <w:p>
+      <w:pPr>
+        <w:jc w:val="both"/>
+        <w:rPr>
+          <w:sz w:val="24"/>
+          <w:szCs w:val="24"/>
+        </w:rPr>
+      </w:pPr>
+    </w:p>
+    <w:p>
+      <w:pPr>
+        <w:jc w:val="both"/>
+        <w:rPr>
+          <w:sz w:val="24"/>
+          <w:szCs w:val="24"/>
+        </w:rPr>
+      </w:pPr>
+      <w:r>
+        <w:rPr>
+          <w:b/>
+          <w:bCs/>
+          <w:sz w:val="24"/>
+          <w:szCs w:val="24"/>
+        </w:rPr>
+        <w:lastRenderedPageBreak/>
+        <w:t>Task 2</w:t>
+      </w:r>
+      <w:r>
+        <w:rPr>
+          <w:b/>
+          <w:bCs/>
+          <w:sz w:val="24"/>
+          <w:szCs w:val="24"/>
+        </w:rPr>
+        <w:t xml:space="preserve">: </w:t>
+      </w:r>
+      <w:r>
+        <w:rPr>
+          <w:b/>
+          <w:bCs/>
+          <w:sz w:val="24"/>
+          <w:szCs w:val="24"/>
+        </w:rPr>
+        <w:t xml:space="preserve"> Initial Scope and Scenario</w:t>
+      </w:r>
+    </w:p>
+    <w:p>
+      <w:pPr>
+        <w:jc w:val="both"/>
+        <w:rPr>
+          <w:sz w:val="24"/>
+          <w:szCs w:val="24"/>
+        </w:rPr>
+      </w:pPr>
+      <w:r>
+        <w:rPr>
+          <w:b/>
+          <w:bCs/>
+          <w:sz w:val="24"/>
+          <w:szCs w:val="24"/>
+        </w:rPr>
+        <w:t>Contributor:</w:t>
+      </w:r>
+      <w:r>
+        <w:rPr>
+          <w:sz w:val="24"/>
+          <w:szCs w:val="24"/>
+        </w:rPr>
+        <w:t xml:space="preserve"> Kristy Heesen</w:t>
+      </w:r>
+    </w:p>
+    <w:p>
+      <w:pPr>
+        <w:jc w:val="both"/>
+        <w:rPr>
+          <w:sz w:val="24"/>
+          <w:szCs w:val="24"/>
+        </w:rPr>
+      </w:pPr>
+    </w:p>
+    <w:p>
+      <w:pPr>
+        <w:jc w:val="both"/>
+        <w:rPr>
+          <w:sz w:val="24"/>
+          <w:szCs w:val="24"/>
+        </w:rPr>
+      </w:pPr>
+      <w:r>
+        <w:rPr>
+          <w:sz w:val="24"/>
+          <w:szCs w:val="24"/>
+        </w:rPr>
+        <w:t>Kristy Heesen developed the initial scope of TIVIDY and defined the selected University Student Complaint Management scenario. This included distinguishing workflow definitions from running workflow instances and establishing the responsibilities and boundaries of the generic workflow management system.</w:t>
+      </w:r>
+    </w:p>
+    <w:p>
+      <w:pPr>
+        <w:jc w:val="both"/>
+        <w:rPr>
+          <w:sz w:val="24"/>
+          <w:szCs w:val="24"/>
+        </w:rPr>
+      </w:pPr>
+    </w:p>
+    <w:p>
+      <w:pPr>
+        <w:jc w:val="both"/>
+        <w:rPr>
+          <w:sz w:val="24"/>
+          <w:szCs w:val="24"/>
+        </w:rPr>
+      </w:pPr>
+      <w:r>
+        <w:rPr>
+          <w:b/>
+          <w:bCs/>
+          <w:sz w:val="24"/>
+          <w:szCs w:val="24"/>
+        </w:rPr>
+        <w:t>Task 3</w:t>
+      </w:r>
+      <w:r>
+        <w:rPr>
+          <w:b/>
+          <w:bCs/>
+          <w:sz w:val="24"/>
+          <w:szCs w:val="24"/>
+        </w:rPr>
+        <w:t xml:space="preserve">: </w:t>
+      </w:r>
+      <w:r>
+        <w:rPr>
+          <w:b/>
+          <w:bCs/>
+          <w:sz w:val="24"/>
+          <w:szCs w:val="24"/>
+        </w:rPr>
+        <w:t>UML Activity Diagrams</w:t>
+      </w:r>
+    </w:p>
+    <w:p>
+      <w:pPr>
+        <w:jc w:val="both"/>
+        <w:rPr>
+          <w:sz w:val="24"/>
+          <w:szCs w:val="24"/>
+        </w:rPr>
+      </w:pPr>
+      <w:r>
+        <w:rPr>
+          <w:b/>
+          <w:bCs/>
+          <w:sz w:val="24"/>
+          <w:szCs w:val="24"/>
+        </w:rPr>
+        <w:t>Contributors:</w:t>
+      </w:r>
+      <w:r>
+        <w:rPr>
+          <w:sz w:val="24"/>
+          <w:szCs w:val="24"/>
+        </w:rPr>
+        <w:t xml:space="preserve"> Lindokuhle Skosana, Joshua Peter</w:t>
+      </w:r>
+    </w:p>
+    <w:p>
+      <w:pPr>
+        <w:jc w:val="both"/>
+        <w:rPr>
+          <w:sz w:val="24"/>
+          <w:szCs w:val="24"/>
+        </w:rPr>
+      </w:pPr>
+    </w:p>
+    <w:p>
+      <w:pPr>
+        <w:jc w:val="both"/>
+        <w:rPr>
+          <w:sz w:val="24"/>
+          <w:szCs w:val="24"/>
+        </w:rPr>
+      </w:pPr>
+      <w:r>
+        <w:rPr>
+          <w:sz w:val="24"/>
+          <w:szCs w:val="24"/>
+        </w:rPr>
+        <w:t>Lindokuhle Skosana and Joshua Peter worked on the UML Activity Diagrams for the generic TIVIDY workflows and the selected University Student Complaint Management scenario.</w:t>
+      </w:r>
+    </w:p>
+    <w:p>
+      <w:pPr>
+        <w:jc w:val="both"/>
+        <w:rPr>
+          <w:sz w:val="24"/>
+          <w:szCs w:val="24"/>
+        </w:rPr>
+      </w:pPr>
+    </w:p>
+    <w:p>
+      <w:pPr>
+        <w:jc w:val="both"/>
+        <w:rPr>
+          <w:sz w:val="24"/>
+          <w:szCs w:val="24"/>
+        </w:rPr>
+      </w:pPr>
+      <w:r>
+        <w:rPr>
+          <w:b/>
+          <w:bCs/>
+          <w:sz w:val="24"/>
+          <w:szCs w:val="24"/>
+        </w:rPr>
+        <w:t>Task 4</w:t>
+      </w:r>
+      <w:r>
+        <w:rPr>
+          <w:b/>
+          <w:bCs/>
+          <w:sz w:val="24"/>
+          <w:szCs w:val="24"/>
+        </w:rPr>
+        <w:t xml:space="preserve">: </w:t>
+      </w:r>
+      <w:r>
+        <w:rPr>
+          <w:b/>
+          <w:bCs/>
+          <w:sz w:val="24"/>
+          <w:szCs w:val="24"/>
+        </w:rPr>
+        <w:t>Design Patterns</w:t>
+      </w:r>
+    </w:p>
+    <w:p>
+      <w:pPr>
+        <w:jc w:val="both"/>
+        <w:rPr>
+          <w:sz w:val="24"/>
+          <w:szCs w:val="24"/>
+        </w:rPr>
+      </w:pPr>
+      <w:r>
+        <w:rPr>
+          <w:b/>
+          <w:bCs/>
+          <w:sz w:val="24"/>
+          <w:szCs w:val="24"/>
+        </w:rPr>
+        <w:t>Contributors:</w:t>
+      </w:r>
+      <w:r>
+        <w:rPr>
+          <w:sz w:val="24"/>
+          <w:szCs w:val="24"/>
+        </w:rPr>
+        <w:t xml:space="preserve"> Kristy Heesen, Musa Msibi, Lindokuhle Skosana</w:t>
+      </w:r>
+    </w:p>
+    <w:p>
+      <w:pPr>
+        <w:jc w:val="both"/>
+        <w:rPr>
+          <w:sz w:val="24"/>
+          <w:szCs w:val="24"/>
+        </w:rPr>
+      </w:pPr>
+    </w:p>
+    <w:p>
+      <w:pPr>
+        <w:jc w:val="both"/>
+        <w:rPr>
+          <w:sz w:val="24"/>
+          <w:szCs w:val="24"/>
+        </w:rPr>
+      </w:pPr>
+      <w:r>
+        <w:rPr>
+          <w:sz w:val="24"/>
+          <w:szCs w:val="24"/>
+        </w:rPr>
+        <w:t xml:space="preserve">Kristy Heesen, Musa Msibi and Lindokuhle Skosana worked on identifying and justifying the </w:t>
+      </w:r>
+      <w:proofErr w:type="spellStart"/>
+      <w:r>
+        <w:rPr>
+          <w:sz w:val="24"/>
+          <w:szCs w:val="24"/>
+        </w:rPr>
+        <w:t>GoF</w:t>
+      </w:r>
+      <w:proofErr w:type="spellEnd"/>
+      <w:r>
+        <w:rPr>
+          <w:sz w:val="24"/>
+          <w:szCs w:val="24"/>
+        </w:rPr>
+        <w:t xml:space="preserve"> design patterns used in TIVIDY. This included defining the design problems, pattern participants, collaborations, variation points and how the patterns work together within the workflow management system.</w:t>
+      </w:r>
+    </w:p>
+    <w:p>
+      <w:pPr>
+        <w:jc w:val="both"/>
+        <w:rPr>
+          <w:sz w:val="24"/>
+          <w:szCs w:val="24"/>
+        </w:rPr>
+      </w:pPr>
+    </w:p>
+    <w:p>
+      <w:pPr>
+        <w:jc w:val="both"/>
+        <w:rPr>
+          <w:sz w:val="24"/>
+          <w:szCs w:val="24"/>
+        </w:rPr>
+      </w:pPr>
+      <w:r>
+        <w:rPr>
+          <w:b/>
+          <w:bCs/>
+          <w:sz w:val="24"/>
+          <w:szCs w:val="24"/>
+        </w:rPr>
+        <w:t>Task 5</w:t>
+      </w:r>
+      <w:r>
+        <w:rPr>
+          <w:b/>
+          <w:bCs/>
+          <w:sz w:val="24"/>
+          <w:szCs w:val="24"/>
+        </w:rPr>
+        <w:t xml:space="preserve">: </w:t>
+      </w:r>
+      <w:r>
+        <w:rPr>
+          <w:b/>
+          <w:bCs/>
+          <w:sz w:val="24"/>
+          <w:szCs w:val="24"/>
+        </w:rPr>
+        <w:t>UML Class Diagram</w:t>
+      </w:r>
+    </w:p>
+    <w:p>
+      <w:pPr>
+        <w:jc w:val="both"/>
+        <w:rPr>
+          <w:sz w:val="24"/>
+          <w:szCs w:val="24"/>
+        </w:rPr>
+      </w:pPr>
+      <w:r>
+        <w:rPr>
+          <w:b/>
+          <w:bCs/>
+          <w:sz w:val="24"/>
+          <w:szCs w:val="24"/>
+        </w:rPr>
+        <w:t>Contributors:</w:t>
+      </w:r>
+      <w:r>
+        <w:rPr>
+          <w:sz w:val="24"/>
+          <w:szCs w:val="24"/>
+        </w:rPr>
+        <w:t xml:space="preserve"> </w:t>
+      </w:r>
+      <w:r>
+        <w:rPr>
+          <w:sz w:val="24"/>
+          <w:szCs w:val="24"/>
+        </w:rPr>
+        <w:t>Kristy Heesen</w:t>
+      </w:r>
+    </w:p>
+    <w:p>
+      <w:pPr>
+        <w:jc w:val="both"/>
+        <w:rPr>
+          <w:sz w:val="24"/>
+          <w:szCs w:val="24"/>
+        </w:rPr>
+      </w:pPr>
+    </w:p>
+    <w:p>
+      <w:pPr>
+        <w:jc w:val="both"/>
+        <w:rPr>
+          <w:sz w:val="24"/>
+          <w:szCs w:val="24"/>
+        </w:rPr>
+      </w:pPr>
+      <w:r>
+        <w:rPr>
+          <w:sz w:val="24"/>
+          <w:szCs w:val="24"/>
+        </w:rPr>
+        <w:t>Kristy Heesen</w:t>
+      </w:r>
+      <w:r>
+        <w:rPr>
+          <w:sz w:val="24"/>
+          <w:szCs w:val="24"/>
+        </w:rPr>
+        <w:t xml:space="preserve"> </w:t>
+      </w:r>
+      <w:r>
+        <w:rPr>
+          <w:sz w:val="24"/>
+          <w:szCs w:val="24"/>
+        </w:rPr>
+        <w:t>worked on developing the complete UML Class Diagram for TIVIDY. This included the main classes, relationships, multiplicities, attributes, operations, ownership relationships and the collaborations between the different design patterns and subsystems.</w:t>
+      </w:r>
+    </w:p>
+    <w:p>
+      <w:pPr>
+        <w:jc w:val="both"/>
+        <w:rPr>
+          <w:sz w:val="24"/>
+          <w:szCs w:val="24"/>
+        </w:rPr>
+      </w:pPr>
+    </w:p>
+    <w:p>
+      <w:pPr>
+        <w:jc w:val="both"/>
+        <w:rPr>
+          <w:sz w:val="24"/>
+          <w:szCs w:val="24"/>
+        </w:rPr>
+      </w:pPr>
+      <w:r>
+        <w:rPr>
+          <w:b/>
+          <w:bCs/>
+          <w:sz w:val="24"/>
+          <w:szCs w:val="24"/>
+        </w:rPr>
+        <w:t>Task 6</w:t>
+      </w:r>
+      <w:r>
+        <w:rPr>
+          <w:b/>
+          <w:bCs/>
+          <w:sz w:val="24"/>
+          <w:szCs w:val="24"/>
+        </w:rPr>
+        <w:t xml:space="preserve">: </w:t>
+      </w:r>
+      <w:r>
+        <w:rPr>
+          <w:b/>
+          <w:bCs/>
+          <w:sz w:val="24"/>
+          <w:szCs w:val="24"/>
+        </w:rPr>
+        <w:t>Runtime Behaviour Diagrams</w:t>
+      </w:r>
+    </w:p>
+    <w:p>
+      <w:pPr>
+        <w:jc w:val="both"/>
+        <w:rPr>
+          <w:sz w:val="24"/>
+          <w:szCs w:val="24"/>
+        </w:rPr>
+      </w:pPr>
+      <w:r>
+        <w:rPr>
+          <w:b/>
+          <w:bCs/>
+          <w:sz w:val="24"/>
+          <w:szCs w:val="24"/>
+        </w:rPr>
+        <w:t>Contributors:</w:t>
+      </w:r>
+      <w:r>
+        <w:rPr>
+          <w:sz w:val="24"/>
+          <w:szCs w:val="24"/>
+        </w:rPr>
+        <w:t xml:space="preserve"> LM Kabongo, Musa Msibi</w:t>
+      </w:r>
+    </w:p>
+    <w:p>
+      <w:pPr>
+        <w:jc w:val="both"/>
+        <w:rPr>
+          <w:sz w:val="24"/>
+          <w:szCs w:val="24"/>
+        </w:rPr>
+      </w:pPr>
+    </w:p>
+    <w:p>
+      <w:pPr>
+        <w:jc w:val="both"/>
+        <w:rPr>
+          <w:sz w:val="24"/>
+          <w:szCs w:val="24"/>
+        </w:rPr>
+      </w:pPr>
+      <w:r>
+        <w:rPr>
+          <w:sz w:val="24"/>
+          <w:szCs w:val="24"/>
+        </w:rPr>
+        <w:lastRenderedPageBreak/>
+        <w:t xml:space="preserve">LM Kabongo and Musa Msibi worked on the UML runtime behaviour diagrams. LM Kabongo developed the sequence diagram showing the completion of a </w:t>
+      </w:r>
+      <w:proofErr w:type="spellStart"/>
+      <w:r>
+        <w:rPr>
+          <w:sz w:val="24"/>
+          <w:szCs w:val="24"/>
+        </w:rPr>
+        <w:t>WorkItem</w:t>
+      </w:r>
+      <w:proofErr w:type="spellEnd"/>
+      <w:r>
+        <w:rPr>
+          <w:sz w:val="24"/>
+          <w:szCs w:val="24"/>
+        </w:rPr>
+        <w:t xml:space="preserve"> and determining what happens next, as well as the </w:t>
+      </w:r>
+      <w:proofErr w:type="spellStart"/>
+      <w:r>
+        <w:rPr>
+          <w:sz w:val="24"/>
+          <w:szCs w:val="24"/>
+        </w:rPr>
+        <w:t>WorkflowInstance</w:t>
+      </w:r>
+      <w:proofErr w:type="spellEnd"/>
+      <w:r>
+        <w:rPr>
+          <w:sz w:val="24"/>
+          <w:szCs w:val="24"/>
+        </w:rPr>
+        <w:t xml:space="preserve"> State Diagram. Musa Msibi developed the sequence diagram showing the escalation process.</w:t>
+      </w:r>
+    </w:p>
+    <w:p>
+      <w:pPr>
+        <w:jc w:val="both"/>
+        <w:rPr>
+          <w:sz w:val="24"/>
+          <w:szCs w:val="24"/>
+        </w:rPr>
+      </w:pPr>
+    </w:p>
+    <w:p>
+      <w:pPr>
+        <w:jc w:val="both"/>
+        <w:rPr>
+          <w:sz w:val="24"/>
+          <w:szCs w:val="24"/>
+        </w:rPr>
+      </w:pPr>
+      <w:r>
+        <w:rPr>
+          <w:b/>
+          <w:bCs/>
+          <w:sz w:val="24"/>
+          <w:szCs w:val="24"/>
+        </w:rPr>
+        <w:t>Task 7</w:t>
+      </w:r>
+      <w:r>
+        <w:rPr>
+          <w:b/>
+          <w:bCs/>
+          <w:sz w:val="24"/>
+          <w:szCs w:val="24"/>
+        </w:rPr>
+        <w:t xml:space="preserve">: </w:t>
+      </w:r>
+      <w:r>
+        <w:rPr>
+          <w:b/>
+          <w:bCs/>
+          <w:sz w:val="24"/>
+          <w:szCs w:val="24"/>
+        </w:rPr>
+        <w:t>Design Decisions and Revisions</w:t>
+      </w:r>
+    </w:p>
+    <w:p>
+      <w:pPr>
+        <w:jc w:val="both"/>
+        <w:rPr>
+          <w:sz w:val="24"/>
+          <w:szCs w:val="24"/>
+        </w:rPr>
+      </w:pPr>
+      <w:r>
+        <w:rPr>
+          <w:b/>
+          <w:bCs/>
+          <w:sz w:val="24"/>
+          <w:szCs w:val="24"/>
+        </w:rPr>
+        <w:t>Contributors:</w:t>
+      </w:r>
+      <w:r>
+        <w:rPr>
+          <w:sz w:val="24"/>
+          <w:szCs w:val="24"/>
+        </w:rPr>
+        <w:t xml:space="preserve"> Entire Team</w:t>
+      </w:r>
+    </w:p>
+    <w:p>
+      <w:pPr>
+        <w:jc w:val="both"/>
+        <w:rPr>
+          <w:sz w:val="24"/>
+          <w:szCs w:val="24"/>
+        </w:rPr>
+      </w:pPr>
+    </w:p>
+    <w:p>
+      <w:pPr>
+        <w:jc w:val="both"/>
+        <w:rPr>
+          <w:sz w:val="24"/>
+          <w:szCs w:val="24"/>
+        </w:rPr>
+      </w:pPr>
+      <w:r>
+        <w:rPr>
+          <w:sz w:val="24"/>
+          <w:szCs w:val="24"/>
+        </w:rPr>
+        <w:t>The team documented the major design decisions and revisions made throughout the practical. These included changes to the State, Chain of Responsibility and Command patterns as the design was refined.</w:t>
+      </w:r>
+    </w:p>
+    <w:p>
+      <w:pPr>
+        <w:jc w:val="both"/>
+        <w:rPr>
+          <w:sz w:val="24"/>
+          <w:szCs w:val="24"/>
+        </w:rPr>
+      </w:pPr>
+    </w:p>
+    <w:p>
+      <w:pPr>
+        <w:jc w:val="both"/>
+        <w:rPr>
+          <w:sz w:val="24"/>
+          <w:szCs w:val="24"/>
+        </w:rPr>
+      </w:pPr>
+      <w:r>
+        <w:rPr>
+          <w:b/>
+          <w:bCs/>
+          <w:sz w:val="24"/>
+          <w:szCs w:val="24"/>
+        </w:rPr>
+        <w:t>Task 8</w:t>
+      </w:r>
+      <w:r>
+        <w:rPr>
+          <w:b/>
+          <w:bCs/>
+          <w:sz w:val="24"/>
+          <w:szCs w:val="24"/>
+        </w:rPr>
+        <w:t>:</w:t>
+      </w:r>
+      <w:r>
+        <w:rPr>
+          <w:b/>
+          <w:bCs/>
+          <w:sz w:val="24"/>
+          <w:szCs w:val="24"/>
+        </w:rPr>
+        <w:t xml:space="preserve"> GitHub and Documentation</w:t>
+      </w:r>
+    </w:p>
+    <w:p>
+      <w:pPr>
+        <w:jc w:val="both"/>
+        <w:rPr>
+          <w:sz w:val="24"/>
+          <w:szCs w:val="24"/>
+        </w:rPr>
+      </w:pPr>
+      <w:r>
+        <w:rPr>
+          <w:b/>
+          <w:bCs/>
+          <w:sz w:val="24"/>
+          <w:szCs w:val="24"/>
+        </w:rPr>
+        <w:t>Contributors:</w:t>
+      </w:r>
+      <w:r>
+        <w:rPr>
+          <w:sz w:val="24"/>
+          <w:szCs w:val="24"/>
+        </w:rPr>
+        <w:t xml:space="preserve"> Entire Team</w:t>
+      </w:r>
+    </w:p>
+    <w:p>
+      <w:pPr>
+        <w:jc w:val="both"/>
+        <w:rPr>
+          <w:sz w:val="24"/>
+          <w:szCs w:val="24"/>
+        </w:rPr>
+      </w:pPr>
+    </w:p>
+    <w:p>
+      <w:pPr>
+        <w:jc w:val="both"/>
+        <w:rPr>
+          <w:sz w:val="24"/>
+          <w:szCs w:val="24"/>
+        </w:rPr>
+      </w:pPr>
+      <w:r>
+        <w:rPr>
+          <w:sz w:val="24"/>
+          <w:szCs w:val="24"/>
+        </w:rPr>
+        <w:t>The team contributed to the GitHub repository and project documentation, including the research, UML diagrams, design decisions, README and supporting project material.</w:t>
+      </w:r>
+    </w:p>
+    <w:p>
+      <w:pPr>
+        <w:jc w:val="both"/>
+        <w:rPr>
+          <w:sz w:val="24"/>
+          <w:szCs w:val="24"/>
+        </w:rPr>
+      </w:pPr>
+    </w:p>
+    <w:p>
+      <w:pPr>
+        <w:jc w:val="both"/>
+        <w:rPr>
+          <w:sz w:val="24"/>
+          <w:szCs w:val="24"/>
+        </w:rPr>
+      </w:pPr>
+    </w:p>
+    <w:p>
+      <w:pPr>
+        <w:jc w:val="both"/>
+        <w:rPr>
+          <w:sz w:val="24"/>
+          <w:szCs w:val="24"/>
+        </w:rPr>
+      </w:pPr>
+    </w:p>
+    <w:p>
+      <w:pPr>
+        <w:jc w:val="both"/>
+        <w:rPr>
+          <w:sz w:val="24"/>
+          <w:szCs w:val="24"/>
+        </w:rPr>
+      </w:pPr>
     </w:p>
     <w:p/>
     <w:sectPr>

</xml_diff>

<commit_message>
updated to add task 7 for activity diagram updates
</commit_message>
<xml_diff>
--- a/docs/214 PDF document.docx
+++ b/docs/214 PDF document.docx
@@ -1,6 +1,6 @@
 
 <file path=word/document.xml><?xml version="1.0" encoding="utf-8"?>
-<w:document xmlns:wpc="http://schemas.microsoft.com/office/word/2010/wordprocessingCanvas" xmlns:cx="http://schemas.microsoft.com/office/drawing/2014/chartex" xmlns:cx1="http://schemas.microsoft.com/office/drawing/2015/9/8/chartex" xmlns:cx2="http://schemas.microsoft.com/office/drawing/2015/10/21/chartex" xmlns:cx3="http://schemas.microsoft.com/office/drawing/2016/5/9/chartex" xmlns:cx4="http://schemas.microsoft.com/office/drawing/2016/5/10/chartex" xmlns:cx5="http://schemas.microsoft.com/office/drawing/2016/5/11/chartex" xmlns:cx6="http://schemas.microsoft.com/office/drawing/2016/5/12/chartex" xmlns:cx7="http://schemas.microsoft.com/office/drawing/2016/5/13/chartex" xmlns:cx8="http://schemas.microsoft.com/office/drawing/2016/5/14/chartex" xmlns:mc="http://schemas.openxmlformats.org/markup-compatibility/2006" xmlns:aink="http://schemas.microsoft.com/office/drawing/2016/ink" xmlns:am3d="http://schemas.microsoft.com/office/drawing/2017/model3d" xmlns:o="urn:schemas-microsoft-com:office:office" xmlns:oel="http://schemas.microsoft.com/office/2019/extlst" xmlns:r="http://schemas.openxmlformats.org/officeDocument/2006/relationships" xmlns:m="http://schemas.openxmlformats.org/officeDocument/2006/math" xmlns:v="urn:schemas-microsoft-com:vml" xmlns:wp14="http://schemas.microsoft.com/office/word/2010/wordprocessingDrawing" xmlns:wp="http://schemas.openxmlformats.org/drawingml/2006/wordprocessingDrawing" xmlns:w10="urn:schemas-microsoft-com:office:word" xmlns:w="http://schemas.openxmlformats.org/wordprocessingml/2006/main" xmlns:w14="http://schemas.microsoft.com/office/word/2010/wordml" xmlns:w15="http://schemas.microsoft.com/office/word/2012/wordml" xmlns:w16cex="http://schemas.microsoft.com/office/word/2018/wordml/cex" xmlns:w16cid="http://schemas.microsoft.com/office/word/2016/wordml/cid" xmlns:w16="http://schemas.microsoft.com/office/word/2018/wordml" xmlns:w16du="http://schemas.microsoft.com/office/word/2023/wordml/word16du" xmlns:w16sdtdh="http://schemas.microsoft.com/office/word/2020/wordml/sdtdatahash" xmlns:w16sdtfl="http://schemas.microsoft.com/office/word/2024/wordml/sdtformatlock" xmlns:w16se="http://schemas.microsoft.com/office/word/2015/wordml/symex" xmlns:wpg="http://schemas.microsoft.com/office/word/2010/wordprocessingGroup" xmlns:wpi="http://schemas.microsoft.com/office/word/2010/wordprocessingInk" xmlns:wne="http://schemas.microsoft.com/office/word/2006/wordml" xmlns:wps="http://schemas.microsoft.com/office/word/2010/wordprocessingShape" mc:Ignorable="w14 w15 w16se w16cid w16 w16cex w16sdtdh w16sdtfl w16du wp14">
+<w:document xmlns:wpc="http://schemas.microsoft.com/office/word/2010/wordprocessingCanvas" xmlns:cx="http://schemas.microsoft.com/office/drawing/2014/chartex" xmlns:cx1="http://schemas.microsoft.com/office/drawing/2015/9/8/chartex" xmlns:cx2="http://schemas.microsoft.com/office/drawing/2015/10/21/chartex" xmlns:cx3="http://schemas.microsoft.com/office/drawing/2016/5/9/chartex" xmlns:cx4="http://schemas.microsoft.com/office/drawing/2016/5/10/chartex" xmlns:cx5="http://schemas.microsoft.com/office/drawing/2016/5/11/chartex" xmlns:cx6="http://schemas.microsoft.com/office/drawing/2016/5/12/chartex" xmlns:cx7="http://schemas.microsoft.com/office/drawing/2016/5/13/chartex" xmlns:cx8="http://schemas.microsoft.com/office/drawing/2016/5/14/chartex" xmlns:mc="http://schemas.openxmlformats.org/markup-compatibility/2006" xmlns:aink="http://schemas.microsoft.com/office/drawing/2016/ink" xmlns:am3d="http://schemas.microsoft.com/office/drawing/2017/model3d" xmlns:o="urn:schemas-microsoft-com:office:office" xmlns:oel="http://schemas.microsoft.com/office/2019/extlst" xmlns:r="http://schemas.openxmlformats.org/officeDocument/2006/relationships" xmlns:m="http://schemas.openxmlformats.org/officeDocument/2006/math" xmlns:v="urn:schemas-microsoft-com:vml" xmlns:wp14="http://schemas.microsoft.com/office/word/2010/wordprocessingDrawing" xmlns:wp="http://schemas.openxmlformats.org/drawingml/2006/wordprocessingDrawing" xmlns:w10="urn:schemas-microsoft-com:office:word" xmlns:w="http://schemas.openxmlformats.org/wordprocessingml/2006/main" xmlns:w14="http://schemas.microsoft.com/office/word/2010/wordml" xmlns:w15="http://schemas.microsoft.com/office/word/2012/wordml" xmlns:w16cex="http://schemas.microsoft.com/office/word/2018/wordml/cex" xmlns:w16cid="http://schemas.microsoft.com/office/word/2016/wordml/cid" xmlns:w16="http://schemas.microsoft.com/office/word/2018/wordml" xmlns:w16sdtdh="http://schemas.microsoft.com/office/word/2020/wordml/sdtdatahash" xmlns:w16se="http://schemas.microsoft.com/office/word/2015/wordml/symex" xmlns:wpg="http://schemas.microsoft.com/office/word/2010/wordprocessingGroup" xmlns:wpi="http://schemas.microsoft.com/office/word/2010/wordprocessingInk" xmlns:wne="http://schemas.microsoft.com/office/word/2006/wordml" xmlns:wps="http://schemas.microsoft.com/office/word/2010/wordprocessingShape" mc:Ignorable="w14 w15 w16se w16cid w16 w16cex w16sdtdh wp14">
   <w:body>
     <w:p>
       <w:pPr>
@@ -6301,12 +6301,72 @@
     </w:p>
     <w:p>
       <w:pPr>
+        <w:pStyle w:val="Heading1"/>
+        <w:rPr>
+          <w:color w:val="0070C0"/>
+        </w:rPr>
+      </w:pPr>
+      <w:r>
+        <w:rPr>
+          <w:color w:val="0070C0"/>
+        </w:rPr>
+        <w:t xml:space="preserve">TASK </w:t>
+      </w:r>
+      <w:r>
+        <w:rPr>
+          <w:color w:val="0070C0"/>
+        </w:rPr>
+        <w:t>7</w:t>
+      </w:r>
+      <w:r>
+        <w:rPr>
+          <w:color w:val="0070C0"/>
+        </w:rPr>
+        <w:t>:</w:t>
+      </w:r>
+      <w:r>
+        <w:rPr>
+          <w:color w:val="0070C0"/>
+        </w:rPr>
+        <w:t xml:space="preserve"> </w:t>
+      </w:r>
+      <w:r>
+        <w:rPr>
+          <w:color w:val="0070C0"/>
+        </w:rPr>
+        <w:t>Design Decisions and Revisions</w:t>
+      </w:r>
+    </w:p>
+    <w:p>
+      <w:pPr>
         <w:jc w:val="both"/>
         <w:rPr>
           <w:sz w:val="24"/>
           <w:szCs w:val="24"/>
         </w:rPr>
       </w:pPr>
+      <w:r>
+        <w:rPr>
+          <w:sz w:val="24"/>
+          <w:szCs w:val="24"/>
+        </w:rPr>
+        <w:t>After tutor feedback we updated our original Generic Activity diagram to more clearly describe the activities performed in each node and to remove function calls. This update improves the readability of the diagrams, allows them to match the expected format, and more clearly displays the flow and actions that TIVIDY will produce. This update was made on 20</w:t>
+      </w:r>
+      <w:r>
+        <w:rPr>
+          <w:sz w:val="24"/>
+          <w:szCs w:val="24"/>
+          <w:vertAlign w:val="superscript"/>
+        </w:rPr>
+        <w:t>th</w:t>
+      </w:r>
+      <w:r>
+        <w:rPr>
+          <w:sz w:val="24"/>
+          <w:szCs w:val="24"/>
+        </w:rPr>
+        <w:t xml:space="preserve"> October 2026. </w:t>
+      </w:r>
     </w:p>
     <w:p>
       <w:pPr>
@@ -6316,6 +6376,15 @@
           <w:szCs w:val="24"/>
         </w:rPr>
       </w:pPr>
+    </w:p>
+    <w:p>
+      <w:pPr>
+        <w:jc w:val="both"/>
+        <w:rPr>
+          <w:sz w:val="24"/>
+          <w:szCs w:val="24"/>
+        </w:rPr>
+      </w:pPr>
       <w:r>
         <w:rPr>
           <w:b/>
@@ -6418,6 +6487,7 @@
           <w:sz w:val="24"/>
           <w:szCs w:val="24"/>
         </w:rPr>
+        <w:lastRenderedPageBreak/>
         <w:t>LM Kabongo and Joshua Peter worked on the research into workflow management systems and the concepts relevant to TIVIDY. This included workflow definitions and instances, activities, work items, assignment, routing, participants, dependencies, events, auditing, monitoring, reusability and workflow versioning.</w:t>
       </w:r>
     </w:p>
@@ -6481,15 +6551,362 @@
           <w:sz w:val="24"/>
           <w:szCs w:val="24"/>
         </w:rPr>
+        <w:t>Contributor:</w:t>
+      </w:r>
+      <w:r>
+        <w:rPr>
+          <w:sz w:val="24"/>
+          <w:szCs w:val="24"/>
+        </w:rPr>
+        <w:t xml:space="preserve"> Kristy Heesen</w:t>
+      </w:r>
+    </w:p>
+    <w:p>
+      <w:pPr>
+        <w:jc w:val="both"/>
+        <w:rPr>
+          <w:sz w:val="24"/>
+          <w:szCs w:val="24"/>
+        </w:rPr>
+      </w:pPr>
+    </w:p>
+    <w:p>
+      <w:pPr>
+        <w:jc w:val="both"/>
+        <w:rPr>
+          <w:sz w:val="24"/>
+          <w:szCs w:val="24"/>
+        </w:rPr>
+      </w:pPr>
+      <w:r>
+        <w:rPr>
+          <w:sz w:val="24"/>
+          <w:szCs w:val="24"/>
+        </w:rPr>
+        <w:t>Kristy Heesen developed the initial scope of TIVIDY and defined the selected University Student Complaint Management scenario. This included distinguishing workflow definitions from running workflow instances and establishing the responsibilities and boundaries of the generic workflow management system.</w:t>
+      </w:r>
+    </w:p>
+    <w:p>
+      <w:pPr>
+        <w:jc w:val="both"/>
+        <w:rPr>
+          <w:sz w:val="24"/>
+          <w:szCs w:val="24"/>
+        </w:rPr>
+      </w:pPr>
+    </w:p>
+    <w:p>
+      <w:pPr>
+        <w:jc w:val="both"/>
+        <w:rPr>
+          <w:sz w:val="24"/>
+          <w:szCs w:val="24"/>
+        </w:rPr>
+      </w:pPr>
+      <w:r>
+        <w:rPr>
+          <w:b/>
+          <w:bCs/>
+          <w:sz w:val="24"/>
+          <w:szCs w:val="24"/>
+        </w:rPr>
+        <w:t>Task 3</w:t>
+      </w:r>
+      <w:r>
+        <w:rPr>
+          <w:b/>
+          <w:bCs/>
+          <w:sz w:val="24"/>
+          <w:szCs w:val="24"/>
+        </w:rPr>
+        <w:t xml:space="preserve">: </w:t>
+      </w:r>
+      <w:r>
+        <w:rPr>
+          <w:b/>
+          <w:bCs/>
+          <w:sz w:val="24"/>
+          <w:szCs w:val="24"/>
+        </w:rPr>
+        <w:t>UML Activity Diagrams</w:t>
+      </w:r>
+    </w:p>
+    <w:p>
+      <w:pPr>
+        <w:jc w:val="both"/>
+        <w:rPr>
+          <w:sz w:val="24"/>
+          <w:szCs w:val="24"/>
+        </w:rPr>
+      </w:pPr>
+      <w:r>
+        <w:rPr>
+          <w:b/>
+          <w:bCs/>
+          <w:sz w:val="24"/>
+          <w:szCs w:val="24"/>
+        </w:rPr>
+        <w:t>Contributors:</w:t>
+      </w:r>
+      <w:r>
+        <w:rPr>
+          <w:sz w:val="24"/>
+          <w:szCs w:val="24"/>
+        </w:rPr>
+        <w:t xml:space="preserve"> Lindokuhle Skosana, Joshua Peter</w:t>
+      </w:r>
+    </w:p>
+    <w:p>
+      <w:pPr>
+        <w:jc w:val="both"/>
+        <w:rPr>
+          <w:sz w:val="24"/>
+          <w:szCs w:val="24"/>
+        </w:rPr>
+      </w:pPr>
+    </w:p>
+    <w:p>
+      <w:pPr>
+        <w:jc w:val="both"/>
+        <w:rPr>
+          <w:sz w:val="24"/>
+          <w:szCs w:val="24"/>
+        </w:rPr>
+      </w:pPr>
+      <w:r>
+        <w:rPr>
+          <w:sz w:val="24"/>
+          <w:szCs w:val="24"/>
+        </w:rPr>
+        <w:t>Lindokuhle Skosana and Joshua Peter worked on the UML Activity Diagrams for the generic TIVIDY workflows and the selected University Student Complaint Management scenario.</w:t>
+      </w:r>
+    </w:p>
+    <w:p>
+      <w:pPr>
+        <w:jc w:val="both"/>
+        <w:rPr>
+          <w:sz w:val="24"/>
+          <w:szCs w:val="24"/>
+        </w:rPr>
+      </w:pPr>
+    </w:p>
+    <w:p>
+      <w:pPr>
+        <w:jc w:val="both"/>
+        <w:rPr>
+          <w:sz w:val="24"/>
+          <w:szCs w:val="24"/>
+        </w:rPr>
+      </w:pPr>
+      <w:r>
+        <w:rPr>
+          <w:b/>
+          <w:bCs/>
+          <w:sz w:val="24"/>
+          <w:szCs w:val="24"/>
+        </w:rPr>
+        <w:t>Task 4</w:t>
+      </w:r>
+      <w:r>
+        <w:rPr>
+          <w:b/>
+          <w:bCs/>
+          <w:sz w:val="24"/>
+          <w:szCs w:val="24"/>
+        </w:rPr>
+        <w:t xml:space="preserve">: </w:t>
+      </w:r>
+      <w:r>
+        <w:rPr>
+          <w:b/>
+          <w:bCs/>
+          <w:sz w:val="24"/>
+          <w:szCs w:val="24"/>
+        </w:rPr>
+        <w:t>Design Patterns</w:t>
+      </w:r>
+    </w:p>
+    <w:p>
+      <w:pPr>
+        <w:jc w:val="both"/>
+        <w:rPr>
+          <w:sz w:val="24"/>
+          <w:szCs w:val="24"/>
+        </w:rPr>
+      </w:pPr>
+      <w:r>
+        <w:rPr>
+          <w:b/>
+          <w:bCs/>
+          <w:sz w:val="24"/>
+          <w:szCs w:val="24"/>
+        </w:rPr>
+        <w:t>Contributors:</w:t>
+      </w:r>
+      <w:r>
+        <w:rPr>
+          <w:sz w:val="24"/>
+          <w:szCs w:val="24"/>
+        </w:rPr>
+        <w:t xml:space="preserve"> Kristy Heesen, Musa Msibi, Lindokuhle Skosana</w:t>
+      </w:r>
+    </w:p>
+    <w:p>
+      <w:pPr>
+        <w:jc w:val="both"/>
+        <w:rPr>
+          <w:sz w:val="24"/>
+          <w:szCs w:val="24"/>
+        </w:rPr>
+      </w:pPr>
+    </w:p>
+    <w:p>
+      <w:pPr>
+        <w:jc w:val="both"/>
+        <w:rPr>
+          <w:sz w:val="24"/>
+          <w:szCs w:val="24"/>
+        </w:rPr>
+      </w:pPr>
+      <w:r>
+        <w:rPr>
+          <w:sz w:val="24"/>
+          <w:szCs w:val="24"/>
+        </w:rPr>
+        <w:t xml:space="preserve">Kristy Heesen, Musa Msibi and Lindokuhle Skosana worked on identifying and justifying the </w:t>
+      </w:r>
+      <w:proofErr w:type="spellStart"/>
+      <w:r>
+        <w:rPr>
+          <w:sz w:val="24"/>
+          <w:szCs w:val="24"/>
+        </w:rPr>
+        <w:t>GoF</w:t>
+      </w:r>
+      <w:proofErr w:type="spellEnd"/>
+      <w:r>
+        <w:rPr>
+          <w:sz w:val="24"/>
+          <w:szCs w:val="24"/>
+        </w:rPr>
+        <w:t xml:space="preserve"> design patterns used in TIVIDY. This included defining the design problems, pattern participants, collaborations, variation points and how the patterns work together within the workflow management system.</w:t>
+      </w:r>
+    </w:p>
+    <w:p>
+      <w:pPr>
+        <w:jc w:val="both"/>
+        <w:rPr>
+          <w:sz w:val="24"/>
+          <w:szCs w:val="24"/>
+        </w:rPr>
+      </w:pPr>
+    </w:p>
+    <w:p>
+      <w:pPr>
+        <w:jc w:val="both"/>
+        <w:rPr>
+          <w:sz w:val="24"/>
+          <w:szCs w:val="24"/>
+        </w:rPr>
+      </w:pPr>
+      <w:r>
+        <w:rPr>
+          <w:b/>
+          <w:bCs/>
+          <w:sz w:val="24"/>
+          <w:szCs w:val="24"/>
+        </w:rPr>
+        <w:t>Task 5</w:t>
+      </w:r>
+      <w:r>
+        <w:rPr>
+          <w:b/>
+          <w:bCs/>
+          <w:sz w:val="24"/>
+          <w:szCs w:val="24"/>
+        </w:rPr>
+        <w:t xml:space="preserve">: </w:t>
+      </w:r>
+      <w:r>
+        <w:rPr>
+          <w:b/>
+          <w:bCs/>
+          <w:sz w:val="24"/>
+          <w:szCs w:val="24"/>
+        </w:rPr>
+        <w:t>UML Class Diagram</w:t>
+      </w:r>
+    </w:p>
+    <w:p>
+      <w:pPr>
+        <w:jc w:val="both"/>
+        <w:rPr>
+          <w:sz w:val="24"/>
+          <w:szCs w:val="24"/>
+        </w:rPr>
+      </w:pPr>
+      <w:r>
+        <w:rPr>
+          <w:b/>
+          <w:bCs/>
+          <w:sz w:val="24"/>
+          <w:szCs w:val="24"/>
+        </w:rPr>
+        <w:t>Contributors:</w:t>
+      </w:r>
+      <w:r>
+        <w:rPr>
+          <w:sz w:val="24"/>
+          <w:szCs w:val="24"/>
+        </w:rPr>
+        <w:t xml:space="preserve"> </w:t>
+      </w:r>
+      <w:r>
+        <w:rPr>
+          <w:sz w:val="24"/>
+          <w:szCs w:val="24"/>
+        </w:rPr>
+        <w:t>Kristy Heesen</w:t>
+      </w:r>
+    </w:p>
+    <w:p>
+      <w:pPr>
+        <w:jc w:val="both"/>
+        <w:rPr>
+          <w:sz w:val="24"/>
+          <w:szCs w:val="24"/>
+        </w:rPr>
+      </w:pPr>
+    </w:p>
+    <w:p>
+      <w:pPr>
+        <w:jc w:val="both"/>
+        <w:rPr>
+          <w:sz w:val="24"/>
+          <w:szCs w:val="24"/>
+        </w:rPr>
+      </w:pPr>
+      <w:r>
+        <w:rPr>
+          <w:sz w:val="24"/>
+          <w:szCs w:val="24"/>
+        </w:rPr>
+        <w:t xml:space="preserve">Kristy Heesen </w:t>
+      </w:r>
+      <w:r>
+        <w:rPr>
+          <w:sz w:val="24"/>
+          <w:szCs w:val="24"/>
+        </w:rPr>
+        <w:t xml:space="preserve">worked on developing the complete UML Class Diagram for TIVIDY. This included the main classes, relationships, multiplicities, attributes, </w:t>
+      </w:r>
+      <w:r>
+        <w:rPr>
+          <w:sz w:val="24"/>
+          <w:szCs w:val="24"/>
+        </w:rPr>
         <w:lastRenderedPageBreak/>
-        <w:t>Contributor:</w:t>
-      </w:r>
-      <w:r>
-        <w:rPr>
-          <w:sz w:val="24"/>
-          <w:szCs w:val="24"/>
-        </w:rPr>
-        <w:t xml:space="preserve"> Kristy Heesen</w:t>
+        <w:t>operations, ownership relationships and the collaborations between the different design patterns and subsystems.</w:t>
       </w:r>
     </w:p>
     <w:p>
@@ -6511,10 +6928,30 @@
       </w:pPr>
       <w:r>
         <w:rPr>
-          <w:sz w:val="24"/>
-          <w:szCs w:val="24"/>
-        </w:rPr>
-        <w:t>Kristy Heesen developed the initial scope of TIVIDY and defined the selected University Student Complaint Management scenario. This included distinguishing workflow definitions from running workflow instances and establishing the responsibilities and boundaries of the generic workflow management system.</w:t>
+          <w:b/>
+          <w:bCs/>
+          <w:sz w:val="24"/>
+          <w:szCs w:val="24"/>
+        </w:rPr>
+        <w:t>Task 6</w:t>
+      </w:r>
+      <w:r>
+        <w:rPr>
+          <w:b/>
+          <w:bCs/>
+          <w:sz w:val="24"/>
+          <w:szCs w:val="24"/>
+        </w:rPr>
+        <w:t xml:space="preserve">: </w:t>
+      </w:r>
+      <w:r>
+        <w:rPr>
+          <w:b/>
+          <w:bCs/>
+          <w:sz w:val="24"/>
+          <w:szCs w:val="24"/>
+        </w:rPr>
+        <w:t>Runtime Behaviour Diagrams</w:t>
       </w:r>
     </w:p>
     <w:p>
@@ -6525,6 +6962,22 @@
           <w:szCs w:val="24"/>
         </w:rPr>
       </w:pPr>
+      <w:r>
+        <w:rPr>
+          <w:b/>
+          <w:bCs/>
+          <w:sz w:val="24"/>
+          <w:szCs w:val="24"/>
+        </w:rPr>
+        <w:t>Contributors:</w:t>
+      </w:r>
+      <w:r>
+        <w:rPr>
+          <w:sz w:val="24"/>
+          <w:szCs w:val="24"/>
+        </w:rPr>
+        <w:t xml:space="preserve"> LM Kabongo, Musa Msibi</w:t>
+      </w:r>
     </w:p>
     <w:p>
       <w:pPr>
@@ -6534,33 +6987,6 @@
           <w:szCs w:val="24"/>
         </w:rPr>
       </w:pPr>
-      <w:r>
-        <w:rPr>
-          <w:b/>
-          <w:bCs/>
-          <w:sz w:val="24"/>
-          <w:szCs w:val="24"/>
-        </w:rPr>
-        <w:t>Task 3</w:t>
-      </w:r>
-      <w:r>
-        <w:rPr>
-          <w:b/>
-          <w:bCs/>
-          <w:sz w:val="24"/>
-          <w:szCs w:val="24"/>
-        </w:rPr>
-        <w:t xml:space="preserve">: </w:t>
-      </w:r>
-      <w:r>
-        <w:rPr>
-          <w:b/>
-          <w:bCs/>
-          <w:sz w:val="24"/>
-          <w:szCs w:val="24"/>
-        </w:rPr>
-        <w:t>UML Activity Diagrams</w:t>
-      </w:r>
     </w:p>
     <w:p>
       <w:pPr>
@@ -6572,359 +6998,9 @@
       </w:pPr>
       <w:r>
         <w:rPr>
-          <w:b/>
-          <w:bCs/>
-          <w:sz w:val="24"/>
-          <w:szCs w:val="24"/>
-        </w:rPr>
-        <w:t>Contributors:</w:t>
-      </w:r>
-      <w:r>
-        <w:rPr>
-          <w:sz w:val="24"/>
-          <w:szCs w:val="24"/>
-        </w:rPr>
-        <w:t xml:space="preserve"> Lindokuhle Skosana, Joshua Peter</w:t>
-      </w:r>
-    </w:p>
-    <w:p>
-      <w:pPr>
-        <w:jc w:val="both"/>
-        <w:rPr>
-          <w:sz w:val="24"/>
-          <w:szCs w:val="24"/>
-        </w:rPr>
-      </w:pPr>
-    </w:p>
-    <w:p>
-      <w:pPr>
-        <w:jc w:val="both"/>
-        <w:rPr>
-          <w:sz w:val="24"/>
-          <w:szCs w:val="24"/>
-        </w:rPr>
-      </w:pPr>
-      <w:r>
-        <w:rPr>
-          <w:sz w:val="24"/>
-          <w:szCs w:val="24"/>
-        </w:rPr>
-        <w:t>Lindokuhle Skosana and Joshua Peter worked on the UML Activity Diagrams for the generic TIVIDY workflows and the selected University Student Complaint Management scenario.</w:t>
-      </w:r>
-    </w:p>
-    <w:p>
-      <w:pPr>
-        <w:jc w:val="both"/>
-        <w:rPr>
-          <w:sz w:val="24"/>
-          <w:szCs w:val="24"/>
-        </w:rPr>
-      </w:pPr>
-    </w:p>
-    <w:p>
-      <w:pPr>
-        <w:jc w:val="both"/>
-        <w:rPr>
-          <w:sz w:val="24"/>
-          <w:szCs w:val="24"/>
-        </w:rPr>
-      </w:pPr>
-      <w:r>
-        <w:rPr>
-          <w:b/>
-          <w:bCs/>
-          <w:sz w:val="24"/>
-          <w:szCs w:val="24"/>
-        </w:rPr>
-        <w:t>Task 4</w:t>
-      </w:r>
-      <w:r>
-        <w:rPr>
-          <w:b/>
-          <w:bCs/>
-          <w:sz w:val="24"/>
-          <w:szCs w:val="24"/>
-        </w:rPr>
-        <w:t xml:space="preserve">: </w:t>
-      </w:r>
-      <w:r>
-        <w:rPr>
-          <w:b/>
-          <w:bCs/>
-          <w:sz w:val="24"/>
-          <w:szCs w:val="24"/>
-        </w:rPr>
-        <w:t>Design Patterns</w:t>
-      </w:r>
-    </w:p>
-    <w:p>
-      <w:pPr>
-        <w:jc w:val="both"/>
-        <w:rPr>
-          <w:sz w:val="24"/>
-          <w:szCs w:val="24"/>
-        </w:rPr>
-      </w:pPr>
-      <w:r>
-        <w:rPr>
-          <w:b/>
-          <w:bCs/>
-          <w:sz w:val="24"/>
-          <w:szCs w:val="24"/>
-        </w:rPr>
-        <w:t>Contributors:</w:t>
-      </w:r>
-      <w:r>
-        <w:rPr>
-          <w:sz w:val="24"/>
-          <w:szCs w:val="24"/>
-        </w:rPr>
-        <w:t xml:space="preserve"> Kristy Heesen, Musa Msibi, Lindokuhle Skosana</w:t>
-      </w:r>
-    </w:p>
-    <w:p>
-      <w:pPr>
-        <w:jc w:val="both"/>
-        <w:rPr>
-          <w:sz w:val="24"/>
-          <w:szCs w:val="24"/>
-        </w:rPr>
-      </w:pPr>
-    </w:p>
-    <w:p>
-      <w:pPr>
-        <w:jc w:val="both"/>
-        <w:rPr>
-          <w:sz w:val="24"/>
-          <w:szCs w:val="24"/>
-        </w:rPr>
-      </w:pPr>
-      <w:r>
-        <w:rPr>
-          <w:sz w:val="24"/>
-          <w:szCs w:val="24"/>
-        </w:rPr>
-        <w:t xml:space="preserve">Kristy Heesen, Musa Msibi and Lindokuhle Skosana worked on identifying and justifying the </w:t>
-      </w:r>
-      <w:proofErr w:type="spellStart"/>
-      <w:r>
-        <w:rPr>
-          <w:sz w:val="24"/>
-          <w:szCs w:val="24"/>
-        </w:rPr>
-        <w:t>GoF</w:t>
-      </w:r>
-      <w:proofErr w:type="spellEnd"/>
-      <w:r>
-        <w:rPr>
-          <w:sz w:val="24"/>
-          <w:szCs w:val="24"/>
-        </w:rPr>
-        <w:t xml:space="preserve"> design patterns used in TIVIDY. This included defining the design problems, pattern participants, collaborations, variation points and how the patterns work together within the workflow management system.</w:t>
-      </w:r>
-    </w:p>
-    <w:p>
-      <w:pPr>
-        <w:jc w:val="both"/>
-        <w:rPr>
-          <w:sz w:val="24"/>
-          <w:szCs w:val="24"/>
-        </w:rPr>
-      </w:pPr>
-    </w:p>
-    <w:p>
-      <w:pPr>
-        <w:jc w:val="both"/>
-        <w:rPr>
-          <w:sz w:val="24"/>
-          <w:szCs w:val="24"/>
-        </w:rPr>
-      </w:pPr>
-      <w:r>
-        <w:rPr>
-          <w:b/>
-          <w:bCs/>
-          <w:sz w:val="24"/>
-          <w:szCs w:val="24"/>
-        </w:rPr>
-        <w:t>Task 5</w:t>
-      </w:r>
-      <w:r>
-        <w:rPr>
-          <w:b/>
-          <w:bCs/>
-          <w:sz w:val="24"/>
-          <w:szCs w:val="24"/>
-        </w:rPr>
-        <w:t xml:space="preserve">: </w:t>
-      </w:r>
-      <w:r>
-        <w:rPr>
-          <w:b/>
-          <w:bCs/>
-          <w:sz w:val="24"/>
-          <w:szCs w:val="24"/>
-        </w:rPr>
-        <w:t>UML Class Diagram</w:t>
-      </w:r>
-    </w:p>
-    <w:p>
-      <w:pPr>
-        <w:jc w:val="both"/>
-        <w:rPr>
-          <w:sz w:val="24"/>
-          <w:szCs w:val="24"/>
-        </w:rPr>
-      </w:pPr>
-      <w:r>
-        <w:rPr>
-          <w:b/>
-          <w:bCs/>
-          <w:sz w:val="24"/>
-          <w:szCs w:val="24"/>
-        </w:rPr>
-        <w:t>Contributors:</w:t>
-      </w:r>
-      <w:r>
-        <w:rPr>
-          <w:sz w:val="24"/>
-          <w:szCs w:val="24"/>
-        </w:rPr>
-        <w:t xml:space="preserve"> </w:t>
-      </w:r>
-      <w:r>
-        <w:rPr>
-          <w:sz w:val="24"/>
-          <w:szCs w:val="24"/>
-        </w:rPr>
-        <w:t>Kristy Heesen</w:t>
-      </w:r>
-    </w:p>
-    <w:p>
-      <w:pPr>
-        <w:jc w:val="both"/>
-        <w:rPr>
-          <w:sz w:val="24"/>
-          <w:szCs w:val="24"/>
-        </w:rPr>
-      </w:pPr>
-    </w:p>
-    <w:p>
-      <w:pPr>
-        <w:jc w:val="both"/>
-        <w:rPr>
-          <w:sz w:val="24"/>
-          <w:szCs w:val="24"/>
-        </w:rPr>
-      </w:pPr>
-      <w:r>
-        <w:rPr>
-          <w:sz w:val="24"/>
-          <w:szCs w:val="24"/>
-        </w:rPr>
-        <w:t xml:space="preserve">Kristy Heesen </w:t>
-      </w:r>
-      <w:r>
-        <w:rPr>
-          <w:sz w:val="24"/>
-          <w:szCs w:val="24"/>
-        </w:rPr>
-        <w:t>worked on developing the complete UML Class Diagram for TIVIDY. This included the main classes, relationships, multiplicities, attributes, operations, ownership relationships and the collaborations between the different design patterns and subsystems.</w:t>
-      </w:r>
-    </w:p>
-    <w:p>
-      <w:pPr>
-        <w:jc w:val="both"/>
-        <w:rPr>
-          <w:sz w:val="24"/>
-          <w:szCs w:val="24"/>
-        </w:rPr>
-      </w:pPr>
-    </w:p>
-    <w:p>
-      <w:pPr>
-        <w:jc w:val="both"/>
-        <w:rPr>
-          <w:sz w:val="24"/>
-          <w:szCs w:val="24"/>
-        </w:rPr>
-      </w:pPr>
-      <w:r>
-        <w:rPr>
-          <w:b/>
-          <w:bCs/>
-          <w:sz w:val="24"/>
-          <w:szCs w:val="24"/>
-        </w:rPr>
-        <w:t>Task 6</w:t>
-      </w:r>
-      <w:r>
-        <w:rPr>
-          <w:b/>
-          <w:bCs/>
-          <w:sz w:val="24"/>
-          <w:szCs w:val="24"/>
-        </w:rPr>
-        <w:t xml:space="preserve">: </w:t>
-      </w:r>
-      <w:r>
-        <w:rPr>
-          <w:b/>
-          <w:bCs/>
-          <w:sz w:val="24"/>
-          <w:szCs w:val="24"/>
-        </w:rPr>
-        <w:t>Runtime Behaviour Diagrams</w:t>
-      </w:r>
-    </w:p>
-    <w:p>
-      <w:pPr>
-        <w:jc w:val="both"/>
-        <w:rPr>
-          <w:sz w:val="24"/>
-          <w:szCs w:val="24"/>
-        </w:rPr>
-      </w:pPr>
-      <w:r>
-        <w:rPr>
-          <w:b/>
-          <w:bCs/>
-          <w:sz w:val="24"/>
-          <w:szCs w:val="24"/>
-        </w:rPr>
-        <w:t>Contributors:</w:t>
-      </w:r>
-      <w:r>
-        <w:rPr>
-          <w:sz w:val="24"/>
-          <w:szCs w:val="24"/>
-        </w:rPr>
-        <w:t xml:space="preserve"> LM Kabongo, Musa Msibi</w:t>
-      </w:r>
-    </w:p>
-    <w:p>
-      <w:pPr>
-        <w:jc w:val="both"/>
-        <w:rPr>
-          <w:sz w:val="24"/>
-          <w:szCs w:val="24"/>
-        </w:rPr>
-      </w:pPr>
-    </w:p>
-    <w:p>
-      <w:pPr>
-        <w:jc w:val="both"/>
-        <w:rPr>
-          <w:sz w:val="24"/>
-          <w:szCs w:val="24"/>
-        </w:rPr>
-      </w:pPr>
-      <w:r>
-        <w:rPr>
-          <w:sz w:val="24"/>
-          <w:szCs w:val="24"/>
-        </w:rPr>
-        <w:lastRenderedPageBreak/>
+          <w:sz w:val="24"/>
+          <w:szCs w:val="24"/>
+        </w:rPr>
         <w:t xml:space="preserve">LM Kabongo and Musa Msibi worked on the UML runtime behaviour diagrams. LM Kabongo developed the sequence diagram showing the completion of a </w:t>
       </w:r>
       <w:proofErr w:type="spellStart"/>
@@ -7172,7 +7248,7 @@
 </file>
 
 <file path=word/endnotes.xml><?xml version="1.0" encoding="utf-8"?>
-<w:endnotes xmlns:wpc="http://schemas.microsoft.com/office/word/2010/wordprocessingCanvas" xmlns:cx="http://schemas.microsoft.com/office/drawing/2014/chartex" xmlns:cx1="http://schemas.microsoft.com/office/drawing/2015/9/8/chartex" xmlns:cx2="http://schemas.microsoft.com/office/drawing/2015/10/21/chartex" xmlns:cx3="http://schemas.microsoft.com/office/drawing/2016/5/9/chartex" xmlns:cx4="http://schemas.microsoft.com/office/drawing/2016/5/10/chartex" xmlns:cx5="http://schemas.microsoft.com/office/drawing/2016/5/11/chartex" xmlns:cx6="http://schemas.microsoft.com/office/drawing/2016/5/12/chartex" xmlns:cx7="http://schemas.microsoft.com/office/drawing/2016/5/13/chartex" xmlns:cx8="http://schemas.microsoft.com/office/drawing/2016/5/14/chartex" xmlns:mc="http://schemas.openxmlformats.org/markup-compatibility/2006" xmlns:aink="http://schemas.microsoft.com/office/drawing/2016/ink" xmlns:am3d="http://schemas.microsoft.com/office/drawing/2017/model3d" xmlns:o="urn:schemas-microsoft-com:office:office" xmlns:oel="http://schemas.microsoft.com/office/2019/extlst" xmlns:r="http://schemas.openxmlformats.org/officeDocument/2006/relationships" xmlns:m="http://schemas.openxmlformats.org/officeDocument/2006/math" xmlns:v="urn:schemas-microsoft-com:vml" xmlns:wp14="http://schemas.microsoft.com/office/word/2010/wordprocessingDrawing" xmlns:wp="http://schemas.openxmlformats.org/drawingml/2006/wordprocessingDrawing" xmlns:w10="urn:schemas-microsoft-com:office:word" xmlns:w="http://schemas.openxmlformats.org/wordprocessingml/2006/main" xmlns:w14="http://schemas.microsoft.com/office/word/2010/wordml" xmlns:w15="http://schemas.microsoft.com/office/word/2012/wordml" xmlns:w16cex="http://schemas.microsoft.com/office/word/2018/wordml/cex" xmlns:w16cid="http://schemas.microsoft.com/office/word/2016/wordml/cid" xmlns:w16="http://schemas.microsoft.com/office/word/2018/wordml" xmlns:w16du="http://schemas.microsoft.com/office/word/2023/wordml/word16du" xmlns:w16sdtdh="http://schemas.microsoft.com/office/word/2020/wordml/sdtdatahash" xmlns:w16sdtfl="http://schemas.microsoft.com/office/word/2024/wordml/sdtformatlock" xmlns:w16se="http://schemas.microsoft.com/office/word/2015/wordml/symex" xmlns:wpg="http://schemas.microsoft.com/office/word/2010/wordprocessingGroup" xmlns:wpi="http://schemas.microsoft.com/office/word/2010/wordprocessingInk" xmlns:wne="http://schemas.microsoft.com/office/word/2006/wordml" xmlns:wps="http://schemas.microsoft.com/office/word/2010/wordprocessingShape" mc:Ignorable="w14 w15 w16se w16cid w16 w16cex w16sdtdh w16sdtfl w16du wp14">
+<w:endnotes xmlns:wpc="http://schemas.microsoft.com/office/word/2010/wordprocessingCanvas" xmlns:cx="http://schemas.microsoft.com/office/drawing/2014/chartex" xmlns:cx1="http://schemas.microsoft.com/office/drawing/2015/9/8/chartex" xmlns:cx2="http://schemas.microsoft.com/office/drawing/2015/10/21/chartex" xmlns:cx3="http://schemas.microsoft.com/office/drawing/2016/5/9/chartex" xmlns:cx4="http://schemas.microsoft.com/office/drawing/2016/5/10/chartex" xmlns:cx5="http://schemas.microsoft.com/office/drawing/2016/5/11/chartex" xmlns:cx6="http://schemas.microsoft.com/office/drawing/2016/5/12/chartex" xmlns:cx7="http://schemas.microsoft.com/office/drawing/2016/5/13/chartex" xmlns:cx8="http://schemas.microsoft.com/office/drawing/2016/5/14/chartex" xmlns:mc="http://schemas.openxmlformats.org/markup-compatibility/2006" xmlns:aink="http://schemas.microsoft.com/office/drawing/2016/ink" xmlns:am3d="http://schemas.microsoft.com/office/drawing/2017/model3d" xmlns:o="urn:schemas-microsoft-com:office:office" xmlns:oel="http://schemas.microsoft.com/office/2019/extlst" xmlns:r="http://schemas.openxmlformats.org/officeDocument/2006/relationships" xmlns:m="http://schemas.openxmlformats.org/officeDocument/2006/math" xmlns:v="urn:schemas-microsoft-com:vml" xmlns:wp14="http://schemas.microsoft.com/office/word/2010/wordprocessingDrawing" xmlns:wp="http://schemas.openxmlformats.org/drawingml/2006/wordprocessingDrawing" xmlns:w10="urn:schemas-microsoft-com:office:word" xmlns:w="http://schemas.openxmlformats.org/wordprocessingml/2006/main" xmlns:w14="http://schemas.microsoft.com/office/word/2010/wordml" xmlns:w15="http://schemas.microsoft.com/office/word/2012/wordml" xmlns:w16cex="http://schemas.microsoft.com/office/word/2018/wordml/cex" xmlns:w16cid="http://schemas.microsoft.com/office/word/2016/wordml/cid" xmlns:w16="http://schemas.microsoft.com/office/word/2018/wordml" xmlns:w16sdtdh="http://schemas.microsoft.com/office/word/2020/wordml/sdtdatahash" xmlns:w16se="http://schemas.microsoft.com/office/word/2015/wordml/symex" xmlns:wpg="http://schemas.microsoft.com/office/word/2010/wordprocessingGroup" xmlns:wpi="http://schemas.microsoft.com/office/word/2010/wordprocessingInk" xmlns:wne="http://schemas.microsoft.com/office/word/2006/wordml" xmlns:wps="http://schemas.microsoft.com/office/word/2010/wordprocessingShape" mc:Ignorable="w14 w15 w16se w16cid w16 w16cex w16sdtdh wp14">
   <w:endnote w:type="separator" w:id="-1">
     <w:p>
       <w:pPr>
@@ -7197,7 +7273,7 @@
 </file>
 
 <file path=word/footnotes.xml><?xml version="1.0" encoding="utf-8"?>
-<w:footnotes xmlns:wpc="http://schemas.microsoft.com/office/word/2010/wordprocessingCanvas" xmlns:cx="http://schemas.microsoft.com/office/drawing/2014/chartex" xmlns:cx1="http://schemas.microsoft.com/office/drawing/2015/9/8/chartex" xmlns:cx2="http://schemas.microsoft.com/office/drawing/2015/10/21/chartex" xmlns:cx3="http://schemas.microsoft.com/office/drawing/2016/5/9/chartex" xmlns:cx4="http://schemas.microsoft.com/office/drawing/2016/5/10/chartex" xmlns:cx5="http://schemas.microsoft.com/office/drawing/2016/5/11/chartex" xmlns:cx6="http://schemas.microsoft.com/office/drawing/2016/5/12/chartex" xmlns:cx7="http://schemas.microsoft.com/office/drawing/2016/5/13/chartex" xmlns:cx8="http://schemas.microsoft.com/office/drawing/2016/5/14/chartex" xmlns:mc="http://schemas.openxmlformats.org/markup-compatibility/2006" xmlns:aink="http://schemas.microsoft.com/office/drawing/2016/ink" xmlns:am3d="http://schemas.microsoft.com/office/drawing/2017/model3d" xmlns:o="urn:schemas-microsoft-com:office:office" xmlns:oel="http://schemas.microsoft.com/office/2019/extlst" xmlns:r="http://schemas.openxmlformats.org/officeDocument/2006/relationships" xmlns:m="http://schemas.openxmlformats.org/officeDocument/2006/math" xmlns:v="urn:schemas-microsoft-com:vml" xmlns:wp14="http://schemas.microsoft.com/office/word/2010/wordprocessingDrawing" xmlns:wp="http://schemas.openxmlformats.org/drawingml/2006/wordprocessingDrawing" xmlns:w10="urn:schemas-microsoft-com:office:word" xmlns:w="http://schemas.openxmlformats.org/wordprocessingml/2006/main" xmlns:w14="http://schemas.microsoft.com/office/word/2010/wordml" xmlns:w15="http://schemas.microsoft.com/office/word/2012/wordml" xmlns:w16cex="http://schemas.microsoft.com/office/word/2018/wordml/cex" xmlns:w16cid="http://schemas.microsoft.com/office/word/2016/wordml/cid" xmlns:w16="http://schemas.microsoft.com/office/word/2018/wordml" xmlns:w16du="http://schemas.microsoft.com/office/word/2023/wordml/word16du" xmlns:w16sdtdh="http://schemas.microsoft.com/office/word/2020/wordml/sdtdatahash" xmlns:w16sdtfl="http://schemas.microsoft.com/office/word/2024/wordml/sdtformatlock" xmlns:w16se="http://schemas.microsoft.com/office/word/2015/wordml/symex" xmlns:wpg="http://schemas.microsoft.com/office/word/2010/wordprocessingGroup" xmlns:wpi="http://schemas.microsoft.com/office/word/2010/wordprocessingInk" xmlns:wne="http://schemas.microsoft.com/office/word/2006/wordml" xmlns:wps="http://schemas.microsoft.com/office/word/2010/wordprocessingShape" mc:Ignorable="w14 w15 w16se w16cid w16 w16cex w16sdtdh w16sdtfl w16du wp14">
+<w:footnotes xmlns:wpc="http://schemas.microsoft.com/office/word/2010/wordprocessingCanvas" xmlns:cx="http://schemas.microsoft.com/office/drawing/2014/chartex" xmlns:cx1="http://schemas.microsoft.com/office/drawing/2015/9/8/chartex" xmlns:cx2="http://schemas.microsoft.com/office/drawing/2015/10/21/chartex" xmlns:cx3="http://schemas.microsoft.com/office/drawing/2016/5/9/chartex" xmlns:cx4="http://schemas.microsoft.com/office/drawing/2016/5/10/chartex" xmlns:cx5="http://schemas.microsoft.com/office/drawing/2016/5/11/chartex" xmlns:cx6="http://schemas.microsoft.com/office/drawing/2016/5/12/chartex" xmlns:cx7="http://schemas.microsoft.com/office/drawing/2016/5/13/chartex" xmlns:cx8="http://schemas.microsoft.com/office/drawing/2016/5/14/chartex" xmlns:mc="http://schemas.openxmlformats.org/markup-compatibility/2006" xmlns:aink="http://schemas.microsoft.com/office/drawing/2016/ink" xmlns:am3d="http://schemas.microsoft.com/office/drawing/2017/model3d" xmlns:o="urn:schemas-microsoft-com:office:office" xmlns:oel="http://schemas.microsoft.com/office/2019/extlst" xmlns:r="http://schemas.openxmlformats.org/officeDocument/2006/relationships" xmlns:m="http://schemas.openxmlformats.org/officeDocument/2006/math" xmlns:v="urn:schemas-microsoft-com:vml" xmlns:wp14="http://schemas.microsoft.com/office/word/2010/wordprocessingDrawing" xmlns:wp="http://schemas.openxmlformats.org/drawingml/2006/wordprocessingDrawing" xmlns:w10="urn:schemas-microsoft-com:office:word" xmlns:w="http://schemas.openxmlformats.org/wordprocessingml/2006/main" xmlns:w14="http://schemas.microsoft.com/office/word/2010/wordml" xmlns:w15="http://schemas.microsoft.com/office/word/2012/wordml" xmlns:w16cex="http://schemas.microsoft.com/office/word/2018/wordml/cex" xmlns:w16cid="http://schemas.microsoft.com/office/word/2016/wordml/cid" xmlns:w16="http://schemas.microsoft.com/office/word/2018/wordml" xmlns:w16sdtdh="http://schemas.microsoft.com/office/word/2020/wordml/sdtdatahash" xmlns:w16se="http://schemas.microsoft.com/office/word/2015/wordml/symex" xmlns:wpg="http://schemas.microsoft.com/office/word/2010/wordprocessingGroup" xmlns:wpi="http://schemas.microsoft.com/office/word/2010/wordprocessingInk" xmlns:wne="http://schemas.microsoft.com/office/word/2006/wordml" xmlns:wps="http://schemas.microsoft.com/office/word/2010/wordprocessingShape" mc:Ignorable="w14 w15 w16se w16cid w16 w16cex w16sdtdh wp14">
   <w:footnote w:type="separator" w:id="-1">
     <w:p>
       <w:pPr>
@@ -7222,7 +7298,7 @@
 </file>
 
 <file path=word/header1.xml><?xml version="1.0" encoding="utf-8"?>
-<w:hdr xmlns:wpc="http://schemas.microsoft.com/office/word/2010/wordprocessingCanvas" xmlns:cx="http://schemas.microsoft.com/office/drawing/2014/chartex" xmlns:cx1="http://schemas.microsoft.com/office/drawing/2015/9/8/chartex" xmlns:cx2="http://schemas.microsoft.com/office/drawing/2015/10/21/chartex" xmlns:cx3="http://schemas.microsoft.com/office/drawing/2016/5/9/chartex" xmlns:cx4="http://schemas.microsoft.com/office/drawing/2016/5/10/chartex" xmlns:cx5="http://schemas.microsoft.com/office/drawing/2016/5/11/chartex" xmlns:cx6="http://schemas.microsoft.com/office/drawing/2016/5/12/chartex" xmlns:cx7="http://schemas.microsoft.com/office/drawing/2016/5/13/chartex" xmlns:cx8="http://schemas.microsoft.com/office/drawing/2016/5/14/chartex" xmlns:mc="http://schemas.openxmlformats.org/markup-compatibility/2006" xmlns:aink="http://schemas.microsoft.com/office/drawing/2016/ink" xmlns:am3d="http://schemas.microsoft.com/office/drawing/2017/model3d" xmlns:o="urn:schemas-microsoft-com:office:office" xmlns:oel="http://schemas.microsoft.com/office/2019/extlst" xmlns:r="http://schemas.openxmlformats.org/officeDocument/2006/relationships" xmlns:m="http://schemas.openxmlformats.org/officeDocument/2006/math" xmlns:v="urn:schemas-microsoft-com:vml" xmlns:wp14="http://schemas.microsoft.com/office/word/2010/wordprocessingDrawing" xmlns:wp="http://schemas.openxmlformats.org/drawingml/2006/wordprocessingDrawing" xmlns:w10="urn:schemas-microsoft-com:office:word" xmlns:w="http://schemas.openxmlformats.org/wordprocessingml/2006/main" xmlns:w14="http://schemas.microsoft.com/office/word/2010/wordml" xmlns:w15="http://schemas.microsoft.com/office/word/2012/wordml" xmlns:w16cex="http://schemas.microsoft.com/office/word/2018/wordml/cex" xmlns:w16cid="http://schemas.microsoft.com/office/word/2016/wordml/cid" xmlns:w16="http://schemas.microsoft.com/office/word/2018/wordml" xmlns:w16du="http://schemas.microsoft.com/office/word/2023/wordml/word16du" xmlns:w16sdtdh="http://schemas.microsoft.com/office/word/2020/wordml/sdtdatahash" xmlns:w16sdtfl="http://schemas.microsoft.com/office/word/2024/wordml/sdtformatlock" xmlns:w16se="http://schemas.microsoft.com/office/word/2015/wordml/symex" xmlns:wpg="http://schemas.microsoft.com/office/word/2010/wordprocessingGroup" xmlns:wpi="http://schemas.microsoft.com/office/word/2010/wordprocessingInk" xmlns:wne="http://schemas.microsoft.com/office/word/2006/wordml" xmlns:wps="http://schemas.microsoft.com/office/word/2010/wordprocessingShape" mc:Ignorable="w14 w15 w16se w16cid w16 w16cex w16sdtdh w16sdtfl w16du wp14">
+<w:hdr xmlns:wpc="http://schemas.microsoft.com/office/word/2010/wordprocessingCanvas" xmlns:cx="http://schemas.microsoft.com/office/drawing/2014/chartex" xmlns:cx1="http://schemas.microsoft.com/office/drawing/2015/9/8/chartex" xmlns:cx2="http://schemas.microsoft.com/office/drawing/2015/10/21/chartex" xmlns:cx3="http://schemas.microsoft.com/office/drawing/2016/5/9/chartex" xmlns:cx4="http://schemas.microsoft.com/office/drawing/2016/5/10/chartex" xmlns:cx5="http://schemas.microsoft.com/office/drawing/2016/5/11/chartex" xmlns:cx6="http://schemas.microsoft.com/office/drawing/2016/5/12/chartex" xmlns:cx7="http://schemas.microsoft.com/office/drawing/2016/5/13/chartex" xmlns:cx8="http://schemas.microsoft.com/office/drawing/2016/5/14/chartex" xmlns:mc="http://schemas.openxmlformats.org/markup-compatibility/2006" xmlns:aink="http://schemas.microsoft.com/office/drawing/2016/ink" xmlns:am3d="http://schemas.microsoft.com/office/drawing/2017/model3d" xmlns:o="urn:schemas-microsoft-com:office:office" xmlns:oel="http://schemas.microsoft.com/office/2019/extlst" xmlns:r="http://schemas.openxmlformats.org/officeDocument/2006/relationships" xmlns:m="http://schemas.openxmlformats.org/officeDocument/2006/math" xmlns:v="urn:schemas-microsoft-com:vml" xmlns:wp14="http://schemas.microsoft.com/office/word/2010/wordprocessingDrawing" xmlns:wp="http://schemas.openxmlformats.org/drawingml/2006/wordprocessingDrawing" xmlns:w10="urn:schemas-microsoft-com:office:word" xmlns:w="http://schemas.openxmlformats.org/wordprocessingml/2006/main" xmlns:w14="http://schemas.microsoft.com/office/word/2010/wordml" xmlns:w15="http://schemas.microsoft.com/office/word/2012/wordml" xmlns:w16cex="http://schemas.microsoft.com/office/word/2018/wordml/cex" xmlns:w16cid="http://schemas.microsoft.com/office/word/2016/wordml/cid" xmlns:w16="http://schemas.microsoft.com/office/word/2018/wordml" xmlns:w16sdtdh="http://schemas.microsoft.com/office/word/2020/wordml/sdtdatahash" xmlns:w16se="http://schemas.microsoft.com/office/word/2015/wordml/symex" xmlns:wpg="http://schemas.microsoft.com/office/word/2010/wordprocessingGroup" xmlns:wpi="http://schemas.microsoft.com/office/word/2010/wordprocessingInk" xmlns:wne="http://schemas.microsoft.com/office/word/2006/wordml" xmlns:wps="http://schemas.microsoft.com/office/word/2010/wordprocessingShape" mc:Ignorable="w14 w15 w16se w16cid w16 w16cex w16sdtdh wp14">
   <w:p>
     <w:pPr>
       <w:pStyle w:val="Header"/>
@@ -7343,7 +7419,7 @@
             </wp:anchor>
           </w:drawing>
         </mc:Choice>
-        <mc:Fallback>
+        <mc:Fallback xmlns:w16sdtfl="http://schemas.microsoft.com/office/word/2024/wordml/sdtformatlock" xmlns:w16du="http://schemas.microsoft.com/office/word/2023/wordml/word16du">
           <w:pict>
             <v:rect w14:anchorId="10FAEFA2" id="Rectangle 200" o:spid="_x0000_s1026" style="position:absolute;margin-left:1.85pt;margin-top:36.9pt;width:449.4pt;height:22.9pt;z-index:-251658240;visibility:visible;mso-wrap-style:square;mso-width-percent:0;mso-height-percent:0;mso-wrap-distance-left:9.35pt;mso-wrap-distance-top:0;mso-wrap-distance-right:9.35pt;mso-wrap-distance-bottom:0;mso-position-horizontal:absolute;mso-position-horizontal-relative:margin;mso-position-vertical:absolute;mso-position-vertical-relative:page;mso-width-percent:0;mso-height-percent:0;mso-width-relative:margin;mso-height-relative:page;v-text-anchor:middle" o:gfxdata="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" o:allowoverlap="f" fillcolor="#0070c0" stroked="f" strokeweight="1pt">
               <v:textbox>
@@ -7400,7 +7476,7 @@
 </file>
 
 <file path=word/numbering.xml><?xml version="1.0" encoding="utf-8"?>
-<w:numbering xmlns:wpc="http://schemas.microsoft.com/office/word/2010/wordprocessingCanvas" xmlns:cx="http://schemas.microsoft.com/office/drawing/2014/chartex" xmlns:cx1="http://schemas.microsoft.com/office/drawing/2015/9/8/chartex" xmlns:cx2="http://schemas.microsoft.com/office/drawing/2015/10/21/chartex" xmlns:cx3="http://schemas.microsoft.com/office/drawing/2016/5/9/chartex" xmlns:cx4="http://schemas.microsoft.com/office/drawing/2016/5/10/chartex" xmlns:cx5="http://schemas.microsoft.com/office/drawing/2016/5/11/chartex" xmlns:cx6="http://schemas.microsoft.com/office/drawing/2016/5/12/chartex" xmlns:cx7="http://schemas.microsoft.com/office/drawing/2016/5/13/chartex" xmlns:cx8="http://schemas.microsoft.com/office/drawing/2016/5/14/chartex" xmlns:mc="http://schemas.openxmlformats.org/markup-compatibility/2006" xmlns:aink="http://schemas.microsoft.com/office/drawing/2016/ink" xmlns:am3d="http://schemas.microsoft.com/office/drawing/2017/model3d" xmlns:o="urn:schemas-microsoft-com:office:office" xmlns:oel="http://schemas.microsoft.com/office/2019/extlst" xmlns:r="http://schemas.openxmlformats.org/officeDocument/2006/relationships" xmlns:m="http://schemas.openxmlformats.org/officeDocument/2006/math" xmlns:v="urn:schemas-microsoft-com:vml" xmlns:wp14="http://schemas.microsoft.com/office/word/2010/wordprocessingDrawing" xmlns:wp="http://schemas.openxmlformats.org/drawingml/2006/wordprocessingDrawing" xmlns:w10="urn:schemas-microsoft-com:office:word" xmlns:w="http://schemas.openxmlformats.org/wordprocessingml/2006/main" xmlns:w14="http://schemas.microsoft.com/office/word/2010/wordml" xmlns:w15="http://schemas.microsoft.com/office/word/2012/wordml" xmlns:w16cex="http://schemas.microsoft.com/office/word/2018/wordml/cex" xmlns:w16cid="http://schemas.microsoft.com/office/word/2016/wordml/cid" xmlns:w16="http://schemas.microsoft.com/office/word/2018/wordml" xmlns:w16du="http://schemas.microsoft.com/office/word/2023/wordml/word16du" xmlns:w16sdtdh="http://schemas.microsoft.com/office/word/2020/wordml/sdtdatahash" xmlns:w16sdtfl="http://schemas.microsoft.com/office/word/2024/wordml/sdtformatlock" xmlns:w16se="http://schemas.microsoft.com/office/word/2015/wordml/symex" xmlns:wpg="http://schemas.microsoft.com/office/word/2010/wordprocessingGroup" xmlns:wpi="http://schemas.microsoft.com/office/word/2010/wordprocessingInk" xmlns:wne="http://schemas.microsoft.com/office/word/2006/wordml" xmlns:wps="http://schemas.microsoft.com/office/word/2010/wordprocessingShape" mc:Ignorable="w14 w15 w16se w16cid w16 w16cex w16sdtdh w16sdtfl w16du wp14">
+<w:numbering xmlns:wpc="http://schemas.microsoft.com/office/word/2010/wordprocessingCanvas" xmlns:cx="http://schemas.microsoft.com/office/drawing/2014/chartex" xmlns:cx1="http://schemas.microsoft.com/office/drawing/2015/9/8/chartex" xmlns:cx2="http://schemas.microsoft.com/office/drawing/2015/10/21/chartex" xmlns:cx3="http://schemas.microsoft.com/office/drawing/2016/5/9/chartex" xmlns:cx4="http://schemas.microsoft.com/office/drawing/2016/5/10/chartex" xmlns:cx5="http://schemas.microsoft.com/office/drawing/2016/5/11/chartex" xmlns:cx6="http://schemas.microsoft.com/office/drawing/2016/5/12/chartex" xmlns:cx7="http://schemas.microsoft.com/office/drawing/2016/5/13/chartex" xmlns:cx8="http://schemas.microsoft.com/office/drawing/2016/5/14/chartex" xmlns:mc="http://schemas.openxmlformats.org/markup-compatibility/2006" xmlns:aink="http://schemas.microsoft.com/office/drawing/2016/ink" xmlns:am3d="http://schemas.microsoft.com/office/drawing/2017/model3d" xmlns:o="urn:schemas-microsoft-com:office:office" xmlns:oel="http://schemas.microsoft.com/office/2019/extlst" xmlns:r="http://schemas.openxmlformats.org/officeDocument/2006/relationships" xmlns:m="http://schemas.openxmlformats.org/officeDocument/2006/math" xmlns:v="urn:schemas-microsoft-com:vml" xmlns:wp14="http://schemas.microsoft.com/office/word/2010/wordprocessingDrawing" xmlns:wp="http://schemas.openxmlformats.org/drawingml/2006/wordprocessingDrawing" xmlns:w10="urn:schemas-microsoft-com:office:word" xmlns:w="http://schemas.openxmlformats.org/wordprocessingml/2006/main" xmlns:w14="http://schemas.microsoft.com/office/word/2010/wordml" xmlns:w15="http://schemas.microsoft.com/office/word/2012/wordml" xmlns:w16cex="http://schemas.microsoft.com/office/word/2018/wordml/cex" xmlns:w16cid="http://schemas.microsoft.com/office/word/2016/wordml/cid" xmlns:w16="http://schemas.microsoft.com/office/word/2018/wordml" xmlns:w16sdtdh="http://schemas.microsoft.com/office/word/2020/wordml/sdtdatahash" xmlns:w16se="http://schemas.microsoft.com/office/word/2015/wordml/symex" xmlns:wpg="http://schemas.microsoft.com/office/word/2010/wordprocessingGroup" xmlns:wpi="http://schemas.microsoft.com/office/word/2010/wordprocessingInk" xmlns:wne="http://schemas.microsoft.com/office/word/2006/wordml" xmlns:wps="http://schemas.microsoft.com/office/word/2010/wordprocessingShape" mc:Ignorable="w14 w15 w16se w16cid w16 w16cex w16sdtdh wp14">
   <w:abstractNum w:abstractNumId="0" w15:restartNumberingAfterBreak="0">
     <w:nsid w:val="036205D6"/>
     <w:multiLevelType w:val="multilevel"/>
@@ -12204,7 +12280,7 @@
 </file>
 
 <file path=word/styles.xml><?xml version="1.0" encoding="utf-8"?>
-<w:styles xmlns:mc="http://schemas.openxmlformats.org/markup-compatibility/2006" xmlns:r="http://schemas.openxmlformats.org/officeDocument/2006/relationships" xmlns:w="http://schemas.openxmlformats.org/wordprocessingml/2006/main" xmlns:w14="http://schemas.microsoft.com/office/word/2010/wordml" xmlns:w15="http://schemas.microsoft.com/office/word/2012/wordml" xmlns:w16cex="http://schemas.microsoft.com/office/word/2018/wordml/cex" xmlns:w16cid="http://schemas.microsoft.com/office/word/2016/wordml/cid" xmlns:w16="http://schemas.microsoft.com/office/word/2018/wordml" xmlns:w16du="http://schemas.microsoft.com/office/word/2023/wordml/word16du" xmlns:w16sdtdh="http://schemas.microsoft.com/office/word/2020/wordml/sdtdatahash" xmlns:w16sdtfl="http://schemas.microsoft.com/office/word/2024/wordml/sdtformatlock" xmlns:w16se="http://schemas.microsoft.com/office/word/2015/wordml/symex" mc:Ignorable="w14 w15 w16se w16cid w16 w16cex w16sdtdh w16sdtfl w16du">
+<w:styles xmlns:mc="http://schemas.openxmlformats.org/markup-compatibility/2006" xmlns:r="http://schemas.openxmlformats.org/officeDocument/2006/relationships" xmlns:w="http://schemas.openxmlformats.org/wordprocessingml/2006/main" xmlns:w14="http://schemas.microsoft.com/office/word/2010/wordml" xmlns:w15="http://schemas.microsoft.com/office/word/2012/wordml" xmlns:w16cex="http://schemas.microsoft.com/office/word/2018/wordml/cex" xmlns:w16cid="http://schemas.microsoft.com/office/word/2016/wordml/cid" xmlns:w16="http://schemas.microsoft.com/office/word/2018/wordml" xmlns:w16sdtdh="http://schemas.microsoft.com/office/word/2020/wordml/sdtdatahash" xmlns:w16se="http://schemas.microsoft.com/office/word/2015/wordml/symex" mc:Ignorable="w14 w15 w16se w16cid w16 w16cex w16sdtdh">
   <w:docDefaults>
     <w:rPrDefault>
       <w:rPr>
@@ -12813,7 +12889,6 @@
   <w:style w:type="character" w:default="1" w:styleId="DefaultParagraphFont">
     <w:name w:val="Default Paragraph Font"/>
     <w:uiPriority w:val="1"/>
-    <w:semiHidden/>
     <w:unhideWhenUsed/>
   </w:style>
   <w:style w:type="table" w:default="1" w:styleId="TableNormal">

</xml_diff>

<commit_message>
Updated PDF task 7
I added my notes of chnages to the pdf in task 7 about chnages in the uml
</commit_message>
<xml_diff>
--- a/docs/214 PDF document.docx
+++ b/docs/214 PDF document.docx
@@ -1,6 +1,6 @@
 
 <file path=word/document.xml><?xml version="1.0" encoding="utf-8"?>
-<w:document xmlns:wpc="http://schemas.microsoft.com/office/word/2010/wordprocessingCanvas" xmlns:cx="http://schemas.microsoft.com/office/drawing/2014/chartex" xmlns:cx1="http://schemas.microsoft.com/office/drawing/2015/9/8/chartex" xmlns:cx2="http://schemas.microsoft.com/office/drawing/2015/10/21/chartex" xmlns:cx3="http://schemas.microsoft.com/office/drawing/2016/5/9/chartex" xmlns:cx4="http://schemas.microsoft.com/office/drawing/2016/5/10/chartex" xmlns:cx5="http://schemas.microsoft.com/office/drawing/2016/5/11/chartex" xmlns:cx6="http://schemas.microsoft.com/office/drawing/2016/5/12/chartex" xmlns:cx7="http://schemas.microsoft.com/office/drawing/2016/5/13/chartex" xmlns:cx8="http://schemas.microsoft.com/office/drawing/2016/5/14/chartex" xmlns:mc="http://schemas.openxmlformats.org/markup-compatibility/2006" xmlns:aink="http://schemas.microsoft.com/office/drawing/2016/ink" xmlns:am3d="http://schemas.microsoft.com/office/drawing/2017/model3d" xmlns:o="urn:schemas-microsoft-com:office:office" xmlns:oel="http://schemas.microsoft.com/office/2019/extlst" xmlns:r="http://schemas.openxmlformats.org/officeDocument/2006/relationships" xmlns:m="http://schemas.openxmlformats.org/officeDocument/2006/math" xmlns:v="urn:schemas-microsoft-com:vml" xmlns:wp14="http://schemas.microsoft.com/office/word/2010/wordprocessingDrawing" xmlns:wp="http://schemas.openxmlformats.org/drawingml/2006/wordprocessingDrawing" xmlns:w10="urn:schemas-microsoft-com:office:word" xmlns:w="http://schemas.openxmlformats.org/wordprocessingml/2006/main" xmlns:w14="http://schemas.microsoft.com/office/word/2010/wordml" xmlns:w15="http://schemas.microsoft.com/office/word/2012/wordml" xmlns:w16cex="http://schemas.microsoft.com/office/word/2018/wordml/cex" xmlns:w16cid="http://schemas.microsoft.com/office/word/2016/wordml/cid" xmlns:w16="http://schemas.microsoft.com/office/word/2018/wordml" xmlns:w16sdtdh="http://schemas.microsoft.com/office/word/2020/wordml/sdtdatahash" xmlns:w16se="http://schemas.microsoft.com/office/word/2015/wordml/symex" xmlns:wpg="http://schemas.microsoft.com/office/word/2010/wordprocessingGroup" xmlns:wpi="http://schemas.microsoft.com/office/word/2010/wordprocessingInk" xmlns:wne="http://schemas.microsoft.com/office/word/2006/wordml" xmlns:wps="http://schemas.microsoft.com/office/word/2010/wordprocessingShape" mc:Ignorable="w14 w15 w16se w16cid w16 w16cex w16sdtdh wp14">
+<w:document xmlns:wpc="http://schemas.microsoft.com/office/word/2010/wordprocessingCanvas" xmlns:cx="http://schemas.microsoft.com/office/drawing/2014/chartex" xmlns:cx1="http://schemas.microsoft.com/office/drawing/2015/9/8/chartex" xmlns:cx2="http://schemas.microsoft.com/office/drawing/2015/10/21/chartex" xmlns:cx3="http://schemas.microsoft.com/office/drawing/2016/5/9/chartex" xmlns:cx4="http://schemas.microsoft.com/office/drawing/2016/5/10/chartex" xmlns:cx5="http://schemas.microsoft.com/office/drawing/2016/5/11/chartex" xmlns:cx6="http://schemas.microsoft.com/office/drawing/2016/5/12/chartex" xmlns:cx7="http://schemas.microsoft.com/office/drawing/2016/5/13/chartex" xmlns:cx8="http://schemas.microsoft.com/office/drawing/2016/5/14/chartex" xmlns:mc="http://schemas.openxmlformats.org/markup-compatibility/2006" xmlns:aink="http://schemas.microsoft.com/office/drawing/2016/ink" xmlns:am3d="http://schemas.microsoft.com/office/drawing/2017/model3d" xmlns:o="urn:schemas-microsoft-com:office:office" xmlns:oel="http://schemas.microsoft.com/office/2019/extlst" xmlns:r="http://schemas.openxmlformats.org/officeDocument/2006/relationships" xmlns:m="http://schemas.openxmlformats.org/officeDocument/2006/math" xmlns:v="urn:schemas-microsoft-com:vml" xmlns:wp14="http://schemas.microsoft.com/office/word/2010/wordprocessingDrawing" xmlns:wp="http://schemas.openxmlformats.org/drawingml/2006/wordprocessingDrawing" xmlns:w10="urn:schemas-microsoft-com:office:word" xmlns:w="http://schemas.openxmlformats.org/wordprocessingml/2006/main" xmlns:w14="http://schemas.microsoft.com/office/word/2010/wordml" xmlns:w15="http://schemas.microsoft.com/office/word/2012/wordml" xmlns:w16cex="http://schemas.microsoft.com/office/word/2018/wordml/cex" xmlns:w16cid="http://schemas.microsoft.com/office/word/2016/wordml/cid" xmlns:w16="http://schemas.microsoft.com/office/word/2018/wordml" xmlns:w16du="http://schemas.microsoft.com/office/word/2023/wordml/word16du" xmlns:w16sdtdh="http://schemas.microsoft.com/office/word/2020/wordml/sdtdatahash" xmlns:w16sdtfl="http://schemas.microsoft.com/office/word/2024/wordml/sdtformatlock" xmlns:w16se="http://schemas.microsoft.com/office/word/2015/wordml/symex" xmlns:wpg="http://schemas.microsoft.com/office/word/2010/wordprocessingGroup" xmlns:wpi="http://schemas.microsoft.com/office/word/2010/wordprocessingInk" xmlns:wne="http://schemas.microsoft.com/office/word/2006/wordml" xmlns:wps="http://schemas.microsoft.com/office/word/2010/wordprocessingShape" mc:Ignorable="w14 w15 w16se w16cid w16 w16cex w16sdtdh w16sdtfl w16du wp14">
   <w:body>
     <w:p>
       <w:pPr>
@@ -186,6 +186,9 @@
       </w:pPr>
     </w:p>
     <w:p>
+      <w:pPr>
+        <w:jc w:val="center"/>
+      </w:pPr>
       <w:proofErr w:type="spellStart"/>
       <w:r>
         <w:rPr>
@@ -204,10 +207,13 @@
           <w:sz w:val="24"/>
           <w:szCs w:val="24"/>
         </w:rPr>
-        <w:t xml:space="preserve"> repo link: </w:t>
-      </w:r>
-    </w:p>
-    <w:p>
+        <w:t xml:space="preserve"> repo link:</w:t>
+      </w:r>
+    </w:p>
+    <w:p>
+      <w:pPr>
+        <w:jc w:val="center"/>
+      </w:pPr>
       <w:r>
         <w:t>https://github.com/Kristy2005/TIVIDY-Prac6</w:t>
       </w:r>
@@ -5356,31 +5362,21 @@
     <w:p/>
     <w:p/>
     <w:p/>
-    <w:p/>
-    <w:p/>
-    <w:p/>
-    <w:p>
-      <w:r>
-        <w:rPr>
-          <w:b/>
-          <w:bCs/>
-          <w:noProof/>
-          <w:sz w:val="22"/>
-          <w:szCs w:val="22"/>
-        </w:rPr>
+    <w:p>
+      <w:r>
         <w:drawing>
-          <wp:anchor distT="0" distB="0" distL="114300" distR="114300" simplePos="0" relativeHeight="251658240" behindDoc="0" locked="0" layoutInCell="1" allowOverlap="1" wp14:anchorId="09BDFB84" wp14:editId="1E23AABD">
+          <wp:anchor distT="0" distB="0" distL="114300" distR="114300" simplePos="0" relativeHeight="251658240" behindDoc="0" locked="0" layoutInCell="1" allowOverlap="1" wp14:anchorId="3854DDD3" wp14:editId="4399C3ED">
             <wp:simplePos x="0" y="0"/>
-            <wp:positionH relativeFrom="column">
-              <wp:posOffset>-1838819</wp:posOffset>
+            <wp:positionH relativeFrom="margin">
+              <wp:posOffset>-1999108</wp:posOffset>
             </wp:positionH>
             <wp:positionV relativeFrom="paragraph">
-              <wp:posOffset>191162</wp:posOffset>
+              <wp:posOffset>361691</wp:posOffset>
             </wp:positionV>
-            <wp:extent cx="8910506" cy="2840187"/>
+            <wp:extent cx="9134345" cy="4054088"/>
             <wp:effectExtent l="6350" t="0" r="0" b="0"/>
             <wp:wrapNone/>
-            <wp:docPr id="492632744" name="Picture 3"/>
+            <wp:docPr id="298066650" name="Picture 3"/>
             <wp:cNvGraphicFramePr>
               <a:graphicFrameLocks xmlns:a="http://schemas.openxmlformats.org/drawingml/2006/main" noChangeAspect="1"/>
             </wp:cNvGraphicFramePr>
@@ -5395,6 +5391,16 @@
                   </pic:nvPicPr>
                   <pic:blipFill>
                     <a:blip r:embed="rId12" cstate="print">
+                      <a:clrChange>
+                        <a:clrFrom>
+                          <a:srgbClr val="FFFFFF"/>
+                        </a:clrFrom>
+                        <a:clrTo>
+                          <a:srgbClr val="FFFFFF">
+                            <a:alpha val="0"/>
+                          </a:srgbClr>
+                        </a:clrTo>
+                      </a:clrChange>
                       <a:extLst>
                         <a:ext uri="{28A0092B-C50C-407E-A947-70E740481C1C}">
                           <a14:useLocalDpi xmlns:a14="http://schemas.microsoft.com/office/drawing/2010/main" val="0"/>
@@ -5409,7 +5415,7 @@
                   <pic:spPr bwMode="auto">
                     <a:xfrm rot="16200000">
                       <a:off x="0" y="0"/>
-                      <a:ext cx="8914915" cy="2841592"/>
+                      <a:ext cx="9141461" cy="4057246"/>
                     </a:xfrm>
                     <a:prstGeom prst="rect">
                       <a:avLst/>
@@ -5452,6 +5458,7 @@
     <w:p/>
     <w:p/>
     <w:p/>
+    <w:p/>
     <w:p>
       <w:pPr>
         <w:pStyle w:val="Heading1"/>
@@ -5459,11 +5466,18 @@
           <w:color w:val="0070C0"/>
         </w:rPr>
       </w:pPr>
-      <w:r>
+    </w:p>
+    <w:p>
+      <w:pPr>
+        <w:pStyle w:val="Heading1"/>
         <w:rPr>
           <w:color w:val="0070C0"/>
         </w:rPr>
-        <w:lastRenderedPageBreak/>
+      </w:pPr>
+      <w:r>
+        <w:rPr>
+          <w:color w:val="0070C0"/>
+        </w:rPr>
         <w:t>TASK 6:</w:t>
       </w:r>
     </w:p>
@@ -5513,195 +5527,173 @@
     <w:p>
       <w:pPr>
         <w:rPr>
+          <w:sz w:val="22"/>
+          <w:szCs w:val="22"/>
+        </w:rPr>
+      </w:pPr>
+      <w:r>
+        <w:rPr>
+          <w:b/>
+          <w:bCs/>
+          <w:sz w:val="22"/>
+          <w:szCs w:val="22"/>
+        </w:rPr>
+        <w:t>Sequence Diagram: Completing a Work Item and Determining What Happens Next</w:t>
+      </w:r>
+    </w:p>
+    <w:p>
+      <w:pPr>
+        <w:jc w:val="both"/>
+      </w:pPr>
+      <w:r>
+        <w:t xml:space="preserve">This sequence diagram illustrates how TIVIDY processes the completion of a </w:t>
+      </w:r>
+      <w:proofErr w:type="spellStart"/>
+      <w:r>
+        <w:t>WorkItem</w:t>
+      </w:r>
+      <w:proofErr w:type="spellEnd"/>
+      <w:r>
+        <w:t xml:space="preserve"> and determines what happens next in the workflow. A staff member completes the work item through the </w:t>
+      </w:r>
+      <w:proofErr w:type="spellStart"/>
+      <w:r>
+        <w:t>TIVIDYFacade</w:t>
+      </w:r>
+      <w:proofErr w:type="spellEnd"/>
+      <w:r>
+        <w:t xml:space="preserve">, which creates and executes a </w:t>
+      </w:r>
+      <w:proofErr w:type="spellStart"/>
+      <w:r>
+        <w:t>CompleteWorkCommand</w:t>
+      </w:r>
+      <w:proofErr w:type="spellEnd"/>
+      <w:r>
+        <w:t xml:space="preserve">. The command completes the </w:t>
+      </w:r>
+      <w:proofErr w:type="spellStart"/>
+      <w:r>
+        <w:t>WorkItem</w:t>
+      </w:r>
+      <w:proofErr w:type="spellEnd"/>
+      <w:r>
+        <w:t xml:space="preserve"> and then notifies the </w:t>
+      </w:r>
+      <w:proofErr w:type="spellStart"/>
+      <w:r>
+        <w:t>WorkflowInstance</w:t>
+      </w:r>
+      <w:proofErr w:type="spellEnd"/>
+      <w:r>
+        <w:t xml:space="preserve"> that the work item has been completed. The </w:t>
+      </w:r>
+      <w:proofErr w:type="spellStart"/>
+      <w:r>
+        <w:t>WorkflowInstance</w:t>
+      </w:r>
+      <w:proofErr w:type="spellEnd"/>
+      <w:r>
+        <w:t xml:space="preserve"> consults the </w:t>
+      </w:r>
+      <w:proofErr w:type="spellStart"/>
+      <w:r>
+        <w:t>WorkflowDefinition</w:t>
+      </w:r>
+      <w:proofErr w:type="spellEnd"/>
+      <w:r>
+        <w:t xml:space="preserve"> to determine the next work item and checks whether its dependencies have been satisfied. If the dependencies are satisfied, the next work item is made available and the </w:t>
+      </w:r>
+      <w:proofErr w:type="spellStart"/>
+      <w:r>
+        <w:t>AssignmentStrategy</w:t>
+      </w:r>
+      <w:proofErr w:type="spellEnd"/>
+      <w:r>
+        <w:t xml:space="preserve"> selects an appropriate participant. The </w:t>
+      </w:r>
+      <w:proofErr w:type="spellStart"/>
+      <w:r>
+        <w:t>NotificationObserver</w:t>
+      </w:r>
+      <w:proofErr w:type="spellEnd"/>
+      <w:r>
+        <w:t xml:space="preserve"> is then notified of the assignment. If the dependencies are not satisfied, the workflow remains waiting and the event is recorded. This demonstrates the collaboration between the </w:t>
+      </w:r>
+      <w:r>
+        <w:rPr>
+          <w:b/>
+          <w:bCs/>
+        </w:rPr>
+        <w:t>Command, Strategy, and Observer patterns</w:t>
+      </w:r>
+      <w:r>
+        <w:t xml:space="preserve"> within TIVIDY's workflow execution process.</w:t>
+      </w:r>
+    </w:p>
+    <w:p>
+      <w:pPr>
+        <w:rPr>
           <w:sz w:val="28"/>
           <w:szCs w:val="28"/>
         </w:rPr>
       </w:pPr>
-      <w:r>
-        <w:rPr>
-          <w:b/>
-          <w:bCs/>
+    </w:p>
+    <w:p>
+      <w:pPr>
+        <w:rPr>
           <w:sz w:val="28"/>
           <w:szCs w:val="28"/>
         </w:rPr>
-        <w:t>Sequence Diagram: Completing a Work Item and Determining What Happens Next</w:t>
-      </w:r>
-    </w:p>
-    <w:p>
-      <w:pPr>
-        <w:jc w:val="both"/>
-        <w:rPr>
-          <w:sz w:val="24"/>
-          <w:szCs w:val="24"/>
-        </w:rPr>
-      </w:pPr>
-      <w:r>
-        <w:rPr>
-          <w:sz w:val="24"/>
-          <w:szCs w:val="24"/>
-        </w:rPr>
-        <w:t xml:space="preserve">This sequence diagram illustrates how TIVIDY processes the completion of a </w:t>
-      </w:r>
-      <w:proofErr w:type="spellStart"/>
-      <w:r>
-        <w:rPr>
-          <w:sz w:val="24"/>
-          <w:szCs w:val="24"/>
-        </w:rPr>
-        <w:t>WorkItem</w:t>
-      </w:r>
-      <w:proofErr w:type="spellEnd"/>
-      <w:r>
-        <w:rPr>
-          <w:sz w:val="24"/>
-          <w:szCs w:val="24"/>
-        </w:rPr>
-        <w:t xml:space="preserve"> and determines what happens next in the workflow. A staff member completes the work item through the </w:t>
-      </w:r>
-      <w:proofErr w:type="spellStart"/>
-      <w:r>
-        <w:rPr>
-          <w:sz w:val="24"/>
-          <w:szCs w:val="24"/>
-        </w:rPr>
-        <w:t>TIVIDYFacade</w:t>
-      </w:r>
-      <w:proofErr w:type="spellEnd"/>
-      <w:r>
-        <w:rPr>
-          <w:sz w:val="24"/>
-          <w:szCs w:val="24"/>
-        </w:rPr>
-        <w:t xml:space="preserve">, which creates and executes a </w:t>
-      </w:r>
-      <w:proofErr w:type="spellStart"/>
-      <w:r>
-        <w:rPr>
-          <w:sz w:val="24"/>
-          <w:szCs w:val="24"/>
-        </w:rPr>
-        <w:t>CompleteWorkCommand</w:t>
-      </w:r>
-      <w:proofErr w:type="spellEnd"/>
-      <w:r>
-        <w:rPr>
-          <w:sz w:val="24"/>
-          <w:szCs w:val="24"/>
-        </w:rPr>
-        <w:t xml:space="preserve">. The command completes the </w:t>
-      </w:r>
-      <w:proofErr w:type="spellStart"/>
-      <w:r>
-        <w:rPr>
-          <w:sz w:val="24"/>
-          <w:szCs w:val="24"/>
-        </w:rPr>
-        <w:t>WorkItem</w:t>
-      </w:r>
-      <w:proofErr w:type="spellEnd"/>
-      <w:r>
-        <w:rPr>
-          <w:sz w:val="24"/>
-          <w:szCs w:val="24"/>
-        </w:rPr>
-        <w:t xml:space="preserve"> and then notifies the </w:t>
-      </w:r>
-      <w:proofErr w:type="spellStart"/>
-      <w:r>
-        <w:rPr>
-          <w:sz w:val="24"/>
-          <w:szCs w:val="24"/>
-        </w:rPr>
-        <w:t>WorkflowInstance</w:t>
-      </w:r>
-      <w:proofErr w:type="spellEnd"/>
-      <w:r>
-        <w:rPr>
-          <w:sz w:val="24"/>
-          <w:szCs w:val="24"/>
-        </w:rPr>
-        <w:t xml:space="preserve"> that the work item has been completed. The </w:t>
-      </w:r>
-      <w:proofErr w:type="spellStart"/>
-      <w:r>
-        <w:rPr>
-          <w:sz w:val="24"/>
-          <w:szCs w:val="24"/>
-        </w:rPr>
-        <w:t>WorkflowInstance</w:t>
-      </w:r>
-      <w:proofErr w:type="spellEnd"/>
-      <w:r>
-        <w:rPr>
-          <w:sz w:val="24"/>
-          <w:szCs w:val="24"/>
-        </w:rPr>
-        <w:t xml:space="preserve"> consults the </w:t>
-      </w:r>
-      <w:proofErr w:type="spellStart"/>
-      <w:r>
-        <w:rPr>
-          <w:sz w:val="24"/>
-          <w:szCs w:val="24"/>
-        </w:rPr>
-        <w:t>WorkflowDefinition</w:t>
-      </w:r>
-      <w:proofErr w:type="spellEnd"/>
-      <w:r>
-        <w:rPr>
-          <w:sz w:val="24"/>
-          <w:szCs w:val="24"/>
-        </w:rPr>
-        <w:t xml:space="preserve"> to determine the next work item and checks whether its dependencies have been satisfied. If the dependencies are satisfied, the next work item is made available and the </w:t>
-      </w:r>
-      <w:proofErr w:type="spellStart"/>
-      <w:r>
-        <w:rPr>
-          <w:sz w:val="24"/>
-          <w:szCs w:val="24"/>
-        </w:rPr>
-        <w:t>AssignmentStrategy</w:t>
-      </w:r>
-      <w:proofErr w:type="spellEnd"/>
-      <w:r>
-        <w:rPr>
-          <w:sz w:val="24"/>
-          <w:szCs w:val="24"/>
-        </w:rPr>
-        <w:t xml:space="preserve"> selects an appropriate participant. The </w:t>
-      </w:r>
-      <w:proofErr w:type="spellStart"/>
-      <w:r>
-        <w:rPr>
-          <w:sz w:val="24"/>
-          <w:szCs w:val="24"/>
-        </w:rPr>
-        <w:t>NotificationObserver</w:t>
-      </w:r>
-      <w:proofErr w:type="spellEnd"/>
-      <w:r>
-        <w:rPr>
-          <w:sz w:val="24"/>
-          <w:szCs w:val="24"/>
-        </w:rPr>
-        <w:t xml:space="preserve"> is then notified of the assignment. If the dependencies are not satisfied, the workflow remains waiting and the event is recorded. This demonstrates the collaboration between the </w:t>
-      </w:r>
-      <w:r>
-        <w:rPr>
-          <w:b/>
-          <w:bCs/>
-          <w:sz w:val="24"/>
-          <w:szCs w:val="24"/>
-        </w:rPr>
-        <w:t>Command, Strategy, and Observer patterns</w:t>
-      </w:r>
-      <w:r>
-        <w:rPr>
-          <w:sz w:val="24"/>
-          <w:szCs w:val="24"/>
-        </w:rPr>
-        <w:t xml:space="preserve"> within TIVIDY's workflow execution process.</w:t>
-      </w:r>
+      </w:pPr>
+    </w:p>
+    <w:p>
+      <w:pPr>
+        <w:rPr>
+          <w:sz w:val="28"/>
+          <w:szCs w:val="28"/>
+        </w:rPr>
+      </w:pPr>
+    </w:p>
+    <w:p>
+      <w:pPr>
+        <w:rPr>
+          <w:sz w:val="28"/>
+          <w:szCs w:val="28"/>
+        </w:rPr>
+      </w:pPr>
+    </w:p>
+    <w:p>
+      <w:pPr>
+        <w:rPr>
+          <w:sz w:val="28"/>
+          <w:szCs w:val="28"/>
+        </w:rPr>
+      </w:pPr>
+    </w:p>
+    <w:p>
+      <w:pPr>
+        <w:rPr>
+          <w:sz w:val="28"/>
+          <w:szCs w:val="28"/>
+        </w:rPr>
+      </w:pPr>
+    </w:p>
+    <w:p>
+      <w:pPr>
+        <w:rPr>
+          <w:sz w:val="28"/>
+          <w:szCs w:val="28"/>
+        </w:rPr>
+      </w:pPr>
+    </w:p>
+    <w:p>
+      <w:pPr>
+        <w:rPr>
+          <w:sz w:val="28"/>
+          <w:szCs w:val="28"/>
+        </w:rPr>
+      </w:pPr>
     </w:p>
     <w:p>
       <w:pPr>
@@ -5720,13 +5712,17 @@
     <w:p>
       <w:pPr>
         <w:keepNext/>
-      </w:pPr>
-      <w:r>
-        <w:rPr>
-          <w:b/>
-          <w:bCs/>
-          <w:sz w:val="28"/>
-          <w:szCs w:val="28"/>
+        <w:rPr>
+          <w:sz w:val="16"/>
+          <w:szCs w:val="16"/>
+        </w:rPr>
+      </w:pPr>
+      <w:r>
+        <w:rPr>
+          <w:b/>
+          <w:bCs/>
+          <w:sz w:val="22"/>
+          <w:szCs w:val="22"/>
         </w:rPr>
         <w:lastRenderedPageBreak/>
         <w:t>Sequence Diagram: Escalating a Complaint</w:t>
@@ -5780,10 +5776,6 @@
     <w:p>
       <w:pPr>
         <w:jc w:val="both"/>
-        <w:rPr>
-          <w:sz w:val="24"/>
-          <w:szCs w:val="24"/>
-        </w:rPr>
         <w:sectPr>
           <w:pgSz w:w="16838" w:h="11906" w:orient="landscape"/>
           <w:pgMar w:top="900" w:right="1440" w:bottom="900" w:left="1440" w:header="708" w:footer="708" w:gutter="0"/>
@@ -5792,312 +5784,170 @@
         </w:sectPr>
       </w:pPr>
       <w:r>
-        <w:rPr>
-          <w:sz w:val="24"/>
-          <w:szCs w:val="24"/>
-        </w:rPr>
         <w:t xml:space="preserve">This sequence diagram illustrates how TIVIDY processes the escalation of a complaint that cannot be resolved at the current level. A staff member calls </w:t>
       </w:r>
       <w:proofErr w:type="spellStart"/>
       <w:r>
-        <w:rPr>
-          <w:sz w:val="24"/>
-          <w:szCs w:val="24"/>
-        </w:rPr>
         <w:t>escalateWork</w:t>
       </w:r>
       <w:proofErr w:type="spellEnd"/>
       <w:r>
-        <w:rPr>
-          <w:sz w:val="24"/>
-          <w:szCs w:val="24"/>
-        </w:rPr>
         <w:t xml:space="preserve">() on the </w:t>
       </w:r>
       <w:proofErr w:type="spellStart"/>
       <w:r>
-        <w:rPr>
-          <w:sz w:val="24"/>
-          <w:szCs w:val="24"/>
-        </w:rPr>
         <w:t>TIVIDYFacade</w:t>
       </w:r>
       <w:proofErr w:type="spellEnd"/>
       <w:r>
-        <w:rPr>
-          <w:sz w:val="24"/>
-          <w:szCs w:val="24"/>
-        </w:rPr>
         <w:t xml:space="preserve">, which creates and executes an </w:t>
       </w:r>
       <w:proofErr w:type="spellStart"/>
       <w:r>
-        <w:rPr>
-          <w:sz w:val="24"/>
-          <w:szCs w:val="24"/>
-        </w:rPr>
         <w:t>EscalateWorkCommand</w:t>
       </w:r>
       <w:proofErr w:type="spellEnd"/>
       <w:r>
-        <w:rPr>
-          <w:sz w:val="24"/>
-          <w:szCs w:val="24"/>
-        </w:rPr>
         <w:t xml:space="preserve">. Before anything changes, the command asks the </w:t>
       </w:r>
       <w:proofErr w:type="spellStart"/>
       <w:r>
-        <w:rPr>
-          <w:sz w:val="24"/>
-          <w:szCs w:val="24"/>
-        </w:rPr>
         <w:t>WorkflowInstance</w:t>
       </w:r>
       <w:proofErr w:type="spellEnd"/>
       <w:r>
-        <w:rPr>
-          <w:sz w:val="24"/>
-          <w:szCs w:val="24"/>
-        </w:rPr>
         <w:t xml:space="preserve"> for a </w:t>
       </w:r>
       <w:proofErr w:type="spellStart"/>
       <w:r>
-        <w:rPr>
-          <w:sz w:val="24"/>
-          <w:szCs w:val="24"/>
-        </w:rPr>
         <w:t>WorkflowMemento</w:t>
       </w:r>
       <w:proofErr w:type="spellEnd"/>
       <w:r>
-        <w:rPr>
-          <w:sz w:val="24"/>
-          <w:szCs w:val="24"/>
-        </w:rPr>
         <w:t xml:space="preserve"> and stores it in the </w:t>
       </w:r>
       <w:proofErr w:type="spellStart"/>
       <w:r>
-        <w:rPr>
-          <w:sz w:val="24"/>
-          <w:szCs w:val="24"/>
-        </w:rPr>
         <w:t>WorkflowHistory</w:t>
       </w:r>
       <w:proofErr w:type="spellEnd"/>
       <w:r>
-        <w:rPr>
-          <w:sz w:val="24"/>
-          <w:szCs w:val="24"/>
-        </w:rPr>
         <w:t xml:space="preserve"> so the escalation can be undone. The command then asks the </w:t>
       </w:r>
       <w:proofErr w:type="spellStart"/>
       <w:r>
-        <w:rPr>
-          <w:sz w:val="24"/>
-          <w:szCs w:val="24"/>
-        </w:rPr>
         <w:t>WorkflowInstance</w:t>
       </w:r>
       <w:proofErr w:type="spellEnd"/>
       <w:r>
-        <w:rPr>
-          <w:sz w:val="24"/>
-          <w:szCs w:val="24"/>
-        </w:rPr>
         <w:t xml:space="preserve"> to escalate, and the </w:t>
       </w:r>
       <w:proofErr w:type="spellStart"/>
       <w:r>
-        <w:rPr>
-          <w:sz w:val="24"/>
-          <w:szCs w:val="24"/>
-        </w:rPr>
         <w:t>InProgressState</w:t>
       </w:r>
       <w:proofErr w:type="spellEnd"/>
       <w:r>
-        <w:rPr>
-          <w:sz w:val="24"/>
-          <w:szCs w:val="24"/>
-        </w:rPr>
         <w:t xml:space="preserve"> replaces itself with an </w:t>
       </w:r>
       <w:proofErr w:type="spellStart"/>
       <w:r>
-        <w:rPr>
-          <w:sz w:val="24"/>
-          <w:szCs w:val="24"/>
-        </w:rPr>
         <w:t>EscalatedState</w:t>
       </w:r>
       <w:proofErr w:type="spellEnd"/>
       <w:r>
-        <w:rPr>
-          <w:sz w:val="24"/>
-          <w:szCs w:val="24"/>
-        </w:rPr>
         <w:t xml:space="preserve">. Entering the </w:t>
       </w:r>
       <w:proofErr w:type="spellStart"/>
       <w:r>
-        <w:rPr>
-          <w:sz w:val="24"/>
-          <w:szCs w:val="24"/>
-        </w:rPr>
         <w:t>EscalatedState</w:t>
       </w:r>
       <w:proofErr w:type="spellEnd"/>
       <w:r>
-        <w:rPr>
-          <w:sz w:val="24"/>
-          <w:szCs w:val="24"/>
-        </w:rPr>
         <w:t xml:space="preserve"> starts the escalation chain: the </w:t>
       </w:r>
       <w:proofErr w:type="spellStart"/>
       <w:r>
-        <w:rPr>
-          <w:sz w:val="24"/>
-          <w:szCs w:val="24"/>
-        </w:rPr>
         <w:t>CoordinatorHandler</w:t>
       </w:r>
       <w:proofErr w:type="spellEnd"/>
       <w:r>
-        <w:rPr>
-          <w:sz w:val="24"/>
-          <w:szCs w:val="24"/>
-        </w:rPr>
         <w:t xml:space="preserve"> cannot handle the request and passes it on, and the </w:t>
       </w:r>
       <w:proofErr w:type="spellStart"/>
       <w:r>
-        <w:rPr>
-          <w:sz w:val="24"/>
-          <w:szCs w:val="24"/>
-        </w:rPr>
         <w:t>DepartmentHeadHandler</w:t>
       </w:r>
       <w:proofErr w:type="spellEnd"/>
       <w:r>
-        <w:rPr>
-          <w:sz w:val="24"/>
-          <w:szCs w:val="24"/>
-        </w:rPr>
         <w:t xml:space="preserve"> accepts it, so the Department Head is assigned. The </w:t>
       </w:r>
       <w:proofErr w:type="spellStart"/>
       <w:r>
-        <w:rPr>
-          <w:sz w:val="24"/>
-          <w:szCs w:val="24"/>
-        </w:rPr>
         <w:t>WorkflowInstance</w:t>
       </w:r>
       <w:proofErr w:type="spellEnd"/>
       <w:r>
-        <w:rPr>
-          <w:sz w:val="24"/>
-          <w:szCs w:val="24"/>
-        </w:rPr>
         <w:t xml:space="preserve"> then notifies its observers: the </w:t>
       </w:r>
       <w:proofErr w:type="spellStart"/>
       <w:r>
-        <w:rPr>
-          <w:sz w:val="24"/>
-          <w:szCs w:val="24"/>
-        </w:rPr>
         <w:t>WorkflowHistory</w:t>
       </w:r>
       <w:proofErr w:type="spellEnd"/>
       <w:r>
-        <w:rPr>
-          <w:sz w:val="24"/>
-          <w:szCs w:val="24"/>
-        </w:rPr>
         <w:t xml:space="preserve"> records the change from In Progress to Escalated, and the </w:t>
       </w:r>
       <w:proofErr w:type="spellStart"/>
       <w:r>
-        <w:rPr>
-          <w:sz w:val="24"/>
-          <w:szCs w:val="24"/>
-        </w:rPr>
         <w:t>NotificationObserver</w:t>
       </w:r>
       <w:proofErr w:type="spellEnd"/>
       <w:r>
-        <w:rPr>
-          <w:sz w:val="24"/>
-          <w:szCs w:val="24"/>
-        </w:rPr>
         <w:t xml:space="preserve"> asks the </w:t>
       </w:r>
       <w:proofErr w:type="spellStart"/>
       <w:r>
-        <w:rPr>
-          <w:sz w:val="24"/>
-          <w:szCs w:val="24"/>
-        </w:rPr>
         <w:t>EmailAdapter</w:t>
       </w:r>
       <w:proofErr w:type="spellEnd"/>
       <w:r>
-        <w:rPr>
-          <w:sz w:val="24"/>
-          <w:szCs w:val="24"/>
-        </w:rPr>
         <w:t xml:space="preserve"> to email the Department Head through the </w:t>
       </w:r>
       <w:proofErr w:type="spellStart"/>
       <w:r>
-        <w:rPr>
-          <w:sz w:val="24"/>
-          <w:szCs w:val="24"/>
-        </w:rPr>
         <w:t>ExternalEmailService</w:t>
       </w:r>
       <w:proofErr w:type="spellEnd"/>
       <w:r>
-        <w:rPr>
-          <w:sz w:val="24"/>
-          <w:szCs w:val="24"/>
-        </w:rPr>
         <w:t xml:space="preserve">. If the email fails, the failure is recorded in the history and the escalation still stands. This demonstrates the collaboration between the </w:t>
       </w:r>
       <w:r>
         <w:rPr>
           <w:b/>
           <w:bCs/>
-          <w:sz w:val="24"/>
-          <w:szCs w:val="24"/>
         </w:rPr>
         <w:t>Facade, Command, Memento, State, Chain of Responsibility, Observer and Adapter patterns</w:t>
       </w:r>
       <w:r>
-        <w:rPr>
-          <w:sz w:val="24"/>
-          <w:szCs w:val="24"/>
-        </w:rPr>
         <w:t xml:space="preserve"> within TIVIDY.</w:t>
       </w:r>
     </w:p>
     <w:p>
       <w:pPr>
         <w:rPr>
-          <w:sz w:val="28"/>
-          <w:szCs w:val="28"/>
-        </w:rPr>
-      </w:pPr>
-      <w:r>
-        <w:rPr>
-          <w:sz w:val="28"/>
-          <w:szCs w:val="28"/>
+          <w:b/>
+          <w:bCs/>
+          <w:sz w:val="22"/>
+          <w:szCs w:val="22"/>
+        </w:rPr>
+      </w:pPr>
+      <w:r>
+        <w:rPr>
+          <w:b/>
+          <w:bCs/>
+          <w:sz w:val="22"/>
+          <w:szCs w:val="22"/>
         </w:rPr>
         <w:lastRenderedPageBreak/>
         <w:t xml:space="preserve">State diagram: </w:t>
@@ -6105,16 +5955,20 @@
       <w:proofErr w:type="spellStart"/>
       <w:r>
         <w:rPr>
-          <w:sz w:val="28"/>
-          <w:szCs w:val="28"/>
+          <w:b/>
+          <w:bCs/>
+          <w:sz w:val="22"/>
+          <w:szCs w:val="22"/>
         </w:rPr>
         <w:t>WorkItem</w:t>
       </w:r>
       <w:proofErr w:type="spellEnd"/>
       <w:r>
         <w:rPr>
-          <w:sz w:val="28"/>
-          <w:szCs w:val="28"/>
+          <w:b/>
+          <w:bCs/>
+          <w:sz w:val="22"/>
+          <w:szCs w:val="22"/>
         </w:rPr>
         <w:t xml:space="preserve"> State Lifecycle</w:t>
       </w:r>
@@ -6172,1057 +6026,1290 @@
     <w:p>
       <w:pPr>
         <w:jc w:val="both"/>
+      </w:pPr>
+      <w:r>
+        <w:t xml:space="preserve">This state diagram illustrates the lifecycle of a TIVIDY </w:t>
+      </w:r>
+      <w:proofErr w:type="spellStart"/>
+      <w:r>
+        <w:t>WorkflowInstance</w:t>
+      </w:r>
+      <w:proofErr w:type="spellEnd"/>
+      <w:r>
+        <w:t xml:space="preserve"> from submission to completion. A workflow progresses through the states </w:t>
+      </w:r>
+      <w:r>
+        <w:rPr>
+          <w:b/>
+          <w:bCs/>
+        </w:rPr>
+        <w:t>Submitted, Active, and In Progress</w:t>
+      </w:r>
+      <w:r>
+        <w:t xml:space="preserve"> as the case is processed. If the case cannot be handled at the current level, it enters the </w:t>
+      </w:r>
+      <w:r>
+        <w:rPr>
+          <w:b/>
+          <w:bCs/>
+        </w:rPr>
+        <w:t>Escalated</w:t>
+      </w:r>
+      <w:r>
+        <w:t xml:space="preserve"> state and returns to </w:t>
+      </w:r>
+      <w:r>
+        <w:rPr>
+          <w:b/>
+          <w:bCs/>
+        </w:rPr>
+        <w:t>In Progress</w:t>
+      </w:r>
+      <w:r>
+        <w:t xml:space="preserve"> when a handler accepts it. From In Progress, the workflow can either become </w:t>
+      </w:r>
+      <w:r>
+        <w:rPr>
+          <w:b/>
+          <w:bCs/>
+        </w:rPr>
+        <w:t>Resolved</w:t>
+      </w:r>
+      <w:r>
+        <w:t xml:space="preserve"> when the case is successfully completed or </w:t>
+      </w:r>
+      <w:r>
+        <w:rPr>
+          <w:b/>
+          <w:bCs/>
+        </w:rPr>
+        <w:t>Closed</w:t>
+      </w:r>
+      <w:r>
+        <w:t xml:space="preserve"> when the workflow ends without resolution. Resolved and Closed represent the final states of the workflow.</w:t>
+      </w:r>
+    </w:p>
+    <w:p>
+      <w:pPr>
+        <w:jc w:val="both"/>
         <w:rPr>
           <w:sz w:val="24"/>
           <w:szCs w:val="24"/>
         </w:rPr>
       </w:pPr>
-      <w:r>
+    </w:p>
+    <w:p>
+      <w:pPr>
+        <w:jc w:val="both"/>
         <w:rPr>
           <w:sz w:val="24"/>
           <w:szCs w:val="24"/>
         </w:rPr>
-        <w:t xml:space="preserve">This state diagram illustrates the lifecycle of a TIVIDY </w:t>
-      </w:r>
-      <w:proofErr w:type="spellStart"/>
-      <w:r>
+      </w:pPr>
+    </w:p>
+    <w:p>
+      <w:pPr>
+        <w:pStyle w:val="Heading1"/>
+        <w:rPr>
+          <w:color w:val="0070C0"/>
+        </w:rPr>
+      </w:pPr>
+    </w:p>
+    <w:p>
+      <w:pPr>
+        <w:pStyle w:val="Heading1"/>
+        <w:rPr>
+          <w:color w:val="0070C0"/>
+        </w:rPr>
+      </w:pPr>
+    </w:p>
+    <w:p/>
+    <w:p/>
+    <w:p/>
+    <w:p/>
+    <w:p/>
+    <w:p/>
+    <w:p/>
+    <w:p/>
+    <w:p/>
+    <w:p/>
+    <w:p>
+      <w:pPr>
+        <w:pStyle w:val="Heading1"/>
+        <w:rPr>
+          <w:color w:val="0070C0"/>
+        </w:rPr>
+      </w:pPr>
+      <w:r>
+        <w:rPr>
+          <w:color w:val="0070C0"/>
+        </w:rPr>
+        <w:lastRenderedPageBreak/>
+        <w:t xml:space="preserve">TASK 7: </w:t>
+      </w:r>
+      <w:r>
+        <w:rPr>
+          <w:color w:val="0070C0"/>
+        </w:rPr>
+        <w:t>Design Decisions and Revisions</w:t>
+      </w:r>
+    </w:p>
+    <w:p/>
+    <w:p>
+      <w:pPr>
+        <w:jc w:val="both"/>
+      </w:pPr>
+      <w:r>
+        <w:t>Throughout the design of TIVIDY, several parts of the original UML and pattern implementation were revised as the group gained a clearer understanding of the workflow system and received feedback. The main revisions are documented below.</w:t>
+      </w:r>
+    </w:p>
+    <w:p>
+      <w:pPr>
+        <w:jc w:val="both"/>
         <w:rPr>
           <w:sz w:val="24"/>
           <w:szCs w:val="24"/>
         </w:rPr>
+      </w:pPr>
+    </w:p>
+    <w:p>
+      <w:pPr>
+        <w:rPr>
+          <w:b/>
+          <w:bCs/>
+          <w:sz w:val="22"/>
+          <w:szCs w:val="22"/>
+        </w:rPr>
+      </w:pPr>
+      <w:r>
+        <w:rPr>
+          <w:b/>
+          <w:bCs/>
+          <w:sz w:val="22"/>
+          <w:szCs w:val="22"/>
+        </w:rPr>
+        <w:t xml:space="preserve">1. State Pattern Changed from </w:t>
+      </w:r>
+      <w:proofErr w:type="spellStart"/>
+      <w:r>
+        <w:rPr>
+          <w:b/>
+          <w:bCs/>
+          <w:sz w:val="22"/>
+          <w:szCs w:val="22"/>
+        </w:rPr>
+        <w:t>WorkItem</w:t>
+      </w:r>
+      <w:proofErr w:type="spellEnd"/>
+      <w:r>
+        <w:rPr>
+          <w:b/>
+          <w:bCs/>
+          <w:sz w:val="22"/>
+          <w:szCs w:val="22"/>
+        </w:rPr>
+        <w:t xml:space="preserve"> to </w:t>
+      </w:r>
+      <w:proofErr w:type="spellStart"/>
+      <w:r>
+        <w:rPr>
+          <w:b/>
+          <w:bCs/>
+          <w:sz w:val="22"/>
+          <w:szCs w:val="22"/>
+        </w:rPr>
         <w:t>WorkflowInstance</w:t>
       </w:r>
       <w:proofErr w:type="spellEnd"/>
+    </w:p>
+    <w:p>
+      <w:r>
+        <w:rPr>
+          <w:b/>
+          <w:bCs/>
+          <w:sz w:val="22"/>
+          <w:szCs w:val="22"/>
+          <w:u w:val="single"/>
+        </w:rPr>
+        <w:t>Problem</w:t>
+      </w:r>
       <w:r>
         <w:rPr>
           <w:sz w:val="24"/>
           <w:szCs w:val="24"/>
         </w:rPr>
-        <w:t xml:space="preserve"> from submission to completion. A workflow progresses through the states </w:t>
-      </w:r>
-      <w:r>
-        <w:rPr>
-          <w:b/>
-          <w:bCs/>
+        <w:br/>
+      </w:r>
+      <w:r>
+        <w:t xml:space="preserve">The original design applied the State pattern to individual </w:t>
+      </w:r>
+      <w:proofErr w:type="spellStart"/>
+      <w:r>
+        <w:t>WorkItem</w:t>
+      </w:r>
+      <w:proofErr w:type="spellEnd"/>
+      <w:r>
+        <w:t xml:space="preserve"> objects. States such as Created, Available, Assigned, In Progress, Escalated, Resolved and Closed were initially considered as work-item states.</w:t>
+      </w:r>
+    </w:p>
+    <w:p>
+      <w:r>
+        <w:rPr>
+          <w:b/>
+          <w:bCs/>
+          <w:sz w:val="22"/>
+          <w:szCs w:val="22"/>
+          <w:u w:val="single"/>
+        </w:rPr>
+        <w:t>Original</w:t>
+      </w:r>
+      <w:r>
+        <w:rPr>
+          <w:b/>
+          <w:bCs/>
+          <w:sz w:val="22"/>
+          <w:szCs w:val="22"/>
+          <w:u w:val="single"/>
+        </w:rPr>
+        <w:t xml:space="preserve"> </w:t>
+      </w:r>
+      <w:r>
+        <w:rPr>
+          <w:b/>
+          <w:bCs/>
+          <w:sz w:val="22"/>
+          <w:szCs w:val="22"/>
+          <w:u w:val="single"/>
+        </w:rPr>
+        <w:t>Design:</w:t>
+      </w:r>
+      <w:r>
+        <w:br/>
+      </w:r>
+      <w:proofErr w:type="spellStart"/>
+      <w:r>
+        <w:t>WorkItem</w:t>
+      </w:r>
+      <w:proofErr w:type="spellEnd"/>
+      <w:r>
+        <w:t xml:space="preserve"> stored a </w:t>
+      </w:r>
+      <w:proofErr w:type="spellStart"/>
+      <w:r>
+        <w:t>WorkItemState</w:t>
+      </w:r>
+      <w:proofErr w:type="spellEnd"/>
+      <w:r>
+        <w:t>, with separate concrete state classes controlling the behaviour of each individual task.</w:t>
+      </w:r>
+    </w:p>
+    <w:p>
+      <w:r>
+        <w:rPr>
+          <w:b/>
+          <w:bCs/>
+          <w:sz w:val="22"/>
+          <w:szCs w:val="22"/>
+          <w:u w:val="single"/>
+        </w:rPr>
+        <w:t>Change Made:</w:t>
+      </w:r>
+      <w:r>
+        <w:br/>
+        <w:t xml:space="preserve">The State pattern was moved from </w:t>
+      </w:r>
+      <w:proofErr w:type="spellStart"/>
+      <w:r>
+        <w:t>WorkItem</w:t>
+      </w:r>
+      <w:proofErr w:type="spellEnd"/>
+      <w:r>
+        <w:t xml:space="preserve"> to </w:t>
+      </w:r>
+      <w:proofErr w:type="spellStart"/>
+      <w:r>
+        <w:t>WorkflowInstance</w:t>
+      </w:r>
+      <w:proofErr w:type="spellEnd"/>
+      <w:r>
+        <w:t>.</w:t>
+      </w:r>
+    </w:p>
+    <w:p>
+      <w:r>
+        <w:t>The final state hierarchy became:</w:t>
+      </w:r>
+    </w:p>
+    <w:p>
+      <w:pPr>
+        <w:numPr>
+          <w:ilvl w:val="0"/>
+          <w:numId w:val="40"/>
+        </w:numPr>
+      </w:pPr>
+      <w:proofErr w:type="spellStart"/>
+      <w:r>
+        <w:t>SubmittedState</w:t>
+      </w:r>
+      <w:proofErr w:type="spellEnd"/>
+    </w:p>
+    <w:p>
+      <w:pPr>
+        <w:numPr>
+          <w:ilvl w:val="0"/>
+          <w:numId w:val="40"/>
+        </w:numPr>
+      </w:pPr>
+      <w:proofErr w:type="spellStart"/>
+      <w:r>
+        <w:t>ActiveState</w:t>
+      </w:r>
+      <w:proofErr w:type="spellEnd"/>
+    </w:p>
+    <w:p>
+      <w:pPr>
+        <w:numPr>
+          <w:ilvl w:val="0"/>
+          <w:numId w:val="40"/>
+        </w:numPr>
+      </w:pPr>
+      <w:proofErr w:type="spellStart"/>
+      <w:r>
+        <w:t>InProgressState</w:t>
+      </w:r>
+      <w:proofErr w:type="spellEnd"/>
+    </w:p>
+    <w:p>
+      <w:pPr>
+        <w:numPr>
+          <w:ilvl w:val="0"/>
+          <w:numId w:val="40"/>
+        </w:numPr>
+      </w:pPr>
+      <w:proofErr w:type="spellStart"/>
+      <w:r>
+        <w:t>ResolvedState</w:t>
+      </w:r>
+      <w:proofErr w:type="spellEnd"/>
+    </w:p>
+    <w:p>
+      <w:pPr>
+        <w:numPr>
+          <w:ilvl w:val="0"/>
+          <w:numId w:val="40"/>
+        </w:numPr>
+      </w:pPr>
+      <w:proofErr w:type="spellStart"/>
+      <w:r>
+        <w:t>ClosedState</w:t>
+      </w:r>
+      <w:proofErr w:type="spellEnd"/>
+    </w:p>
+    <w:p>
+      <w:r>
+        <w:rPr>
+          <w:b/>
+          <w:bCs/>
+          <w:sz w:val="22"/>
+          <w:szCs w:val="22"/>
+          <w:u w:val="single"/>
+        </w:rPr>
+        <w:t>Reason for Change:</w:t>
+      </w:r>
+      <w:r>
+        <w:br/>
+        <w:t xml:space="preserve">States such as Submitted, Resolved and Closed describe the lifecycle of the entire running case rather than one individual work item. Applying State to </w:t>
+      </w:r>
+      <w:proofErr w:type="spellStart"/>
+      <w:r>
+        <w:t>WorkflowInstance</w:t>
+      </w:r>
+      <w:proofErr w:type="spellEnd"/>
+      <w:r>
+        <w:t xml:space="preserve"> therefore represented the case-processing workflow more accurately and simplified the overall design.</w:t>
+      </w:r>
+    </w:p>
+    <w:p>
+      <w:r>
+        <w:rPr>
+          <w:b/>
+          <w:bCs/>
+          <w:sz w:val="22"/>
+          <w:szCs w:val="22"/>
+          <w:u w:val="single"/>
+        </w:rPr>
+        <w:t>Diagram Updates:</w:t>
+      </w:r>
+      <w:r>
+        <w:br/>
+        <w:t xml:space="preserve">The association between </w:t>
+      </w:r>
+      <w:proofErr w:type="spellStart"/>
+      <w:r>
+        <w:t>WorkItem</w:t>
+      </w:r>
+      <w:proofErr w:type="spellEnd"/>
+      <w:r>
+        <w:t xml:space="preserve"> and </w:t>
+      </w:r>
+      <w:proofErr w:type="spellStart"/>
+      <w:r>
+        <w:t>WorkItemState</w:t>
+      </w:r>
+      <w:proofErr w:type="spellEnd"/>
+      <w:r>
+        <w:t xml:space="preserve"> was removed. </w:t>
+      </w:r>
+      <w:proofErr w:type="spellStart"/>
+      <w:r>
+        <w:t>WorkflowInstance</w:t>
+      </w:r>
+      <w:proofErr w:type="spellEnd"/>
+      <w:r>
+        <w:t xml:space="preserve"> was instead associated with the abstract </w:t>
+      </w:r>
+      <w:proofErr w:type="spellStart"/>
+      <w:r>
+        <w:t>WorkflowState</w:t>
+      </w:r>
+      <w:proofErr w:type="spellEnd"/>
+      <w:r>
+        <w:t xml:space="preserve"> class and its concrete states.</w:t>
+      </w:r>
+    </w:p>
+    <w:p/>
+    <w:p>
+      <w:pPr>
+        <w:rPr>
+          <w:b/>
+          <w:bCs/>
+          <w:sz w:val="22"/>
+          <w:szCs w:val="22"/>
+        </w:rPr>
+      </w:pPr>
+      <w:r>
+        <w:rPr>
+          <w:b/>
+          <w:bCs/>
+          <w:sz w:val="22"/>
+          <w:szCs w:val="22"/>
+        </w:rPr>
+        <w:t xml:space="preserve">2. </w:t>
+      </w:r>
+      <w:proofErr w:type="spellStart"/>
+      <w:r>
+        <w:rPr>
+          <w:b/>
+          <w:bCs/>
+          <w:sz w:val="22"/>
+          <w:szCs w:val="22"/>
+        </w:rPr>
+        <w:t>EscalatedState</w:t>
+      </w:r>
+      <w:proofErr w:type="spellEnd"/>
+      <w:r>
+        <w:rPr>
+          <w:b/>
+          <w:bCs/>
+          <w:sz w:val="22"/>
+          <w:szCs w:val="22"/>
+        </w:rPr>
+        <w:t xml:space="preserve"> Removed</w:t>
+      </w:r>
+    </w:p>
+    <w:p>
+      <w:r>
+        <w:rPr>
+          <w:b/>
+          <w:bCs/>
+          <w:sz w:val="22"/>
+          <w:szCs w:val="22"/>
+          <w:u w:val="single"/>
+        </w:rPr>
+        <w:t>Problem / Question:</w:t>
+      </w:r>
+      <w:r>
+        <w:br/>
+        <w:t xml:space="preserve">The original design treated escalation as a separate workflow state. This resulted in the workflow moving from </w:t>
+      </w:r>
+      <w:proofErr w:type="spellStart"/>
+      <w:r>
+        <w:t>InProgressState</w:t>
+      </w:r>
+      <w:proofErr w:type="spellEnd"/>
+      <w:r>
+        <w:t xml:space="preserve"> to </w:t>
+      </w:r>
+      <w:proofErr w:type="spellStart"/>
+      <w:r>
+        <w:t>EscalatedState</w:t>
+      </w:r>
+      <w:proofErr w:type="spellEnd"/>
+      <w:r>
+        <w:t xml:space="preserve"> and then back to </w:t>
+      </w:r>
+      <w:proofErr w:type="spellStart"/>
+      <w:r>
+        <w:t>InProgressState</w:t>
+      </w:r>
+      <w:proofErr w:type="spellEnd"/>
+      <w:r>
+        <w:t xml:space="preserve"> once a higher-level participant accepted the case.</w:t>
+      </w:r>
+    </w:p>
+    <w:p>
+      <w:pPr>
+        <w:rPr>
+          <w:sz w:val="22"/>
+          <w:szCs w:val="22"/>
+          <w:u w:val="single"/>
+        </w:rPr>
+      </w:pPr>
+      <w:r>
+        <w:rPr>
+          <w:b/>
+          <w:bCs/>
+          <w:sz w:val="22"/>
+          <w:szCs w:val="22"/>
+          <w:u w:val="single"/>
+        </w:rPr>
+        <w:t>Original Design:</w:t>
+      </w:r>
+    </w:p>
+    <w:p>
+      <w:proofErr w:type="spellStart"/>
+      <w:r>
+        <w:t>InProgressState</w:t>
+      </w:r>
+      <w:proofErr w:type="spellEnd"/>
+      <w:r>
+        <w:t xml:space="preserve"> -&gt; </w:t>
+      </w:r>
+      <w:proofErr w:type="spellStart"/>
+      <w:r>
+        <w:t>EscalatedState</w:t>
+      </w:r>
+      <w:proofErr w:type="spellEnd"/>
+      <w:r>
+        <w:t xml:space="preserve"> -&gt; </w:t>
+      </w:r>
+      <w:proofErr w:type="spellStart"/>
+      <w:r>
+        <w:t>InProgressState</w:t>
+      </w:r>
+      <w:proofErr w:type="spellEnd"/>
+    </w:p>
+    <w:p>
+      <w:r>
+        <w:rPr>
+          <w:b/>
+          <w:bCs/>
+          <w:sz w:val="22"/>
+          <w:szCs w:val="22"/>
+          <w:u w:val="single"/>
+        </w:rPr>
+        <w:t>Change Made:</w:t>
+      </w:r>
+      <w:r>
+        <w:br/>
+      </w:r>
+      <w:proofErr w:type="spellStart"/>
+      <w:r>
+        <w:t>EscalatedState</w:t>
+      </w:r>
+      <w:proofErr w:type="spellEnd"/>
+      <w:r>
+        <w:t xml:space="preserve"> was removed. Escalation now takes place while the workflow remains in </w:t>
+      </w:r>
+      <w:proofErr w:type="spellStart"/>
+      <w:r>
+        <w:t>InProgressState</w:t>
+      </w:r>
+      <w:proofErr w:type="spellEnd"/>
+      <w:r>
+        <w:t>.</w:t>
+      </w:r>
+    </w:p>
+    <w:p>
+      <w:r>
+        <w:lastRenderedPageBreak/>
+        <w:t>The escalate() operation invokes the Chain of Responsibility to find a participant with sufficient authority to continue handling the case.</w:t>
+      </w:r>
+    </w:p>
+    <w:p>
+      <w:r>
+        <w:rPr>
+          <w:b/>
+          <w:bCs/>
+          <w:sz w:val="22"/>
+          <w:szCs w:val="22"/>
+          <w:u w:val="single"/>
+        </w:rPr>
+        <w:t>Reason for Change:</w:t>
+      </w:r>
+      <w:r>
+        <w:br/>
+        <w:t xml:space="preserve">Escalation does not necessarily represent a new stage in the lifecycle of the case. The case is still being processed, but responsibility has moved to a higher-authority participant. Keeping the workflow in </w:t>
+      </w:r>
+      <w:proofErr w:type="spellStart"/>
+      <w:r>
+        <w:t>InProgressState</w:t>
+      </w:r>
+      <w:proofErr w:type="spellEnd"/>
+      <w:r>
+        <w:t xml:space="preserve"> separates the state of the case from the authority of the person currently handling it.</w:t>
+      </w:r>
+    </w:p>
+    <w:p>
+      <w:r>
+        <w:t>A higher-level participant may then use their authority to resolve the workflow or close it.</w:t>
+      </w:r>
+    </w:p>
+    <w:p>
+      <w:r>
+        <w:rPr>
+          <w:b/>
+          <w:bCs/>
+          <w:sz w:val="22"/>
+          <w:szCs w:val="22"/>
+          <w:u w:val="single"/>
+        </w:rPr>
+        <w:t>Diagram Updates:</w:t>
+      </w:r>
+      <w:r>
+        <w:br/>
+      </w:r>
+      <w:proofErr w:type="spellStart"/>
+      <w:r>
+        <w:t>EscalatedState</w:t>
+      </w:r>
+      <w:proofErr w:type="spellEnd"/>
+      <w:r>
+        <w:t xml:space="preserve"> was removed from the State hierarchy and the State Diagram. Escalation is now represented as an action from </w:t>
+      </w:r>
+      <w:proofErr w:type="spellStart"/>
+      <w:r>
+        <w:t>InProgressState</w:t>
+      </w:r>
+      <w:proofErr w:type="spellEnd"/>
+      <w:r>
+        <w:t xml:space="preserve"> that changes the current handler while remaining in the same workflow state.</w:t>
+      </w:r>
+    </w:p>
+    <w:p>
+      <w:pPr>
+        <w:rPr>
+          <w:b/>
+          <w:bCs/>
+          <w:sz w:val="22"/>
+          <w:szCs w:val="22"/>
+        </w:rPr>
+      </w:pPr>
+      <w:r>
+        <w:rPr>
+          <w:b/>
+          <w:bCs/>
+          <w:sz w:val="22"/>
+          <w:szCs w:val="22"/>
+        </w:rPr>
+        <w:t>3</w:t>
+      </w:r>
+      <w:r>
+        <w:rPr>
+          <w:b/>
+          <w:bCs/>
+          <w:sz w:val="22"/>
+          <w:szCs w:val="22"/>
+        </w:rPr>
+        <w:t>. Role Class Expanded to Include Functional Behaviour</w:t>
+      </w:r>
+    </w:p>
+    <w:p>
+      <w:r>
+        <w:rPr>
+          <w:b/>
+          <w:bCs/>
+          <w:sz w:val="22"/>
+          <w:szCs w:val="22"/>
+          <w:u w:val="single"/>
+        </w:rPr>
+        <w:t>Problem / Question:</w:t>
+      </w:r>
+      <w:r>
+        <w:br/>
+        <w:t>The original Role class contained only a name attribute. This made the class very limited and raised the question of whether it justified being a separate class.</w:t>
+      </w:r>
+    </w:p>
+    <w:p>
+      <w:r>
+        <w:rPr>
+          <w:b/>
+          <w:bCs/>
+          <w:sz w:val="22"/>
+          <w:szCs w:val="22"/>
+          <w:u w:val="single"/>
+        </w:rPr>
+        <w:t>Change Made:</w:t>
+      </w:r>
+      <w:r>
+        <w:br/>
+        <w:t>The Role class was expanded to support role configuration through a templated operation.</w:t>
+      </w:r>
+    </w:p>
+    <w:p>
+      <w:r>
+        <w:t>The design allows role configurations such as:</w:t>
+      </w:r>
+    </w:p>
+    <w:p>
+      <w:pPr>
+        <w:numPr>
+          <w:ilvl w:val="0"/>
+          <w:numId w:val="42"/>
+        </w:numPr>
+      </w:pPr>
+      <w:r>
+        <w:t>Junior</w:t>
+      </w:r>
+    </w:p>
+    <w:p>
+      <w:pPr>
+        <w:numPr>
+          <w:ilvl w:val="0"/>
+          <w:numId w:val="42"/>
+        </w:numPr>
+      </w:pPr>
+      <w:r>
+        <w:t>Intermediate</w:t>
+      </w:r>
+    </w:p>
+    <w:p>
+      <w:pPr>
+        <w:numPr>
+          <w:ilvl w:val="0"/>
+          <w:numId w:val="42"/>
+        </w:numPr>
+      </w:pPr>
+      <w:r>
+        <w:t>Senior</w:t>
+      </w:r>
+    </w:p>
+    <w:p>
+      <w:r>
+        <w:t xml:space="preserve">A templated </w:t>
+      </w:r>
+      <w:proofErr w:type="spellStart"/>
+      <w:r>
+        <w:t>configureRole</w:t>
+      </w:r>
+      <w:proofErr w:type="spellEnd"/>
+      <w:r>
+        <w:t>&lt;T&gt;() concept is used to configure the authority and responsibilities associated with the selected role level.</w:t>
+      </w:r>
+    </w:p>
+    <w:p>
+      <w:r>
+        <w:t>For example:</w:t>
+      </w:r>
+    </w:p>
+    <w:p>
+      <w:pPr>
+        <w:numPr>
+          <w:ilvl w:val="0"/>
+          <w:numId w:val="43"/>
+        </w:numPr>
+      </w:pPr>
+      <w:r>
+        <w:t>Junior roles have basic handling authority.</w:t>
+      </w:r>
+    </w:p>
+    <w:p>
+      <w:pPr>
+        <w:numPr>
+          <w:ilvl w:val="0"/>
+          <w:numId w:val="43"/>
+        </w:numPr>
+      </w:pPr>
+      <w:r>
+        <w:t>Intermediate roles have greater handling authority and may approve or escalate work.</w:t>
+      </w:r>
+    </w:p>
+    <w:p>
+      <w:pPr>
+        <w:numPr>
+          <w:ilvl w:val="0"/>
+          <w:numId w:val="43"/>
+        </w:numPr>
+      </w:pPr>
+      <w:r>
+        <w:t>Senior roles have the highest authority and may make final decisions or close cases where appropriate.</w:t>
+      </w:r>
+    </w:p>
+    <w:p>
+      <w:r>
+        <w:rPr>
+          <w:b/>
+          <w:bCs/>
+          <w:sz w:val="22"/>
+          <w:szCs w:val="22"/>
+          <w:u w:val="single"/>
+        </w:rPr>
+        <w:t>Reason for Change:</w:t>
+      </w:r>
+      <w:r>
+        <w:br/>
+        <w:t>This gives the Role class meaningful behaviour rather than using it simply as a container for one string. It also allows the same generic role mechanism to be reused across different organisations.</w:t>
+      </w:r>
+    </w:p>
+    <w:p>
+      <w:r>
+        <w:t>For example, a Teacher could be configured with an intermediate authority level, while a Principal could be configured with a senior authority level.</w:t>
+      </w:r>
+    </w:p>
+    <w:p>
+      <w:r>
+        <w:t>Keeping Role separate from Participant also allows participants and roles to have a many-to-many relationship. A participant may hold multiple roles, while one role may be shared by several participants.</w:t>
+      </w:r>
+    </w:p>
+    <w:p>
+      <w:r>
+        <w:rPr>
+          <w:b/>
+          <w:bCs/>
+          <w:sz w:val="22"/>
+          <w:szCs w:val="22"/>
+          <w:u w:val="single"/>
+        </w:rPr>
+        <w:t>Diagram Updates:</w:t>
+      </w:r>
+      <w:r>
+        <w:br/>
+        <w:t>The Role class now contains the role configuration operation and is linked to explanatory UML notes describing the supported template configurations.</w:t>
+      </w:r>
+    </w:p>
+    <w:p>
+      <w:pPr>
+        <w:jc w:val="both"/>
+        <w:rPr>
           <w:sz w:val="24"/>
           <w:szCs w:val="24"/>
         </w:rPr>
-        <w:t>Submitted, Active, and In Progress</w:t>
-      </w:r>
-      <w:r>
-        <w:rPr>
-          <w:sz w:val="24"/>
-          <w:szCs w:val="24"/>
-        </w:rPr>
-        <w:t xml:space="preserve"> as the case is processed. If the case cannot be handled at the current level, it enters the </w:t>
-      </w:r>
-      <w:r>
-        <w:rPr>
-          <w:b/>
-          <w:bCs/>
-          <w:sz w:val="24"/>
-          <w:szCs w:val="24"/>
-        </w:rPr>
-        <w:t>Escalated</w:t>
-      </w:r>
-      <w:r>
-        <w:rPr>
-          <w:sz w:val="24"/>
-          <w:szCs w:val="24"/>
-        </w:rPr>
-        <w:t xml:space="preserve"> state and returns to </w:t>
-      </w:r>
-      <w:r>
-        <w:rPr>
-          <w:b/>
-          <w:bCs/>
-          <w:sz w:val="24"/>
-          <w:szCs w:val="24"/>
-        </w:rPr>
-        <w:t>In Progress</w:t>
-      </w:r>
-      <w:r>
-        <w:rPr>
-          <w:sz w:val="24"/>
-          <w:szCs w:val="24"/>
-        </w:rPr>
-        <w:t xml:space="preserve"> when a handler accepts it. From In Progress, the workflow can either become </w:t>
-      </w:r>
-      <w:r>
-        <w:rPr>
-          <w:b/>
-          <w:bCs/>
-          <w:sz w:val="24"/>
-          <w:szCs w:val="24"/>
-        </w:rPr>
-        <w:t>Resolved</w:t>
-      </w:r>
-      <w:r>
-        <w:rPr>
-          <w:sz w:val="24"/>
-          <w:szCs w:val="24"/>
-        </w:rPr>
-        <w:t xml:space="preserve"> when the case is successfully completed or </w:t>
-      </w:r>
-      <w:r>
-        <w:rPr>
-          <w:b/>
-          <w:bCs/>
-          <w:sz w:val="24"/>
-          <w:szCs w:val="24"/>
-        </w:rPr>
-        <w:t>Closed</w:t>
-      </w:r>
-      <w:r>
-        <w:rPr>
-          <w:sz w:val="24"/>
-          <w:szCs w:val="24"/>
-        </w:rPr>
-        <w:t xml:space="preserve"> when the workflow ends without resolution. Resolved and Closed represent the final states of the workflow.</w:t>
+      </w:pPr>
+    </w:p>
+    <w:p>
+      <w:pPr>
+        <w:pStyle w:val="Heading1"/>
+        <w:rPr>
+          <w:color w:val="0070C0"/>
+        </w:rPr>
+      </w:pPr>
+      <w:r>
+        <w:rPr>
+          <w:color w:val="0070C0"/>
+        </w:rPr>
+        <w:t>Team C</w:t>
+      </w:r>
+      <w:r>
+        <w:rPr>
+          <w:color w:val="0070C0"/>
+        </w:rPr>
+        <w:t>o</w:t>
+      </w:r>
+      <w:r>
+        <w:rPr>
+          <w:color w:val="0070C0"/>
+        </w:rPr>
+        <w:t>ntributions:</w:t>
       </w:r>
     </w:p>
     <w:p>
       <w:pPr>
         <w:jc w:val="both"/>
         <w:rPr>
-          <w:sz w:val="24"/>
-          <w:szCs w:val="24"/>
-        </w:rPr>
-      </w:pPr>
+          <w:sz w:val="22"/>
+          <w:szCs w:val="22"/>
+        </w:rPr>
+      </w:pPr>
+      <w:r>
+        <w:rPr>
+          <w:b/>
+          <w:bCs/>
+          <w:sz w:val="22"/>
+          <w:szCs w:val="22"/>
+        </w:rPr>
+        <w:t>Task 1: Research</w:t>
+      </w:r>
     </w:p>
     <w:p>
       <w:pPr>
         <w:jc w:val="both"/>
-        <w:rPr>
-          <w:sz w:val="24"/>
-          <w:szCs w:val="24"/>
-        </w:rPr>
-      </w:pPr>
-    </w:p>
-    <w:p>
-      <w:pPr>
-        <w:pStyle w:val="Heading1"/>
-        <w:rPr>
-          <w:color w:val="0070C0"/>
-        </w:rPr>
-      </w:pPr>
-      <w:r>
-        <w:rPr>
-          <w:color w:val="0070C0"/>
-        </w:rPr>
-        <w:t xml:space="preserve">TASK </w:t>
-      </w:r>
-      <w:r>
-        <w:rPr>
-          <w:color w:val="0070C0"/>
-        </w:rPr>
-        <w:t>7</w:t>
-      </w:r>
-      <w:r>
-        <w:rPr>
-          <w:color w:val="0070C0"/>
-        </w:rPr>
-        <w:t>:</w:t>
-      </w:r>
-      <w:r>
-        <w:rPr>
-          <w:color w:val="0070C0"/>
-        </w:rPr>
-        <w:t xml:space="preserve"> </w:t>
-      </w:r>
-      <w:r>
-        <w:rPr>
-          <w:color w:val="0070C0"/>
-        </w:rPr>
-        <w:t>Design Decisions and Revisions</w:t>
+      </w:pPr>
+      <w:r>
+        <w:rPr>
+          <w:b/>
+          <w:bCs/>
+        </w:rPr>
+        <w:t>Contributors:</w:t>
+      </w:r>
+      <w:r>
+        <w:t xml:space="preserve"> LM Kabongo, Joshua Peter</w:t>
       </w:r>
     </w:p>
     <w:p>
       <w:pPr>
         <w:jc w:val="both"/>
-        <w:rPr>
-          <w:sz w:val="24"/>
-          <w:szCs w:val="24"/>
-        </w:rPr>
-      </w:pPr>
-      <w:r>
-        <w:rPr>
-          <w:sz w:val="24"/>
-          <w:szCs w:val="24"/>
-        </w:rPr>
-        <w:t>After tutor feedback we updated our original Generic Activity diagram to more clearly describe the activities performed in each node and to remove function calls. This update improves the readability of the diagrams, allows them to match the expected format, and more clearly displays the flow and actions that TIVIDY will produce. This update was made on 20</w:t>
-      </w:r>
-      <w:r>
-        <w:rPr>
-          <w:sz w:val="24"/>
-          <w:szCs w:val="24"/>
-          <w:vertAlign w:val="superscript"/>
-        </w:rPr>
-        <w:t>th</w:t>
-      </w:r>
-      <w:r>
-        <w:rPr>
-          <w:sz w:val="24"/>
-          <w:szCs w:val="24"/>
-        </w:rPr>
-        <w:t xml:space="preserve"> October 2026. </w:t>
+      </w:pPr>
+      <w:r>
+        <w:t>LM Kabongo and Joshua Peter worked on the research into workflow management systems and the concepts relevant to TIVIDY. This included workflow definitions and instances, activities, work items, assignment, routing, participants, dependencies, events, auditing, monitoring, reusability and workflow versioning.</w:t>
       </w:r>
     </w:p>
     <w:p>
       <w:pPr>
         <w:jc w:val="both"/>
-        <w:rPr>
-          <w:sz w:val="24"/>
-          <w:szCs w:val="24"/>
-        </w:rPr>
       </w:pPr>
     </w:p>
     <w:p>
       <w:pPr>
         <w:jc w:val="both"/>
         <w:rPr>
-          <w:sz w:val="24"/>
-          <w:szCs w:val="24"/>
-        </w:rPr>
-      </w:pPr>
-      <w:r>
-        <w:rPr>
-          <w:b/>
-          <w:bCs/>
-          <w:sz w:val="24"/>
-          <w:szCs w:val="24"/>
-        </w:rPr>
-        <w:t>Team Contributions</w:t>
+          <w:sz w:val="22"/>
+          <w:szCs w:val="22"/>
+        </w:rPr>
+      </w:pPr>
+      <w:r>
+        <w:rPr>
+          <w:b/>
+          <w:bCs/>
+          <w:sz w:val="22"/>
+          <w:szCs w:val="22"/>
+        </w:rPr>
+        <w:t>Task 2:  Initial Scope and Scenario</w:t>
       </w:r>
     </w:p>
     <w:p>
       <w:pPr>
         <w:jc w:val="both"/>
-        <w:rPr>
-          <w:sz w:val="24"/>
-          <w:szCs w:val="24"/>
-        </w:rPr>
-      </w:pPr>
+      </w:pPr>
+      <w:r>
+        <w:rPr>
+          <w:b/>
+          <w:bCs/>
+        </w:rPr>
+        <w:t>Contributor:</w:t>
+      </w:r>
+      <w:r>
+        <w:t xml:space="preserve"> Kristy Heesen</w:t>
+      </w:r>
     </w:p>
     <w:p>
       <w:pPr>
         <w:jc w:val="both"/>
-        <w:rPr>
-          <w:sz w:val="24"/>
-          <w:szCs w:val="24"/>
-        </w:rPr>
-      </w:pPr>
-      <w:r>
-        <w:rPr>
-          <w:b/>
-          <w:bCs/>
-          <w:sz w:val="24"/>
-          <w:szCs w:val="24"/>
-        </w:rPr>
-        <w:t>Task 1</w:t>
-      </w:r>
-      <w:r>
-        <w:rPr>
-          <w:b/>
-          <w:bCs/>
-          <w:sz w:val="24"/>
-          <w:szCs w:val="24"/>
-        </w:rPr>
-        <w:t xml:space="preserve">: </w:t>
-      </w:r>
-      <w:r>
-        <w:rPr>
-          <w:b/>
-          <w:bCs/>
-          <w:sz w:val="24"/>
-          <w:szCs w:val="24"/>
-        </w:rPr>
-        <w:t>Research</w:t>
+      </w:pPr>
+      <w:r>
+        <w:t>Kristy Heesen developed the initial scope of TIVIDY and defined the selected University Student Complaint Management scenario. This included distinguishing workflow definitions from running workflow instances and establishing the responsibilities and boundaries of the generic workflow management system.</w:t>
       </w:r>
     </w:p>
     <w:p>
       <w:pPr>
         <w:jc w:val="both"/>
-        <w:rPr>
-          <w:sz w:val="24"/>
-          <w:szCs w:val="24"/>
-        </w:rPr>
-      </w:pPr>
-      <w:r>
-        <w:rPr>
-          <w:b/>
-          <w:bCs/>
-          <w:sz w:val="24"/>
-          <w:szCs w:val="24"/>
+      </w:pPr>
+    </w:p>
+    <w:p>
+      <w:pPr>
+        <w:jc w:val="both"/>
+        <w:rPr>
+          <w:sz w:val="22"/>
+          <w:szCs w:val="22"/>
+        </w:rPr>
+      </w:pPr>
+      <w:r>
+        <w:rPr>
+          <w:b/>
+          <w:bCs/>
+          <w:sz w:val="22"/>
+          <w:szCs w:val="22"/>
+        </w:rPr>
+        <w:t>Task 3: UML Activity Diagrams</w:t>
+      </w:r>
+    </w:p>
+    <w:p>
+      <w:pPr>
+        <w:jc w:val="both"/>
+      </w:pPr>
+      <w:r>
+        <w:rPr>
+          <w:b/>
+          <w:bCs/>
         </w:rPr>
         <w:t>Contributors:</w:t>
       </w:r>
       <w:r>
-        <w:rPr>
-          <w:sz w:val="24"/>
-          <w:szCs w:val="24"/>
-        </w:rPr>
-        <w:t xml:space="preserve"> LM Kabongo, Joshua Peter</w:t>
+        <w:t xml:space="preserve"> Lindokuhle Skosana, Joshua Peter</w:t>
       </w:r>
     </w:p>
     <w:p>
       <w:pPr>
         <w:jc w:val="both"/>
-        <w:rPr>
-          <w:sz w:val="24"/>
-          <w:szCs w:val="24"/>
-        </w:rPr>
-      </w:pPr>
+      </w:pPr>
+      <w:r>
+        <w:t>Lindokuhle Skosana and Joshua Peter worked on the UML Activity Diagrams for the generic TIVIDY workflows and the selected University Student Complaint Management scenario.</w:t>
+      </w:r>
     </w:p>
     <w:p>
       <w:pPr>
         <w:jc w:val="both"/>
-        <w:rPr>
-          <w:sz w:val="24"/>
-          <w:szCs w:val="24"/>
-        </w:rPr>
-      </w:pPr>
-      <w:r>
-        <w:rPr>
-          <w:sz w:val="24"/>
-          <w:szCs w:val="24"/>
-        </w:rPr>
+      </w:pPr>
+    </w:p>
+    <w:p>
+      <w:pPr>
+        <w:jc w:val="both"/>
+        <w:rPr>
+          <w:sz w:val="22"/>
+          <w:szCs w:val="22"/>
+        </w:rPr>
+      </w:pPr>
+      <w:r>
+        <w:rPr>
+          <w:b/>
+          <w:bCs/>
+          <w:sz w:val="22"/>
+          <w:szCs w:val="22"/>
+        </w:rPr>
+        <w:t>Task 4: Design Patterns</w:t>
+      </w:r>
+    </w:p>
+    <w:p>
+      <w:pPr>
+        <w:jc w:val="both"/>
+      </w:pPr>
+      <w:r>
+        <w:rPr>
+          <w:b/>
+          <w:bCs/>
+        </w:rPr>
+        <w:t>Contributors:</w:t>
+      </w:r>
+      <w:r>
+        <w:t xml:space="preserve"> Kristy Heesen, Musa Msibi, Lindokuhle Skosana</w:t>
+      </w:r>
+    </w:p>
+    <w:p>
+      <w:pPr>
+        <w:jc w:val="both"/>
+      </w:pPr>
+      <w:r>
+        <w:t xml:space="preserve">Kristy Heesen, Musa Msibi and Lindokuhle Skosana worked on identifying and justifying the </w:t>
+      </w:r>
+      <w:proofErr w:type="spellStart"/>
+      <w:r>
+        <w:t>GoF</w:t>
+      </w:r>
+      <w:proofErr w:type="spellEnd"/>
+      <w:r>
+        <w:t xml:space="preserve"> design patterns used in TIVIDY. This included defining the design problems, pattern participants, collaborations, variation points and how the patterns work together within the workflow management system.</w:t>
+      </w:r>
+    </w:p>
+    <w:p>
+      <w:pPr>
+        <w:jc w:val="both"/>
+      </w:pPr>
+    </w:p>
+    <w:p>
+      <w:pPr>
+        <w:jc w:val="both"/>
+        <w:rPr>
+          <w:sz w:val="22"/>
+          <w:szCs w:val="22"/>
+        </w:rPr>
+      </w:pPr>
+      <w:r>
+        <w:rPr>
+          <w:b/>
+          <w:bCs/>
+          <w:sz w:val="22"/>
+          <w:szCs w:val="22"/>
+        </w:rPr>
+        <w:t>Task 5: UML Class Diagram</w:t>
+      </w:r>
+    </w:p>
+    <w:p>
+      <w:pPr>
+        <w:jc w:val="both"/>
+      </w:pPr>
+      <w:r>
+        <w:rPr>
+          <w:b/>
+          <w:bCs/>
+        </w:rPr>
+        <w:t>Contributors:</w:t>
+      </w:r>
+      <w:r>
+        <w:t xml:space="preserve"> Kristy Heesen</w:t>
+      </w:r>
+    </w:p>
+    <w:p>
+      <w:pPr>
+        <w:jc w:val="both"/>
+      </w:pPr>
+      <w:r>
+        <w:t>Kristy Heesen worked on developing the complete UML Class Diagram for TIVIDY. This included the main classes, relationships, multiplicities, attributes, operations, ownership relationships and the collaborations between the different design patterns and subsystems.</w:t>
+      </w:r>
+    </w:p>
+    <w:p>
+      <w:pPr>
+        <w:jc w:val="both"/>
+      </w:pPr>
+    </w:p>
+    <w:p>
+      <w:pPr>
+        <w:jc w:val="both"/>
+        <w:rPr>
+          <w:sz w:val="22"/>
+          <w:szCs w:val="22"/>
+        </w:rPr>
+      </w:pPr>
+      <w:r>
+        <w:rPr>
+          <w:b/>
+          <w:bCs/>
+          <w:sz w:val="22"/>
+          <w:szCs w:val="22"/>
+        </w:rPr>
+        <w:t>Task 6: Runtime Behaviour Diagrams</w:t>
+      </w:r>
+    </w:p>
+    <w:p>
+      <w:pPr>
+        <w:jc w:val="both"/>
+      </w:pPr>
+      <w:r>
+        <w:rPr>
+          <w:b/>
+          <w:bCs/>
+        </w:rPr>
+        <w:t>Contributors:</w:t>
+      </w:r>
+      <w:r>
+        <w:t xml:space="preserve"> LM Kabongo, Musa Msibi</w:t>
+      </w:r>
+    </w:p>
+    <w:p>
+      <w:pPr>
+        <w:jc w:val="both"/>
+      </w:pPr>
+      <w:r>
+        <w:t xml:space="preserve">LM Kabongo and Musa Msibi worked on the UML runtime behaviour diagrams. LM Kabongo developed the sequence diagram showing the completion of a </w:t>
+      </w:r>
+      <w:proofErr w:type="spellStart"/>
+      <w:r>
+        <w:t>WorkItem</w:t>
+      </w:r>
+      <w:proofErr w:type="spellEnd"/>
+      <w:r>
+        <w:t xml:space="preserve"> and determining </w:t>
+      </w:r>
+      <w:r>
         <w:lastRenderedPageBreak/>
-        <w:t>LM Kabongo and Joshua Peter worked on the research into workflow management systems and the concepts relevant to TIVIDY. This included workflow definitions and instances, activities, work items, assignment, routing, participants, dependencies, events, auditing, monitoring, reusability and workflow versioning.</w:t>
+        <w:t xml:space="preserve">what happens next, as well as the </w:t>
+      </w:r>
+      <w:proofErr w:type="spellStart"/>
+      <w:r>
+        <w:t>WorkflowInstance</w:t>
+      </w:r>
+      <w:proofErr w:type="spellEnd"/>
+      <w:r>
+        <w:t xml:space="preserve"> State Diagram. Musa Msibi developed the sequence diagram showing the escalation process.</w:t>
       </w:r>
     </w:p>
     <w:p>
       <w:pPr>
         <w:jc w:val="both"/>
-        <w:rPr>
-          <w:sz w:val="24"/>
-          <w:szCs w:val="24"/>
-        </w:rPr>
       </w:pPr>
     </w:p>
     <w:p>
       <w:pPr>
         <w:jc w:val="both"/>
         <w:rPr>
-          <w:sz w:val="24"/>
-          <w:szCs w:val="24"/>
-        </w:rPr>
-      </w:pPr>
-      <w:r>
-        <w:rPr>
-          <w:b/>
-          <w:bCs/>
-          <w:sz w:val="24"/>
-          <w:szCs w:val="24"/>
-        </w:rPr>
-        <w:t>Task 2</w:t>
-      </w:r>
-      <w:r>
-        <w:rPr>
-          <w:b/>
-          <w:bCs/>
-          <w:sz w:val="24"/>
-          <w:szCs w:val="24"/>
-        </w:rPr>
-        <w:t xml:space="preserve">: </w:t>
-      </w:r>
-      <w:r>
-        <w:rPr>
-          <w:b/>
-          <w:bCs/>
-          <w:sz w:val="24"/>
-          <w:szCs w:val="24"/>
-        </w:rPr>
-        <w:t xml:space="preserve"> Initial Scope and Scenario</w:t>
+          <w:sz w:val="22"/>
+          <w:szCs w:val="22"/>
+        </w:rPr>
+      </w:pPr>
+      <w:r>
+        <w:rPr>
+          <w:b/>
+          <w:bCs/>
+          <w:sz w:val="22"/>
+          <w:szCs w:val="22"/>
+        </w:rPr>
+        <w:t>Task 7: Design Decisions and Revisions</w:t>
       </w:r>
     </w:p>
     <w:p>
       <w:pPr>
         <w:jc w:val="both"/>
-        <w:rPr>
-          <w:sz w:val="24"/>
-          <w:szCs w:val="24"/>
-        </w:rPr>
-      </w:pPr>
-      <w:r>
-        <w:rPr>
-          <w:b/>
-          <w:bCs/>
-          <w:sz w:val="24"/>
-          <w:szCs w:val="24"/>
-        </w:rPr>
-        <w:t>Contributor:</w:t>
-      </w:r>
-      <w:r>
-        <w:rPr>
-          <w:sz w:val="24"/>
-          <w:szCs w:val="24"/>
-        </w:rPr>
-        <w:t xml:space="preserve"> Kristy Heesen</w:t>
+      </w:pPr>
+      <w:r>
+        <w:rPr>
+          <w:b/>
+          <w:bCs/>
+        </w:rPr>
+        <w:t>Contributors:</w:t>
+      </w:r>
+      <w:r>
+        <w:t xml:space="preserve"> Entire Team</w:t>
       </w:r>
     </w:p>
     <w:p>
       <w:pPr>
         <w:jc w:val="both"/>
-        <w:rPr>
-          <w:sz w:val="24"/>
-          <w:szCs w:val="24"/>
-        </w:rPr>
-      </w:pPr>
+      </w:pPr>
+      <w:r>
+        <w:t xml:space="preserve">The team documented the major design decisions and revisions made throughout the practical. </w:t>
+      </w:r>
     </w:p>
     <w:p>
       <w:pPr>
         <w:jc w:val="both"/>
-        <w:rPr>
-          <w:sz w:val="24"/>
-          <w:szCs w:val="24"/>
-        </w:rPr>
-      </w:pPr>
-      <w:r>
-        <w:rPr>
-          <w:sz w:val="24"/>
-          <w:szCs w:val="24"/>
-        </w:rPr>
-        <w:t>Kristy Heesen developed the initial scope of TIVIDY and defined the selected University Student Complaint Management scenario. This included distinguishing workflow definitions from running workflow instances and establishing the responsibilities and boundaries of the generic workflow management system.</w:t>
-      </w:r>
+      </w:pPr>
     </w:p>
     <w:p>
       <w:pPr>
         <w:jc w:val="both"/>
         <w:rPr>
-          <w:sz w:val="24"/>
-          <w:szCs w:val="24"/>
-        </w:rPr>
-      </w:pPr>
+          <w:sz w:val="22"/>
+          <w:szCs w:val="22"/>
+        </w:rPr>
+      </w:pPr>
+      <w:r>
+        <w:rPr>
+          <w:b/>
+          <w:bCs/>
+          <w:sz w:val="22"/>
+          <w:szCs w:val="22"/>
+        </w:rPr>
+        <w:t>Task 8: GitHub and Documentation</w:t>
+      </w:r>
     </w:p>
     <w:p>
       <w:pPr>
         <w:jc w:val="both"/>
-        <w:rPr>
-          <w:sz w:val="24"/>
-          <w:szCs w:val="24"/>
-        </w:rPr>
-      </w:pPr>
-      <w:r>
-        <w:rPr>
-          <w:b/>
-          <w:bCs/>
-          <w:sz w:val="24"/>
-          <w:szCs w:val="24"/>
-        </w:rPr>
-        <w:t>Task 3</w:t>
-      </w:r>
-      <w:r>
-        <w:rPr>
-          <w:b/>
-          <w:bCs/>
-          <w:sz w:val="24"/>
-          <w:szCs w:val="24"/>
-        </w:rPr>
-        <w:t xml:space="preserve">: </w:t>
-      </w:r>
-      <w:r>
-        <w:rPr>
-          <w:b/>
-          <w:bCs/>
-          <w:sz w:val="24"/>
-          <w:szCs w:val="24"/>
-        </w:rPr>
-        <w:t>UML Activity Diagrams</w:t>
+      </w:pPr>
+      <w:r>
+        <w:rPr>
+          <w:b/>
+          <w:bCs/>
+        </w:rPr>
+        <w:t>Contributors:</w:t>
+      </w:r>
+      <w:r>
+        <w:t xml:space="preserve"> Entire Team</w:t>
       </w:r>
     </w:p>
     <w:p>
       <w:pPr>
         <w:jc w:val="both"/>
-        <w:rPr>
-          <w:sz w:val="24"/>
-          <w:szCs w:val="24"/>
-        </w:rPr>
-      </w:pPr>
-      <w:r>
-        <w:rPr>
-          <w:b/>
-          <w:bCs/>
-          <w:sz w:val="24"/>
-          <w:szCs w:val="24"/>
-        </w:rPr>
-        <w:t>Contributors:</w:t>
-      </w:r>
-      <w:r>
-        <w:rPr>
-          <w:sz w:val="24"/>
-          <w:szCs w:val="24"/>
-        </w:rPr>
-        <w:t xml:space="preserve"> Lindokuhle Skosana, Joshua Peter</w:t>
-      </w:r>
-    </w:p>
-    <w:p>
-      <w:pPr>
-        <w:jc w:val="both"/>
-        <w:rPr>
-          <w:sz w:val="24"/>
-          <w:szCs w:val="24"/>
-        </w:rPr>
-      </w:pPr>
-    </w:p>
-    <w:p>
-      <w:pPr>
-        <w:jc w:val="both"/>
-        <w:rPr>
-          <w:sz w:val="24"/>
-          <w:szCs w:val="24"/>
-        </w:rPr>
-      </w:pPr>
-      <w:r>
-        <w:rPr>
-          <w:sz w:val="24"/>
-          <w:szCs w:val="24"/>
-        </w:rPr>
-        <w:t>Lindokuhle Skosana and Joshua Peter worked on the UML Activity Diagrams for the generic TIVIDY workflows and the selected University Student Complaint Management scenario.</w:t>
-      </w:r>
-    </w:p>
-    <w:p>
-      <w:pPr>
-        <w:jc w:val="both"/>
-        <w:rPr>
-          <w:sz w:val="24"/>
-          <w:szCs w:val="24"/>
-        </w:rPr>
-      </w:pPr>
-    </w:p>
-    <w:p>
-      <w:pPr>
-        <w:jc w:val="both"/>
-        <w:rPr>
-          <w:sz w:val="24"/>
-          <w:szCs w:val="24"/>
-        </w:rPr>
-      </w:pPr>
-      <w:r>
-        <w:rPr>
-          <w:b/>
-          <w:bCs/>
-          <w:sz w:val="24"/>
-          <w:szCs w:val="24"/>
-        </w:rPr>
-        <w:t>Task 4</w:t>
-      </w:r>
-      <w:r>
-        <w:rPr>
-          <w:b/>
-          <w:bCs/>
-          <w:sz w:val="24"/>
-          <w:szCs w:val="24"/>
-        </w:rPr>
-        <w:t xml:space="preserve">: </w:t>
-      </w:r>
-      <w:r>
-        <w:rPr>
-          <w:b/>
-          <w:bCs/>
-          <w:sz w:val="24"/>
-          <w:szCs w:val="24"/>
-        </w:rPr>
-        <w:t>Design Patterns</w:t>
-      </w:r>
-    </w:p>
-    <w:p>
-      <w:pPr>
-        <w:jc w:val="both"/>
-        <w:rPr>
-          <w:sz w:val="24"/>
-          <w:szCs w:val="24"/>
-        </w:rPr>
-      </w:pPr>
-      <w:r>
-        <w:rPr>
-          <w:b/>
-          <w:bCs/>
-          <w:sz w:val="24"/>
-          <w:szCs w:val="24"/>
-        </w:rPr>
-        <w:t>Contributors:</w:t>
-      </w:r>
-      <w:r>
-        <w:rPr>
-          <w:sz w:val="24"/>
-          <w:szCs w:val="24"/>
-        </w:rPr>
-        <w:t xml:space="preserve"> Kristy Heesen, Musa Msibi, Lindokuhle Skosana</w:t>
-      </w:r>
-    </w:p>
-    <w:p>
-      <w:pPr>
-        <w:jc w:val="both"/>
-        <w:rPr>
-          <w:sz w:val="24"/>
-          <w:szCs w:val="24"/>
-        </w:rPr>
-      </w:pPr>
-    </w:p>
-    <w:p>
-      <w:pPr>
-        <w:jc w:val="both"/>
-        <w:rPr>
-          <w:sz w:val="24"/>
-          <w:szCs w:val="24"/>
-        </w:rPr>
-      </w:pPr>
-      <w:r>
-        <w:rPr>
-          <w:sz w:val="24"/>
-          <w:szCs w:val="24"/>
-        </w:rPr>
-        <w:t xml:space="preserve">Kristy Heesen, Musa Msibi and Lindokuhle Skosana worked on identifying and justifying the </w:t>
-      </w:r>
-      <w:proofErr w:type="spellStart"/>
-      <w:r>
-        <w:rPr>
-          <w:sz w:val="24"/>
-          <w:szCs w:val="24"/>
-        </w:rPr>
-        <w:t>GoF</w:t>
-      </w:r>
-      <w:proofErr w:type="spellEnd"/>
-      <w:r>
-        <w:rPr>
-          <w:sz w:val="24"/>
-          <w:szCs w:val="24"/>
-        </w:rPr>
-        <w:t xml:space="preserve"> design patterns used in TIVIDY. This included defining the design problems, pattern participants, collaborations, variation points and how the patterns work together within the workflow management system.</w:t>
-      </w:r>
-    </w:p>
-    <w:p>
-      <w:pPr>
-        <w:jc w:val="both"/>
-        <w:rPr>
-          <w:sz w:val="24"/>
-          <w:szCs w:val="24"/>
-        </w:rPr>
-      </w:pPr>
-    </w:p>
-    <w:p>
-      <w:pPr>
-        <w:jc w:val="both"/>
-        <w:rPr>
-          <w:sz w:val="24"/>
-          <w:szCs w:val="24"/>
-        </w:rPr>
-      </w:pPr>
-      <w:r>
-        <w:rPr>
-          <w:b/>
-          <w:bCs/>
-          <w:sz w:val="24"/>
-          <w:szCs w:val="24"/>
-        </w:rPr>
-        <w:t>Task 5</w:t>
-      </w:r>
-      <w:r>
-        <w:rPr>
-          <w:b/>
-          <w:bCs/>
-          <w:sz w:val="24"/>
-          <w:szCs w:val="24"/>
-        </w:rPr>
-        <w:t xml:space="preserve">: </w:t>
-      </w:r>
-      <w:r>
-        <w:rPr>
-          <w:b/>
-          <w:bCs/>
-          <w:sz w:val="24"/>
-          <w:szCs w:val="24"/>
-        </w:rPr>
-        <w:t>UML Class Diagram</w:t>
-      </w:r>
-    </w:p>
-    <w:p>
-      <w:pPr>
-        <w:jc w:val="both"/>
-        <w:rPr>
-          <w:sz w:val="24"/>
-          <w:szCs w:val="24"/>
-        </w:rPr>
-      </w:pPr>
-      <w:r>
-        <w:rPr>
-          <w:b/>
-          <w:bCs/>
-          <w:sz w:val="24"/>
-          <w:szCs w:val="24"/>
-        </w:rPr>
-        <w:t>Contributors:</w:t>
-      </w:r>
-      <w:r>
-        <w:rPr>
-          <w:sz w:val="24"/>
-          <w:szCs w:val="24"/>
-        </w:rPr>
-        <w:t xml:space="preserve"> </w:t>
-      </w:r>
-      <w:r>
-        <w:rPr>
-          <w:sz w:val="24"/>
-          <w:szCs w:val="24"/>
-        </w:rPr>
-        <w:t>Kristy Heesen</w:t>
-      </w:r>
-    </w:p>
-    <w:p>
-      <w:pPr>
-        <w:jc w:val="both"/>
-        <w:rPr>
-          <w:sz w:val="24"/>
-          <w:szCs w:val="24"/>
-        </w:rPr>
-      </w:pPr>
-    </w:p>
-    <w:p>
-      <w:pPr>
-        <w:jc w:val="both"/>
-        <w:rPr>
-          <w:sz w:val="24"/>
-          <w:szCs w:val="24"/>
-        </w:rPr>
-      </w:pPr>
-      <w:r>
-        <w:rPr>
-          <w:sz w:val="24"/>
-          <w:szCs w:val="24"/>
-        </w:rPr>
-        <w:t xml:space="preserve">Kristy Heesen </w:t>
-      </w:r>
-      <w:r>
-        <w:rPr>
-          <w:sz w:val="24"/>
-          <w:szCs w:val="24"/>
-        </w:rPr>
-        <w:t xml:space="preserve">worked on developing the complete UML Class Diagram for TIVIDY. This included the main classes, relationships, multiplicities, attributes, </w:t>
-      </w:r>
-      <w:r>
-        <w:rPr>
-          <w:sz w:val="24"/>
-          <w:szCs w:val="24"/>
-        </w:rPr>
-        <w:lastRenderedPageBreak/>
-        <w:t>operations, ownership relationships and the collaborations between the different design patterns and subsystems.</w:t>
-      </w:r>
-    </w:p>
-    <w:p>
-      <w:pPr>
-        <w:jc w:val="both"/>
-        <w:rPr>
-          <w:sz w:val="24"/>
-          <w:szCs w:val="24"/>
-        </w:rPr>
-      </w:pPr>
-    </w:p>
-    <w:p>
-      <w:pPr>
-        <w:jc w:val="both"/>
-        <w:rPr>
-          <w:sz w:val="24"/>
-          <w:szCs w:val="24"/>
-        </w:rPr>
-      </w:pPr>
-      <w:r>
-        <w:rPr>
-          <w:b/>
-          <w:bCs/>
-          <w:sz w:val="24"/>
-          <w:szCs w:val="24"/>
-        </w:rPr>
-        <w:t>Task 6</w:t>
-      </w:r>
-      <w:r>
-        <w:rPr>
-          <w:b/>
-          <w:bCs/>
-          <w:sz w:val="24"/>
-          <w:szCs w:val="24"/>
-        </w:rPr>
-        <w:t xml:space="preserve">: </w:t>
-      </w:r>
-      <w:r>
-        <w:rPr>
-          <w:b/>
-          <w:bCs/>
-          <w:sz w:val="24"/>
-          <w:szCs w:val="24"/>
-        </w:rPr>
-        <w:t>Runtime Behaviour Diagrams</w:t>
-      </w:r>
-    </w:p>
-    <w:p>
-      <w:pPr>
-        <w:jc w:val="both"/>
-        <w:rPr>
-          <w:sz w:val="24"/>
-          <w:szCs w:val="24"/>
-        </w:rPr>
-      </w:pPr>
-      <w:r>
-        <w:rPr>
-          <w:b/>
-          <w:bCs/>
-          <w:sz w:val="24"/>
-          <w:szCs w:val="24"/>
-        </w:rPr>
-        <w:t>Contributors:</w:t>
-      </w:r>
-      <w:r>
-        <w:rPr>
-          <w:sz w:val="24"/>
-          <w:szCs w:val="24"/>
-        </w:rPr>
-        <w:t xml:space="preserve"> LM Kabongo, Musa Msibi</w:t>
-      </w:r>
-    </w:p>
-    <w:p>
-      <w:pPr>
-        <w:jc w:val="both"/>
-        <w:rPr>
-          <w:sz w:val="24"/>
-          <w:szCs w:val="24"/>
-        </w:rPr>
-      </w:pPr>
-    </w:p>
-    <w:p>
-      <w:pPr>
-        <w:jc w:val="both"/>
-        <w:rPr>
-          <w:sz w:val="24"/>
-          <w:szCs w:val="24"/>
-        </w:rPr>
-      </w:pPr>
-      <w:r>
-        <w:rPr>
-          <w:sz w:val="24"/>
-          <w:szCs w:val="24"/>
-        </w:rPr>
-        <w:t xml:space="preserve">LM Kabongo and Musa Msibi worked on the UML runtime behaviour diagrams. LM Kabongo developed the sequence diagram showing the completion of a </w:t>
-      </w:r>
-      <w:proofErr w:type="spellStart"/>
-      <w:r>
-        <w:rPr>
-          <w:sz w:val="24"/>
-          <w:szCs w:val="24"/>
-        </w:rPr>
-        <w:t>WorkItem</w:t>
-      </w:r>
-      <w:proofErr w:type="spellEnd"/>
-      <w:r>
-        <w:rPr>
-          <w:sz w:val="24"/>
-          <w:szCs w:val="24"/>
-        </w:rPr>
-        <w:t xml:space="preserve"> and determining what happens next, as well as the </w:t>
-      </w:r>
-      <w:proofErr w:type="spellStart"/>
-      <w:r>
-        <w:rPr>
-          <w:sz w:val="24"/>
-          <w:szCs w:val="24"/>
-        </w:rPr>
-        <w:t>WorkflowInstance</w:t>
-      </w:r>
-      <w:proofErr w:type="spellEnd"/>
-      <w:r>
-        <w:rPr>
-          <w:sz w:val="24"/>
-          <w:szCs w:val="24"/>
-        </w:rPr>
-        <w:t xml:space="preserve"> State Diagram. Musa Msibi developed the sequence diagram showing the escalation process.</w:t>
-      </w:r>
-    </w:p>
-    <w:p>
-      <w:pPr>
-        <w:jc w:val="both"/>
-        <w:rPr>
-          <w:sz w:val="24"/>
-          <w:szCs w:val="24"/>
-        </w:rPr>
-      </w:pPr>
-    </w:p>
-    <w:p>
-      <w:pPr>
-        <w:jc w:val="both"/>
-        <w:rPr>
-          <w:sz w:val="24"/>
-          <w:szCs w:val="24"/>
-        </w:rPr>
-      </w:pPr>
-      <w:r>
-        <w:rPr>
-          <w:b/>
-          <w:bCs/>
-          <w:sz w:val="24"/>
-          <w:szCs w:val="24"/>
-        </w:rPr>
-        <w:t>Task 7</w:t>
-      </w:r>
-      <w:r>
-        <w:rPr>
-          <w:b/>
-          <w:bCs/>
-          <w:sz w:val="24"/>
-          <w:szCs w:val="24"/>
-        </w:rPr>
-        <w:t xml:space="preserve">: </w:t>
-      </w:r>
-      <w:r>
-        <w:rPr>
-          <w:b/>
-          <w:bCs/>
-          <w:sz w:val="24"/>
-          <w:szCs w:val="24"/>
-        </w:rPr>
-        <w:t>Design Decisions and Revisions</w:t>
-      </w:r>
-    </w:p>
-    <w:p>
-      <w:pPr>
-        <w:jc w:val="both"/>
-        <w:rPr>
-          <w:sz w:val="24"/>
-          <w:szCs w:val="24"/>
-        </w:rPr>
-      </w:pPr>
-      <w:r>
-        <w:rPr>
-          <w:b/>
-          <w:bCs/>
-          <w:sz w:val="24"/>
-          <w:szCs w:val="24"/>
-        </w:rPr>
-        <w:t>Contributors:</w:t>
-      </w:r>
-      <w:r>
-        <w:rPr>
-          <w:sz w:val="24"/>
-          <w:szCs w:val="24"/>
-        </w:rPr>
-        <w:t xml:space="preserve"> Entire Team</w:t>
-      </w:r>
-    </w:p>
-    <w:p>
-      <w:pPr>
-        <w:jc w:val="both"/>
-        <w:rPr>
-          <w:sz w:val="24"/>
-          <w:szCs w:val="24"/>
-        </w:rPr>
-      </w:pPr>
-    </w:p>
-    <w:p>
-      <w:pPr>
-        <w:jc w:val="both"/>
-        <w:rPr>
-          <w:sz w:val="24"/>
-          <w:szCs w:val="24"/>
-        </w:rPr>
-      </w:pPr>
-      <w:r>
-        <w:rPr>
-          <w:sz w:val="24"/>
-          <w:szCs w:val="24"/>
-        </w:rPr>
-        <w:t>The team documented the major design decisions and revisions made throughout the practical. These included changes to the State, Chain of Responsibility and Command patterns as the design was refined.</w:t>
-      </w:r>
-    </w:p>
-    <w:p>
-      <w:pPr>
-        <w:jc w:val="both"/>
-        <w:rPr>
-          <w:sz w:val="24"/>
-          <w:szCs w:val="24"/>
-        </w:rPr>
-      </w:pPr>
-    </w:p>
-    <w:p>
-      <w:pPr>
-        <w:jc w:val="both"/>
-        <w:rPr>
-          <w:sz w:val="24"/>
-          <w:szCs w:val="24"/>
-        </w:rPr>
-      </w:pPr>
-      <w:r>
-        <w:rPr>
-          <w:b/>
-          <w:bCs/>
-          <w:sz w:val="24"/>
-          <w:szCs w:val="24"/>
-        </w:rPr>
-        <w:t>Task 8</w:t>
-      </w:r>
-      <w:r>
-        <w:rPr>
-          <w:b/>
-          <w:bCs/>
-          <w:sz w:val="24"/>
-          <w:szCs w:val="24"/>
-        </w:rPr>
-        <w:t>:</w:t>
-      </w:r>
-      <w:r>
-        <w:rPr>
-          <w:b/>
-          <w:bCs/>
-          <w:sz w:val="24"/>
-          <w:szCs w:val="24"/>
-        </w:rPr>
-        <w:t xml:space="preserve"> GitHub and Documentation</w:t>
-      </w:r>
-    </w:p>
-    <w:p>
-      <w:pPr>
-        <w:jc w:val="both"/>
-        <w:rPr>
-          <w:sz w:val="24"/>
-          <w:szCs w:val="24"/>
-        </w:rPr>
-      </w:pPr>
-      <w:r>
-        <w:rPr>
-          <w:b/>
-          <w:bCs/>
-          <w:sz w:val="24"/>
-          <w:szCs w:val="24"/>
-        </w:rPr>
-        <w:t>Contributors:</w:t>
-      </w:r>
-      <w:r>
-        <w:rPr>
-          <w:sz w:val="24"/>
-          <w:szCs w:val="24"/>
-        </w:rPr>
-        <w:t xml:space="preserve"> Entire Team</w:t>
-      </w:r>
-    </w:p>
-    <w:p>
-      <w:pPr>
-        <w:jc w:val="both"/>
-        <w:rPr>
-          <w:sz w:val="24"/>
-          <w:szCs w:val="24"/>
-        </w:rPr>
-      </w:pPr>
-    </w:p>
-    <w:p>
-      <w:pPr>
-        <w:jc w:val="both"/>
-        <w:rPr>
-          <w:sz w:val="24"/>
-          <w:szCs w:val="24"/>
-        </w:rPr>
-      </w:pPr>
-      <w:r>
-        <w:rPr>
-          <w:sz w:val="24"/>
-          <w:szCs w:val="24"/>
-        </w:rPr>
+      </w:pPr>
+      <w:r>
         <w:t>The team contributed to the GitHub repository and project documentation, including the research, UML diagrams, design decisions, README and supporting project material.</w:t>
       </w:r>
     </w:p>
@@ -7248,7 +7335,7 @@
 </file>
 
 <file path=word/endnotes.xml><?xml version="1.0" encoding="utf-8"?>
-<w:endnotes xmlns:wpc="http://schemas.microsoft.com/office/word/2010/wordprocessingCanvas" xmlns:cx="http://schemas.microsoft.com/office/drawing/2014/chartex" xmlns:cx1="http://schemas.microsoft.com/office/drawing/2015/9/8/chartex" xmlns:cx2="http://schemas.microsoft.com/office/drawing/2015/10/21/chartex" xmlns:cx3="http://schemas.microsoft.com/office/drawing/2016/5/9/chartex" xmlns:cx4="http://schemas.microsoft.com/office/drawing/2016/5/10/chartex" xmlns:cx5="http://schemas.microsoft.com/office/drawing/2016/5/11/chartex" xmlns:cx6="http://schemas.microsoft.com/office/drawing/2016/5/12/chartex" xmlns:cx7="http://schemas.microsoft.com/office/drawing/2016/5/13/chartex" xmlns:cx8="http://schemas.microsoft.com/office/drawing/2016/5/14/chartex" xmlns:mc="http://schemas.openxmlformats.org/markup-compatibility/2006" xmlns:aink="http://schemas.microsoft.com/office/drawing/2016/ink" xmlns:am3d="http://schemas.microsoft.com/office/drawing/2017/model3d" xmlns:o="urn:schemas-microsoft-com:office:office" xmlns:oel="http://schemas.microsoft.com/office/2019/extlst" xmlns:r="http://schemas.openxmlformats.org/officeDocument/2006/relationships" xmlns:m="http://schemas.openxmlformats.org/officeDocument/2006/math" xmlns:v="urn:schemas-microsoft-com:vml" xmlns:wp14="http://schemas.microsoft.com/office/word/2010/wordprocessingDrawing" xmlns:wp="http://schemas.openxmlformats.org/drawingml/2006/wordprocessingDrawing" xmlns:w10="urn:schemas-microsoft-com:office:word" xmlns:w="http://schemas.openxmlformats.org/wordprocessingml/2006/main" xmlns:w14="http://schemas.microsoft.com/office/word/2010/wordml" xmlns:w15="http://schemas.microsoft.com/office/word/2012/wordml" xmlns:w16cex="http://schemas.microsoft.com/office/word/2018/wordml/cex" xmlns:w16cid="http://schemas.microsoft.com/office/word/2016/wordml/cid" xmlns:w16="http://schemas.microsoft.com/office/word/2018/wordml" xmlns:w16sdtdh="http://schemas.microsoft.com/office/word/2020/wordml/sdtdatahash" xmlns:w16se="http://schemas.microsoft.com/office/word/2015/wordml/symex" xmlns:wpg="http://schemas.microsoft.com/office/word/2010/wordprocessingGroup" xmlns:wpi="http://schemas.microsoft.com/office/word/2010/wordprocessingInk" xmlns:wne="http://schemas.microsoft.com/office/word/2006/wordml" xmlns:wps="http://schemas.microsoft.com/office/word/2010/wordprocessingShape" mc:Ignorable="w14 w15 w16se w16cid w16 w16cex w16sdtdh wp14">
+<w:endnotes xmlns:wpc="http://schemas.microsoft.com/office/word/2010/wordprocessingCanvas" xmlns:cx="http://schemas.microsoft.com/office/drawing/2014/chartex" xmlns:cx1="http://schemas.microsoft.com/office/drawing/2015/9/8/chartex" xmlns:cx2="http://schemas.microsoft.com/office/drawing/2015/10/21/chartex" xmlns:cx3="http://schemas.microsoft.com/office/drawing/2016/5/9/chartex" xmlns:cx4="http://schemas.microsoft.com/office/drawing/2016/5/10/chartex" xmlns:cx5="http://schemas.microsoft.com/office/drawing/2016/5/11/chartex" xmlns:cx6="http://schemas.microsoft.com/office/drawing/2016/5/12/chartex" xmlns:cx7="http://schemas.microsoft.com/office/drawing/2016/5/13/chartex" xmlns:cx8="http://schemas.microsoft.com/office/drawing/2016/5/14/chartex" xmlns:mc="http://schemas.openxmlformats.org/markup-compatibility/2006" xmlns:aink="http://schemas.microsoft.com/office/drawing/2016/ink" xmlns:am3d="http://schemas.microsoft.com/office/drawing/2017/model3d" xmlns:o="urn:schemas-microsoft-com:office:office" xmlns:oel="http://schemas.microsoft.com/office/2019/extlst" xmlns:r="http://schemas.openxmlformats.org/officeDocument/2006/relationships" xmlns:m="http://schemas.openxmlformats.org/officeDocument/2006/math" xmlns:v="urn:schemas-microsoft-com:vml" xmlns:wp14="http://schemas.microsoft.com/office/word/2010/wordprocessingDrawing" xmlns:wp="http://schemas.openxmlformats.org/drawingml/2006/wordprocessingDrawing" xmlns:w10="urn:schemas-microsoft-com:office:word" xmlns:w="http://schemas.openxmlformats.org/wordprocessingml/2006/main" xmlns:w14="http://schemas.microsoft.com/office/word/2010/wordml" xmlns:w15="http://schemas.microsoft.com/office/word/2012/wordml" xmlns:w16cex="http://schemas.microsoft.com/office/word/2018/wordml/cex" xmlns:w16cid="http://schemas.microsoft.com/office/word/2016/wordml/cid" xmlns:w16="http://schemas.microsoft.com/office/word/2018/wordml" xmlns:w16du="http://schemas.microsoft.com/office/word/2023/wordml/word16du" xmlns:w16sdtdh="http://schemas.microsoft.com/office/word/2020/wordml/sdtdatahash" xmlns:w16sdtfl="http://schemas.microsoft.com/office/word/2024/wordml/sdtformatlock" xmlns:w16se="http://schemas.microsoft.com/office/word/2015/wordml/symex" xmlns:wpg="http://schemas.microsoft.com/office/word/2010/wordprocessingGroup" xmlns:wpi="http://schemas.microsoft.com/office/word/2010/wordprocessingInk" xmlns:wne="http://schemas.microsoft.com/office/word/2006/wordml" xmlns:wps="http://schemas.microsoft.com/office/word/2010/wordprocessingShape" mc:Ignorable="w14 w15 w16se w16cid w16 w16cex w16sdtdh w16sdtfl w16du wp14">
   <w:endnote w:type="separator" w:id="-1">
     <w:p>
       <w:pPr>
@@ -7273,7 +7360,7 @@
 </file>
 
 <file path=word/footnotes.xml><?xml version="1.0" encoding="utf-8"?>
-<w:footnotes xmlns:wpc="http://schemas.microsoft.com/office/word/2010/wordprocessingCanvas" xmlns:cx="http://schemas.microsoft.com/office/drawing/2014/chartex" xmlns:cx1="http://schemas.microsoft.com/office/drawing/2015/9/8/chartex" xmlns:cx2="http://schemas.microsoft.com/office/drawing/2015/10/21/chartex" xmlns:cx3="http://schemas.microsoft.com/office/drawing/2016/5/9/chartex" xmlns:cx4="http://schemas.microsoft.com/office/drawing/2016/5/10/chartex" xmlns:cx5="http://schemas.microsoft.com/office/drawing/2016/5/11/chartex" xmlns:cx6="http://schemas.microsoft.com/office/drawing/2016/5/12/chartex" xmlns:cx7="http://schemas.microsoft.com/office/drawing/2016/5/13/chartex" xmlns:cx8="http://schemas.microsoft.com/office/drawing/2016/5/14/chartex" xmlns:mc="http://schemas.openxmlformats.org/markup-compatibility/2006" xmlns:aink="http://schemas.microsoft.com/office/drawing/2016/ink" xmlns:am3d="http://schemas.microsoft.com/office/drawing/2017/model3d" xmlns:o="urn:schemas-microsoft-com:office:office" xmlns:oel="http://schemas.microsoft.com/office/2019/extlst" xmlns:r="http://schemas.openxmlformats.org/officeDocument/2006/relationships" xmlns:m="http://schemas.openxmlformats.org/officeDocument/2006/math" xmlns:v="urn:schemas-microsoft-com:vml" xmlns:wp14="http://schemas.microsoft.com/office/word/2010/wordprocessingDrawing" xmlns:wp="http://schemas.openxmlformats.org/drawingml/2006/wordprocessingDrawing" xmlns:w10="urn:schemas-microsoft-com:office:word" xmlns:w="http://schemas.openxmlformats.org/wordprocessingml/2006/main" xmlns:w14="http://schemas.microsoft.com/office/word/2010/wordml" xmlns:w15="http://schemas.microsoft.com/office/word/2012/wordml" xmlns:w16cex="http://schemas.microsoft.com/office/word/2018/wordml/cex" xmlns:w16cid="http://schemas.microsoft.com/office/word/2016/wordml/cid" xmlns:w16="http://schemas.microsoft.com/office/word/2018/wordml" xmlns:w16sdtdh="http://schemas.microsoft.com/office/word/2020/wordml/sdtdatahash" xmlns:w16se="http://schemas.microsoft.com/office/word/2015/wordml/symex" xmlns:wpg="http://schemas.microsoft.com/office/word/2010/wordprocessingGroup" xmlns:wpi="http://schemas.microsoft.com/office/word/2010/wordprocessingInk" xmlns:wne="http://schemas.microsoft.com/office/word/2006/wordml" xmlns:wps="http://schemas.microsoft.com/office/word/2010/wordprocessingShape" mc:Ignorable="w14 w15 w16se w16cid w16 w16cex w16sdtdh wp14">
+<w:footnotes xmlns:wpc="http://schemas.microsoft.com/office/word/2010/wordprocessingCanvas" xmlns:cx="http://schemas.microsoft.com/office/drawing/2014/chartex" xmlns:cx1="http://schemas.microsoft.com/office/drawing/2015/9/8/chartex" xmlns:cx2="http://schemas.microsoft.com/office/drawing/2015/10/21/chartex" xmlns:cx3="http://schemas.microsoft.com/office/drawing/2016/5/9/chartex" xmlns:cx4="http://schemas.microsoft.com/office/drawing/2016/5/10/chartex" xmlns:cx5="http://schemas.microsoft.com/office/drawing/2016/5/11/chartex" xmlns:cx6="http://schemas.microsoft.com/office/drawing/2016/5/12/chartex" xmlns:cx7="http://schemas.microsoft.com/office/drawing/2016/5/13/chartex" xmlns:cx8="http://schemas.microsoft.com/office/drawing/2016/5/14/chartex" xmlns:mc="http://schemas.openxmlformats.org/markup-compatibility/2006" xmlns:aink="http://schemas.microsoft.com/office/drawing/2016/ink" xmlns:am3d="http://schemas.microsoft.com/office/drawing/2017/model3d" xmlns:o="urn:schemas-microsoft-com:office:office" xmlns:oel="http://schemas.microsoft.com/office/2019/extlst" xmlns:r="http://schemas.openxmlformats.org/officeDocument/2006/relationships" xmlns:m="http://schemas.openxmlformats.org/officeDocument/2006/math" xmlns:v="urn:schemas-microsoft-com:vml" xmlns:wp14="http://schemas.microsoft.com/office/word/2010/wordprocessingDrawing" xmlns:wp="http://schemas.openxmlformats.org/drawingml/2006/wordprocessingDrawing" xmlns:w10="urn:schemas-microsoft-com:office:word" xmlns:w="http://schemas.openxmlformats.org/wordprocessingml/2006/main" xmlns:w14="http://schemas.microsoft.com/office/word/2010/wordml" xmlns:w15="http://schemas.microsoft.com/office/word/2012/wordml" xmlns:w16cex="http://schemas.microsoft.com/office/word/2018/wordml/cex" xmlns:w16cid="http://schemas.microsoft.com/office/word/2016/wordml/cid" xmlns:w16="http://schemas.microsoft.com/office/word/2018/wordml" xmlns:w16du="http://schemas.microsoft.com/office/word/2023/wordml/word16du" xmlns:w16sdtdh="http://schemas.microsoft.com/office/word/2020/wordml/sdtdatahash" xmlns:w16sdtfl="http://schemas.microsoft.com/office/word/2024/wordml/sdtformatlock" xmlns:w16se="http://schemas.microsoft.com/office/word/2015/wordml/symex" xmlns:wpg="http://schemas.microsoft.com/office/word/2010/wordprocessingGroup" xmlns:wpi="http://schemas.microsoft.com/office/word/2010/wordprocessingInk" xmlns:wne="http://schemas.microsoft.com/office/word/2006/wordml" xmlns:wps="http://schemas.microsoft.com/office/word/2010/wordprocessingShape" mc:Ignorable="w14 w15 w16se w16cid w16 w16cex w16sdtdh w16sdtfl w16du wp14">
   <w:footnote w:type="separator" w:id="-1">
     <w:p>
       <w:pPr>
@@ -7298,7 +7385,7 @@
 </file>
 
 <file path=word/header1.xml><?xml version="1.0" encoding="utf-8"?>
-<w:hdr xmlns:wpc="http://schemas.microsoft.com/office/word/2010/wordprocessingCanvas" xmlns:cx="http://schemas.microsoft.com/office/drawing/2014/chartex" xmlns:cx1="http://schemas.microsoft.com/office/drawing/2015/9/8/chartex" xmlns:cx2="http://schemas.microsoft.com/office/drawing/2015/10/21/chartex" xmlns:cx3="http://schemas.microsoft.com/office/drawing/2016/5/9/chartex" xmlns:cx4="http://schemas.microsoft.com/office/drawing/2016/5/10/chartex" xmlns:cx5="http://schemas.microsoft.com/office/drawing/2016/5/11/chartex" xmlns:cx6="http://schemas.microsoft.com/office/drawing/2016/5/12/chartex" xmlns:cx7="http://schemas.microsoft.com/office/drawing/2016/5/13/chartex" xmlns:cx8="http://schemas.microsoft.com/office/drawing/2016/5/14/chartex" xmlns:mc="http://schemas.openxmlformats.org/markup-compatibility/2006" xmlns:aink="http://schemas.microsoft.com/office/drawing/2016/ink" xmlns:am3d="http://schemas.microsoft.com/office/drawing/2017/model3d" xmlns:o="urn:schemas-microsoft-com:office:office" xmlns:oel="http://schemas.microsoft.com/office/2019/extlst" xmlns:r="http://schemas.openxmlformats.org/officeDocument/2006/relationships" xmlns:m="http://schemas.openxmlformats.org/officeDocument/2006/math" xmlns:v="urn:schemas-microsoft-com:vml" xmlns:wp14="http://schemas.microsoft.com/office/word/2010/wordprocessingDrawing" xmlns:wp="http://schemas.openxmlformats.org/drawingml/2006/wordprocessingDrawing" xmlns:w10="urn:schemas-microsoft-com:office:word" xmlns:w="http://schemas.openxmlformats.org/wordprocessingml/2006/main" xmlns:w14="http://schemas.microsoft.com/office/word/2010/wordml" xmlns:w15="http://schemas.microsoft.com/office/word/2012/wordml" xmlns:w16cex="http://schemas.microsoft.com/office/word/2018/wordml/cex" xmlns:w16cid="http://schemas.microsoft.com/office/word/2016/wordml/cid" xmlns:w16="http://schemas.microsoft.com/office/word/2018/wordml" xmlns:w16sdtdh="http://schemas.microsoft.com/office/word/2020/wordml/sdtdatahash" xmlns:w16se="http://schemas.microsoft.com/office/word/2015/wordml/symex" xmlns:wpg="http://schemas.microsoft.com/office/word/2010/wordprocessingGroup" xmlns:wpi="http://schemas.microsoft.com/office/word/2010/wordprocessingInk" xmlns:wne="http://schemas.microsoft.com/office/word/2006/wordml" xmlns:wps="http://schemas.microsoft.com/office/word/2010/wordprocessingShape" mc:Ignorable="w14 w15 w16se w16cid w16 w16cex w16sdtdh wp14">
+<w:hdr xmlns:wpc="http://schemas.microsoft.com/office/word/2010/wordprocessingCanvas" xmlns:cx="http://schemas.microsoft.com/office/drawing/2014/chartex" xmlns:cx1="http://schemas.microsoft.com/office/drawing/2015/9/8/chartex" xmlns:cx2="http://schemas.microsoft.com/office/drawing/2015/10/21/chartex" xmlns:cx3="http://schemas.microsoft.com/office/drawing/2016/5/9/chartex" xmlns:cx4="http://schemas.microsoft.com/office/drawing/2016/5/10/chartex" xmlns:cx5="http://schemas.microsoft.com/office/drawing/2016/5/11/chartex" xmlns:cx6="http://schemas.microsoft.com/office/drawing/2016/5/12/chartex" xmlns:cx7="http://schemas.microsoft.com/office/drawing/2016/5/13/chartex" xmlns:cx8="http://schemas.microsoft.com/office/drawing/2016/5/14/chartex" xmlns:mc="http://schemas.openxmlformats.org/markup-compatibility/2006" xmlns:aink="http://schemas.microsoft.com/office/drawing/2016/ink" xmlns:am3d="http://schemas.microsoft.com/office/drawing/2017/model3d" xmlns:o="urn:schemas-microsoft-com:office:office" xmlns:oel="http://schemas.microsoft.com/office/2019/extlst" xmlns:r="http://schemas.openxmlformats.org/officeDocument/2006/relationships" xmlns:m="http://schemas.openxmlformats.org/officeDocument/2006/math" xmlns:v="urn:schemas-microsoft-com:vml" xmlns:wp14="http://schemas.microsoft.com/office/word/2010/wordprocessingDrawing" xmlns:wp="http://schemas.openxmlformats.org/drawingml/2006/wordprocessingDrawing" xmlns:w10="urn:schemas-microsoft-com:office:word" xmlns:w="http://schemas.openxmlformats.org/wordprocessingml/2006/main" xmlns:w14="http://schemas.microsoft.com/office/word/2010/wordml" xmlns:w15="http://schemas.microsoft.com/office/word/2012/wordml" xmlns:w16cex="http://schemas.microsoft.com/office/word/2018/wordml/cex" xmlns:w16cid="http://schemas.microsoft.com/office/word/2016/wordml/cid" xmlns:w16="http://schemas.microsoft.com/office/word/2018/wordml" xmlns:w16du="http://schemas.microsoft.com/office/word/2023/wordml/word16du" xmlns:w16sdtdh="http://schemas.microsoft.com/office/word/2020/wordml/sdtdatahash" xmlns:w16sdtfl="http://schemas.microsoft.com/office/word/2024/wordml/sdtformatlock" xmlns:w16se="http://schemas.microsoft.com/office/word/2015/wordml/symex" xmlns:wpg="http://schemas.microsoft.com/office/word/2010/wordprocessingGroup" xmlns:wpi="http://schemas.microsoft.com/office/word/2010/wordprocessingInk" xmlns:wne="http://schemas.microsoft.com/office/word/2006/wordml" xmlns:wps="http://schemas.microsoft.com/office/word/2010/wordprocessingShape" mc:Ignorable="w14 w15 w16se w16cid w16 w16cex w16sdtdh w16sdtfl w16du wp14">
   <w:p>
     <w:pPr>
       <w:pStyle w:val="Header"/>
@@ -7419,7 +7506,7 @@
             </wp:anchor>
           </w:drawing>
         </mc:Choice>
-        <mc:Fallback xmlns:w16sdtfl="http://schemas.microsoft.com/office/word/2024/wordml/sdtformatlock" xmlns:w16du="http://schemas.microsoft.com/office/word/2023/wordml/word16du">
+        <mc:Fallback>
           <w:pict>
             <v:rect w14:anchorId="10FAEFA2" id="Rectangle 200" o:spid="_x0000_s1026" style="position:absolute;margin-left:1.85pt;margin-top:36.9pt;width:449.4pt;height:22.9pt;z-index:-251658240;visibility:visible;mso-wrap-style:square;mso-width-percent:0;mso-height-percent:0;mso-wrap-distance-left:9.35pt;mso-wrap-distance-top:0;mso-wrap-distance-right:9.35pt;mso-wrap-distance-bottom:0;mso-position-horizontal:absolute;mso-position-horizontal-relative:margin;mso-position-vertical:absolute;mso-position-vertical-relative:page;mso-width-percent:0;mso-height-percent:0;mso-width-relative:margin;mso-height-relative:page;v-text-anchor:middle" o:gfxdata="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" o:allowoverlap="f" fillcolor="#0070c0" stroked="f" strokeweight="1pt">
               <v:textbox>
@@ -7476,7 +7563,7 @@
 </file>
 
 <file path=word/numbering.xml><?xml version="1.0" encoding="utf-8"?>
-<w:numbering xmlns:wpc="http://schemas.microsoft.com/office/word/2010/wordprocessingCanvas" xmlns:cx="http://schemas.microsoft.com/office/drawing/2014/chartex" xmlns:cx1="http://schemas.microsoft.com/office/drawing/2015/9/8/chartex" xmlns:cx2="http://schemas.microsoft.com/office/drawing/2015/10/21/chartex" xmlns:cx3="http://schemas.microsoft.com/office/drawing/2016/5/9/chartex" xmlns:cx4="http://schemas.microsoft.com/office/drawing/2016/5/10/chartex" xmlns:cx5="http://schemas.microsoft.com/office/drawing/2016/5/11/chartex" xmlns:cx6="http://schemas.microsoft.com/office/drawing/2016/5/12/chartex" xmlns:cx7="http://schemas.microsoft.com/office/drawing/2016/5/13/chartex" xmlns:cx8="http://schemas.microsoft.com/office/drawing/2016/5/14/chartex" xmlns:mc="http://schemas.openxmlformats.org/markup-compatibility/2006" xmlns:aink="http://schemas.microsoft.com/office/drawing/2016/ink" xmlns:am3d="http://schemas.microsoft.com/office/drawing/2017/model3d" xmlns:o="urn:schemas-microsoft-com:office:office" xmlns:oel="http://schemas.microsoft.com/office/2019/extlst" xmlns:r="http://schemas.openxmlformats.org/officeDocument/2006/relationships" xmlns:m="http://schemas.openxmlformats.org/officeDocument/2006/math" xmlns:v="urn:schemas-microsoft-com:vml" xmlns:wp14="http://schemas.microsoft.com/office/word/2010/wordprocessingDrawing" xmlns:wp="http://schemas.openxmlformats.org/drawingml/2006/wordprocessingDrawing" xmlns:w10="urn:schemas-microsoft-com:office:word" xmlns:w="http://schemas.openxmlformats.org/wordprocessingml/2006/main" xmlns:w14="http://schemas.microsoft.com/office/word/2010/wordml" xmlns:w15="http://schemas.microsoft.com/office/word/2012/wordml" xmlns:w16cex="http://schemas.microsoft.com/office/word/2018/wordml/cex" xmlns:w16cid="http://schemas.microsoft.com/office/word/2016/wordml/cid" xmlns:w16="http://schemas.microsoft.com/office/word/2018/wordml" xmlns:w16sdtdh="http://schemas.microsoft.com/office/word/2020/wordml/sdtdatahash" xmlns:w16se="http://schemas.microsoft.com/office/word/2015/wordml/symex" xmlns:wpg="http://schemas.microsoft.com/office/word/2010/wordprocessingGroup" xmlns:wpi="http://schemas.microsoft.com/office/word/2010/wordprocessingInk" xmlns:wne="http://schemas.microsoft.com/office/word/2006/wordml" xmlns:wps="http://schemas.microsoft.com/office/word/2010/wordprocessingShape" mc:Ignorable="w14 w15 w16se w16cid w16 w16cex w16sdtdh wp14">
+<w:numbering xmlns:wpc="http://schemas.microsoft.com/office/word/2010/wordprocessingCanvas" xmlns:cx="http://schemas.microsoft.com/office/drawing/2014/chartex" xmlns:cx1="http://schemas.microsoft.com/office/drawing/2015/9/8/chartex" xmlns:cx2="http://schemas.microsoft.com/office/drawing/2015/10/21/chartex" xmlns:cx3="http://schemas.microsoft.com/office/drawing/2016/5/9/chartex" xmlns:cx4="http://schemas.microsoft.com/office/drawing/2016/5/10/chartex" xmlns:cx5="http://schemas.microsoft.com/office/drawing/2016/5/11/chartex" xmlns:cx6="http://schemas.microsoft.com/office/drawing/2016/5/12/chartex" xmlns:cx7="http://schemas.microsoft.com/office/drawing/2016/5/13/chartex" xmlns:cx8="http://schemas.microsoft.com/office/drawing/2016/5/14/chartex" xmlns:mc="http://schemas.openxmlformats.org/markup-compatibility/2006" xmlns:aink="http://schemas.microsoft.com/office/drawing/2016/ink" xmlns:am3d="http://schemas.microsoft.com/office/drawing/2017/model3d" xmlns:o="urn:schemas-microsoft-com:office:office" xmlns:oel="http://schemas.microsoft.com/office/2019/extlst" xmlns:r="http://schemas.openxmlformats.org/officeDocument/2006/relationships" xmlns:m="http://schemas.openxmlformats.org/officeDocument/2006/math" xmlns:v="urn:schemas-microsoft-com:vml" xmlns:wp14="http://schemas.microsoft.com/office/word/2010/wordprocessingDrawing" xmlns:wp="http://schemas.openxmlformats.org/drawingml/2006/wordprocessingDrawing" xmlns:w10="urn:schemas-microsoft-com:office:word" xmlns:w="http://schemas.openxmlformats.org/wordprocessingml/2006/main" xmlns:w14="http://schemas.microsoft.com/office/word/2010/wordml" xmlns:w15="http://schemas.microsoft.com/office/word/2012/wordml" xmlns:w16cex="http://schemas.microsoft.com/office/word/2018/wordml/cex" xmlns:w16cid="http://schemas.microsoft.com/office/word/2016/wordml/cid" xmlns:w16="http://schemas.microsoft.com/office/word/2018/wordml" xmlns:w16du="http://schemas.microsoft.com/office/word/2023/wordml/word16du" xmlns:w16sdtdh="http://schemas.microsoft.com/office/word/2020/wordml/sdtdatahash" xmlns:w16sdtfl="http://schemas.microsoft.com/office/word/2024/wordml/sdtformatlock" xmlns:w16se="http://schemas.microsoft.com/office/word/2015/wordml/symex" xmlns:wpg="http://schemas.microsoft.com/office/word/2010/wordprocessingGroup" xmlns:wpi="http://schemas.microsoft.com/office/word/2010/wordprocessingInk" xmlns:wne="http://schemas.microsoft.com/office/word/2006/wordml" xmlns:wps="http://schemas.microsoft.com/office/word/2010/wordprocessingShape" mc:Ignorable="w14 w15 w16se w16cid w16 w16cex w16sdtdh w16sdtfl w16du wp14">
   <w:abstractNum w:abstractNumId="0" w15:restartNumberingAfterBreak="0">
     <w:nsid w:val="036205D6"/>
     <w:multiLevelType w:val="multilevel"/>
@@ -8490,6 +8577,155 @@
     </w:lvl>
   </w:abstractNum>
   <w:abstractNum w:abstractNumId="8" w15:restartNumberingAfterBreak="0">
+    <w:nsid w:val="110801E4"/>
+    <w:multiLevelType w:val="multilevel"/>
+    <w:tmpl w:val="6F06DC0C"/>
+    <w:lvl w:ilvl="0">
+      <w:start w:val="1"/>
+      <w:numFmt w:val="bullet"/>
+      <w:lvlText w:val=""/>
+      <w:lvlJc w:val="left"/>
+      <w:pPr>
+        <w:tabs>
+          <w:tab w:val="num" w:pos="720"/>
+        </w:tabs>
+        <w:ind w:left="720" w:hanging="360"/>
+      </w:pPr>
+      <w:rPr>
+        <w:rFonts w:ascii="Symbol" w:hAnsi="Symbol" w:hint="default"/>
+        <w:sz w:val="20"/>
+      </w:rPr>
+    </w:lvl>
+    <w:lvl w:ilvl="1" w:tentative="1">
+      <w:start w:val="1"/>
+      <w:numFmt w:val="bullet"/>
+      <w:lvlText w:val="o"/>
+      <w:lvlJc w:val="left"/>
+      <w:pPr>
+        <w:tabs>
+          <w:tab w:val="num" w:pos="1440"/>
+        </w:tabs>
+        <w:ind w:left="1440" w:hanging="360"/>
+      </w:pPr>
+      <w:rPr>
+        <w:rFonts w:ascii="Courier New" w:hAnsi="Courier New" w:hint="default"/>
+        <w:sz w:val="20"/>
+      </w:rPr>
+    </w:lvl>
+    <w:lvl w:ilvl="2" w:tentative="1">
+      <w:start w:val="1"/>
+      <w:numFmt w:val="bullet"/>
+      <w:lvlText w:val=""/>
+      <w:lvlJc w:val="left"/>
+      <w:pPr>
+        <w:tabs>
+          <w:tab w:val="num" w:pos="2160"/>
+        </w:tabs>
+        <w:ind w:left="2160" w:hanging="360"/>
+      </w:pPr>
+      <w:rPr>
+        <w:rFonts w:ascii="Wingdings" w:hAnsi="Wingdings" w:hint="default"/>
+        <w:sz w:val="20"/>
+      </w:rPr>
+    </w:lvl>
+    <w:lvl w:ilvl="3" w:tentative="1">
+      <w:start w:val="1"/>
+      <w:numFmt w:val="bullet"/>
+      <w:lvlText w:val=""/>
+      <w:lvlJc w:val="left"/>
+      <w:pPr>
+        <w:tabs>
+          <w:tab w:val="num" w:pos="2880"/>
+        </w:tabs>
+        <w:ind w:left="2880" w:hanging="360"/>
+      </w:pPr>
+      <w:rPr>
+        <w:rFonts w:ascii="Wingdings" w:hAnsi="Wingdings" w:hint="default"/>
+        <w:sz w:val="20"/>
+      </w:rPr>
+    </w:lvl>
+    <w:lvl w:ilvl="4" w:tentative="1">
+      <w:start w:val="1"/>
+      <w:numFmt w:val="bullet"/>
+      <w:lvlText w:val=""/>
+      <w:lvlJc w:val="left"/>
+      <w:pPr>
+        <w:tabs>
+          <w:tab w:val="num" w:pos="3600"/>
+        </w:tabs>
+        <w:ind w:left="3600" w:hanging="360"/>
+      </w:pPr>
+      <w:rPr>
+        <w:rFonts w:ascii="Wingdings" w:hAnsi="Wingdings" w:hint="default"/>
+        <w:sz w:val="20"/>
+      </w:rPr>
+    </w:lvl>
+    <w:lvl w:ilvl="5" w:tentative="1">
+      <w:start w:val="1"/>
+      <w:numFmt w:val="bullet"/>
+      <w:lvlText w:val=""/>
+      <w:lvlJc w:val="left"/>
+      <w:pPr>
+        <w:tabs>
+          <w:tab w:val="num" w:pos="4320"/>
+        </w:tabs>
+        <w:ind w:left="4320" w:hanging="360"/>
+      </w:pPr>
+      <w:rPr>
+        <w:rFonts w:ascii="Wingdings" w:hAnsi="Wingdings" w:hint="default"/>
+        <w:sz w:val="20"/>
+      </w:rPr>
+    </w:lvl>
+    <w:lvl w:ilvl="6" w:tentative="1">
+      <w:start w:val="1"/>
+      <w:numFmt w:val="bullet"/>
+      <w:lvlText w:val=""/>
+      <w:lvlJc w:val="left"/>
+      <w:pPr>
+        <w:tabs>
+          <w:tab w:val="num" w:pos="5040"/>
+        </w:tabs>
+        <w:ind w:left="5040" w:hanging="360"/>
+      </w:pPr>
+      <w:rPr>
+        <w:rFonts w:ascii="Wingdings" w:hAnsi="Wingdings" w:hint="default"/>
+        <w:sz w:val="20"/>
+      </w:rPr>
+    </w:lvl>
+    <w:lvl w:ilvl="7" w:tentative="1">
+      <w:start w:val="1"/>
+      <w:numFmt w:val="bullet"/>
+      <w:lvlText w:val=""/>
+      <w:lvlJc w:val="left"/>
+      <w:pPr>
+        <w:tabs>
+          <w:tab w:val="num" w:pos="5760"/>
+        </w:tabs>
+        <w:ind w:left="5760" w:hanging="360"/>
+      </w:pPr>
+      <w:rPr>
+        <w:rFonts w:ascii="Wingdings" w:hAnsi="Wingdings" w:hint="default"/>
+        <w:sz w:val="20"/>
+      </w:rPr>
+    </w:lvl>
+    <w:lvl w:ilvl="8" w:tentative="1">
+      <w:start w:val="1"/>
+      <w:numFmt w:val="bullet"/>
+      <w:lvlText w:val=""/>
+      <w:lvlJc w:val="left"/>
+      <w:pPr>
+        <w:tabs>
+          <w:tab w:val="num" w:pos="6480"/>
+        </w:tabs>
+        <w:ind w:left="6480" w:hanging="360"/>
+      </w:pPr>
+      <w:rPr>
+        <w:rFonts w:ascii="Wingdings" w:hAnsi="Wingdings" w:hint="default"/>
+        <w:sz w:val="20"/>
+      </w:rPr>
+    </w:lvl>
+  </w:abstractNum>
+  <w:abstractNum w:abstractNumId="9" w15:restartNumberingAfterBreak="0">
     <w:nsid w:val="11A50E00"/>
     <w:multiLevelType w:val="hybridMultilevel"/>
     <w:tmpl w:val="72CED758"/>
@@ -8602,7 +8838,7 @@
       </w:rPr>
     </w:lvl>
   </w:abstractNum>
-  <w:abstractNum w:abstractNumId="9" w15:restartNumberingAfterBreak="0">
+  <w:abstractNum w:abstractNumId="10" w15:restartNumberingAfterBreak="0">
     <w:nsid w:val="11B75B30"/>
     <w:multiLevelType w:val="hybridMultilevel"/>
     <w:tmpl w:val="FCBA38BA"/>
@@ -8715,7 +8951,7 @@
       </w:rPr>
     </w:lvl>
   </w:abstractNum>
-  <w:abstractNum w:abstractNumId="10" w15:restartNumberingAfterBreak="0">
+  <w:abstractNum w:abstractNumId="11" w15:restartNumberingAfterBreak="0">
     <w:nsid w:val="12626686"/>
     <w:multiLevelType w:val="multilevel"/>
     <w:tmpl w:val="BC5801A4"/>
@@ -8864,7 +9100,7 @@
       </w:rPr>
     </w:lvl>
   </w:abstractNum>
-  <w:abstractNum w:abstractNumId="11" w15:restartNumberingAfterBreak="0">
+  <w:abstractNum w:abstractNumId="12" w15:restartNumberingAfterBreak="0">
     <w:nsid w:val="14A7080C"/>
     <w:multiLevelType w:val="multilevel"/>
     <w:tmpl w:val="BD6A2B4E"/>
@@ -8981,7 +9217,156 @@
       </w:pPr>
     </w:lvl>
   </w:abstractNum>
-  <w:abstractNum w:abstractNumId="12" w15:restartNumberingAfterBreak="0">
+  <w:abstractNum w:abstractNumId="13" w15:restartNumberingAfterBreak="0">
+    <w:nsid w:val="16A55C74"/>
+    <w:multiLevelType w:val="multilevel"/>
+    <w:tmpl w:val="190057A6"/>
+    <w:lvl w:ilvl="0">
+      <w:start w:val="1"/>
+      <w:numFmt w:val="bullet"/>
+      <w:lvlText w:val=""/>
+      <w:lvlJc w:val="left"/>
+      <w:pPr>
+        <w:tabs>
+          <w:tab w:val="num" w:pos="720"/>
+        </w:tabs>
+        <w:ind w:left="720" w:hanging="360"/>
+      </w:pPr>
+      <w:rPr>
+        <w:rFonts w:ascii="Symbol" w:hAnsi="Symbol" w:hint="default"/>
+        <w:sz w:val="20"/>
+      </w:rPr>
+    </w:lvl>
+    <w:lvl w:ilvl="1" w:tentative="1">
+      <w:start w:val="1"/>
+      <w:numFmt w:val="bullet"/>
+      <w:lvlText w:val="o"/>
+      <w:lvlJc w:val="left"/>
+      <w:pPr>
+        <w:tabs>
+          <w:tab w:val="num" w:pos="1440"/>
+        </w:tabs>
+        <w:ind w:left="1440" w:hanging="360"/>
+      </w:pPr>
+      <w:rPr>
+        <w:rFonts w:ascii="Courier New" w:hAnsi="Courier New" w:hint="default"/>
+        <w:sz w:val="20"/>
+      </w:rPr>
+    </w:lvl>
+    <w:lvl w:ilvl="2" w:tentative="1">
+      <w:start w:val="1"/>
+      <w:numFmt w:val="bullet"/>
+      <w:lvlText w:val=""/>
+      <w:lvlJc w:val="left"/>
+      <w:pPr>
+        <w:tabs>
+          <w:tab w:val="num" w:pos="2160"/>
+        </w:tabs>
+        <w:ind w:left="2160" w:hanging="360"/>
+      </w:pPr>
+      <w:rPr>
+        <w:rFonts w:ascii="Wingdings" w:hAnsi="Wingdings" w:hint="default"/>
+        <w:sz w:val="20"/>
+      </w:rPr>
+    </w:lvl>
+    <w:lvl w:ilvl="3" w:tentative="1">
+      <w:start w:val="1"/>
+      <w:numFmt w:val="bullet"/>
+      <w:lvlText w:val=""/>
+      <w:lvlJc w:val="left"/>
+      <w:pPr>
+        <w:tabs>
+          <w:tab w:val="num" w:pos="2880"/>
+        </w:tabs>
+        <w:ind w:left="2880" w:hanging="360"/>
+      </w:pPr>
+      <w:rPr>
+        <w:rFonts w:ascii="Wingdings" w:hAnsi="Wingdings" w:hint="default"/>
+        <w:sz w:val="20"/>
+      </w:rPr>
+    </w:lvl>
+    <w:lvl w:ilvl="4" w:tentative="1">
+      <w:start w:val="1"/>
+      <w:numFmt w:val="bullet"/>
+      <w:lvlText w:val=""/>
+      <w:lvlJc w:val="left"/>
+      <w:pPr>
+        <w:tabs>
+          <w:tab w:val="num" w:pos="3600"/>
+        </w:tabs>
+        <w:ind w:left="3600" w:hanging="360"/>
+      </w:pPr>
+      <w:rPr>
+        <w:rFonts w:ascii="Wingdings" w:hAnsi="Wingdings" w:hint="default"/>
+        <w:sz w:val="20"/>
+      </w:rPr>
+    </w:lvl>
+    <w:lvl w:ilvl="5" w:tentative="1">
+      <w:start w:val="1"/>
+      <w:numFmt w:val="bullet"/>
+      <w:lvlText w:val=""/>
+      <w:lvlJc w:val="left"/>
+      <w:pPr>
+        <w:tabs>
+          <w:tab w:val="num" w:pos="4320"/>
+        </w:tabs>
+        <w:ind w:left="4320" w:hanging="360"/>
+      </w:pPr>
+      <w:rPr>
+        <w:rFonts w:ascii="Wingdings" w:hAnsi="Wingdings" w:hint="default"/>
+        <w:sz w:val="20"/>
+      </w:rPr>
+    </w:lvl>
+    <w:lvl w:ilvl="6" w:tentative="1">
+      <w:start w:val="1"/>
+      <w:numFmt w:val="bullet"/>
+      <w:lvlText w:val=""/>
+      <w:lvlJc w:val="left"/>
+      <w:pPr>
+        <w:tabs>
+          <w:tab w:val="num" w:pos="5040"/>
+        </w:tabs>
+        <w:ind w:left="5040" w:hanging="360"/>
+      </w:pPr>
+      <w:rPr>
+        <w:rFonts w:ascii="Wingdings" w:hAnsi="Wingdings" w:hint="default"/>
+        <w:sz w:val="20"/>
+      </w:rPr>
+    </w:lvl>
+    <w:lvl w:ilvl="7" w:tentative="1">
+      <w:start w:val="1"/>
+      <w:numFmt w:val="bullet"/>
+      <w:lvlText w:val=""/>
+      <w:lvlJc w:val="left"/>
+      <w:pPr>
+        <w:tabs>
+          <w:tab w:val="num" w:pos="5760"/>
+        </w:tabs>
+        <w:ind w:left="5760" w:hanging="360"/>
+      </w:pPr>
+      <w:rPr>
+        <w:rFonts w:ascii="Wingdings" w:hAnsi="Wingdings" w:hint="default"/>
+        <w:sz w:val="20"/>
+      </w:rPr>
+    </w:lvl>
+    <w:lvl w:ilvl="8" w:tentative="1">
+      <w:start w:val="1"/>
+      <w:numFmt w:val="bullet"/>
+      <w:lvlText w:val=""/>
+      <w:lvlJc w:val="left"/>
+      <w:pPr>
+        <w:tabs>
+          <w:tab w:val="num" w:pos="6480"/>
+        </w:tabs>
+        <w:ind w:left="6480" w:hanging="360"/>
+      </w:pPr>
+      <w:rPr>
+        <w:rFonts w:ascii="Wingdings" w:hAnsi="Wingdings" w:hint="default"/>
+        <w:sz w:val="20"/>
+      </w:rPr>
+    </w:lvl>
+  </w:abstractNum>
+  <w:abstractNum w:abstractNumId="14" w15:restartNumberingAfterBreak="0">
     <w:nsid w:val="185108A6"/>
     <w:multiLevelType w:val="hybridMultilevel"/>
     <w:tmpl w:val="04489F4E"/>
@@ -9094,7 +9479,7 @@
       </w:rPr>
     </w:lvl>
   </w:abstractNum>
-  <w:abstractNum w:abstractNumId="13" w15:restartNumberingAfterBreak="0">
+  <w:abstractNum w:abstractNumId="15" w15:restartNumberingAfterBreak="0">
     <w:nsid w:val="18A22DDD"/>
     <w:multiLevelType w:val="hybridMultilevel"/>
     <w:tmpl w:val="4A80A0CC"/>
@@ -9207,7 +9592,7 @@
       </w:rPr>
     </w:lvl>
   </w:abstractNum>
-  <w:abstractNum w:abstractNumId="14" w15:restartNumberingAfterBreak="0">
+  <w:abstractNum w:abstractNumId="16" w15:restartNumberingAfterBreak="0">
     <w:nsid w:val="1F1E02A1"/>
     <w:multiLevelType w:val="hybridMultilevel"/>
     <w:tmpl w:val="01149F2E"/>
@@ -9320,7 +9705,7 @@
       </w:rPr>
     </w:lvl>
   </w:abstractNum>
-  <w:abstractNum w:abstractNumId="15" w15:restartNumberingAfterBreak="0">
+  <w:abstractNum w:abstractNumId="17" w15:restartNumberingAfterBreak="0">
     <w:nsid w:val="227A6934"/>
     <w:multiLevelType w:val="hybridMultilevel"/>
     <w:tmpl w:val="A09E57C4"/>
@@ -9433,7 +9818,7 @@
       </w:rPr>
     </w:lvl>
   </w:abstractNum>
-  <w:abstractNum w:abstractNumId="16" w15:restartNumberingAfterBreak="0">
+  <w:abstractNum w:abstractNumId="18" w15:restartNumberingAfterBreak="0">
     <w:nsid w:val="2B9D6675"/>
     <w:multiLevelType w:val="multilevel"/>
     <w:tmpl w:val="BE7A07A0"/>
@@ -9550,7 +9935,7 @@
       </w:pPr>
     </w:lvl>
   </w:abstractNum>
-  <w:abstractNum w:abstractNumId="17" w15:restartNumberingAfterBreak="0">
+  <w:abstractNum w:abstractNumId="19" w15:restartNumberingAfterBreak="0">
     <w:nsid w:val="2BA17EB4"/>
     <w:multiLevelType w:val="hybridMultilevel"/>
     <w:tmpl w:val="3564A9B0"/>
@@ -9662,7 +10047,7 @@
       </w:rPr>
     </w:lvl>
   </w:abstractNum>
-  <w:abstractNum w:abstractNumId="18" w15:restartNumberingAfterBreak="0">
+  <w:abstractNum w:abstractNumId="20" w15:restartNumberingAfterBreak="0">
     <w:nsid w:val="341E27DD"/>
     <w:multiLevelType w:val="multilevel"/>
     <w:tmpl w:val="0D7A4B64"/>
@@ -9775,7 +10160,7 @@
       </w:pPr>
     </w:lvl>
   </w:abstractNum>
-  <w:abstractNum w:abstractNumId="19" w15:restartNumberingAfterBreak="0">
+  <w:abstractNum w:abstractNumId="21" w15:restartNumberingAfterBreak="0">
     <w:nsid w:val="392E573D"/>
     <w:multiLevelType w:val="hybridMultilevel"/>
     <w:tmpl w:val="016CF1F8"/>
@@ -9888,7 +10273,7 @@
       </w:rPr>
     </w:lvl>
   </w:abstractNum>
-  <w:abstractNum w:abstractNumId="20" w15:restartNumberingAfterBreak="0">
+  <w:abstractNum w:abstractNumId="22" w15:restartNumberingAfterBreak="0">
     <w:nsid w:val="3A161027"/>
     <w:multiLevelType w:val="hybridMultilevel"/>
     <w:tmpl w:val="D6203914"/>
@@ -10001,7 +10386,156 @@
       </w:rPr>
     </w:lvl>
   </w:abstractNum>
-  <w:abstractNum w:abstractNumId="21" w15:restartNumberingAfterBreak="0">
+  <w:abstractNum w:abstractNumId="23" w15:restartNumberingAfterBreak="0">
+    <w:nsid w:val="3A877CE9"/>
+    <w:multiLevelType w:val="multilevel"/>
+    <w:tmpl w:val="84A884D6"/>
+    <w:lvl w:ilvl="0">
+      <w:start w:val="1"/>
+      <w:numFmt w:val="bullet"/>
+      <w:lvlText w:val=""/>
+      <w:lvlJc w:val="left"/>
+      <w:pPr>
+        <w:tabs>
+          <w:tab w:val="num" w:pos="720"/>
+        </w:tabs>
+        <w:ind w:left="720" w:hanging="360"/>
+      </w:pPr>
+      <w:rPr>
+        <w:rFonts w:ascii="Symbol" w:hAnsi="Symbol" w:hint="default"/>
+        <w:sz w:val="20"/>
+      </w:rPr>
+    </w:lvl>
+    <w:lvl w:ilvl="1" w:tentative="1">
+      <w:start w:val="1"/>
+      <w:numFmt w:val="bullet"/>
+      <w:lvlText w:val="o"/>
+      <w:lvlJc w:val="left"/>
+      <w:pPr>
+        <w:tabs>
+          <w:tab w:val="num" w:pos="1440"/>
+        </w:tabs>
+        <w:ind w:left="1440" w:hanging="360"/>
+      </w:pPr>
+      <w:rPr>
+        <w:rFonts w:ascii="Courier New" w:hAnsi="Courier New" w:hint="default"/>
+        <w:sz w:val="20"/>
+      </w:rPr>
+    </w:lvl>
+    <w:lvl w:ilvl="2" w:tentative="1">
+      <w:start w:val="1"/>
+      <w:numFmt w:val="bullet"/>
+      <w:lvlText w:val=""/>
+      <w:lvlJc w:val="left"/>
+      <w:pPr>
+        <w:tabs>
+          <w:tab w:val="num" w:pos="2160"/>
+        </w:tabs>
+        <w:ind w:left="2160" w:hanging="360"/>
+      </w:pPr>
+      <w:rPr>
+        <w:rFonts w:ascii="Wingdings" w:hAnsi="Wingdings" w:hint="default"/>
+        <w:sz w:val="20"/>
+      </w:rPr>
+    </w:lvl>
+    <w:lvl w:ilvl="3" w:tentative="1">
+      <w:start w:val="1"/>
+      <w:numFmt w:val="bullet"/>
+      <w:lvlText w:val=""/>
+      <w:lvlJc w:val="left"/>
+      <w:pPr>
+        <w:tabs>
+          <w:tab w:val="num" w:pos="2880"/>
+        </w:tabs>
+        <w:ind w:left="2880" w:hanging="360"/>
+      </w:pPr>
+      <w:rPr>
+        <w:rFonts w:ascii="Wingdings" w:hAnsi="Wingdings" w:hint="default"/>
+        <w:sz w:val="20"/>
+      </w:rPr>
+    </w:lvl>
+    <w:lvl w:ilvl="4" w:tentative="1">
+      <w:start w:val="1"/>
+      <w:numFmt w:val="bullet"/>
+      <w:lvlText w:val=""/>
+      <w:lvlJc w:val="left"/>
+      <w:pPr>
+        <w:tabs>
+          <w:tab w:val="num" w:pos="3600"/>
+        </w:tabs>
+        <w:ind w:left="3600" w:hanging="360"/>
+      </w:pPr>
+      <w:rPr>
+        <w:rFonts w:ascii="Wingdings" w:hAnsi="Wingdings" w:hint="default"/>
+        <w:sz w:val="20"/>
+      </w:rPr>
+    </w:lvl>
+    <w:lvl w:ilvl="5" w:tentative="1">
+      <w:start w:val="1"/>
+      <w:numFmt w:val="bullet"/>
+      <w:lvlText w:val=""/>
+      <w:lvlJc w:val="left"/>
+      <w:pPr>
+        <w:tabs>
+          <w:tab w:val="num" w:pos="4320"/>
+        </w:tabs>
+        <w:ind w:left="4320" w:hanging="360"/>
+      </w:pPr>
+      <w:rPr>
+        <w:rFonts w:ascii="Wingdings" w:hAnsi="Wingdings" w:hint="default"/>
+        <w:sz w:val="20"/>
+      </w:rPr>
+    </w:lvl>
+    <w:lvl w:ilvl="6" w:tentative="1">
+      <w:start w:val="1"/>
+      <w:numFmt w:val="bullet"/>
+      <w:lvlText w:val=""/>
+      <w:lvlJc w:val="left"/>
+      <w:pPr>
+        <w:tabs>
+          <w:tab w:val="num" w:pos="5040"/>
+        </w:tabs>
+        <w:ind w:left="5040" w:hanging="360"/>
+      </w:pPr>
+      <w:rPr>
+        <w:rFonts w:ascii="Wingdings" w:hAnsi="Wingdings" w:hint="default"/>
+        <w:sz w:val="20"/>
+      </w:rPr>
+    </w:lvl>
+    <w:lvl w:ilvl="7" w:tentative="1">
+      <w:start w:val="1"/>
+      <w:numFmt w:val="bullet"/>
+      <w:lvlText w:val=""/>
+      <w:lvlJc w:val="left"/>
+      <w:pPr>
+        <w:tabs>
+          <w:tab w:val="num" w:pos="5760"/>
+        </w:tabs>
+        <w:ind w:left="5760" w:hanging="360"/>
+      </w:pPr>
+      <w:rPr>
+        <w:rFonts w:ascii="Wingdings" w:hAnsi="Wingdings" w:hint="default"/>
+        <w:sz w:val="20"/>
+      </w:rPr>
+    </w:lvl>
+    <w:lvl w:ilvl="8" w:tentative="1">
+      <w:start w:val="1"/>
+      <w:numFmt w:val="bullet"/>
+      <w:lvlText w:val=""/>
+      <w:lvlJc w:val="left"/>
+      <w:pPr>
+        <w:tabs>
+          <w:tab w:val="num" w:pos="6480"/>
+        </w:tabs>
+        <w:ind w:left="6480" w:hanging="360"/>
+      </w:pPr>
+      <w:rPr>
+        <w:rFonts w:ascii="Wingdings" w:hAnsi="Wingdings" w:hint="default"/>
+        <w:sz w:val="20"/>
+      </w:rPr>
+    </w:lvl>
+  </w:abstractNum>
+  <w:abstractNum w:abstractNumId="24" w15:restartNumberingAfterBreak="0">
     <w:nsid w:val="3D3F4B8F"/>
     <w:multiLevelType w:val="multilevel"/>
     <w:tmpl w:val="CCC8B4BE"/>
@@ -10150,7 +10684,7 @@
       </w:rPr>
     </w:lvl>
   </w:abstractNum>
-  <w:abstractNum w:abstractNumId="22" w15:restartNumberingAfterBreak="0">
+  <w:abstractNum w:abstractNumId="25" w15:restartNumberingAfterBreak="0">
     <w:nsid w:val="3E3650FE"/>
     <w:multiLevelType w:val="hybridMultilevel"/>
     <w:tmpl w:val="39E8F52A"/>
@@ -10262,7 +10796,7 @@
       </w:rPr>
     </w:lvl>
   </w:abstractNum>
-  <w:abstractNum w:abstractNumId="23" w15:restartNumberingAfterBreak="0">
+  <w:abstractNum w:abstractNumId="26" w15:restartNumberingAfterBreak="0">
     <w:nsid w:val="3F8B6A82"/>
     <w:multiLevelType w:val="hybridMultilevel"/>
     <w:tmpl w:val="7D04863A"/>
@@ -10375,7 +10909,7 @@
       </w:rPr>
     </w:lvl>
   </w:abstractNum>
-  <w:abstractNum w:abstractNumId="24" w15:restartNumberingAfterBreak="0">
+  <w:abstractNum w:abstractNumId="27" w15:restartNumberingAfterBreak="0">
     <w:nsid w:val="3FAD093B"/>
     <w:multiLevelType w:val="multilevel"/>
     <w:tmpl w:val="ADC6FBF4"/>
@@ -10524,7 +11058,7 @@
       </w:rPr>
     </w:lvl>
   </w:abstractNum>
-  <w:abstractNum w:abstractNumId="25" w15:restartNumberingAfterBreak="0">
+  <w:abstractNum w:abstractNumId="28" w15:restartNumberingAfterBreak="0">
     <w:nsid w:val="513A678C"/>
     <w:multiLevelType w:val="hybridMultilevel"/>
     <w:tmpl w:val="7B96AFB4"/>
@@ -10637,7 +11171,7 @@
       </w:rPr>
     </w:lvl>
   </w:abstractNum>
-  <w:abstractNum w:abstractNumId="26" w15:restartNumberingAfterBreak="0">
+  <w:abstractNum w:abstractNumId="29" w15:restartNumberingAfterBreak="0">
     <w:nsid w:val="58724401"/>
     <w:multiLevelType w:val="hybridMultilevel"/>
     <w:tmpl w:val="2E4452CC"/>
@@ -10750,7 +11284,7 @@
       </w:rPr>
     </w:lvl>
   </w:abstractNum>
-  <w:abstractNum w:abstractNumId="27" w15:restartNumberingAfterBreak="0">
+  <w:abstractNum w:abstractNumId="30" w15:restartNumberingAfterBreak="0">
     <w:nsid w:val="5A234C41"/>
     <w:multiLevelType w:val="hybridMultilevel"/>
     <w:tmpl w:val="38685400"/>
@@ -10863,7 +11397,7 @@
       </w:rPr>
     </w:lvl>
   </w:abstractNum>
-  <w:abstractNum w:abstractNumId="28" w15:restartNumberingAfterBreak="0">
+  <w:abstractNum w:abstractNumId="31" w15:restartNumberingAfterBreak="0">
     <w:nsid w:val="5FE807A8"/>
     <w:multiLevelType w:val="hybridMultilevel"/>
     <w:tmpl w:val="E4182F8C"/>
@@ -10949,7 +11483,7 @@
       </w:pPr>
     </w:lvl>
   </w:abstractNum>
-  <w:abstractNum w:abstractNumId="29" w15:restartNumberingAfterBreak="0">
+  <w:abstractNum w:abstractNumId="32" w15:restartNumberingAfterBreak="0">
     <w:nsid w:val="6D187D40"/>
     <w:multiLevelType w:val="hybridMultilevel"/>
     <w:tmpl w:val="88A0D6BA"/>
@@ -11062,7 +11596,7 @@
       </w:rPr>
     </w:lvl>
   </w:abstractNum>
-  <w:abstractNum w:abstractNumId="30" w15:restartNumberingAfterBreak="0">
+  <w:abstractNum w:abstractNumId="33" w15:restartNumberingAfterBreak="0">
     <w:nsid w:val="6F4B66BE"/>
     <w:multiLevelType w:val="hybridMultilevel"/>
     <w:tmpl w:val="81BC6822"/>
@@ -11175,7 +11709,7 @@
       </w:rPr>
     </w:lvl>
   </w:abstractNum>
-  <w:abstractNum w:abstractNumId="31" w15:restartNumberingAfterBreak="0">
+  <w:abstractNum w:abstractNumId="34" w15:restartNumberingAfterBreak="0">
     <w:nsid w:val="74650835"/>
     <w:multiLevelType w:val="multilevel"/>
     <w:tmpl w:val="FEC43A56"/>
@@ -11324,7 +11858,7 @@
       </w:rPr>
     </w:lvl>
   </w:abstractNum>
-  <w:abstractNum w:abstractNumId="32" w15:restartNumberingAfterBreak="0">
+  <w:abstractNum w:abstractNumId="35" w15:restartNumberingAfterBreak="0">
     <w:nsid w:val="75422585"/>
     <w:multiLevelType w:val="hybridMultilevel"/>
     <w:tmpl w:val="AFEA1AFE"/>
@@ -11436,7 +11970,7 @@
       </w:rPr>
     </w:lvl>
   </w:abstractNum>
-  <w:abstractNum w:abstractNumId="33" w15:restartNumberingAfterBreak="0">
+  <w:abstractNum w:abstractNumId="36" w15:restartNumberingAfterBreak="0">
     <w:nsid w:val="761C6238"/>
     <w:multiLevelType w:val="multilevel"/>
     <w:tmpl w:val="A888F022"/>
@@ -11585,7 +12119,7 @@
       </w:rPr>
     </w:lvl>
   </w:abstractNum>
-  <w:abstractNum w:abstractNumId="34" w15:restartNumberingAfterBreak="0">
+  <w:abstractNum w:abstractNumId="37" w15:restartNumberingAfterBreak="0">
     <w:nsid w:val="766D0BCD"/>
     <w:multiLevelType w:val="hybridMultilevel"/>
     <w:tmpl w:val="D16A84D4"/>
@@ -11698,7 +12232,7 @@
       </w:rPr>
     </w:lvl>
   </w:abstractNum>
-  <w:abstractNum w:abstractNumId="35" w15:restartNumberingAfterBreak="0">
+  <w:abstractNum w:abstractNumId="38" w15:restartNumberingAfterBreak="0">
     <w:nsid w:val="76D22E25"/>
     <w:multiLevelType w:val="hybridMultilevel"/>
     <w:tmpl w:val="09763A0E"/>
@@ -11811,7 +12345,7 @@
       </w:rPr>
     </w:lvl>
   </w:abstractNum>
-  <w:abstractNum w:abstractNumId="36" w15:restartNumberingAfterBreak="0">
+  <w:abstractNum w:abstractNumId="39" w15:restartNumberingAfterBreak="0">
     <w:nsid w:val="780C3A60"/>
     <w:multiLevelType w:val="hybridMultilevel"/>
     <w:tmpl w:val="7D188D74"/>
@@ -11897,7 +12431,7 @@
       </w:pPr>
     </w:lvl>
   </w:abstractNum>
-  <w:abstractNum w:abstractNumId="37" w15:restartNumberingAfterBreak="0">
+  <w:abstractNum w:abstractNumId="40" w15:restartNumberingAfterBreak="0">
     <w:nsid w:val="78B349EF"/>
     <w:multiLevelType w:val="multilevel"/>
     <w:tmpl w:val="55C26242"/>
@@ -12046,7 +12580,7 @@
       </w:rPr>
     </w:lvl>
   </w:abstractNum>
-  <w:abstractNum w:abstractNumId="38" w15:restartNumberingAfterBreak="0">
+  <w:abstractNum w:abstractNumId="41" w15:restartNumberingAfterBreak="0">
     <w:nsid w:val="7B8D2FAB"/>
     <w:multiLevelType w:val="hybridMultilevel"/>
     <w:tmpl w:val="D05E61CC"/>
@@ -12159,29 +12693,178 @@
       </w:rPr>
     </w:lvl>
   </w:abstractNum>
+  <w:abstractNum w:abstractNumId="42" w15:restartNumberingAfterBreak="0">
+    <w:nsid w:val="7F617035"/>
+    <w:multiLevelType w:val="multilevel"/>
+    <w:tmpl w:val="0216734C"/>
+    <w:lvl w:ilvl="0">
+      <w:start w:val="1"/>
+      <w:numFmt w:val="bullet"/>
+      <w:lvlText w:val=""/>
+      <w:lvlJc w:val="left"/>
+      <w:pPr>
+        <w:tabs>
+          <w:tab w:val="num" w:pos="720"/>
+        </w:tabs>
+        <w:ind w:left="720" w:hanging="360"/>
+      </w:pPr>
+      <w:rPr>
+        <w:rFonts w:ascii="Symbol" w:hAnsi="Symbol" w:hint="default"/>
+        <w:sz w:val="20"/>
+      </w:rPr>
+    </w:lvl>
+    <w:lvl w:ilvl="1" w:tentative="1">
+      <w:start w:val="1"/>
+      <w:numFmt w:val="bullet"/>
+      <w:lvlText w:val="o"/>
+      <w:lvlJc w:val="left"/>
+      <w:pPr>
+        <w:tabs>
+          <w:tab w:val="num" w:pos="1440"/>
+        </w:tabs>
+        <w:ind w:left="1440" w:hanging="360"/>
+      </w:pPr>
+      <w:rPr>
+        <w:rFonts w:ascii="Courier New" w:hAnsi="Courier New" w:hint="default"/>
+        <w:sz w:val="20"/>
+      </w:rPr>
+    </w:lvl>
+    <w:lvl w:ilvl="2" w:tentative="1">
+      <w:start w:val="1"/>
+      <w:numFmt w:val="bullet"/>
+      <w:lvlText w:val=""/>
+      <w:lvlJc w:val="left"/>
+      <w:pPr>
+        <w:tabs>
+          <w:tab w:val="num" w:pos="2160"/>
+        </w:tabs>
+        <w:ind w:left="2160" w:hanging="360"/>
+      </w:pPr>
+      <w:rPr>
+        <w:rFonts w:ascii="Wingdings" w:hAnsi="Wingdings" w:hint="default"/>
+        <w:sz w:val="20"/>
+      </w:rPr>
+    </w:lvl>
+    <w:lvl w:ilvl="3" w:tentative="1">
+      <w:start w:val="1"/>
+      <w:numFmt w:val="bullet"/>
+      <w:lvlText w:val=""/>
+      <w:lvlJc w:val="left"/>
+      <w:pPr>
+        <w:tabs>
+          <w:tab w:val="num" w:pos="2880"/>
+        </w:tabs>
+        <w:ind w:left="2880" w:hanging="360"/>
+      </w:pPr>
+      <w:rPr>
+        <w:rFonts w:ascii="Wingdings" w:hAnsi="Wingdings" w:hint="default"/>
+        <w:sz w:val="20"/>
+      </w:rPr>
+    </w:lvl>
+    <w:lvl w:ilvl="4" w:tentative="1">
+      <w:start w:val="1"/>
+      <w:numFmt w:val="bullet"/>
+      <w:lvlText w:val=""/>
+      <w:lvlJc w:val="left"/>
+      <w:pPr>
+        <w:tabs>
+          <w:tab w:val="num" w:pos="3600"/>
+        </w:tabs>
+        <w:ind w:left="3600" w:hanging="360"/>
+      </w:pPr>
+      <w:rPr>
+        <w:rFonts w:ascii="Wingdings" w:hAnsi="Wingdings" w:hint="default"/>
+        <w:sz w:val="20"/>
+      </w:rPr>
+    </w:lvl>
+    <w:lvl w:ilvl="5" w:tentative="1">
+      <w:start w:val="1"/>
+      <w:numFmt w:val="bullet"/>
+      <w:lvlText w:val=""/>
+      <w:lvlJc w:val="left"/>
+      <w:pPr>
+        <w:tabs>
+          <w:tab w:val="num" w:pos="4320"/>
+        </w:tabs>
+        <w:ind w:left="4320" w:hanging="360"/>
+      </w:pPr>
+      <w:rPr>
+        <w:rFonts w:ascii="Wingdings" w:hAnsi="Wingdings" w:hint="default"/>
+        <w:sz w:val="20"/>
+      </w:rPr>
+    </w:lvl>
+    <w:lvl w:ilvl="6" w:tentative="1">
+      <w:start w:val="1"/>
+      <w:numFmt w:val="bullet"/>
+      <w:lvlText w:val=""/>
+      <w:lvlJc w:val="left"/>
+      <w:pPr>
+        <w:tabs>
+          <w:tab w:val="num" w:pos="5040"/>
+        </w:tabs>
+        <w:ind w:left="5040" w:hanging="360"/>
+      </w:pPr>
+      <w:rPr>
+        <w:rFonts w:ascii="Wingdings" w:hAnsi="Wingdings" w:hint="default"/>
+        <w:sz w:val="20"/>
+      </w:rPr>
+    </w:lvl>
+    <w:lvl w:ilvl="7" w:tentative="1">
+      <w:start w:val="1"/>
+      <w:numFmt w:val="bullet"/>
+      <w:lvlText w:val=""/>
+      <w:lvlJc w:val="left"/>
+      <w:pPr>
+        <w:tabs>
+          <w:tab w:val="num" w:pos="5760"/>
+        </w:tabs>
+        <w:ind w:left="5760" w:hanging="360"/>
+      </w:pPr>
+      <w:rPr>
+        <w:rFonts w:ascii="Wingdings" w:hAnsi="Wingdings" w:hint="default"/>
+        <w:sz w:val="20"/>
+      </w:rPr>
+    </w:lvl>
+    <w:lvl w:ilvl="8" w:tentative="1">
+      <w:start w:val="1"/>
+      <w:numFmt w:val="bullet"/>
+      <w:lvlText w:val=""/>
+      <w:lvlJc w:val="left"/>
+      <w:pPr>
+        <w:tabs>
+          <w:tab w:val="num" w:pos="6480"/>
+        </w:tabs>
+        <w:ind w:left="6480" w:hanging="360"/>
+      </w:pPr>
+      <w:rPr>
+        <w:rFonts w:ascii="Wingdings" w:hAnsi="Wingdings" w:hint="default"/>
+        <w:sz w:val="20"/>
+      </w:rPr>
+    </w:lvl>
+  </w:abstractNum>
   <w:num w:numId="1" w16cid:durableId="1124885034">
-    <w:abstractNumId w:val="32"/>
+    <w:abstractNumId w:val="35"/>
   </w:num>
   <w:num w:numId="2" w16cid:durableId="1078286140">
-    <w:abstractNumId w:val="28"/>
+    <w:abstractNumId w:val="31"/>
   </w:num>
   <w:num w:numId="3" w16cid:durableId="434446855">
-    <w:abstractNumId w:val="17"/>
+    <w:abstractNumId w:val="19"/>
   </w:num>
   <w:num w:numId="4" w16cid:durableId="964576492">
-    <w:abstractNumId w:val="27"/>
+    <w:abstractNumId w:val="30"/>
   </w:num>
   <w:num w:numId="5" w16cid:durableId="1320186314">
-    <w:abstractNumId w:val="18"/>
+    <w:abstractNumId w:val="20"/>
   </w:num>
   <w:num w:numId="6" w16cid:durableId="278336686">
-    <w:abstractNumId w:val="12"/>
+    <w:abstractNumId w:val="14"/>
   </w:num>
   <w:num w:numId="7" w16cid:durableId="684673693">
-    <w:abstractNumId w:val="20"/>
+    <w:abstractNumId w:val="22"/>
   </w:num>
   <w:num w:numId="8" w16cid:durableId="571891425">
-    <w:abstractNumId w:val="22"/>
+    <w:abstractNumId w:val="25"/>
   </w:num>
   <w:num w:numId="9" w16cid:durableId="1173105136">
     <w:abstractNumId w:val="6"/>
@@ -12190,97 +12873,109 @@
     <w:abstractNumId w:val="0"/>
   </w:num>
   <w:num w:numId="11" w16cid:durableId="401173260">
-    <w:abstractNumId w:val="10"/>
+    <w:abstractNumId w:val="11"/>
   </w:num>
   <w:num w:numId="12" w16cid:durableId="1116101750">
-    <w:abstractNumId w:val="21"/>
+    <w:abstractNumId w:val="24"/>
   </w:num>
   <w:num w:numId="13" w16cid:durableId="1853764828">
-    <w:abstractNumId w:val="37"/>
+    <w:abstractNumId w:val="40"/>
   </w:num>
   <w:num w:numId="14" w16cid:durableId="879898953">
-    <w:abstractNumId w:val="24"/>
+    <w:abstractNumId w:val="27"/>
   </w:num>
   <w:num w:numId="15" w16cid:durableId="1015380392">
     <w:abstractNumId w:val="1"/>
   </w:num>
   <w:num w:numId="16" w16cid:durableId="1040784751">
-    <w:abstractNumId w:val="31"/>
+    <w:abstractNumId w:val="34"/>
   </w:num>
   <w:num w:numId="17" w16cid:durableId="709691325">
     <w:abstractNumId w:val="2"/>
   </w:num>
   <w:num w:numId="18" w16cid:durableId="1352609442">
-    <w:abstractNumId w:val="11"/>
+    <w:abstractNumId w:val="12"/>
   </w:num>
   <w:num w:numId="19" w16cid:durableId="1905876103">
+    <w:abstractNumId w:val="18"/>
+  </w:num>
+  <w:num w:numId="20" w16cid:durableId="86924542">
+    <w:abstractNumId w:val="36"/>
+  </w:num>
+  <w:num w:numId="21" w16cid:durableId="523595216">
     <w:abstractNumId w:val="16"/>
   </w:num>
-  <w:num w:numId="20" w16cid:durableId="86924542">
+  <w:num w:numId="22" w16cid:durableId="846753958">
     <w:abstractNumId w:val="33"/>
-  </w:num>
-  <w:num w:numId="21" w16cid:durableId="523595216">
-    <w:abstractNumId w:val="14"/>
-  </w:num>
-  <w:num w:numId="22" w16cid:durableId="846753958">
-    <w:abstractNumId w:val="30"/>
   </w:num>
   <w:num w:numId="23" w16cid:durableId="1383552108">
     <w:abstractNumId w:val="4"/>
   </w:num>
   <w:num w:numId="24" w16cid:durableId="340664226">
-    <w:abstractNumId w:val="23"/>
+    <w:abstractNumId w:val="26"/>
   </w:num>
   <w:num w:numId="25" w16cid:durableId="188690670">
-    <w:abstractNumId w:val="25"/>
+    <w:abstractNumId w:val="28"/>
   </w:num>
   <w:num w:numId="26" w16cid:durableId="1320035129">
-    <w:abstractNumId w:val="29"/>
+    <w:abstractNumId w:val="32"/>
   </w:num>
   <w:num w:numId="27" w16cid:durableId="1663045335">
     <w:abstractNumId w:val="5"/>
   </w:num>
   <w:num w:numId="28" w16cid:durableId="1181967262">
-    <w:abstractNumId w:val="34"/>
+    <w:abstractNumId w:val="37"/>
   </w:num>
   <w:num w:numId="29" w16cid:durableId="669024030">
     <w:abstractNumId w:val="3"/>
   </w:num>
   <w:num w:numId="30" w16cid:durableId="366754807">
-    <w:abstractNumId w:val="19"/>
+    <w:abstractNumId w:val="21"/>
   </w:num>
   <w:num w:numId="31" w16cid:durableId="2007587952">
     <w:abstractNumId w:val="7"/>
   </w:num>
   <w:num w:numId="32" w16cid:durableId="1753703327">
+    <w:abstractNumId w:val="17"/>
+  </w:num>
+  <w:num w:numId="33" w16cid:durableId="137579605">
+    <w:abstractNumId w:val="10"/>
+  </w:num>
+  <w:num w:numId="34" w16cid:durableId="2019497458">
+    <w:abstractNumId w:val="9"/>
+  </w:num>
+  <w:num w:numId="35" w16cid:durableId="1369335364">
     <w:abstractNumId w:val="15"/>
   </w:num>
-  <w:num w:numId="33" w16cid:durableId="137579605">
-    <w:abstractNumId w:val="9"/>
+  <w:num w:numId="36" w16cid:durableId="1991136600">
+    <w:abstractNumId w:val="29"/>
   </w:num>
-  <w:num w:numId="34" w16cid:durableId="2019497458">
-    <w:abstractNumId w:val="8"/>
+  <w:num w:numId="37" w16cid:durableId="1183133334">
+    <w:abstractNumId w:val="41"/>
   </w:num>
-  <w:num w:numId="35" w16cid:durableId="1369335364">
+  <w:num w:numId="38" w16cid:durableId="1454009777">
+    <w:abstractNumId w:val="39"/>
+  </w:num>
+  <w:num w:numId="39" w16cid:durableId="175771861">
+    <w:abstractNumId w:val="38"/>
+  </w:num>
+  <w:num w:numId="40" w16cid:durableId="102580993">
     <w:abstractNumId w:val="13"/>
   </w:num>
-  <w:num w:numId="36" w16cid:durableId="1991136600">
-    <w:abstractNumId w:val="26"/>
+  <w:num w:numId="41" w16cid:durableId="867913883">
+    <w:abstractNumId w:val="23"/>
   </w:num>
-  <w:num w:numId="37" w16cid:durableId="1183133334">
-    <w:abstractNumId w:val="38"/>
+  <w:num w:numId="42" w16cid:durableId="1153446902">
+    <w:abstractNumId w:val="42"/>
   </w:num>
-  <w:num w:numId="38" w16cid:durableId="1454009777">
-    <w:abstractNumId w:val="36"/>
-  </w:num>
-  <w:num w:numId="39" w16cid:durableId="175771861">
-    <w:abstractNumId w:val="35"/>
+  <w:num w:numId="43" w16cid:durableId="469906689">
+    <w:abstractNumId w:val="8"/>
   </w:num>
 </w:numbering>
 </file>
 
 <file path=word/styles.xml><?xml version="1.0" encoding="utf-8"?>
-<w:styles xmlns:mc="http://schemas.openxmlformats.org/markup-compatibility/2006" xmlns:r="http://schemas.openxmlformats.org/officeDocument/2006/relationships" xmlns:w="http://schemas.openxmlformats.org/wordprocessingml/2006/main" xmlns:w14="http://schemas.microsoft.com/office/word/2010/wordml" xmlns:w15="http://schemas.microsoft.com/office/word/2012/wordml" xmlns:w16cex="http://schemas.microsoft.com/office/word/2018/wordml/cex" xmlns:w16cid="http://schemas.microsoft.com/office/word/2016/wordml/cid" xmlns:w16="http://schemas.microsoft.com/office/word/2018/wordml" xmlns:w16sdtdh="http://schemas.microsoft.com/office/word/2020/wordml/sdtdatahash" xmlns:w16se="http://schemas.microsoft.com/office/word/2015/wordml/symex" mc:Ignorable="w14 w15 w16se w16cid w16 w16cex w16sdtdh">
+<w:styles xmlns:mc="http://schemas.openxmlformats.org/markup-compatibility/2006" xmlns:r="http://schemas.openxmlformats.org/officeDocument/2006/relationships" xmlns:w="http://schemas.openxmlformats.org/wordprocessingml/2006/main" xmlns:w14="http://schemas.microsoft.com/office/word/2010/wordml" xmlns:w15="http://schemas.microsoft.com/office/word/2012/wordml" xmlns:w16cex="http://schemas.microsoft.com/office/word/2018/wordml/cex" xmlns:w16cid="http://schemas.microsoft.com/office/word/2016/wordml/cid" xmlns:w16="http://schemas.microsoft.com/office/word/2018/wordml" xmlns:w16du="http://schemas.microsoft.com/office/word/2023/wordml/word16du" xmlns:w16sdtdh="http://schemas.microsoft.com/office/word/2020/wordml/sdtdatahash" xmlns:w16sdtfl="http://schemas.microsoft.com/office/word/2024/wordml/sdtformatlock" xmlns:w16se="http://schemas.microsoft.com/office/word/2015/wordml/symex" mc:Ignorable="w14 w15 w16se w16cid w16 w16cex w16sdtdh w16sdtfl w16du">
   <w:docDefaults>
     <w:rPrDefault>
       <w:rPr>

</xml_diff>

<commit_message>
Update Task 7 documentation and add diagram
</commit_message>
<xml_diff>
--- a/docs/214 PDF document.docx
+++ b/docs/214 PDF document.docx
@@ -266,7 +266,15 @@
     </w:p>
     <w:p>
       <w:r>
-        <w:t xml:space="preserve">IBM defines a workflow as [1] a system for managing repetitive processes and tasks which occur in a particular order. They are the mechanism by which people and enterprises accomplish their work. Simply, a workflow is a repeatable sequence of steps that moves a process from start to finish. Workflow management systems are [2] systems designed to assist groups of people in carrying out work processes, and contain organizational knowledge of where work flows in the default case. </w:t>
+        <w:t xml:space="preserve">IBM defines a workflow as [1] a system for managing repetitive processes and tasks which occur in a particular order. They are the mechanism by which people and enterprises accomplish their work. Simply, a workflow is a repeatable sequence of steps that moves a process from start to finish. Workflow management systems are [2] systems designed to assist groups of people in carrying out work </w:t>
+      </w:r>
+      <w:proofErr w:type="gramStart"/>
+      <w:r>
+        <w:t>processes, and</w:t>
+      </w:r>
+      <w:proofErr w:type="gramEnd"/>
+      <w:r>
+        <w:t xml:space="preserve"> contain organizational knowledge of where work flows in the default case. </w:t>
       </w:r>
     </w:p>
     <w:p>
@@ -286,7 +294,15 @@
     </w:p>
     <w:p>
       <w:r>
-        <w:t xml:space="preserve">The workflow definition is static and therefore holds information about the structure of the workflow such as conditions, assigned roles and rules. A running instance holds information about one specific workflow such as its unique ID, current state and completed and pending tasks [3]. Real workflows model nested activities and sub-processes using hierarchies and rules where the parents execution is paused until the child completes their task [6]. In a workflow system, business decisions are usually configurable (able to be changed to meet specific requirements) such as routing decisions, approval rules, time limits, etc. Finally, changes can be made to workflow definitions while work is in progress by “workflow versioning” [12], this involves creating a branch from the public version, and publishing the new branch and storing the outdated branch in a version history. </w:t>
+        <w:t xml:space="preserve">The workflow definition is static and therefore holds information about the structure of the workflow such as conditions, assigned roles and rules. A running instance holds information about one specific workflow such as its unique ID, current state and completed and pending tasks [3]. Real workflows model nested activities and sub-processes using hierarchies and rules where the parents execution is paused until the child completes their task [6]. In a workflow system, business decisions are usually configurable (able to be changed to meet specific requirements) such as routing decisions, approval rules, time limits, etc. Finally, changes can be made to workflow definitions while work is in progress by “workflow versioning” [12], this involves creating a branch from the public </w:t>
+      </w:r>
+      <w:proofErr w:type="gramStart"/>
+      <w:r>
+        <w:t>version, and</w:t>
+      </w:r>
+      <w:proofErr w:type="gramEnd"/>
+      <w:r>
+        <w:t xml:space="preserve"> publishing the new branch and storing the outdated branch in a version history. </w:t>
       </w:r>
     </w:p>
     <w:p>
@@ -2608,7 +2624,15 @@
       </w:r>
       <w:proofErr w:type="spellEnd"/>
       <w:r>
-        <w:t xml:space="preserve"> holds work items, roles, dependencies, routing rules and escalation rules. Creating that in one constructor does not scale across organisations. Builder lets the same construction steps produce a short linear process or a multi-step approval process, and keeps the definition separate from the running instances created from it.</w:t>
+        <w:t xml:space="preserve"> holds work items, roles, dependencies, routing rules and escalation rules. Creating that in one constructor does not scale across organisations. Builder lets the same construction steps produce a short linear process or a multi-step approval </w:t>
+      </w:r>
+      <w:proofErr w:type="gramStart"/>
+      <w:r>
+        <w:t>process, and</w:t>
+      </w:r>
+      <w:proofErr w:type="gramEnd"/>
+      <w:r>
+        <w:t xml:space="preserve"> keeps the definition separate from the running instances created from it.</w:t>
       </w:r>
     </w:p>
     <w:p>
@@ -2659,7 +2683,15 @@
         <w:t xml:space="preserve"> where required when a definition is built</w:t>
       </w:r>
       <w:r>
-        <w:t xml:space="preserve">, so routing and escalation behaviour belongs to the definition and is not hard-coded in the engine. </w:t>
+        <w:t xml:space="preserve">, so routing and escalation behaviour belongs to the definition and is not </w:t>
+      </w:r>
+      <w:proofErr w:type="gramStart"/>
+      <w:r>
+        <w:t>hard-coded</w:t>
+      </w:r>
+      <w:proofErr w:type="gramEnd"/>
+      <w:r>
+        <w:t xml:space="preserve"> in the engine. </w:t>
       </w:r>
       <w:proofErr w:type="spellStart"/>
       <w:r>
@@ -3423,7 +3455,15 @@
     </w:p>
     <w:p>
       <w:r>
-        <w:t>Chain of Responsibility provides a flexible way to manage escalation without hard-coding every escalation level into one class.</w:t>
+        <w:t xml:space="preserve">Chain of Responsibility provides a flexible way to manage escalation without </w:t>
+      </w:r>
+      <w:proofErr w:type="gramStart"/>
+      <w:r>
+        <w:t>hard-coding</w:t>
+      </w:r>
+      <w:proofErr w:type="gramEnd"/>
+      <w:r>
+        <w:t xml:space="preserve"> every escalation level into one class.</w:t>
       </w:r>
     </w:p>
     <w:p>
@@ -4438,7 +4478,15 @@
     </w:p>
     <w:p>
       <w:r>
-        <w:t>A user of TIVIDY should not need to interact directly with all of these classes.</w:t>
+        <w:t xml:space="preserve">A user of TIVIDY should not need to interact directly with </w:t>
+      </w:r>
+      <w:proofErr w:type="gramStart"/>
+      <w:r>
+        <w:t>all of</w:t>
+      </w:r>
+      <w:proofErr w:type="gramEnd"/>
+      <w:r>
+        <w:t xml:space="preserve"> these classes.</w:t>
       </w:r>
     </w:p>
     <w:p>
@@ -4697,8 +4745,13 @@
       <w:r>
         <w:t xml:space="preserve">For example, </w:t>
       </w:r>
-      <w:r>
-        <w:t xml:space="preserve">Before escalation, a </w:t>
+      <w:proofErr w:type="gramStart"/>
+      <w:r>
+        <w:t>Before</w:t>
+      </w:r>
+      <w:proofErr w:type="gramEnd"/>
+      <w:r>
+        <w:t xml:space="preserve"> escalation, a </w:t>
       </w:r>
       <w:proofErr w:type="spellStart"/>
       <w:r>
@@ -5364,6 +5417,9 @@
     <w:p/>
     <w:p>
       <w:r>
+        <w:rPr>
+          <w:noProof/>
+        </w:rPr>
         <w:drawing>
           <wp:anchor distT="0" distB="0" distL="114300" distR="114300" simplePos="0" relativeHeight="251658240" behindDoc="0" locked="0" layoutInCell="1" allowOverlap="1" wp14:anchorId="3854DDD3" wp14:editId="4399C3ED">
             <wp:simplePos x="0" y="0"/>
@@ -5983,14 +6039,12 @@
       <w:r>
         <w:rPr>
           <w:noProof/>
-          <w:sz w:val="28"/>
-          <w:szCs w:val="28"/>
         </w:rPr>
         <w:drawing>
-          <wp:inline distT="0" distB="0" distL="0" distR="0" wp14:anchorId="695722AA" wp14:editId="4ED9CC64">
-            <wp:extent cx="5731510" cy="2834640"/>
-            <wp:effectExtent l="0" t="0" r="2540" b="3810"/>
-            <wp:docPr id="112777972" name="Picture 1"/>
+          <wp:inline distT="0" distB="0" distL="0" distR="0" wp14:anchorId="050391D9" wp14:editId="1ECB3BD4">
+            <wp:extent cx="5731510" cy="2426970"/>
+            <wp:effectExtent l="0" t="0" r="2540" b="0"/>
+            <wp:docPr id="1298660226" name="Picture 2"/>
             <wp:cNvGraphicFramePr>
               <a:graphicFrameLocks xmlns:a="http://schemas.openxmlformats.org/drawingml/2006/main" noChangeAspect="1"/>
             </wp:cNvGraphicFramePr>
@@ -5998,23 +6052,36 @@
               <a:graphicData uri="http://schemas.openxmlformats.org/drawingml/2006/picture">
                 <pic:pic xmlns:pic="http://schemas.openxmlformats.org/drawingml/2006/picture">
                   <pic:nvPicPr>
-                    <pic:cNvPr id="112777972" name=""/>
-                    <pic:cNvPicPr/>
+                    <pic:cNvPr id="0" name="Picture 1"/>
+                    <pic:cNvPicPr>
+                      <a:picLocks noChangeAspect="1" noChangeArrowheads="1"/>
+                    </pic:cNvPicPr>
                   </pic:nvPicPr>
                   <pic:blipFill>
-                    <a:blip r:embed="rId15"/>
+                    <a:blip r:embed="rId15">
+                      <a:extLst>
+                        <a:ext uri="{28A0092B-C50C-407E-A947-70E740481C1C}">
+                          <a14:useLocalDpi xmlns:a14="http://schemas.microsoft.com/office/drawing/2010/main" val="0"/>
+                        </a:ext>
+                      </a:extLst>
+                    </a:blip>
+                    <a:srcRect/>
                     <a:stretch>
                       <a:fillRect/>
                     </a:stretch>
                   </pic:blipFill>
-                  <pic:spPr>
+                  <pic:spPr bwMode="auto">
                     <a:xfrm>
                       <a:off x="0" y="0"/>
-                      <a:ext cx="5731510" cy="2834640"/>
+                      <a:ext cx="5731510" cy="2426970"/>
                     </a:xfrm>
                     <a:prstGeom prst="rect">
                       <a:avLst/>
                     </a:prstGeom>
+                    <a:noFill/>
+                    <a:ln>
+                      <a:noFill/>
+                    </a:ln>
                   </pic:spPr>
                 </pic:pic>
               </a:graphicData>
@@ -6078,6 +6145,7 @@
       <w:r>
         <w:t xml:space="preserve"> when the case is successfully completed or </w:t>
       </w:r>
+      <w:proofErr w:type="gramStart"/>
       <w:r>
         <w:rPr>
           <w:b/>
@@ -6085,6 +6153,7 @@
         </w:rPr>
         <w:t>Closed</w:t>
       </w:r>
+      <w:proofErr w:type="gramEnd"/>
       <w:r>
         <w:t xml:space="preserve"> when the workflow ends without resolution. Resolved and Closed represent the final states of the workflow.</w:t>
       </w:r>
@@ -6144,22 +6213,22 @@
         <w:rPr>
           <w:color w:val="0070C0"/>
         </w:rPr>
+        <w:t xml:space="preserve">TASK 7: </w:t>
+      </w:r>
+      <w:r>
+        <w:rPr>
+          <w:color w:val="0070C0"/>
+        </w:rPr>
+        <w:t>Design Decisions and Revisions</w:t>
+      </w:r>
+    </w:p>
+    <w:p/>
+    <w:p>
+      <w:pPr>
+        <w:jc w:val="both"/>
+      </w:pPr>
+      <w:r>
         <w:lastRenderedPageBreak/>
-        <w:t xml:space="preserve">TASK 7: </w:t>
-      </w:r>
-      <w:r>
-        <w:rPr>
-          <w:color w:val="0070C0"/>
-        </w:rPr>
-        <w:t>Design Decisions and Revisions</w:t>
-      </w:r>
-    </w:p>
-    <w:p/>
-    <w:p>
-      <w:pPr>
-        <w:jc w:val="both"/>
-      </w:pPr>
-      <w:r>
         <w:t>Throughout the design of TIVIDY, several parts of the original UML and pattern implementation were revised as the group gained a clearer understanding of the workflow system and received feedback. The main revisions are documented below.</w:t>
       </w:r>
     </w:p>
@@ -6261,27 +6330,7 @@
           <w:szCs w:val="22"/>
           <w:u w:val="single"/>
         </w:rPr>
-        <w:t>Original</w:t>
-      </w:r>
-      <w:r>
-        <w:rPr>
-          <w:b/>
-          <w:bCs/>
-          <w:sz w:val="22"/>
-          <w:szCs w:val="22"/>
-          <w:u w:val="single"/>
-        </w:rPr>
-        <w:t xml:space="preserve"> </w:t>
-      </w:r>
-      <w:r>
-        <w:rPr>
-          <w:b/>
-          <w:bCs/>
-          <w:sz w:val="22"/>
-          <w:szCs w:val="22"/>
-          <w:u w:val="single"/>
-        </w:rPr>
-        <w:t>Design:</w:t>
+        <w:t>Original Design:</w:t>
       </w:r>
       <w:r>
         <w:br/>
@@ -6632,7 +6681,6 @@
     </w:p>
     <w:p>
       <w:r>
-        <w:lastRenderedPageBreak/>
         <w:t>The escalate() operation invokes the Chain of Responsibility to find a participant with sufficient authority to continue handling the case.</w:t>
       </w:r>
     </w:p>
@@ -6645,6 +6693,7 @@
           <w:szCs w:val="22"/>
           <w:u w:val="single"/>
         </w:rPr>
+        <w:lastRenderedPageBreak/>
         <w:t>Reason for Change:</w:t>
       </w:r>
       <w:r>
@@ -6863,7 +6912,23 @@
     </w:p>
     <w:p>
       <w:r>
-        <w:t>For example, a Teacher could be configured with an intermediate authority level, while a Principal could be configured with a senior authority level.</w:t>
+        <w:t xml:space="preserve">For example, a </w:t>
+      </w:r>
+      <w:proofErr w:type="gramStart"/>
+      <w:r>
+        <w:t>Teacher</w:t>
+      </w:r>
+      <w:proofErr w:type="gramEnd"/>
+      <w:r>
+        <w:t xml:space="preserve"> could be configured with an intermediate authority level, while a </w:t>
+      </w:r>
+      <w:proofErr w:type="gramStart"/>
+      <w:r>
+        <w:t>Principal</w:t>
+      </w:r>
+      <w:proofErr w:type="gramEnd"/>
+      <w:r>
+        <w:t xml:space="preserve"> could be configured with a senior authority level.</w:t>
       </w:r>
     </w:p>
     <w:p>
@@ -6907,6 +6972,7 @@
         <w:rPr>
           <w:color w:val="0070C0"/>
         </w:rPr>
+        <w:lastRenderedPageBreak/>
         <w:t>Team C</w:t>
       </w:r>
       <w:r>
@@ -7206,11 +7272,7 @@
       </w:r>
       <w:proofErr w:type="spellEnd"/>
       <w:r>
-        <w:t xml:space="preserve"> and determining </w:t>
-      </w:r>
-      <w:r>
-        <w:lastRenderedPageBreak/>
-        <w:t xml:space="preserve">what happens next, as well as the </w:t>
+        <w:t xml:space="preserve"> and determining what happens next, as well as the </w:t>
       </w:r>
       <w:proofErr w:type="spellStart"/>
       <w:r>
@@ -7241,6 +7303,7 @@
           <w:sz w:val="22"/>
           <w:szCs w:val="22"/>
         </w:rPr>
+        <w:lastRenderedPageBreak/>
         <w:t>Task 7: Design Decisions and Revisions</w:t>
       </w:r>
     </w:p>
@@ -13584,6 +13647,7 @@
   <w:style w:type="character" w:default="1" w:styleId="DefaultParagraphFont">
     <w:name w:val="Default Paragraph Font"/>
     <w:uiPriority w:val="1"/>
+    <w:semiHidden/>
     <w:unhideWhenUsed/>
   </w:style>
   <w:style w:type="table" w:default="1" w:styleId="TableNormal">

</xml_diff>

<commit_message>
removed the old dagrams and appended new descriptions to task 7
</commit_message>
<xml_diff>
--- a/docs/214 PDF document.docx
+++ b/docs/214 PDF document.docx
@@ -6952,6 +6952,20 @@
         <w:t>The Role class now contains the role configuration operation and is linked to explanatory UML notes describing the supported template configurations.</w:t>
       </w:r>
     </w:p>
+    <w:p/>
+    <w:p/>
+    <w:p>
+      <w:r>
+        <w:lastRenderedPageBreak/>
+        <w:t>4. State Diagram Updated</w:t>
+      </w:r>
+    </w:p>
+    <w:p>
+      <w:r>
+        <w:t xml:space="preserve">The Escalated state has been removed following the advice given by the Tutor; more details are given above, under “Diagram Updates”. Also changed the order of the function calls and the guards as they were previously in the wrong order, function call, guard. We have changed it to guard then, function call. </w:t>
+      </w:r>
+    </w:p>
+    <w:p/>
     <w:p>
       <w:pPr>
         <w:jc w:val="both"/>
@@ -6972,7 +6986,6 @@
         <w:rPr>
           <w:color w:val="0070C0"/>
         </w:rPr>
-        <w:lastRenderedPageBreak/>
         <w:t>Team C</w:t>
       </w:r>
       <w:r>
@@ -7303,7 +7316,6 @@
           <w:sz w:val="22"/>
           <w:szCs w:val="22"/>
         </w:rPr>
-        <w:lastRenderedPageBreak/>
         <w:t>Task 7: Design Decisions and Revisions</w:t>
       </w:r>
     </w:p>

</xml_diff>

<commit_message>
updating the word doc
</commit_message>
<xml_diff>
--- a/docs/214 PDF document.docx
+++ b/docs/214 PDF document.docx
@@ -1,6 +1,6 @@
 
 <file path=word/document.xml><?xml version="1.0" encoding="utf-8"?>
-<w:document xmlns:wpc="http://schemas.microsoft.com/office/word/2010/wordprocessingCanvas" xmlns:cx="http://schemas.microsoft.com/office/drawing/2014/chartex" xmlns:cx1="http://schemas.microsoft.com/office/drawing/2015/9/8/chartex" xmlns:cx2="http://schemas.microsoft.com/office/drawing/2015/10/21/chartex" xmlns:cx3="http://schemas.microsoft.com/office/drawing/2016/5/9/chartex" xmlns:cx4="http://schemas.microsoft.com/office/drawing/2016/5/10/chartex" xmlns:cx5="http://schemas.microsoft.com/office/drawing/2016/5/11/chartex" xmlns:cx6="http://schemas.microsoft.com/office/drawing/2016/5/12/chartex" xmlns:cx7="http://schemas.microsoft.com/office/drawing/2016/5/13/chartex" xmlns:cx8="http://schemas.microsoft.com/office/drawing/2016/5/14/chartex" xmlns:mc="http://schemas.openxmlformats.org/markup-compatibility/2006" xmlns:aink="http://schemas.microsoft.com/office/drawing/2016/ink" xmlns:am3d="http://schemas.microsoft.com/office/drawing/2017/model3d" xmlns:o="urn:schemas-microsoft-com:office:office" xmlns:oel="http://schemas.microsoft.com/office/2019/extlst" xmlns:r="http://schemas.openxmlformats.org/officeDocument/2006/relationships" xmlns:m="http://schemas.openxmlformats.org/officeDocument/2006/math" xmlns:v="urn:schemas-microsoft-com:vml" xmlns:wp14="http://schemas.microsoft.com/office/word/2010/wordprocessingDrawing" xmlns:wp="http://schemas.openxmlformats.org/drawingml/2006/wordprocessingDrawing" xmlns:w10="urn:schemas-microsoft-com:office:word" xmlns:w="http://schemas.openxmlformats.org/wordprocessingml/2006/main" xmlns:w14="http://schemas.microsoft.com/office/word/2010/wordml" xmlns:w15="http://schemas.microsoft.com/office/word/2012/wordml" xmlns:w16cex="http://schemas.microsoft.com/office/word/2018/wordml/cex" xmlns:w16cid="http://schemas.microsoft.com/office/word/2016/wordml/cid" xmlns:w16="http://schemas.microsoft.com/office/word/2018/wordml" xmlns:w16du="http://schemas.microsoft.com/office/word/2023/wordml/word16du" xmlns:w16sdtdh="http://schemas.microsoft.com/office/word/2020/wordml/sdtdatahash" xmlns:w16sdtfl="http://schemas.microsoft.com/office/word/2024/wordml/sdtformatlock" xmlns:w16se="http://schemas.microsoft.com/office/word/2015/wordml/symex" xmlns:wpg="http://schemas.microsoft.com/office/word/2010/wordprocessingGroup" xmlns:wpi="http://schemas.microsoft.com/office/word/2010/wordprocessingInk" xmlns:wne="http://schemas.microsoft.com/office/word/2006/wordml" xmlns:wps="http://schemas.microsoft.com/office/word/2010/wordprocessingShape" mc:Ignorable="w14 w15 w16se w16cid w16 w16cex w16sdtdh w16sdtfl w16du wp14">
+<w:document xmlns:wpc="http://schemas.microsoft.com/office/word/2010/wordprocessingCanvas" xmlns:cx="http://schemas.microsoft.com/office/drawing/2014/chartex" xmlns:cx1="http://schemas.microsoft.com/office/drawing/2015/9/8/chartex" xmlns:cx2="http://schemas.microsoft.com/office/drawing/2015/10/21/chartex" xmlns:cx3="http://schemas.microsoft.com/office/drawing/2016/5/9/chartex" xmlns:cx4="http://schemas.microsoft.com/office/drawing/2016/5/10/chartex" xmlns:cx5="http://schemas.microsoft.com/office/drawing/2016/5/11/chartex" xmlns:cx6="http://schemas.microsoft.com/office/drawing/2016/5/12/chartex" xmlns:cx7="http://schemas.microsoft.com/office/drawing/2016/5/13/chartex" xmlns:cx8="http://schemas.microsoft.com/office/drawing/2016/5/14/chartex" xmlns:mc="http://schemas.openxmlformats.org/markup-compatibility/2006" xmlns:aink="http://schemas.microsoft.com/office/drawing/2016/ink" xmlns:am3d="http://schemas.microsoft.com/office/drawing/2017/model3d" xmlns:o="urn:schemas-microsoft-com:office:office" xmlns:oel="http://schemas.microsoft.com/office/2019/extlst" xmlns:r="http://schemas.openxmlformats.org/officeDocument/2006/relationships" xmlns:m="http://schemas.openxmlformats.org/officeDocument/2006/math" xmlns:v="urn:schemas-microsoft-com:vml" xmlns:wp14="http://schemas.microsoft.com/office/word/2010/wordprocessingDrawing" xmlns:wp="http://schemas.openxmlformats.org/drawingml/2006/wordprocessingDrawing" xmlns:w10="urn:schemas-microsoft-com:office:word" xmlns:w="http://schemas.openxmlformats.org/wordprocessingml/2006/main" xmlns:w14="http://schemas.microsoft.com/office/word/2010/wordml" xmlns:w15="http://schemas.microsoft.com/office/word/2012/wordml" xmlns:w16cex="http://schemas.microsoft.com/office/word/2018/wordml/cex" xmlns:w16cid="http://schemas.microsoft.com/office/word/2016/wordml/cid" xmlns:w16="http://schemas.microsoft.com/office/word/2018/wordml" xmlns:w16sdtdh="http://schemas.microsoft.com/office/word/2020/wordml/sdtdatahash" xmlns:w16se="http://schemas.microsoft.com/office/word/2015/wordml/symex" xmlns:wpg="http://schemas.microsoft.com/office/word/2010/wordprocessingGroup" xmlns:wpi="http://schemas.microsoft.com/office/word/2010/wordprocessingInk" xmlns:wne="http://schemas.microsoft.com/office/word/2006/wordml" xmlns:wps="http://schemas.microsoft.com/office/word/2010/wordprocessingShape" mc:Ignorable="w14 w15 w16se w16cid w16 w16cex w16sdtdh wp14">
   <w:body>
     <w:p>
       <w:pPr>
@@ -189,7 +189,6 @@
       <w:pPr>
         <w:jc w:val="center"/>
       </w:pPr>
-      <w:proofErr w:type="spellStart"/>
       <w:r>
         <w:rPr>
           <w:b/>
@@ -197,17 +196,7 @@
           <w:sz w:val="24"/>
           <w:szCs w:val="24"/>
         </w:rPr>
-        <w:t>Github</w:t>
-      </w:r>
-      <w:proofErr w:type="spellEnd"/>
-      <w:r>
-        <w:rPr>
-          <w:b/>
-          <w:bCs/>
-          <w:sz w:val="24"/>
-          <w:szCs w:val="24"/>
-        </w:rPr>
-        <w:t xml:space="preserve"> repo link:</w:t>
+        <w:t>Github repo link:</w:t>
       </w:r>
     </w:p>
     <w:p>
@@ -266,15 +255,7 @@
     </w:p>
     <w:p>
       <w:r>
-        <w:t xml:space="preserve">IBM defines a workflow as [1] a system for managing repetitive processes and tasks which occur in a particular order. They are the mechanism by which people and enterprises accomplish their work. Simply, a workflow is a repeatable sequence of steps that moves a process from start to finish. Workflow management systems are [2] systems designed to assist groups of people in carrying out work </w:t>
-      </w:r>
-      <w:proofErr w:type="gramStart"/>
-      <w:r>
-        <w:t>processes, and</w:t>
-      </w:r>
-      <w:proofErr w:type="gramEnd"/>
-      <w:r>
-        <w:t xml:space="preserve"> contain organizational knowledge of where work flows in the default case. </w:t>
+        <w:t xml:space="preserve">IBM defines a workflow as [1] a system for managing repetitive processes and tasks which occur in a particular order. They are the mechanism by which people and enterprises accomplish their work. Simply, a workflow is a repeatable sequence of steps that moves a process from start to finish. Workflow management systems are [2] systems designed to assist groups of people in carrying out work processes, and contain organizational knowledge of where work flows in the default case. </w:t>
       </w:r>
     </w:p>
     <w:p>
@@ -294,28 +275,12 @@
     </w:p>
     <w:p>
       <w:r>
-        <w:t xml:space="preserve">The workflow definition is static and therefore holds information about the structure of the workflow such as conditions, assigned roles and rules. A running instance holds information about one specific workflow such as its unique ID, current state and completed and pending tasks [3]. Real workflows model nested activities and sub-processes using hierarchies and rules where the parents execution is paused until the child completes their task [6]. In a workflow system, business decisions are usually configurable (able to be changed to meet specific requirements) such as routing decisions, approval rules, time limits, etc. Finally, changes can be made to workflow definitions while work is in progress by “workflow versioning” [12], this involves creating a branch from the public </w:t>
-      </w:r>
-      <w:proofErr w:type="gramStart"/>
-      <w:r>
-        <w:t>version, and</w:t>
-      </w:r>
-      <w:proofErr w:type="gramEnd"/>
-      <w:r>
-        <w:t xml:space="preserve"> publishing the new branch and storing the outdated branch in a version history. </w:t>
-      </w:r>
-    </w:p>
-    <w:p>
-      <w:r>
-        <w:t xml:space="preserve">The research indicates that TIVIDY should provide a generic mechanism for defining and executing workflows rather than implementing one fixed problem-solving process. It’s core concepts should include </w:t>
-      </w:r>
-      <w:proofErr w:type="spellStart"/>
-      <w:r>
-        <w:t>WorkItems</w:t>
-      </w:r>
-      <w:proofErr w:type="spellEnd"/>
-      <w:r>
-        <w:t xml:space="preserve">, workflow definitions and instances, activities, participants roles, routing, states, events escalation, history and monitoring. These capabilities can then be used in different scenarios such as complaints, IT problems and work-task management, while the underlying system remains the same. </w:t>
+        <w:t xml:space="preserve">The workflow definition is static and therefore holds information about the structure of the workflow such as conditions, assigned roles and rules. A running instance holds information about one specific workflow such as its unique ID, current state and completed and pending tasks [3]. Real workflows model nested activities and sub-processes using hierarchies and rules where the parents execution is paused until the child completes their task [6]. In a workflow system, business decisions are usually configurable (able to be changed to meet specific requirements) such as routing decisions, approval rules, time limits, etc. Finally, changes can be made to workflow definitions while work is in progress by “workflow versioning” [12], this involves creating a branch from the public version, and publishing the new branch and storing the outdated branch in a version history. </w:t>
+      </w:r>
+    </w:p>
+    <w:p>
+      <w:r>
+        <w:t xml:space="preserve">The research indicates that TIVIDY should provide a generic mechanism for defining and executing workflows rather than implementing one fixed problem-solving process. It’s core concepts should include WorkItems, workflow definitions and instances, activities, participants roles, routing, states, events escalation, history and monitoring. These capabilities can then be used in different scenarios such as complaints, IT problems and work-task management, while the underlying system remains the same. </w:t>
       </w:r>
     </w:p>
     <w:p>
@@ -485,13 +450,8 @@
           <w:numId w:val="38"/>
         </w:numPr>
       </w:pPr>
-      <w:proofErr w:type="spellStart"/>
-      <w:r>
-        <w:t>Hyperbots</w:t>
-      </w:r>
-      <w:proofErr w:type="spellEnd"/>
-      <w:r>
-        <w:t xml:space="preserve"> (2026) Workflow history. Available at: https://www.hyperbots.com/glossary/workflow-history (Accessed: 2 October 2026).</w:t>
+      <w:r>
+        <w:t>Hyperbots (2026) Workflow history. Available at: https://www.hyperbots.com/glossary/workflow-history (Accessed: 2 October 2026).</w:t>
       </w:r>
     </w:p>
     <w:p>
@@ -502,13 +462,8 @@
           <w:numId w:val="38"/>
         </w:numPr>
       </w:pPr>
-      <w:proofErr w:type="spellStart"/>
-      <w:r>
-        <w:t>SearchInform</w:t>
-      </w:r>
-      <w:proofErr w:type="spellEnd"/>
-      <w:r>
-        <w:t xml:space="preserve"> (2026) Workflow management: Monitoring. Available at: https://searchinform.com/articles/cybersecurity/measures/security-monitoring/workflow management/monitoring/ (Accessed: 2 October 2026).  </w:t>
+      <w:r>
+        <w:t xml:space="preserve">SearchInform (2026) Workflow management: Monitoring. Available at: https://searchinform.com/articles/cybersecurity/measures/security-monitoring/workflow management/monitoring/ (Accessed: 2 October 2026).  </w:t>
       </w:r>
     </w:p>
     <w:p>
@@ -531,13 +486,8 @@
           <w:numId w:val="38"/>
         </w:numPr>
       </w:pPr>
-      <w:proofErr w:type="spellStart"/>
-      <w:r>
-        <w:t>JetAdmin</w:t>
-      </w:r>
-      <w:proofErr w:type="spellEnd"/>
-      <w:r>
-        <w:t xml:space="preserve"> (2026) Workflow versioning. Available at: https://www.jetadmin.io/ (IBM, 2026)blog/workflow-versioning/amp/ (Accessed: 2 October 2026).</w:t>
+      <w:r>
+        <w:t>JetAdmin (2026) Workflow versioning. Available at: https://www.jetadmin.io/ (IBM, 2026)blog/workflow-versioning/amp/ (Accessed: 2 October 2026).</w:t>
       </w:r>
     </w:p>
     <w:p/>
@@ -1781,10 +1731,10 @@
           <w:szCs w:val="22"/>
         </w:rPr>
         <w:drawing>
-          <wp:inline distT="0" distB="0" distL="0" distR="0" wp14:anchorId="5350054F" wp14:editId="0808A93A">
-            <wp:extent cx="4358640" cy="8272763"/>
-            <wp:effectExtent l="0" t="0" r="3810" b="0"/>
-            <wp:docPr id="7220520" name="Picture 3"/>
+          <wp:inline distT="0" distB="0" distL="0" distR="0" wp14:anchorId="70E48F42" wp14:editId="07E2B79F">
+            <wp:extent cx="6307136" cy="7038753"/>
+            <wp:effectExtent l="0" t="0" r="0" b="0"/>
+            <wp:docPr id="1" name="Picture 1" descr="A diagram of a diagram&#10;&#10;AI-generated content may be incorrect."/>
             <wp:cNvGraphicFramePr>
               <a:graphicFrameLocks xmlns:a="http://schemas.openxmlformats.org/drawingml/2006/main" noChangeAspect="1"/>
             </wp:cNvGraphicFramePr>
@@ -1792,7 +1742,7 @@
               <a:graphicData uri="http://schemas.openxmlformats.org/drawingml/2006/picture">
                 <pic:pic xmlns:pic="http://schemas.openxmlformats.org/drawingml/2006/picture">
                   <pic:nvPicPr>
-                    <pic:cNvPr id="7220520" name="Picture 7220520"/>
+                    <pic:cNvPr id="1" name="Picture 1" descr="A diagram of a diagram&#10;&#10;AI-generated content may be incorrect."/>
                     <pic:cNvPicPr/>
                   </pic:nvPicPr>
                   <pic:blipFill>
@@ -1810,7 +1760,7 @@
                   <pic:spPr>
                     <a:xfrm>
                       <a:off x="0" y="0"/>
-                      <a:ext cx="4365830" cy="8286409"/>
+                      <a:ext cx="6309408" cy="7041288"/>
                     </a:xfrm>
                     <a:prstGeom prst="rect">
                       <a:avLst/>
@@ -1842,6 +1792,46 @@
           <w:szCs w:val="22"/>
         </w:rPr>
       </w:pPr>
+    </w:p>
+    <w:p>
+      <w:pPr>
+        <w:rPr>
+          <w:b/>
+          <w:bCs/>
+          <w:sz w:val="22"/>
+          <w:szCs w:val="22"/>
+        </w:rPr>
+      </w:pPr>
+    </w:p>
+    <w:p>
+      <w:pPr>
+        <w:rPr>
+          <w:b/>
+          <w:bCs/>
+          <w:sz w:val="22"/>
+          <w:szCs w:val="22"/>
+        </w:rPr>
+      </w:pPr>
+    </w:p>
+    <w:p>
+      <w:pPr>
+        <w:rPr>
+          <w:b/>
+          <w:bCs/>
+          <w:sz w:val="22"/>
+          <w:szCs w:val="22"/>
+        </w:rPr>
+      </w:pPr>
+    </w:p>
+    <w:p>
+      <w:pPr>
+        <w:rPr>
+          <w:b/>
+          <w:bCs/>
+          <w:sz w:val="22"/>
+          <w:szCs w:val="22"/>
+        </w:rPr>
+      </w:pPr>
       <w:r>
         <w:rPr>
           <w:b/>
@@ -1862,6 +1852,16 @@
           <w:szCs w:val="22"/>
         </w:rPr>
       </w:pPr>
+    </w:p>
+    <w:p>
+      <w:pPr>
+        <w:rPr>
+          <w:b/>
+          <w:bCs/>
+          <w:sz w:val="22"/>
+          <w:szCs w:val="22"/>
+        </w:rPr>
+      </w:pPr>
       <w:r>
         <w:rPr>
           <w:b/>
@@ -1871,10 +1871,10 @@
           <w:szCs w:val="22"/>
         </w:rPr>
         <w:drawing>
-          <wp:inline distT="0" distB="0" distL="0" distR="0" wp14:anchorId="68A531D1" wp14:editId="61A813B3">
-            <wp:extent cx="4396740" cy="8388423"/>
-            <wp:effectExtent l="0" t="0" r="3810" b="0"/>
-            <wp:docPr id="1189055709" name="Picture 4"/>
+          <wp:inline distT="0" distB="0" distL="0" distR="0" wp14:anchorId="0D0237C5" wp14:editId="1E578805">
+            <wp:extent cx="5731510" cy="5549265"/>
+            <wp:effectExtent l="0" t="0" r="2540" b="0"/>
+            <wp:docPr id="4" name="Picture 4" descr="A white board with blue text&#10;&#10;AI-generated content may be incorrect."/>
             <wp:cNvGraphicFramePr>
               <a:graphicFrameLocks xmlns:a="http://schemas.openxmlformats.org/drawingml/2006/main" noChangeAspect="1"/>
             </wp:cNvGraphicFramePr>
@@ -1882,7 +1882,7 @@
               <a:graphicData uri="http://schemas.openxmlformats.org/drawingml/2006/picture">
                 <pic:pic xmlns:pic="http://schemas.openxmlformats.org/drawingml/2006/picture">
                   <pic:nvPicPr>
-                    <pic:cNvPr id="1189055709" name="Picture 1189055709"/>
+                    <pic:cNvPr id="4" name="Picture 4" descr="A white board with blue text&#10;&#10;AI-generated content may be incorrect."/>
                     <pic:cNvPicPr/>
                   </pic:nvPicPr>
                   <pic:blipFill>
@@ -1900,7 +1900,7 @@
                   <pic:spPr>
                     <a:xfrm>
                       <a:off x="0" y="0"/>
-                      <a:ext cx="4401152" cy="8396840"/>
+                      <a:ext cx="5731510" cy="5549265"/>
                     </a:xfrm>
                     <a:prstGeom prst="rect">
                       <a:avLst/>
@@ -1920,62 +1920,94 @@
           <w:color w:val="0070C0"/>
         </w:rPr>
       </w:pPr>
-      <w:r>
+    </w:p>
+    <w:p>
+      <w:pPr>
+        <w:pStyle w:val="Heading1"/>
         <w:rPr>
           <w:color w:val="0070C0"/>
         </w:rPr>
+      </w:pPr>
+    </w:p>
+    <w:p>
+      <w:pPr>
+        <w:pStyle w:val="Heading1"/>
+        <w:rPr>
+          <w:color w:val="0070C0"/>
+        </w:rPr>
+      </w:pPr>
+    </w:p>
+    <w:p>
+      <w:pPr>
+        <w:pStyle w:val="Heading1"/>
+        <w:rPr>
+          <w:color w:val="0070C0"/>
+        </w:rPr>
+      </w:pPr>
+    </w:p>
+    <w:p>
+      <w:pPr>
+        <w:pStyle w:val="Heading1"/>
+        <w:rPr>
+          <w:color w:val="0070C0"/>
+        </w:rPr>
+      </w:pPr>
+      <w:r>
+        <w:rPr>
+          <w:color w:val="0070C0"/>
+        </w:rPr>
+        <w:t>TASK 4</w:t>
+      </w:r>
+    </w:p>
+    <w:p>
+      <w:pPr>
+        <w:rPr>
+          <w:b/>
+          <w:bCs/>
+        </w:rPr>
+      </w:pPr>
+      <w:r>
+        <w:rPr>
+          <w:b/>
+          <w:bCs/>
+          <w:sz w:val="22"/>
+          <w:szCs w:val="22"/>
+        </w:rPr>
+        <w:t>Design Patterns for TIVIDY:</w:t>
+      </w:r>
+    </w:p>
+    <w:p>
+      <w:pPr>
+        <w:rPr>
+          <w:b/>
+          <w:bCs/>
+          <w:sz w:val="22"/>
+          <w:szCs w:val="22"/>
+        </w:rPr>
+      </w:pPr>
+      <w:r>
+        <w:rPr>
+          <w:b/>
+          <w:bCs/>
+          <w:sz w:val="22"/>
+          <w:szCs w:val="22"/>
+        </w:rPr>
+        <w:t>1. Observer Pattern</w:t>
+      </w:r>
+    </w:p>
+    <w:p>
+      <w:pPr>
+        <w:rPr>
+          <w:b/>
+          <w:bCs/>
+        </w:rPr>
+      </w:pPr>
+      <w:r>
+        <w:rPr>
+          <w:b/>
+          <w:bCs/>
+        </w:rPr>
         <w:lastRenderedPageBreak/>
-        <w:t>TASK 4</w:t>
-      </w:r>
-    </w:p>
-    <w:p>
-      <w:pPr>
-        <w:rPr>
-          <w:b/>
-          <w:bCs/>
-        </w:rPr>
-      </w:pPr>
-      <w:r>
-        <w:rPr>
-          <w:b/>
-          <w:bCs/>
-          <w:sz w:val="22"/>
-          <w:szCs w:val="22"/>
-        </w:rPr>
-        <w:t>Design Patterns for TIVIDY:</w:t>
-      </w:r>
-    </w:p>
-    <w:p>
-      <w:pPr>
-        <w:rPr>
-          <w:b/>
-          <w:bCs/>
-          <w:sz w:val="22"/>
-          <w:szCs w:val="22"/>
-        </w:rPr>
-      </w:pPr>
-      <w:r>
-        <w:rPr>
-          <w:b/>
-          <w:bCs/>
-          <w:sz w:val="22"/>
-          <w:szCs w:val="22"/>
-        </w:rPr>
-        <w:t>1. Observer Pattern</w:t>
-      </w:r>
-    </w:p>
-    <w:p>
-      <w:pPr>
-        <w:rPr>
-          <w:b/>
-          <w:bCs/>
-        </w:rPr>
-      </w:pPr>
-      <w:r>
-        <w:rPr>
-          <w:b/>
-          <w:bCs/>
-        </w:rPr>
         <w:t>Design Problem</w:t>
       </w:r>
     </w:p>
@@ -2058,18 +2090,14 @@
       </w:r>
     </w:p>
     <w:p>
-      <w:proofErr w:type="spellStart"/>
       <w:r>
         <w:t>WorkflowInstance</w:t>
       </w:r>
-      <w:proofErr w:type="spellEnd"/>
-    </w:p>
-    <w:p>
-      <w:proofErr w:type="spellStart"/>
+    </w:p>
+    <w:p>
       <w:r>
         <w:t>WorkItem</w:t>
       </w:r>
-      <w:proofErr w:type="spellEnd"/>
     </w:p>
     <w:p/>
     <w:p>
@@ -2078,25 +2106,19 @@
       </w:r>
     </w:p>
     <w:p>
-      <w:proofErr w:type="spellStart"/>
       <w:r>
         <w:t>NotificationObserver</w:t>
       </w:r>
-      <w:proofErr w:type="spellEnd"/>
-    </w:p>
-    <w:p>
-      <w:proofErr w:type="spellStart"/>
+    </w:p>
+    <w:p>
       <w:r>
         <w:t>HistoryObserver</w:t>
       </w:r>
-      <w:proofErr w:type="spellEnd"/>
-    </w:p>
-    <w:p>
-      <w:proofErr w:type="spellStart"/>
+    </w:p>
+    <w:p>
       <w:r>
         <w:t>ProgressObserver</w:t>
       </w:r>
-      <w:proofErr w:type="spellEnd"/>
     </w:p>
     <w:p>
       <w:pPr>
@@ -2115,23 +2137,7 @@
     </w:p>
     <w:p>
       <w:r>
-        <w:t xml:space="preserve">The </w:t>
-      </w:r>
-      <w:proofErr w:type="spellStart"/>
-      <w:r>
-        <w:t>WorkflowInstance</w:t>
-      </w:r>
-      <w:proofErr w:type="spellEnd"/>
-      <w:r>
-        <w:t xml:space="preserve"> or </w:t>
-      </w:r>
-      <w:proofErr w:type="spellStart"/>
-      <w:r>
-        <w:t>WorkItem</w:t>
-      </w:r>
-      <w:proofErr w:type="spellEnd"/>
-      <w:r>
-        <w:t xml:space="preserve"> notifies its registered observers when an important event or state change occurs.</w:t>
+        <w:t>The WorkflowInstance or WorkItem notifies its registered observers when an important event or state change occurs.</w:t>
       </w:r>
     </w:p>
     <w:p>
@@ -2176,23 +2182,7 @@
     </w:p>
     <w:p>
       <w:r>
-        <w:t xml:space="preserve">Observer prevents the </w:t>
-      </w:r>
-      <w:proofErr w:type="spellStart"/>
-      <w:r>
-        <w:t>WorkflowInstance</w:t>
-      </w:r>
-      <w:proofErr w:type="spellEnd"/>
-      <w:r>
-        <w:t xml:space="preserve"> or </w:t>
-      </w:r>
-      <w:proofErr w:type="spellStart"/>
-      <w:r>
-        <w:t>WorkItem</w:t>
-      </w:r>
-      <w:proofErr w:type="spellEnd"/>
-      <w:r>
-        <w:t xml:space="preserve"> from directly depending on every object that needs to react to workflow events.</w:t>
+        <w:t>Observer prevents the WorkflowInstance or WorkItem from directly depending on every object that needs to react to workflow events.</w:t>
       </w:r>
     </w:p>
     <w:p>
@@ -2212,23 +2202,7 @@
     </w:p>
     <w:p>
       <w:r>
-        <w:t xml:space="preserve">In TIVIDY, completing one work item can make the next one available, notify a participant, update the history and refresh progress. The set of interested parties differs between organisations, so none of these reactions can be hard-wired into </w:t>
-      </w:r>
-      <w:proofErr w:type="spellStart"/>
-      <w:r>
-        <w:t>WorkItem</w:t>
-      </w:r>
-      <w:proofErr w:type="spellEnd"/>
-      <w:r>
-        <w:t xml:space="preserve"> or </w:t>
-      </w:r>
-      <w:proofErr w:type="spellStart"/>
-      <w:r>
-        <w:t>WorkflowInstance</w:t>
-      </w:r>
-      <w:proofErr w:type="spellEnd"/>
-      <w:r>
-        <w:t>. A new concern, such as a monitoring view or another notification channel, subscribes as an observer without touching the source of the event.</w:t>
+        <w:t>In TIVIDY, completing one work item can make the next one available, notify a participant, update the history and refresh progress. The set of interested parties differs between organisations, so none of these reactions can be hard-wired into WorkItem or WorkflowInstance. A new concern, such as a monitoring view or another notification channel, subscribes as an observer without touching the source of the event.</w:t>
       </w:r>
     </w:p>
     <w:p>
@@ -2248,15 +2222,7 @@
     </w:p>
     <w:p>
       <w:r>
-        <w:t xml:space="preserve">Observer is triggered by State transitions. Command execution also notifies observers so the history is always current, and the </w:t>
-      </w:r>
-      <w:proofErr w:type="spellStart"/>
-      <w:r>
-        <w:t>EmailAdapter</w:t>
-      </w:r>
-      <w:proofErr w:type="spellEnd"/>
-      <w:r>
-        <w:t xml:space="preserve"> can register as an observer so the external email system is told about workflow events without the engine knowing its interface.</w:t>
+        <w:t>Observer is triggered by State transitions. Command execution also notifies observers so the history is always current, and the EmailAdapter can register as an observer so the external email system is told about workflow events without the engine knowing its interface.</w:t>
       </w:r>
     </w:p>
     <w:p/>
@@ -2276,32 +2242,32 @@
           <w:sz w:val="22"/>
           <w:szCs w:val="22"/>
         </w:rPr>
+        <w:t>2. Builder Pattern</w:t>
+      </w:r>
+    </w:p>
+    <w:p>
+      <w:pPr>
+        <w:rPr>
+          <w:b/>
+          <w:bCs/>
+        </w:rPr>
+      </w:pPr>
+      <w:r>
+        <w:rPr>
+          <w:b/>
+          <w:bCs/>
+        </w:rPr>
+        <w:t>Design Problem</w:t>
+      </w:r>
+    </w:p>
+    <w:p>
+      <w:r>
+        <w:t>Different organisations may need different workflow definitions.</w:t>
+      </w:r>
+    </w:p>
+    <w:p>
+      <w:r>
         <w:lastRenderedPageBreak/>
-        <w:t>2. Builder Pattern</w:t>
-      </w:r>
-    </w:p>
-    <w:p>
-      <w:pPr>
-        <w:rPr>
-          <w:b/>
-          <w:bCs/>
-        </w:rPr>
-      </w:pPr>
-      <w:r>
-        <w:rPr>
-          <w:b/>
-          <w:bCs/>
-        </w:rPr>
-        <w:t>Design Problem</w:t>
-      </w:r>
-    </w:p>
-    <w:p>
-      <w:r>
-        <w:t>Different organisations may need different workflow definitions.</w:t>
-      </w:r>
-    </w:p>
-    <w:p>
-      <w:r>
         <w:t>One workflow may contain:</w:t>
       </w:r>
     </w:p>
@@ -2451,25 +2417,19 @@
       </w:r>
     </w:p>
     <w:p>
-      <w:proofErr w:type="spellStart"/>
       <w:r>
         <w:t>WorkflowBuilder</w:t>
       </w:r>
-      <w:proofErr w:type="spellEnd"/>
-    </w:p>
-    <w:p>
-      <w:proofErr w:type="spellStart"/>
+    </w:p>
+    <w:p>
       <w:r>
         <w:t>ConcreteWorkflowBuilder</w:t>
       </w:r>
-      <w:proofErr w:type="spellEnd"/>
-    </w:p>
-    <w:p>
-      <w:proofErr w:type="spellStart"/>
+    </w:p>
+    <w:p>
       <w:r>
         <w:t>WorkflowDefinition</w:t>
       </w:r>
-      <w:proofErr w:type="spellEnd"/>
     </w:p>
     <w:p>
       <w:r>
@@ -2477,53 +2437,28 @@
       </w:r>
     </w:p>
     <w:p>
-      <w:proofErr w:type="spellStart"/>
-      <w:r>
-        <w:t>addWorkItem</w:t>
-      </w:r>
-      <w:proofErr w:type="spellEnd"/>
-      <w:r>
-        <w:t>()</w:t>
-      </w:r>
-    </w:p>
-    <w:p>
-      <w:proofErr w:type="spellStart"/>
-      <w:r>
-        <w:t>addRole</w:t>
-      </w:r>
-      <w:proofErr w:type="spellEnd"/>
-      <w:r>
-        <w:t>()</w:t>
-      </w:r>
-    </w:p>
-    <w:p>
-      <w:proofErr w:type="spellStart"/>
-      <w:r>
-        <w:t>addDependency</w:t>
-      </w:r>
-      <w:proofErr w:type="spellEnd"/>
-      <w:r>
-        <w:t>()</w:t>
-      </w:r>
-    </w:p>
-    <w:p>
-      <w:proofErr w:type="spellStart"/>
-      <w:r>
-        <w:t>addRoutingRule</w:t>
-      </w:r>
-      <w:proofErr w:type="spellEnd"/>
-      <w:r>
-        <w:t>()</w:t>
-      </w:r>
-    </w:p>
-    <w:p>
-      <w:proofErr w:type="spellStart"/>
-      <w:r>
-        <w:t>addEscalationRule</w:t>
-      </w:r>
-      <w:proofErr w:type="spellEnd"/>
-      <w:r>
-        <w:t>()</w:t>
+      <w:r>
+        <w:t>addWorkItem()</w:t>
+      </w:r>
+    </w:p>
+    <w:p>
+      <w:r>
+        <w:t>addRole()</w:t>
+      </w:r>
+    </w:p>
+    <w:p>
+      <w:r>
+        <w:t>addDependency()</w:t>
+      </w:r>
+    </w:p>
+    <w:p>
+      <w:r>
+        <w:t>addRoutingRule()</w:t>
+      </w:r>
+    </w:p>
+    <w:p>
+      <w:r>
+        <w:t>addEscalationRule()</w:t>
       </w:r>
     </w:p>
     <w:p>
@@ -2548,15 +2483,7 @@
     </w:p>
     <w:p>
       <w:r>
-        <w:t xml:space="preserve">The builder constructs a </w:t>
-      </w:r>
-      <w:proofErr w:type="spellStart"/>
-      <w:r>
-        <w:t>WorkflowDefinition</w:t>
-      </w:r>
-      <w:proofErr w:type="spellEnd"/>
-      <w:r>
-        <w:t xml:space="preserve"> step by step.</w:t>
+        <w:t>The builder constructs a WorkflowDefinition step by step.</w:t>
       </w:r>
     </w:p>
     <w:p>
@@ -2616,90 +2543,37 @@
     </w:p>
     <w:p>
       <w:r>
-        <w:t xml:space="preserve">A </w:t>
-      </w:r>
-      <w:proofErr w:type="spellStart"/>
-      <w:r>
-        <w:t>WorkflowDefinition</w:t>
-      </w:r>
-      <w:proofErr w:type="spellEnd"/>
-      <w:r>
-        <w:t xml:space="preserve"> holds work items, roles, dependencies, routing rules and escalation rules. Creating that in one constructor does not scale across organisations. Builder lets the same construction steps produce a short linear process or a multi-step approval </w:t>
-      </w:r>
-      <w:proofErr w:type="gramStart"/>
-      <w:r>
-        <w:t>process, and</w:t>
-      </w:r>
-      <w:proofErr w:type="gramEnd"/>
-      <w:r>
-        <w:t xml:space="preserve"> keeps the definition separate from the running instances created from it.</w:t>
-      </w:r>
-    </w:p>
-    <w:p>
-      <w:pPr>
-        <w:rPr>
-          <w:b/>
-          <w:bCs/>
-        </w:rPr>
-      </w:pPr>
-      <w:r>
-        <w:rPr>
-          <w:b/>
-          <w:bCs/>
-        </w:rPr>
+        <w:t>A WorkflowDefinition holds work items, roles, dependencies, routing rules and escalation rules. Creating that in one constructor does not scale across organisations. Builder lets the same construction steps produce a short linear process or a multi-step approval process, and keeps the definition separate from the running instances created from it.</w:t>
+      </w:r>
+    </w:p>
+    <w:p>
+      <w:pPr>
+        <w:rPr>
+          <w:b/>
+          <w:bCs/>
+        </w:rPr>
+      </w:pPr>
+      <w:r>
+        <w:rPr>
+          <w:b/>
+          <w:bCs/>
+        </w:rPr>
+        <w:t>How It Connects</w:t>
+      </w:r>
+    </w:p>
+    <w:p>
+      <w:r>
+        <w:t xml:space="preserve">The Builder assembles the WorkflowComponent structure, sets the AssignmentStrategy, links the escalation Handler chain and </w:t>
+      </w:r>
+      <w:r>
+        <w:t xml:space="preserve">applies a PriorityDecorator where required when a </w:t>
+      </w:r>
+      <w:r>
         <w:lastRenderedPageBreak/>
-        <w:t>How It Connects</w:t>
-      </w:r>
-    </w:p>
-    <w:p>
-      <w:r>
-        <w:t xml:space="preserve">The Builder assembles the </w:t>
-      </w:r>
-      <w:proofErr w:type="spellStart"/>
-      <w:r>
-        <w:t>WorkflowComponent</w:t>
-      </w:r>
-      <w:proofErr w:type="spellEnd"/>
-      <w:r>
-        <w:t xml:space="preserve"> structure, sets the </w:t>
-      </w:r>
-      <w:proofErr w:type="spellStart"/>
-      <w:r>
-        <w:t>AssignmentStrategy</w:t>
-      </w:r>
-      <w:proofErr w:type="spellEnd"/>
-      <w:r>
-        <w:t xml:space="preserve">, links the escalation Handler chain and </w:t>
-      </w:r>
-      <w:r>
-        <w:t xml:space="preserve">applies a </w:t>
-      </w:r>
-      <w:proofErr w:type="spellStart"/>
-      <w:r>
-        <w:t>PriorityDecorator</w:t>
-      </w:r>
-      <w:proofErr w:type="spellEnd"/>
-      <w:r>
-        <w:t xml:space="preserve"> where required when a definition is built</w:t>
-      </w:r>
-      <w:r>
-        <w:t xml:space="preserve">, so routing and escalation behaviour belongs to the definition and is not </w:t>
-      </w:r>
-      <w:proofErr w:type="gramStart"/>
-      <w:r>
-        <w:t>hard-coded</w:t>
-      </w:r>
-      <w:proofErr w:type="gramEnd"/>
-      <w:r>
-        <w:t xml:space="preserve"> in the engine. </w:t>
-      </w:r>
-      <w:proofErr w:type="spellStart"/>
-      <w:r>
-        <w:t>TIVIDYFacade</w:t>
-      </w:r>
-      <w:proofErr w:type="spellEnd"/>
-      <w:r>
-        <w:t xml:space="preserve"> triggers the Builder for outside callers.</w:t>
+        <w:t>definition is built</w:t>
+      </w:r>
+      <w:r>
+        <w:t>, so routing and escalation behaviour belongs to the definition and is not hard-coded in the engine. TIVIDYFacade triggers the Builder for outside callers.</w:t>
       </w:r>
     </w:p>
     <w:p/>
@@ -2843,61 +2717,45 @@
       </w:r>
     </w:p>
     <w:p>
-      <w:proofErr w:type="spellStart"/>
       <w:r>
         <w:t>WorkflowInstance</w:t>
       </w:r>
-      <w:proofErr w:type="spellEnd"/>
     </w:p>
     <w:p/>
     <w:p>
-      <w:proofErr w:type="spellStart"/>
       <w:r>
         <w:t>WorkflowState</w:t>
       </w:r>
-      <w:proofErr w:type="spellEnd"/>
-    </w:p>
-    <w:p>
-      <w:proofErr w:type="spellStart"/>
+    </w:p>
+    <w:p>
       <w:r>
         <w:t>SubmittedState</w:t>
       </w:r>
-      <w:proofErr w:type="spellEnd"/>
-    </w:p>
-    <w:p>
-      <w:proofErr w:type="spellStart"/>
+    </w:p>
+    <w:p>
       <w:r>
         <w:t>ActiveState</w:t>
       </w:r>
-      <w:proofErr w:type="spellEnd"/>
-    </w:p>
-    <w:p>
-      <w:proofErr w:type="spellStart"/>
+    </w:p>
+    <w:p>
       <w:r>
         <w:t>InProgressState</w:t>
       </w:r>
-      <w:proofErr w:type="spellEnd"/>
-    </w:p>
-    <w:p>
-      <w:proofErr w:type="spellStart"/>
+    </w:p>
+    <w:p>
       <w:r>
         <w:t>EscalatedState</w:t>
       </w:r>
-      <w:proofErr w:type="spellEnd"/>
-    </w:p>
-    <w:p>
-      <w:proofErr w:type="spellStart"/>
+    </w:p>
+    <w:p>
       <w:r>
         <w:t>ResolvedState</w:t>
       </w:r>
-      <w:proofErr w:type="spellEnd"/>
-    </w:p>
-    <w:p>
-      <w:proofErr w:type="spellStart"/>
+    </w:p>
+    <w:p>
       <w:r>
         <w:t>ClosedState</w:t>
       </w:r>
-      <w:proofErr w:type="spellEnd"/>
     </w:p>
     <w:p>
       <w:pPr>
@@ -2915,21 +2773,8 @@
       </w:r>
     </w:p>
     <w:p>
-      <w:proofErr w:type="spellStart"/>
-      <w:r>
-        <w:t>WorkflowInstance</w:t>
-      </w:r>
-      <w:proofErr w:type="spellEnd"/>
-      <w:r>
-        <w:t xml:space="preserve"> stores a current </w:t>
-      </w:r>
-      <w:proofErr w:type="spellStart"/>
-      <w:r>
-        <w:t>WorkflowState</w:t>
-      </w:r>
-      <w:proofErr w:type="spellEnd"/>
-      <w:r>
-        <w:t>.</w:t>
+      <w:r>
+        <w:t>WorkflowInstance stores a current WorkflowState.</w:t>
       </w:r>
     </w:p>
     <w:p>
@@ -2994,52 +2839,33 @@
     </w:p>
     <w:p>
       <w:r>
-        <w:t xml:space="preserve">A running case behaves differently depending on where it is in its lifecycle. A newly submitted case can be reviewed and assigned, an active case can be processed, an </w:t>
-      </w:r>
-      <w:r>
+        <w:t>A running case behaves differently depending on where it is in its lifecycle. A newly submitted case can be reviewed and assigned, an active case can be processed, an escalated case requires higher-level handling, and a resolved or closed case should no longer continue through the workflow.</w:t>
+      </w:r>
+    </w:p>
+    <w:p>
+      <w:r>
+        <w:t>Using the State pattern keeps this behaviour separate from WorkflowInstance and makes it easier to add new states later if needed.</w:t>
+      </w:r>
+    </w:p>
+    <w:p>
+      <w:pPr>
+        <w:rPr>
+          <w:b/>
+          <w:bCs/>
+        </w:rPr>
+      </w:pPr>
+      <w:r>
+        <w:rPr>
+          <w:b/>
+          <w:bCs/>
+        </w:rPr>
         <w:lastRenderedPageBreak/>
-        <w:t>escalated case requires higher-level handling, and a resolved or closed case should no longer continue through the workflow.</w:t>
-      </w:r>
-    </w:p>
-    <w:p>
-      <w:r>
-        <w:t xml:space="preserve">Using the State pattern keeps this behaviour separate from </w:t>
-      </w:r>
-      <w:proofErr w:type="spellStart"/>
-      <w:r>
-        <w:t>WorkflowInstance</w:t>
-      </w:r>
-      <w:proofErr w:type="spellEnd"/>
-      <w:r>
-        <w:t xml:space="preserve"> and makes it easier to add new states later if needed.</w:t>
-      </w:r>
-    </w:p>
-    <w:p>
-      <w:pPr>
-        <w:rPr>
-          <w:b/>
-          <w:bCs/>
-        </w:rPr>
-      </w:pPr>
-      <w:r>
-        <w:rPr>
-          <w:b/>
-          <w:bCs/>
-        </w:rPr>
         <w:t>How It Connects</w:t>
       </w:r>
     </w:p>
     <w:p>
       <w:r>
-        <w:t xml:space="preserve">State transitions can trigger Observer notifications. Commands can cause state changes, and Memento can preserve earlier workflow states for rollback where appropriate. When a workflow enters </w:t>
-      </w:r>
-      <w:proofErr w:type="spellStart"/>
-      <w:r>
-        <w:t>EscalatedState</w:t>
-      </w:r>
-      <w:proofErr w:type="spellEnd"/>
-      <w:r>
-        <w:t>, the Chain of Responsibility can be used to determine the next handler.</w:t>
+        <w:t>State transitions can trigger Observer notifications. Commands can cause state changes, and Memento can preserve earlier workflow states for rollback where appropriate. When a workflow enters EscalatedState, the Chain of Responsibility can be used to determine the next handler.</w:t>
       </w:r>
     </w:p>
     <w:p/>
@@ -3113,15 +2939,7 @@
     </w:p>
     <w:p>
       <w:r>
-        <w:t xml:space="preserve">The assignment method should be able to change without changing the </w:t>
-      </w:r>
-      <w:proofErr w:type="spellStart"/>
-      <w:r>
-        <w:t>WorkItem</w:t>
-      </w:r>
-      <w:proofErr w:type="spellEnd"/>
-      <w:r>
-        <w:t xml:space="preserve"> class.</w:t>
+        <w:t>The assignment method should be able to change without changing the WorkItem class.</w:t>
       </w:r>
     </w:p>
     <w:p>
@@ -3140,26 +2958,20 @@
       </w:r>
     </w:p>
     <w:p>
-      <w:proofErr w:type="spellStart"/>
       <w:r>
         <w:t>AssignmentStrategy</w:t>
       </w:r>
-      <w:proofErr w:type="spellEnd"/>
     </w:p>
     <w:p/>
     <w:p>
-      <w:proofErr w:type="spellStart"/>
       <w:r>
         <w:t>RoleBasedAssignment</w:t>
       </w:r>
-      <w:proofErr w:type="spellEnd"/>
-    </w:p>
-    <w:p>
-      <w:proofErr w:type="spellStart"/>
+    </w:p>
+    <w:p>
       <w:r>
         <w:t>WorkloadBasedAssignment</w:t>
       </w:r>
-      <w:proofErr w:type="spellEnd"/>
     </w:p>
     <w:p>
       <w:pPr>
@@ -3178,15 +2990,7 @@
     </w:p>
     <w:p>
       <w:r>
-        <w:t xml:space="preserve">TIVIDY stores an </w:t>
-      </w:r>
-      <w:proofErr w:type="spellStart"/>
-      <w:r>
-        <w:t>AssignmentStrategy</w:t>
-      </w:r>
-      <w:proofErr w:type="spellEnd"/>
-      <w:r>
-        <w:t xml:space="preserve"> and asks it to determine which participant should receive a work item.</w:t>
+        <w:t>TIVIDY stores an AssignmentStrategy and asks it to determine which participant should receive a work item.</w:t>
       </w:r>
     </w:p>
     <w:p>
@@ -3246,15 +3050,7 @@
     </w:p>
     <w:p>
       <w:r>
-        <w:t xml:space="preserve">Organisations route work differently: by participant role or by current workload, or by a rule calculated from the workflow's own data. Each rule becomes its own class, so the choice is configuration and not a change to </w:t>
-      </w:r>
-      <w:proofErr w:type="spellStart"/>
-      <w:r>
-        <w:t>WorkItem</w:t>
-      </w:r>
-      <w:proofErr w:type="spellEnd"/>
-      <w:r>
-        <w:t xml:space="preserve"> or the engine.</w:t>
+        <w:t>Organisations route work differently: by participant role or by current workload, or by a rule calculated from the workflow's own data. Each rule becomes its own class, so the choice is configuration and not a change to WorkItem or the engine.</w:t>
       </w:r>
     </w:p>
     <w:p>
@@ -3274,23 +3070,7 @@
     </w:p>
     <w:p>
       <w:r>
-        <w:t xml:space="preserve">The configured </w:t>
-      </w:r>
-      <w:proofErr w:type="spellStart"/>
-      <w:r>
-        <w:t>AssignmentStrategy</w:t>
-      </w:r>
-      <w:proofErr w:type="spellEnd"/>
-      <w:r>
-        <w:t xml:space="preserve"> is used when a work item becomes Available or a routing decision point is reached. It is set on the </w:t>
-      </w:r>
-      <w:proofErr w:type="spellStart"/>
-      <w:r>
-        <w:t>WorkflowDefinition</w:t>
-      </w:r>
-      <w:proofErr w:type="spellEnd"/>
-      <w:r>
-        <w:t xml:space="preserve"> through the Builder. Priority handling is not part of Strategy; it is covered by the Decorator pattern, and a strategy can read a work item's priority when selecting a participant.</w:t>
+        <w:t>The configured AssignmentStrategy is used when a work item becomes Available or a routing decision point is reached. It is set on the WorkflowDefinition through the Builder. Priority handling is not part of Strategy; it is covered by the Decorator pattern, and a strategy can read a work item's priority when selecting a participant.</w:t>
       </w:r>
     </w:p>
     <w:p/>
@@ -3310,27 +3090,27 @@
           <w:sz w:val="22"/>
           <w:szCs w:val="22"/>
         </w:rPr>
+        <w:t>5. Chain of Responsibility Pattern</w:t>
+      </w:r>
+    </w:p>
+    <w:p>
+      <w:pPr>
+        <w:rPr>
+          <w:b/>
+          <w:bCs/>
+        </w:rPr>
+      </w:pPr>
+      <w:r>
+        <w:rPr>
+          <w:b/>
+          <w:bCs/>
+        </w:rPr>
+        <w:t>Design Problem</w:t>
+      </w:r>
+    </w:p>
+    <w:p>
+      <w:r>
         <w:lastRenderedPageBreak/>
-        <w:t>5. Chain of Responsibility Pattern</w:t>
-      </w:r>
-    </w:p>
-    <w:p>
-      <w:pPr>
-        <w:rPr>
-          <w:b/>
-          <w:bCs/>
-        </w:rPr>
-      </w:pPr>
-      <w:r>
-        <w:rPr>
-          <w:b/>
-          <w:bCs/>
-        </w:rPr>
-        <w:t>Design Problem</w:t>
-      </w:r>
-    </w:p>
-    <w:p>
-      <w:r>
         <w:t>Some work may need to be escalated through several levels until an appropriate participant can handle it.</w:t>
       </w:r>
     </w:p>
@@ -3366,32 +3146,24 @@
     </w:p>
     <w:p/>
     <w:p>
-      <w:proofErr w:type="spellStart"/>
       <w:r>
         <w:t>WorkHandler</w:t>
       </w:r>
-      <w:proofErr w:type="spellEnd"/>
-    </w:p>
-    <w:p>
-      <w:proofErr w:type="spellStart"/>
+    </w:p>
+    <w:p>
       <w:r>
         <w:t>ApprovalHandler</w:t>
       </w:r>
-      <w:proofErr w:type="spellEnd"/>
-    </w:p>
-    <w:p>
-      <w:proofErr w:type="spellStart"/>
+    </w:p>
+    <w:p>
       <w:r>
         <w:t>EscalationHandler</w:t>
       </w:r>
-      <w:proofErr w:type="spellEnd"/>
-    </w:p>
-    <w:p>
-      <w:proofErr w:type="spellStart"/>
+    </w:p>
+    <w:p>
       <w:r>
         <w:t>FinalDecisionHandler</w:t>
       </w:r>
-      <w:proofErr w:type="spellEnd"/>
     </w:p>
     <w:p>
       <w:pPr>
@@ -3455,15 +3227,7 @@
     </w:p>
     <w:p>
       <w:r>
-        <w:t xml:space="preserve">Chain of Responsibility provides a flexible way to manage escalation without </w:t>
-      </w:r>
-      <w:proofErr w:type="gramStart"/>
-      <w:r>
-        <w:t>hard-coding</w:t>
-      </w:r>
-      <w:proofErr w:type="gramEnd"/>
-      <w:r>
-        <w:t xml:space="preserve"> every escalation level into one class.</w:t>
+        <w:t>Chain of Responsibility provides a flexible way to manage escalation without hard-coding every escalation level into one class.</w:t>
       </w:r>
     </w:p>
     <w:p>
@@ -3503,31 +3267,10 @@
     </w:p>
     <w:p>
       <w:r>
-        <w:t xml:space="preserve">The chain is invoked when the </w:t>
-      </w:r>
-      <w:proofErr w:type="spellStart"/>
-      <w:r>
-        <w:t>WorkflowInstance</w:t>
-      </w:r>
-      <w:proofErr w:type="spellEnd"/>
-      <w:r>
-        <w:t xml:space="preserve"> enters </w:t>
-      </w:r>
-      <w:proofErr w:type="spellStart"/>
-      <w:r>
-        <w:t>EscalatedState</w:t>
-      </w:r>
-      <w:proofErr w:type="spellEnd"/>
-      <w:r>
-        <w:t xml:space="preserve">. The Builder constructs it as part of the </w:t>
-      </w:r>
-      <w:proofErr w:type="spellStart"/>
-      <w:r>
-        <w:t>WorkflowDefinition</w:t>
-      </w:r>
-      <w:proofErr w:type="spellEnd"/>
-      <w:r>
-        <w:t>, each handler corresponds to a participant role, and each approval or escalation outcome is recorded as a Command, with Observer notifying the relevant parties.</w:t>
+        <w:t>The chain is invoked when the WorkflowInstance enters EscalatedState</w:t>
+      </w:r>
+      <w:r>
+        <w:t>. The Builder constructs it as part of the WorkflowDefinition, each handler corresponds to a participant role, and each approval or escalation outcome is recorded as a Command, with Observer notifying the relevant parties.</w:t>
       </w:r>
     </w:p>
     <w:p/>
@@ -3596,7 +3339,6 @@
         </w:numPr>
       </w:pPr>
       <w:r>
-        <w:lastRenderedPageBreak/>
         <w:t>Complete work</w:t>
       </w:r>
     </w:p>
@@ -3633,6 +3375,7 @@
         </w:numPr>
       </w:pPr>
       <w:r>
+        <w:lastRenderedPageBreak/>
         <w:t>Close work</w:t>
       </w:r>
     </w:p>
@@ -3663,46 +3406,34 @@
     </w:p>
     <w:p/>
     <w:p>
-      <w:proofErr w:type="spellStart"/>
       <w:r>
         <w:t>AssignWorkCommand</w:t>
       </w:r>
-      <w:proofErr w:type="spellEnd"/>
-    </w:p>
-    <w:p>
-      <w:proofErr w:type="spellStart"/>
+    </w:p>
+    <w:p>
       <w:r>
         <w:t>CompleteWorkCommand</w:t>
       </w:r>
-      <w:proofErr w:type="spellEnd"/>
-    </w:p>
-    <w:p>
-      <w:proofErr w:type="spellStart"/>
+    </w:p>
+    <w:p>
       <w:r>
         <w:t>EscalateWorkCommand</w:t>
       </w:r>
-      <w:proofErr w:type="spellEnd"/>
-    </w:p>
-    <w:p>
-      <w:proofErr w:type="spellStart"/>
+    </w:p>
+    <w:p>
       <w:r>
         <w:t>ApproveWorkCommand</w:t>
       </w:r>
-      <w:proofErr w:type="spellEnd"/>
-    </w:p>
-    <w:p>
-      <w:proofErr w:type="spellStart"/>
+    </w:p>
+    <w:p>
       <w:r>
         <w:t>CancelWorkCommand</w:t>
       </w:r>
-      <w:proofErr w:type="spellEnd"/>
-    </w:p>
-    <w:p>
-      <w:proofErr w:type="spellStart"/>
+    </w:p>
+    <w:p>
       <w:r>
         <w:t>CloseWorkflowCommand</w:t>
       </w:r>
-      <w:proofErr w:type="spellEnd"/>
     </w:p>
     <w:p>
       <w:pPr>
@@ -3726,15 +3457,7 @@
     </w:p>
     <w:p>
       <w:r>
-        <w:t xml:space="preserve">The workflow system executes the required command when the action must occur. </w:t>
-      </w:r>
-      <w:proofErr w:type="spellStart"/>
-      <w:r>
-        <w:t>CloseWorkflowCommand</w:t>
-      </w:r>
-      <w:proofErr w:type="spellEnd"/>
-      <w:r>
-        <w:t xml:space="preserve"> is used when a running case must be formally closed, such as when a student retracts a complaint or when a final appeal is denied.</w:t>
+        <w:t>The workflow system executes the required command when the action must occur. CloseWorkflowCommand is used when a running case must be formally closed, such as when a student retracts a complaint or when a final appeal is denied.</w:t>
       </w:r>
     </w:p>
     <w:p>
@@ -3794,15 +3517,193 @@
     </w:p>
     <w:p>
       <w:r>
-        <w:t xml:space="preserve">The system must be able to explain what happened, in what order and by whom, and some actions must be reversible. Placing that inside </w:t>
-      </w:r>
-      <w:proofErr w:type="spellStart"/>
+        <w:t>The system must be able to explain what happened, in what order and by whom, and some actions must be reversible. Placing that inside WorkItem would mix audit responsibility into the work item and make rollback hard. Command objects can be stored, logged, queued and undone independently.</w:t>
+      </w:r>
+    </w:p>
+    <w:p>
+      <w:pPr>
+        <w:rPr>
+          <w:b/>
+          <w:bCs/>
+        </w:rPr>
+      </w:pPr>
+      <w:r>
+        <w:rPr>
+          <w:b/>
+          <w:bCs/>
+        </w:rPr>
+        <w:t>How It Connects</w:t>
+      </w:r>
+    </w:p>
+    <w:p>
+      <w:r>
+        <w:t>Before a reversible action, a Command can request a WorkflowMemento and use it on undo. Command execution fires Observer notifications so the history stays current, Commands call Adapters when an action needs an external system, and TIVIDYFacade is the entry point through which commands are submitted.</w:t>
+      </w:r>
+    </w:p>
+    <w:p/>
+    <w:p>
+      <w:pPr>
+        <w:rPr>
+          <w:b/>
+          <w:bCs/>
+          <w:sz w:val="22"/>
+          <w:szCs w:val="22"/>
+        </w:rPr>
+      </w:pPr>
+      <w:r>
+        <w:rPr>
+          <w:b/>
+          <w:bCs/>
+          <w:sz w:val="22"/>
+          <w:szCs w:val="22"/>
+        </w:rPr>
+        <w:t>7. Composite Pattern</w:t>
+      </w:r>
+    </w:p>
+    <w:p>
+      <w:pPr>
+        <w:rPr>
+          <w:b/>
+          <w:bCs/>
+        </w:rPr>
+      </w:pPr>
+      <w:r>
+        <w:rPr>
+          <w:b/>
+          <w:bCs/>
+        </w:rPr>
+        <w:t>Design Problem</w:t>
+      </w:r>
+    </w:p>
+    <w:p>
+      <w:r>
+        <w:t>A workflow may contain simple work items, groups of work items, stages or smaller sub-processes.</w:t>
+      </w:r>
+    </w:p>
+    <w:p>
+      <w:r>
+        <w:t>The system should be able to manage simple and grouped work in a consistent way.</w:t>
+      </w:r>
+    </w:p>
+    <w:p>
+      <w:pPr>
+        <w:rPr>
+          <w:b/>
+          <w:bCs/>
+        </w:rPr>
+      </w:pPr>
+      <w:r>
+        <w:rPr>
+          <w:b/>
+          <w:bCs/>
+        </w:rPr>
+        <w:t>Possible Classes</w:t>
+      </w:r>
+    </w:p>
+    <w:p>
+      <w:r>
+        <w:t>WorkflowComponent</w:t>
+      </w:r>
+    </w:p>
+    <w:p/>
+    <w:p>
       <w:r>
         <w:t>WorkItem</w:t>
       </w:r>
-      <w:proofErr w:type="spellEnd"/>
-      <w:r>
-        <w:t xml:space="preserve"> would mix audit responsibility into the work item and make rollback hard. Command objects can be stored, logged, queued and undone independently.</w:t>
+    </w:p>
+    <w:p>
+      <w:r>
+        <w:t>WorkflowStage</w:t>
+      </w:r>
+    </w:p>
+    <w:p>
+      <w:r>
+        <w:t>SubProcess</w:t>
+      </w:r>
+    </w:p>
+    <w:p>
+      <w:pPr>
+        <w:rPr>
+          <w:b/>
+          <w:bCs/>
+        </w:rPr>
+      </w:pPr>
+      <w:r>
+        <w:rPr>
+          <w:b/>
+          <w:bCs/>
+        </w:rPr>
+        <w:t>Collaboration</w:t>
+      </w:r>
+    </w:p>
+    <w:p>
+      <w:r>
+        <w:t>WorkItem represents a simple component.</w:t>
+      </w:r>
+    </w:p>
+    <w:p>
+      <w:r>
+        <w:t>WorkflowStage or SubProcess can contain other WorkflowComponent objects.</w:t>
+      </w:r>
+    </w:p>
+    <w:p>
+      <w:pPr>
+        <w:rPr>
+          <w:b/>
+          <w:bCs/>
+        </w:rPr>
+      </w:pPr>
+      <w:r>
+        <w:rPr>
+          <w:b/>
+          <w:bCs/>
+        </w:rPr>
+        <w:t>What Varies</w:t>
+      </w:r>
+    </w:p>
+    <w:p>
+      <w:r>
+        <w:t>The structure and nesting of workflow activities.</w:t>
+      </w:r>
+    </w:p>
+    <w:p>
+      <w:pPr>
+        <w:rPr>
+          <w:b/>
+          <w:bCs/>
+        </w:rPr>
+      </w:pPr>
+      <w:r>
+        <w:rPr>
+          <w:b/>
+          <w:bCs/>
+        </w:rPr>
+        <w:t>Why It Is Appropriate</w:t>
+      </w:r>
+    </w:p>
+    <w:p>
+      <w:r>
+        <w:t>Composite allows individual tasks and groups of tasks to be treated through a common interface.</w:t>
+      </w:r>
+    </w:p>
+    <w:p>
+      <w:pPr>
+        <w:rPr>
+          <w:b/>
+          <w:bCs/>
+        </w:rPr>
+      </w:pPr>
+      <w:r>
+        <w:rPr>
+          <w:b/>
+          <w:bCs/>
+        </w:rPr>
+        <w:t>Workflow Justification</w:t>
+      </w:r>
+    </w:p>
+    <w:p>
+      <w:r>
+        <w:t>Work is nested: a stage holds work items, and some work items hold smaller sub-processes. The engine must assign, start, complete and track a single WorkItem or a whole WorkflowStage through the same interface, without needing to know whether it holds one item or many.</w:t>
       </w:r>
     </w:p>
     <w:p>
@@ -3822,23 +3723,22 @@
     </w:p>
     <w:p>
       <w:r>
-        <w:t xml:space="preserve">Before a reversible action, a Command can request a </w:t>
-      </w:r>
-      <w:proofErr w:type="spellStart"/>
-      <w:r>
-        <w:t>WorkflowMemento</w:t>
-      </w:r>
-      <w:proofErr w:type="spellEnd"/>
-      <w:r>
-        <w:t xml:space="preserve"> and use it on undo. Command execution fires Observer notifications so the history stays current, Commands call Adapters when an action needs an external system, and </w:t>
-      </w:r>
-      <w:proofErr w:type="spellStart"/>
-      <w:r>
-        <w:t>TIVIDYFacade</w:t>
-      </w:r>
-      <w:proofErr w:type="spellEnd"/>
-      <w:r>
-        <w:t xml:space="preserve"> is the entry point through which commands are submitted.</w:t>
+        <w:t xml:space="preserve">Composite is the structure the Builder assembles for a WorkflowDefinition. </w:t>
+      </w:r>
+      <w:r>
+        <w:t>The Composite structure represents the work contained in a WorkflowDefinition, while the running WorkflowInstance is governed by the State pattern</w:t>
+      </w:r>
+      <w:r>
+        <w:t>.</w:t>
+      </w:r>
+      <w:r>
+        <w:t xml:space="preserve"> </w:t>
+      </w:r>
+      <w:r>
+        <w:t>PriorityDecorator can wrap a WorkItem that requires priority handling</w:t>
+      </w:r>
+      <w:r>
+        <w:t xml:space="preserve"> and the structure is what gets traversed for reporting and monitoring.</w:t>
       </w:r>
     </w:p>
     <w:p/>
@@ -3858,7 +3758,7 @@
           <w:sz w:val="22"/>
           <w:szCs w:val="22"/>
         </w:rPr>
-        <w:t>7. Composite Pattern</w:t>
+        <w:t>8. Adapter Pattern</w:t>
       </w:r>
     </w:p>
     <w:p>
@@ -3878,12 +3778,83 @@
     </w:p>
     <w:p>
       <w:r>
-        <w:t>A workflow may contain simple work items, groups of work items, stages or smaller sub-processes.</w:t>
-      </w:r>
-    </w:p>
-    <w:p>
-      <w:r>
-        <w:t>The system should be able to manage simple and grouped work in a consistent way.</w:t>
+        <w:t>TIVIDY may need to communicate with external systems whose interfaces are different from its own.</w:t>
+      </w:r>
+    </w:p>
+    <w:p>
+      <w:pPr>
+        <w:rPr>
+          <w:b/>
+          <w:bCs/>
+        </w:rPr>
+      </w:pPr>
+      <w:r>
+        <w:rPr>
+          <w:b/>
+          <w:bCs/>
+        </w:rPr>
+        <w:t>Possible Classes</w:t>
+      </w:r>
+    </w:p>
+    <w:p>
+      <w:r>
+        <w:t>NotificationService</w:t>
+      </w:r>
+    </w:p>
+    <w:p/>
+    <w:p>
+      <w:r>
+        <w:t>EmailAdapter</w:t>
+      </w:r>
+    </w:p>
+    <w:p>
+      <w:r>
+        <w:t>ExternalEmailService</w:t>
+      </w:r>
+    </w:p>
+    <w:p>
+      <w:pPr>
+        <w:rPr>
+          <w:b/>
+          <w:bCs/>
+        </w:rPr>
+      </w:pPr>
+      <w:r>
+        <w:rPr>
+          <w:b/>
+          <w:bCs/>
+        </w:rPr>
+        <w:t>Collaboration</w:t>
+      </w:r>
+    </w:p>
+    <w:p>
+      <w:r>
+        <w:t>TIVIDY communicates with the NotificationService interface.</w:t>
+      </w:r>
+    </w:p>
+    <w:p>
+      <w:r>
+        <w:t>EmailAdapter translates TIVIDY requests into the format required by the external email system.</w:t>
+      </w:r>
+    </w:p>
+    <w:p>
+      <w:pPr>
+        <w:rPr>
+          <w:b/>
+          <w:bCs/>
+        </w:rPr>
+      </w:pPr>
+      <w:r>
+        <w:rPr>
+          <w:b/>
+          <w:bCs/>
+        </w:rPr>
+        <w:t>What Varies</w:t>
+      </w:r>
+    </w:p>
+    <w:p>
+      <w:r>
+        <w:t>The external service being used.</w:t>
       </w:r>
     </w:p>
     <w:p>
@@ -3899,127 +3870,12 @@
           <w:bCs/>
         </w:rPr>
         <w:lastRenderedPageBreak/>
-        <w:t>Possible Classes</w:t>
-      </w:r>
-    </w:p>
-    <w:p>
-      <w:proofErr w:type="spellStart"/>
-      <w:r>
-        <w:t>WorkflowComponent</w:t>
-      </w:r>
-      <w:proofErr w:type="spellEnd"/>
-    </w:p>
-    <w:p/>
-    <w:p>
-      <w:proofErr w:type="spellStart"/>
-      <w:r>
-        <w:t>WorkItem</w:t>
-      </w:r>
-      <w:proofErr w:type="spellEnd"/>
-    </w:p>
-    <w:p>
-      <w:proofErr w:type="spellStart"/>
-      <w:r>
-        <w:t>WorkflowStage</w:t>
-      </w:r>
-      <w:proofErr w:type="spellEnd"/>
-    </w:p>
-    <w:p>
-      <w:proofErr w:type="spellStart"/>
-      <w:r>
-        <w:t>SubProcess</w:t>
-      </w:r>
-      <w:proofErr w:type="spellEnd"/>
-    </w:p>
-    <w:p>
-      <w:pPr>
-        <w:rPr>
-          <w:b/>
-          <w:bCs/>
-        </w:rPr>
-      </w:pPr>
-      <w:r>
-        <w:rPr>
-          <w:b/>
-          <w:bCs/>
-        </w:rPr>
-        <w:t>Collaboration</w:t>
-      </w:r>
-    </w:p>
-    <w:p>
-      <w:proofErr w:type="spellStart"/>
-      <w:r>
-        <w:t>WorkItem</w:t>
-      </w:r>
-      <w:proofErr w:type="spellEnd"/>
-      <w:r>
-        <w:t xml:space="preserve"> represents a simple component.</w:t>
-      </w:r>
-    </w:p>
-    <w:p>
-      <w:proofErr w:type="spellStart"/>
-      <w:r>
-        <w:t>WorkflowStage</w:t>
-      </w:r>
-      <w:proofErr w:type="spellEnd"/>
-      <w:r>
-        <w:t xml:space="preserve"> or </w:t>
-      </w:r>
-      <w:proofErr w:type="spellStart"/>
-      <w:r>
-        <w:t>SubProcess</w:t>
-      </w:r>
-      <w:proofErr w:type="spellEnd"/>
-      <w:r>
-        <w:t xml:space="preserve"> can contain other </w:t>
-      </w:r>
-      <w:proofErr w:type="spellStart"/>
-      <w:r>
-        <w:t>WorkflowComponent</w:t>
-      </w:r>
-      <w:proofErr w:type="spellEnd"/>
-      <w:r>
-        <w:t xml:space="preserve"> objects.</w:t>
-      </w:r>
-    </w:p>
-    <w:p>
-      <w:pPr>
-        <w:rPr>
-          <w:b/>
-          <w:bCs/>
-        </w:rPr>
-      </w:pPr>
-      <w:r>
-        <w:rPr>
-          <w:b/>
-          <w:bCs/>
-        </w:rPr>
-        <w:t>What Varies</w:t>
-      </w:r>
-    </w:p>
-    <w:p>
-      <w:r>
-        <w:t>The structure and nesting of workflow activities.</w:t>
-      </w:r>
-    </w:p>
-    <w:p>
-      <w:pPr>
-        <w:rPr>
-          <w:b/>
-          <w:bCs/>
-        </w:rPr>
-      </w:pPr>
-      <w:r>
-        <w:rPr>
-          <w:b/>
-          <w:bCs/>
-        </w:rPr>
         <w:t>Why It Is Appropriate</w:t>
       </w:r>
     </w:p>
     <w:p>
       <w:r>
-        <w:t>Composite allows individual tasks and groups of tasks to be treated through a common interface.</w:t>
+        <w:t>Adapter allows TIVIDY to communicate with external systems without making the core workflow system depend on their specific interfaces.</w:t>
       </w:r>
     </w:p>
     <w:p>
@@ -4039,23 +3895,7 @@
     </w:p>
     <w:p>
       <w:r>
-        <w:t xml:space="preserve">Work is nested: a stage holds work items, and some work items hold smaller sub-processes. The engine must assign, start, complete and track a single </w:t>
-      </w:r>
-      <w:proofErr w:type="spellStart"/>
-      <w:r>
-        <w:t>WorkItem</w:t>
-      </w:r>
-      <w:proofErr w:type="spellEnd"/>
-      <w:r>
-        <w:t xml:space="preserve"> or a whole </w:t>
-      </w:r>
-      <w:proofErr w:type="spellStart"/>
-      <w:r>
-        <w:t>WorkflowStage</w:t>
-      </w:r>
-      <w:proofErr w:type="spellEnd"/>
-      <w:r>
-        <w:t xml:space="preserve"> through the same interface, without needing to know whether it holds one item or many.</w:t>
+        <w:t>TIVIDY cannot depend on the interface of every external system. In the complaint scenario, confirmation and escalation notices are sent through an external email service. A new integration should mean a new adapter and not a change to the core engine.</w:t>
       </w:r>
     </w:p>
     <w:p>
@@ -4075,268 +3915,7 @@
     </w:p>
     <w:p>
       <w:r>
-        <w:t xml:space="preserve">Composite is the structure the Builder assembles for a </w:t>
-      </w:r>
-      <w:proofErr w:type="spellStart"/>
-      <w:r>
-        <w:t>WorkflowDefinition</w:t>
-      </w:r>
-      <w:proofErr w:type="spellEnd"/>
-      <w:r>
-        <w:t xml:space="preserve">. </w:t>
-      </w:r>
-      <w:r>
-        <w:t xml:space="preserve">The Composite structure represents the work contained in a </w:t>
-      </w:r>
-      <w:proofErr w:type="spellStart"/>
-      <w:r>
-        <w:t>WorkflowDefinition</w:t>
-      </w:r>
-      <w:proofErr w:type="spellEnd"/>
-      <w:r>
-        <w:t xml:space="preserve">, while the running </w:t>
-      </w:r>
-      <w:proofErr w:type="spellStart"/>
-      <w:r>
-        <w:t>WorkflowInstance</w:t>
-      </w:r>
-      <w:proofErr w:type="spellEnd"/>
-      <w:r>
-        <w:t xml:space="preserve"> is governed by the State pattern</w:t>
-      </w:r>
-      <w:r>
-        <w:t>.</w:t>
-      </w:r>
-      <w:r>
-        <w:t xml:space="preserve"> </w:t>
-      </w:r>
-      <w:proofErr w:type="spellStart"/>
-      <w:r>
-        <w:t>PriorityDecorator</w:t>
-      </w:r>
-      <w:proofErr w:type="spellEnd"/>
-      <w:r>
-        <w:t xml:space="preserve"> can wrap a </w:t>
-      </w:r>
-      <w:proofErr w:type="spellStart"/>
-      <w:r>
-        <w:t>WorkItem</w:t>
-      </w:r>
-      <w:proofErr w:type="spellEnd"/>
-      <w:r>
-        <w:t xml:space="preserve"> that requires priority handling</w:t>
-      </w:r>
-      <w:r>
-        <w:t xml:space="preserve"> and the structure is what gets traversed for reporting and monitoring.</w:t>
-      </w:r>
-    </w:p>
-    <w:p/>
-    <w:p>
-      <w:pPr>
-        <w:rPr>
-          <w:b/>
-          <w:bCs/>
-          <w:sz w:val="22"/>
-          <w:szCs w:val="22"/>
-        </w:rPr>
-      </w:pPr>
-      <w:r>
-        <w:rPr>
-          <w:b/>
-          <w:bCs/>
-          <w:sz w:val="22"/>
-          <w:szCs w:val="22"/>
-        </w:rPr>
-        <w:t>8. Adapter Pattern</w:t>
-      </w:r>
-    </w:p>
-    <w:p>
-      <w:pPr>
-        <w:rPr>
-          <w:b/>
-          <w:bCs/>
-        </w:rPr>
-      </w:pPr>
-      <w:r>
-        <w:rPr>
-          <w:b/>
-          <w:bCs/>
-        </w:rPr>
-        <w:t>Design Problem</w:t>
-      </w:r>
-    </w:p>
-    <w:p>
-      <w:r>
-        <w:t>TIVIDY may need to communicate with external systems whose interfaces are different from its own.</w:t>
-      </w:r>
-    </w:p>
-    <w:p>
-      <w:pPr>
-        <w:rPr>
-          <w:b/>
-          <w:bCs/>
-        </w:rPr>
-      </w:pPr>
-      <w:r>
-        <w:rPr>
-          <w:b/>
-          <w:bCs/>
-        </w:rPr>
-        <w:t>Possible Classes</w:t>
-      </w:r>
-    </w:p>
-    <w:p>
-      <w:proofErr w:type="spellStart"/>
-      <w:r>
-        <w:t>NotificationService</w:t>
-      </w:r>
-      <w:proofErr w:type="spellEnd"/>
-    </w:p>
-    <w:p/>
-    <w:p>
-      <w:proofErr w:type="spellStart"/>
-      <w:r>
-        <w:t>EmailAdapter</w:t>
-      </w:r>
-      <w:proofErr w:type="spellEnd"/>
-    </w:p>
-    <w:p>
-      <w:proofErr w:type="spellStart"/>
-      <w:r>
-        <w:t>ExternalEmailService</w:t>
-      </w:r>
-      <w:proofErr w:type="spellEnd"/>
-    </w:p>
-    <w:p>
-      <w:pPr>
-        <w:rPr>
-          <w:b/>
-          <w:bCs/>
-        </w:rPr>
-      </w:pPr>
-      <w:r>
-        <w:rPr>
-          <w:b/>
-          <w:bCs/>
-        </w:rPr>
-        <w:t>Collaboration</w:t>
-      </w:r>
-    </w:p>
-    <w:p>
-      <w:r>
-        <w:t xml:space="preserve">TIVIDY communicates with the </w:t>
-      </w:r>
-      <w:proofErr w:type="spellStart"/>
-      <w:r>
-        <w:t>NotificationService</w:t>
-      </w:r>
-      <w:proofErr w:type="spellEnd"/>
-      <w:r>
-        <w:t xml:space="preserve"> interface.</w:t>
-      </w:r>
-    </w:p>
-    <w:p>
-      <w:proofErr w:type="spellStart"/>
-      <w:r>
-        <w:t>EmailAdapter</w:t>
-      </w:r>
-      <w:proofErr w:type="spellEnd"/>
-      <w:r>
-        <w:t xml:space="preserve"> translates TIVIDY requests into the format required by the external email system.</w:t>
-      </w:r>
-    </w:p>
-    <w:p>
-      <w:pPr>
-        <w:rPr>
-          <w:b/>
-          <w:bCs/>
-        </w:rPr>
-      </w:pPr>
-      <w:r>
-        <w:rPr>
-          <w:b/>
-          <w:bCs/>
-        </w:rPr>
-        <w:lastRenderedPageBreak/>
-        <w:t>What Varies</w:t>
-      </w:r>
-    </w:p>
-    <w:p>
-      <w:r>
-        <w:t>The external service being used.</w:t>
-      </w:r>
-    </w:p>
-    <w:p>
-      <w:pPr>
-        <w:rPr>
-          <w:b/>
-          <w:bCs/>
-        </w:rPr>
-      </w:pPr>
-      <w:r>
-        <w:rPr>
-          <w:b/>
-          <w:bCs/>
-        </w:rPr>
-        <w:t>Why It Is Appropriate</w:t>
-      </w:r>
-    </w:p>
-    <w:p>
-      <w:r>
-        <w:t>Adapter allows TIVIDY to communicate with external systems without making the core workflow system depend on their specific interfaces.</w:t>
-      </w:r>
-    </w:p>
-    <w:p>
-      <w:pPr>
-        <w:rPr>
-          <w:b/>
-          <w:bCs/>
-        </w:rPr>
-      </w:pPr>
-      <w:r>
-        <w:rPr>
-          <w:b/>
-          <w:bCs/>
-        </w:rPr>
-        <w:t>Workflow Justification</w:t>
-      </w:r>
-    </w:p>
-    <w:p>
-      <w:r>
-        <w:t>TIVIDY cannot depend on the interface of every external system. In the complaint scenario, confirmation and escalation notices are sent through an external email service. A new integration should mean a new adapter and not a change to the core engine.</w:t>
-      </w:r>
-    </w:p>
-    <w:p>
-      <w:pPr>
-        <w:rPr>
-          <w:b/>
-          <w:bCs/>
-        </w:rPr>
-      </w:pPr>
-      <w:r>
-        <w:rPr>
-          <w:b/>
-          <w:bCs/>
-        </w:rPr>
-        <w:t>How It Connects</w:t>
-      </w:r>
-    </w:p>
-    <w:p>
-      <w:proofErr w:type="spellStart"/>
-      <w:r>
-        <w:t>EmailAdapter</w:t>
-      </w:r>
-      <w:proofErr w:type="spellEnd"/>
-      <w:r>
-        <w:t xml:space="preserve"> can register as an Observer so notifications go out when workflow events happen, and Commands use it when an action needs external communication. The engine only ever calls </w:t>
-      </w:r>
-      <w:proofErr w:type="spellStart"/>
-      <w:r>
-        <w:t>NotificationService</w:t>
-      </w:r>
-      <w:proofErr w:type="spellEnd"/>
-      <w:r>
-        <w:t>, never the foreign interface directly.</w:t>
+        <w:t>EmailAdapter can register as an Observer so notifications go out when workflow events happen, and Commands use it when an action needs external communication. The engine only ever calls NotificationService, never the foreign interface directly.</w:t>
       </w:r>
     </w:p>
     <w:p/>
@@ -4392,11 +3971,9 @@
           <w:numId w:val="37"/>
         </w:numPr>
       </w:pPr>
-      <w:proofErr w:type="spellStart"/>
       <w:r>
         <w:t>WorkflowDefinition</w:t>
       </w:r>
-      <w:proofErr w:type="spellEnd"/>
     </w:p>
     <w:p>
       <w:pPr>
@@ -4406,11 +3983,9 @@
           <w:numId w:val="37"/>
         </w:numPr>
       </w:pPr>
-      <w:proofErr w:type="spellStart"/>
       <w:r>
         <w:t>WorkflowInstance</w:t>
       </w:r>
-      <w:proofErr w:type="spellEnd"/>
     </w:p>
     <w:p>
       <w:pPr>
@@ -4420,11 +3995,9 @@
           <w:numId w:val="37"/>
         </w:numPr>
       </w:pPr>
-      <w:proofErr w:type="spellStart"/>
       <w:r>
         <w:t>WorkItem</w:t>
       </w:r>
-      <w:proofErr w:type="spellEnd"/>
     </w:p>
     <w:p>
       <w:pPr>
@@ -4434,11 +4007,9 @@
           <w:numId w:val="37"/>
         </w:numPr>
       </w:pPr>
-      <w:proofErr w:type="spellStart"/>
       <w:r>
         <w:t>AssignmentStrategy</w:t>
       </w:r>
-      <w:proofErr w:type="spellEnd"/>
     </w:p>
     <w:p>
       <w:pPr>
@@ -4478,92 +4049,241 @@
     </w:p>
     <w:p>
       <w:r>
-        <w:t xml:space="preserve">A user of TIVIDY should not need to interact directly with </w:t>
+        <w:t>A user of TIVIDY should not need to interact directly with all of these classes.</w:t>
+      </w:r>
+    </w:p>
+    <w:p>
+      <w:pPr>
+        <w:rPr>
+          <w:b/>
+          <w:bCs/>
+        </w:rPr>
+      </w:pPr>
+      <w:r>
+        <w:rPr>
+          <w:b/>
+          <w:bCs/>
+        </w:rPr>
+        <w:t>Possible Class</w:t>
+      </w:r>
+    </w:p>
+    <w:p>
+      <w:r>
+        <w:t>TIVIDYFacade</w:t>
+      </w:r>
+    </w:p>
+    <w:p>
+      <w:r>
+        <w:t>Possible operations:</w:t>
+      </w:r>
+    </w:p>
+    <w:p>
+      <w:r>
+        <w:t>createWorkflow()</w:t>
+      </w:r>
+    </w:p>
+    <w:p>
+      <w:r>
+        <w:t>startWorkflow()</w:t>
+      </w:r>
+    </w:p>
+    <w:p>
+      <w:r>
+        <w:t>assignWork()</w:t>
+      </w:r>
+    </w:p>
+    <w:p>
+      <w:r>
+        <w:t>completeWork()</w:t>
+      </w:r>
+    </w:p>
+    <w:p>
+      <w:r>
+        <w:t>escalateWork()</w:t>
+      </w:r>
+    </w:p>
+    <w:p>
+      <w:pPr>
+        <w:rPr>
+          <w:b/>
+          <w:bCs/>
+        </w:rPr>
+      </w:pPr>
+      <w:r>
+        <w:rPr>
+          <w:b/>
+          <w:bCs/>
+        </w:rPr>
+        <w:t>Collaboration</w:t>
+      </w:r>
+    </w:p>
+    <w:p>
+      <w:r>
+        <w:t>TIVIDYFacade provides a simple interface and delegates requests to the appropriate internal workflow objects.</w:t>
+      </w:r>
+    </w:p>
+    <w:p>
+      <w:pPr>
+        <w:rPr>
+          <w:b/>
+          <w:bCs/>
+        </w:rPr>
+      </w:pPr>
+      <w:r>
+        <w:rPr>
+          <w:b/>
+          <w:bCs/>
+        </w:rPr>
+        <w:t>What Varies</w:t>
+      </w:r>
+    </w:p>
+    <w:p>
+      <w:r>
+        <w:t>The internal implementation of TIVIDY can change while the external interface remains simpler and more stable.</w:t>
+      </w:r>
+    </w:p>
+    <w:p>
+      <w:pPr>
+        <w:rPr>
+          <w:b/>
+          <w:bCs/>
+        </w:rPr>
+      </w:pPr>
+      <w:r>
+        <w:rPr>
+          <w:b/>
+          <w:bCs/>
+        </w:rPr>
+        <w:t>Why It Is Appropriate</w:t>
+      </w:r>
+    </w:p>
+    <w:p>
+      <w:r>
+        <w:lastRenderedPageBreak/>
+        <w:t>Facade reduces the complexity of using the workflow system and hides unnecessary internal details.</w:t>
+      </w:r>
+    </w:p>
+    <w:p>
+      <w:pPr>
+        <w:rPr>
+          <w:b/>
+          <w:bCs/>
+        </w:rPr>
+      </w:pPr>
+      <w:r>
+        <w:rPr>
+          <w:b/>
+          <w:bCs/>
+        </w:rPr>
+        <w:t>Workflow Justification</w:t>
+      </w:r>
+    </w:p>
+    <w:p>
+      <w:r>
+        <w:t>TIVIDY contains definitions, instances, work items, strategies, event handling, history and notifications. A caller such as a user interface or the scenario layer should not need to know all of them. One entry point means internal refactoring does not ripple outwards.</w:t>
+      </w:r>
+    </w:p>
+    <w:p>
+      <w:pPr>
+        <w:rPr>
+          <w:b/>
+          <w:bCs/>
+        </w:rPr>
+      </w:pPr>
+      <w:r>
+        <w:rPr>
+          <w:b/>
+          <w:bCs/>
+        </w:rPr>
+        <w:t>How It Connects</w:t>
+      </w:r>
+    </w:p>
+    <w:p>
+      <w:r>
+        <w:t>TIVIDYFacade is the outermost layer. Calls such as createWorkflow(), assignWork() and completeWork() are delegated to the Builder, the Command objects, the State machine and the Observer system. The scenario layer talks to the engine only through the Facade.</w:t>
+      </w:r>
+    </w:p>
+    <w:p/>
+    <w:p>
+      <w:pPr>
+        <w:rPr>
+          <w:b/>
+          <w:bCs/>
+          <w:sz w:val="22"/>
+          <w:szCs w:val="22"/>
+        </w:rPr>
+      </w:pPr>
+      <w:r>
+        <w:rPr>
+          <w:b/>
+          <w:bCs/>
+          <w:sz w:val="22"/>
+          <w:szCs w:val="22"/>
+        </w:rPr>
+        <w:t>10. Memento Pattern</w:t>
+      </w:r>
+    </w:p>
+    <w:p>
+      <w:pPr>
+        <w:rPr>
+          <w:b/>
+          <w:bCs/>
+        </w:rPr>
+      </w:pPr>
+      <w:r>
+        <w:rPr>
+          <w:b/>
+          <w:bCs/>
+        </w:rPr>
+        <w:t>Design Problem</w:t>
+      </w:r>
+    </w:p>
+    <w:p>
+      <w:r>
+        <w:t>TIVIDY may need to preserve earlier workflow states for history or rollback.</w:t>
+      </w:r>
+    </w:p>
+    <w:p>
+      <w:r>
+        <w:t xml:space="preserve">For example, </w:t>
       </w:r>
       <w:proofErr w:type="gramStart"/>
       <w:r>
-        <w:t>all of</w:t>
+        <w:t>Before</w:t>
       </w:r>
       <w:proofErr w:type="gramEnd"/>
       <w:r>
-        <w:t xml:space="preserve"> these classes.</w:t>
-      </w:r>
-    </w:p>
-    <w:p>
-      <w:pPr>
-        <w:rPr>
-          <w:b/>
-          <w:bCs/>
-        </w:rPr>
-      </w:pPr>
-      <w:r>
-        <w:rPr>
-          <w:b/>
-          <w:bCs/>
-        </w:rPr>
-        <w:t>Possible Class</w:t>
-      </w:r>
-    </w:p>
-    <w:p>
-      <w:proofErr w:type="spellStart"/>
-      <w:r>
-        <w:t>TIVIDYFacade</w:t>
-      </w:r>
-      <w:proofErr w:type="spellEnd"/>
-    </w:p>
-    <w:p>
-      <w:r>
-        <w:t>Possible operations:</w:t>
-      </w:r>
-    </w:p>
-    <w:p>
-      <w:proofErr w:type="spellStart"/>
-      <w:r>
-        <w:t>createWorkflow</w:t>
-      </w:r>
-      <w:proofErr w:type="spellEnd"/>
-      <w:r>
-        <w:t>()</w:t>
-      </w:r>
-    </w:p>
-    <w:p>
-      <w:proofErr w:type="spellStart"/>
-      <w:r>
-        <w:t>startWorkflow</w:t>
-      </w:r>
-      <w:proofErr w:type="spellEnd"/>
-      <w:r>
-        <w:t>()</w:t>
-      </w:r>
-    </w:p>
-    <w:p>
-      <w:proofErr w:type="spellStart"/>
-      <w:r>
-        <w:t>assignWork</w:t>
-      </w:r>
-      <w:proofErr w:type="spellEnd"/>
-      <w:r>
-        <w:t>()</w:t>
-      </w:r>
-    </w:p>
-    <w:p>
-      <w:proofErr w:type="spellStart"/>
-      <w:r>
-        <w:t>completeWork</w:t>
-      </w:r>
-      <w:proofErr w:type="spellEnd"/>
-      <w:r>
-        <w:t>()</w:t>
-      </w:r>
-    </w:p>
-    <w:p>
-      <w:proofErr w:type="spellStart"/>
-      <w:r>
-        <w:t>escalateWork</w:t>
-      </w:r>
-      <w:proofErr w:type="spellEnd"/>
-      <w:r>
-        <w:t>()</w:t>
+        <w:t xml:space="preserve"> escalation, a WorkflowInstance may have been in InProgressState with a particular assignment and workflow position.</w:t>
+      </w:r>
+    </w:p>
+    <w:p>
+      <w:pPr>
+        <w:rPr>
+          <w:b/>
+          <w:bCs/>
+        </w:rPr>
+      </w:pPr>
+      <w:r>
+        <w:rPr>
+          <w:b/>
+          <w:bCs/>
+        </w:rPr>
+        <w:t>Possible Classes</w:t>
+      </w:r>
+    </w:p>
+    <w:p>
+      <w:r>
+        <w:t>WorkflowInstance</w:t>
+      </w:r>
+    </w:p>
+    <w:p>
+      <w:r>
+        <w:t>WorkflowMemento</w:t>
+      </w:r>
+    </w:p>
+    <w:p>
+      <w:r>
+        <w:t>WorkflowHistory</w:t>
       </w:r>
     </w:p>
     <w:p>
@@ -4582,13 +4302,13 @@
       </w:r>
     </w:p>
     <w:p>
-      <w:proofErr w:type="spellStart"/>
-      <w:r>
-        <w:t>TIVIDYFacade</w:t>
-      </w:r>
-      <w:proofErr w:type="spellEnd"/>
-      <w:r>
-        <w:t xml:space="preserve"> provides a simple interface and delegates requests to the appropriate internal workflow objects.</w:t>
+      <w:r>
+        <w:t>WorkflowInstance creates a WorkflowMemento containing its current state.</w:t>
+      </w:r>
+    </w:p>
+    <w:p>
+      <w:r>
+        <w:t>WorkflowHistory stores the mementos and can provide an earlier state when required.</w:t>
       </w:r>
     </w:p>
     <w:p>
@@ -4608,28 +4328,227 @@
     </w:p>
     <w:p>
       <w:r>
-        <w:t>The internal implementation of TIVIDY can change while the external interface remains simpler and more stable.</w:t>
-      </w:r>
-    </w:p>
-    <w:p>
-      <w:pPr>
-        <w:rPr>
-          <w:b/>
-          <w:bCs/>
-        </w:rPr>
-      </w:pPr>
-      <w:r>
-        <w:rPr>
-          <w:b/>
-          <w:bCs/>
-        </w:rPr>
+        <w:t>The stored state of a WorkflowInstance over time.</w:t>
+      </w:r>
+    </w:p>
+    <w:p>
+      <w:pPr>
+        <w:rPr>
+          <w:b/>
+          <w:bCs/>
+        </w:rPr>
+      </w:pPr>
+      <w:r>
+        <w:rPr>
+          <w:b/>
+          <w:bCs/>
+        </w:rPr>
+        <w:t>Why It Is Appropriate</w:t>
+      </w:r>
+    </w:p>
+    <w:p>
+      <w:r>
+        <w:t>Memento allows TIVIDY to preserve previous states without exposing the internal details of the workflow object.</w:t>
+      </w:r>
+    </w:p>
+    <w:p>
+      <w:pPr>
+        <w:rPr>
+          <w:b/>
+          <w:bCs/>
+        </w:rPr>
+      </w:pPr>
+      <w:r>
+        <w:rPr>
+          <w:b/>
+          <w:bCs/>
+        </w:rPr>
+        <w:t>Workflow Justification</w:t>
+      </w:r>
+    </w:p>
+    <w:p>
+      <w:r>
+        <w:t xml:space="preserve">Workflow actions can be wrong: an item completed by mistake, a routing decision made on bad data, a failed email integration. Restoring a known-good state needs a snapshot taken </w:t>
+      </w:r>
+      <w:r>
+        <w:t>without exposing the internal state of WorkflowInstance.</w:t>
+      </w:r>
+    </w:p>
+    <w:p>
+      <w:pPr>
+        <w:rPr>
+          <w:b/>
+          <w:bCs/>
+        </w:rPr>
+      </w:pPr>
+      <w:r>
+        <w:rPr>
+          <w:b/>
+          <w:bCs/>
+        </w:rPr>
+        <w:t>How It Connects</w:t>
+      </w:r>
+    </w:p>
+    <w:p>
+      <w:r>
+        <w:t>Memento is created and used through Command: before a reversible action the Command asks for a WorkflowMemento, and on undo passes it back to restore the earlier state. WorkflowHistory stores the snapshots, so the audit trail can point to them.</w:t>
+      </w:r>
+    </w:p>
+    <w:p>
+      <w:pPr>
+        <w:rPr>
+          <w:b/>
+          <w:bCs/>
+          <w:sz w:val="22"/>
+          <w:szCs w:val="22"/>
+        </w:rPr>
+      </w:pPr>
+      <w:r>
+        <w:rPr>
+          <w:b/>
+          <w:bCs/>
+          <w:sz w:val="22"/>
+          <w:szCs w:val="22"/>
+        </w:rPr>
+        <w:t>11. Decorator Pattern</w:t>
+      </w:r>
+    </w:p>
+    <w:p>
+      <w:pPr>
+        <w:rPr>
+          <w:b/>
+          <w:bCs/>
+        </w:rPr>
+      </w:pPr>
+      <w:r>
+        <w:rPr>
+          <w:b/>
+          <w:bCs/>
+        </w:rPr>
+        <w:t>Design Problem</w:t>
+      </w:r>
+    </w:p>
+    <w:p>
+      <w:r>
+        <w:t>Work items sometimes need extra behaviour without becoming a different kind of work item.</w:t>
+      </w:r>
+    </w:p>
+    <w:p>
+      <w:r>
         <w:lastRenderedPageBreak/>
+        <w:t>For example, a work item may need to</w:t>
+      </w:r>
+      <w:r>
+        <w:t xml:space="preserve"> be </w:t>
+      </w:r>
+      <w:r>
+        <w:t>treated as urgent (priority handling)</w:t>
+      </w:r>
+      <w:r>
+        <w:t>.</w:t>
+      </w:r>
+    </w:p>
+    <w:p>
+      <w:r>
+        <w:t>Creating a separate WorkItem subclass only to represent priority would unnecessarily increase the number of classes.</w:t>
+      </w:r>
+    </w:p>
+    <w:p>
+      <w:pPr>
+        <w:rPr>
+          <w:b/>
+          <w:bCs/>
+        </w:rPr>
+      </w:pPr>
+      <w:r>
+        <w:rPr>
+          <w:b/>
+          <w:bCs/>
+        </w:rPr>
+        <w:t>Possible Classes</w:t>
+      </w:r>
+    </w:p>
+    <w:p>
+      <w:r>
+        <w:t>WorkflowComponent</w:t>
+      </w:r>
+    </w:p>
+    <w:p>
+      <w:r>
+        <w:t>WorkItem</w:t>
+      </w:r>
+    </w:p>
+    <w:p>
+      <w:r>
+        <w:t>WorkItemDecorator</w:t>
+      </w:r>
+    </w:p>
+    <w:p>
+      <w:r>
+        <w:t>PriorityDecorator</w:t>
+      </w:r>
+    </w:p>
+    <w:p>
+      <w:pPr>
+        <w:rPr>
+          <w:b/>
+          <w:bCs/>
+        </w:rPr>
+      </w:pPr>
+      <w:r>
+        <w:rPr>
+          <w:b/>
+          <w:bCs/>
+        </w:rPr>
+        <w:t>Collaboration</w:t>
+      </w:r>
+    </w:p>
+    <w:p>
+      <w:r>
+        <w:t xml:space="preserve">A WorkItemDecorator holds a WorkflowComponent and implements the same interface. It adds its own behaviour before or after passing the request to the wrapped component. </w:t>
+      </w:r>
+      <w:r>
+        <w:t>A PriorityDecorator wraps a work item and adds priority behaviour without changing the original WorkItem class.</w:t>
+      </w:r>
+    </w:p>
+    <w:p>
+      <w:pPr>
+        <w:rPr>
+          <w:b/>
+          <w:bCs/>
+        </w:rPr>
+      </w:pPr>
+      <w:r>
+        <w:rPr>
+          <w:b/>
+          <w:bCs/>
+        </w:rPr>
+        <w:t>What Varies</w:t>
+      </w:r>
+    </w:p>
+    <w:p>
+      <w:r>
+        <w:t>Which work items require priority behaviour.</w:t>
+      </w:r>
+    </w:p>
+    <w:p>
+      <w:pPr>
+        <w:rPr>
+          <w:b/>
+          <w:bCs/>
+        </w:rPr>
+      </w:pPr>
+      <w:r>
+        <w:rPr>
+          <w:b/>
+          <w:bCs/>
+        </w:rPr>
         <w:t>Why It Is Appropriate</w:t>
       </w:r>
     </w:p>
     <w:p>
       <w:r>
-        <w:t>Facade reduces the complexity of using the workflow system and hides unnecessary internal details.</w:t>
+        <w:t>Decorator allows priority behaviour to be added to a work item without changing the WorkItem class or creating a separate priority-specific work item class.</w:t>
       </w:r>
     </w:p>
     <w:p>
@@ -4649,7 +4568,7 @@
     </w:p>
     <w:p>
       <w:r>
-        <w:t>TIVIDY contains definitions, instances, work items, strategies, event handling, history and notifications. A caller such as a user interface or the scenario layer should not need to know all of them. One entry point means internal refactoring does not ripple outwards.</w:t>
+        <w:t>In the complaint scenario, a complaint that affects an upcoming exam may need priority handling. Rather than creating a special type of WorkItem, PriorityDecorator can add priority behaviour to the existing work item. Priority handling belongs here rather than in Strategy because it adds behaviour to a work item instead of deciding who receives it.</w:t>
       </w:r>
     </w:p>
     <w:p>
@@ -4668,606 +4587,8 @@
       </w:r>
     </w:p>
     <w:p>
-      <w:proofErr w:type="spellStart"/>
-      <w:r>
-        <w:t>TIVIDYFacade</w:t>
-      </w:r>
-      <w:proofErr w:type="spellEnd"/>
-      <w:r>
-        <w:t xml:space="preserve"> is the outermost layer. Calls such as </w:t>
-      </w:r>
-      <w:proofErr w:type="spellStart"/>
-      <w:r>
-        <w:t>createWorkflow</w:t>
-      </w:r>
-      <w:proofErr w:type="spellEnd"/>
-      <w:r>
-        <w:t xml:space="preserve">(), </w:t>
-      </w:r>
-      <w:proofErr w:type="spellStart"/>
-      <w:r>
-        <w:t>assignWork</w:t>
-      </w:r>
-      <w:proofErr w:type="spellEnd"/>
-      <w:r>
-        <w:t xml:space="preserve">() and </w:t>
-      </w:r>
-      <w:proofErr w:type="spellStart"/>
-      <w:r>
-        <w:t>completeWork</w:t>
-      </w:r>
-      <w:proofErr w:type="spellEnd"/>
-      <w:r>
-        <w:t>() are delegated to the Builder, the Command objects, the State machine and the Observer system. The scenario layer talks to the engine only through the Facade.</w:t>
-      </w:r>
-    </w:p>
-    <w:p/>
-    <w:p>
-      <w:pPr>
-        <w:rPr>
-          <w:b/>
-          <w:bCs/>
-          <w:sz w:val="22"/>
-          <w:szCs w:val="22"/>
-        </w:rPr>
-      </w:pPr>
-      <w:r>
-        <w:rPr>
-          <w:b/>
-          <w:bCs/>
-          <w:sz w:val="22"/>
-          <w:szCs w:val="22"/>
-        </w:rPr>
-        <w:t>10. Memento Pattern</w:t>
-      </w:r>
-    </w:p>
-    <w:p>
-      <w:pPr>
-        <w:rPr>
-          <w:b/>
-          <w:bCs/>
-        </w:rPr>
-      </w:pPr>
-      <w:r>
-        <w:rPr>
-          <w:b/>
-          <w:bCs/>
-        </w:rPr>
-        <w:t>Design Problem</w:t>
-      </w:r>
-    </w:p>
-    <w:p>
-      <w:r>
-        <w:t>TIVIDY may need to preserve earlier workflow states for history or rollback.</w:t>
-      </w:r>
-    </w:p>
-    <w:p>
-      <w:r>
-        <w:t xml:space="preserve">For example, </w:t>
-      </w:r>
-      <w:proofErr w:type="gramStart"/>
-      <w:r>
-        <w:t>Before</w:t>
-      </w:r>
-      <w:proofErr w:type="gramEnd"/>
-      <w:r>
-        <w:t xml:space="preserve"> escalation, a </w:t>
-      </w:r>
-      <w:proofErr w:type="spellStart"/>
-      <w:r>
-        <w:t>WorkflowInstance</w:t>
-      </w:r>
-      <w:proofErr w:type="spellEnd"/>
-      <w:r>
-        <w:t xml:space="preserve"> may have been in </w:t>
-      </w:r>
-      <w:proofErr w:type="spellStart"/>
-      <w:r>
-        <w:t>InProgressState</w:t>
-      </w:r>
-      <w:proofErr w:type="spellEnd"/>
-      <w:r>
-        <w:t xml:space="preserve"> with a particular assignment and workflow position.</w:t>
-      </w:r>
-    </w:p>
-    <w:p>
-      <w:pPr>
-        <w:rPr>
-          <w:b/>
-          <w:bCs/>
-        </w:rPr>
-      </w:pPr>
-      <w:r>
-        <w:rPr>
-          <w:b/>
-          <w:bCs/>
-        </w:rPr>
-        <w:t>Possible Classes</w:t>
-      </w:r>
-    </w:p>
-    <w:p>
-      <w:proofErr w:type="spellStart"/>
-      <w:r>
-        <w:t>WorkflowInstance</w:t>
-      </w:r>
-      <w:proofErr w:type="spellEnd"/>
-    </w:p>
-    <w:p>
-      <w:proofErr w:type="spellStart"/>
-      <w:r>
-        <w:t>WorkflowMemento</w:t>
-      </w:r>
-      <w:proofErr w:type="spellEnd"/>
-    </w:p>
-    <w:p>
-      <w:proofErr w:type="spellStart"/>
-      <w:r>
-        <w:t>WorkflowHistory</w:t>
-      </w:r>
-      <w:proofErr w:type="spellEnd"/>
-    </w:p>
-    <w:p>
-      <w:pPr>
-        <w:rPr>
-          <w:b/>
-          <w:bCs/>
-        </w:rPr>
-      </w:pPr>
-      <w:r>
-        <w:rPr>
-          <w:b/>
-          <w:bCs/>
-        </w:rPr>
-        <w:t>Collaboration</w:t>
-      </w:r>
-    </w:p>
-    <w:p>
-      <w:proofErr w:type="spellStart"/>
-      <w:r>
-        <w:t>WorkflowInstance</w:t>
-      </w:r>
-      <w:proofErr w:type="spellEnd"/>
-      <w:r>
-        <w:t xml:space="preserve"> creates a </w:t>
-      </w:r>
-      <w:proofErr w:type="spellStart"/>
-      <w:r>
-        <w:t>WorkflowMemento</w:t>
-      </w:r>
-      <w:proofErr w:type="spellEnd"/>
-      <w:r>
-        <w:t xml:space="preserve"> containing its current state.</w:t>
-      </w:r>
-    </w:p>
-    <w:p>
-      <w:proofErr w:type="spellStart"/>
-      <w:r>
-        <w:t>WorkflowHistory</w:t>
-      </w:r>
-      <w:proofErr w:type="spellEnd"/>
-      <w:r>
-        <w:t xml:space="preserve"> stores the mementos and can provide an earlier state when required.</w:t>
-      </w:r>
-    </w:p>
-    <w:p>
-      <w:pPr>
-        <w:rPr>
-          <w:b/>
-          <w:bCs/>
-        </w:rPr>
-      </w:pPr>
-      <w:r>
-        <w:rPr>
-          <w:b/>
-          <w:bCs/>
-        </w:rPr>
-        <w:t>What Varies</w:t>
-      </w:r>
-    </w:p>
-    <w:p>
-      <w:r>
-        <w:t xml:space="preserve">The stored state of a </w:t>
-      </w:r>
-      <w:proofErr w:type="spellStart"/>
-      <w:r>
-        <w:t>WorkflowInstance</w:t>
-      </w:r>
-      <w:proofErr w:type="spellEnd"/>
-      <w:r>
-        <w:t xml:space="preserve"> over time.</w:t>
-      </w:r>
-    </w:p>
-    <w:p>
-      <w:pPr>
-        <w:rPr>
-          <w:b/>
-          <w:bCs/>
-        </w:rPr>
-      </w:pPr>
-      <w:r>
-        <w:rPr>
-          <w:b/>
-          <w:bCs/>
-        </w:rPr>
-        <w:t>Why It Is Appropriate</w:t>
-      </w:r>
-    </w:p>
-    <w:p>
-      <w:r>
-        <w:t>Memento allows TIVIDY to preserve previous states without exposing the internal details of the workflow object.</w:t>
-      </w:r>
-    </w:p>
-    <w:p>
-      <w:pPr>
-        <w:rPr>
-          <w:b/>
-          <w:bCs/>
-        </w:rPr>
-      </w:pPr>
-      <w:r>
-        <w:rPr>
-          <w:b/>
-          <w:bCs/>
-        </w:rPr>
-        <w:t>Workflow Justification</w:t>
-      </w:r>
-    </w:p>
-    <w:p>
-      <w:r>
-        <w:t xml:space="preserve">Workflow actions can be wrong: an item completed by mistake, a routing decision made on bad data, a failed email integration. Restoring a known-good state needs a snapshot taken </w:t>
-      </w:r>
-      <w:r>
-        <w:t xml:space="preserve">without exposing the internal state of </w:t>
-      </w:r>
-      <w:proofErr w:type="spellStart"/>
-      <w:r>
-        <w:t>WorkflowInstance</w:t>
-      </w:r>
-      <w:proofErr w:type="spellEnd"/>
-      <w:r>
-        <w:t>.</w:t>
-      </w:r>
-    </w:p>
-    <w:p>
-      <w:pPr>
-        <w:rPr>
-          <w:b/>
-          <w:bCs/>
-        </w:rPr>
-      </w:pPr>
-      <w:r>
-        <w:rPr>
-          <w:b/>
-          <w:bCs/>
-        </w:rPr>
-        <w:t>How It Connects</w:t>
-      </w:r>
-    </w:p>
-    <w:p>
-      <w:r>
-        <w:t xml:space="preserve">Memento is created and used through Command: before a reversible action the Command asks for a </w:t>
-      </w:r>
-      <w:proofErr w:type="spellStart"/>
-      <w:r>
-        <w:t>WorkflowMemento</w:t>
-      </w:r>
-      <w:proofErr w:type="spellEnd"/>
-      <w:r>
-        <w:t xml:space="preserve">, and on undo passes it back to restore the earlier state. </w:t>
-      </w:r>
-      <w:proofErr w:type="spellStart"/>
-      <w:r>
-        <w:t>WorkflowHistory</w:t>
-      </w:r>
-      <w:proofErr w:type="spellEnd"/>
-      <w:r>
-        <w:t xml:space="preserve"> stores the snapshots, so the audit trail can point to them.</w:t>
-      </w:r>
-    </w:p>
-    <w:p>
-      <w:pPr>
-        <w:rPr>
-          <w:b/>
-          <w:bCs/>
-          <w:sz w:val="22"/>
-          <w:szCs w:val="22"/>
-        </w:rPr>
-      </w:pPr>
-      <w:r>
-        <w:rPr>
-          <w:b/>
-          <w:bCs/>
-          <w:sz w:val="22"/>
-          <w:szCs w:val="22"/>
-        </w:rPr>
-        <w:t>11. Decorator Pattern</w:t>
-      </w:r>
-    </w:p>
-    <w:p>
-      <w:pPr>
-        <w:rPr>
-          <w:b/>
-          <w:bCs/>
-        </w:rPr>
-      </w:pPr>
-      <w:r>
-        <w:rPr>
-          <w:b/>
-          <w:bCs/>
-        </w:rPr>
-        <w:t>Design Problem</w:t>
-      </w:r>
-    </w:p>
-    <w:p>
-      <w:r>
-        <w:lastRenderedPageBreak/>
-        <w:t>Work items sometimes need extra behaviour without becoming a different kind of work item.</w:t>
-      </w:r>
-    </w:p>
-    <w:p>
-      <w:r>
-        <w:t>For example, a work item may need to</w:t>
-      </w:r>
-      <w:r>
-        <w:t xml:space="preserve"> be </w:t>
-      </w:r>
-      <w:r>
-        <w:t>treated as urgent (priority handling)</w:t>
-      </w:r>
-      <w:r>
-        <w:t>.</w:t>
-      </w:r>
-    </w:p>
-    <w:p>
-      <w:r>
-        <w:t xml:space="preserve">Creating a separate </w:t>
-      </w:r>
-      <w:proofErr w:type="spellStart"/>
-      <w:r>
-        <w:t>WorkItem</w:t>
-      </w:r>
-      <w:proofErr w:type="spellEnd"/>
-      <w:r>
-        <w:t xml:space="preserve"> subclass only to represent priority would unnecessarily increase the number of classes.</w:t>
-      </w:r>
-    </w:p>
-    <w:p>
-      <w:pPr>
-        <w:rPr>
-          <w:b/>
-          <w:bCs/>
-        </w:rPr>
-      </w:pPr>
-      <w:r>
-        <w:rPr>
-          <w:b/>
-          <w:bCs/>
-        </w:rPr>
-        <w:t>Possible Classes</w:t>
-      </w:r>
-    </w:p>
-    <w:p>
-      <w:proofErr w:type="spellStart"/>
-      <w:r>
-        <w:t>WorkflowComponent</w:t>
-      </w:r>
-      <w:proofErr w:type="spellEnd"/>
-    </w:p>
-    <w:p>
-      <w:proofErr w:type="spellStart"/>
-      <w:r>
-        <w:t>WorkItem</w:t>
-      </w:r>
-      <w:proofErr w:type="spellEnd"/>
-    </w:p>
-    <w:p>
-      <w:proofErr w:type="spellStart"/>
-      <w:r>
-        <w:t>WorkItemDecorator</w:t>
-      </w:r>
-      <w:proofErr w:type="spellEnd"/>
-    </w:p>
-    <w:p>
-      <w:proofErr w:type="spellStart"/>
-      <w:r>
-        <w:t>PriorityDecorator</w:t>
-      </w:r>
-      <w:proofErr w:type="spellEnd"/>
-    </w:p>
-    <w:p>
-      <w:pPr>
-        <w:rPr>
-          <w:b/>
-          <w:bCs/>
-        </w:rPr>
-      </w:pPr>
-      <w:r>
-        <w:rPr>
-          <w:b/>
-          <w:bCs/>
-        </w:rPr>
-        <w:t>Collaboration</w:t>
-      </w:r>
-    </w:p>
-    <w:p>
-      <w:r>
-        <w:t xml:space="preserve">A </w:t>
-      </w:r>
-      <w:proofErr w:type="spellStart"/>
-      <w:r>
-        <w:t>WorkItemDecorator</w:t>
-      </w:r>
-      <w:proofErr w:type="spellEnd"/>
-      <w:r>
-        <w:t xml:space="preserve"> holds a </w:t>
-      </w:r>
-      <w:proofErr w:type="spellStart"/>
-      <w:r>
-        <w:t>WorkflowComponent</w:t>
-      </w:r>
-      <w:proofErr w:type="spellEnd"/>
-      <w:r>
-        <w:t xml:space="preserve"> and implements the same interface. It adds its own behaviour before or after passing the request to the wrapped component. </w:t>
-      </w:r>
-      <w:r>
-        <w:t xml:space="preserve">A </w:t>
-      </w:r>
-      <w:proofErr w:type="spellStart"/>
-      <w:r>
-        <w:t>PriorityDecorator</w:t>
-      </w:r>
-      <w:proofErr w:type="spellEnd"/>
-      <w:r>
-        <w:t xml:space="preserve"> wraps a work item and adds priority behaviour without changing the original </w:t>
-      </w:r>
-      <w:proofErr w:type="spellStart"/>
-      <w:r>
-        <w:t>WorkItem</w:t>
-      </w:r>
-      <w:proofErr w:type="spellEnd"/>
-      <w:r>
-        <w:t xml:space="preserve"> class.</w:t>
-      </w:r>
-    </w:p>
-    <w:p>
-      <w:pPr>
-        <w:rPr>
-          <w:b/>
-          <w:bCs/>
-        </w:rPr>
-      </w:pPr>
-      <w:r>
-        <w:rPr>
-          <w:b/>
-          <w:bCs/>
-        </w:rPr>
-        <w:t>What Varies</w:t>
-      </w:r>
-    </w:p>
-    <w:p>
-      <w:r>
-        <w:t>Which work items require priority behaviour.</w:t>
-      </w:r>
-    </w:p>
-    <w:p>
-      <w:pPr>
-        <w:rPr>
-          <w:b/>
-          <w:bCs/>
-        </w:rPr>
-      </w:pPr>
-      <w:r>
-        <w:rPr>
-          <w:b/>
-          <w:bCs/>
-        </w:rPr>
-        <w:t>Why It Is Appropriate</w:t>
-      </w:r>
-    </w:p>
-    <w:p>
-      <w:r>
-        <w:t xml:space="preserve">Decorator allows priority behaviour to be added to a work item without changing the </w:t>
-      </w:r>
-      <w:proofErr w:type="spellStart"/>
-      <w:r>
-        <w:t>WorkItem</w:t>
-      </w:r>
-      <w:proofErr w:type="spellEnd"/>
-      <w:r>
-        <w:t xml:space="preserve"> class or creating a separate priority-specific work item class.</w:t>
-      </w:r>
-    </w:p>
-    <w:p>
-      <w:pPr>
-        <w:rPr>
-          <w:b/>
-          <w:bCs/>
-        </w:rPr>
-      </w:pPr>
-      <w:r>
-        <w:rPr>
-          <w:b/>
-          <w:bCs/>
-        </w:rPr>
-        <w:t>Workflow Justification</w:t>
-      </w:r>
-    </w:p>
-    <w:p>
-      <w:r>
-        <w:t xml:space="preserve">In the complaint scenario, a complaint that affects an upcoming exam may need priority handling. Rather than creating a special type of </w:t>
-      </w:r>
-      <w:proofErr w:type="spellStart"/>
-      <w:r>
-        <w:t>WorkItem</w:t>
-      </w:r>
-      <w:proofErr w:type="spellEnd"/>
-      <w:r>
-        <w:t xml:space="preserve">, </w:t>
-      </w:r>
-      <w:proofErr w:type="spellStart"/>
-      <w:r>
-        <w:t>PriorityDecorator</w:t>
-      </w:r>
-      <w:proofErr w:type="spellEnd"/>
-      <w:r>
-        <w:t xml:space="preserve"> can add priority behaviour to the existing work item. Priority handling belongs here rather than in Strategy because it adds behaviour to a work item instead of deciding who receives it.</w:t>
-      </w:r>
-    </w:p>
-    <w:p>
-      <w:pPr>
-        <w:rPr>
-          <w:b/>
-          <w:bCs/>
-        </w:rPr>
-      </w:pPr>
-      <w:r>
-        <w:rPr>
-          <w:b/>
-          <w:bCs/>
-        </w:rPr>
-        <w:t>How It Connects</w:t>
-      </w:r>
-    </w:p>
-    <w:p>
-      <w:proofErr w:type="spellStart"/>
-      <w:r>
-        <w:t>PriorityDecorator</w:t>
-      </w:r>
-      <w:proofErr w:type="spellEnd"/>
-      <w:r>
-        <w:t xml:space="preserve"> uses the same </w:t>
-      </w:r>
-      <w:proofErr w:type="spellStart"/>
-      <w:r>
-        <w:t>WorkflowComponent</w:t>
-      </w:r>
-      <w:proofErr w:type="spellEnd"/>
-      <w:r>
-        <w:t xml:space="preserve"> interface as the wrapped </w:t>
-      </w:r>
-      <w:proofErr w:type="spellStart"/>
-      <w:r>
-        <w:t>WorkItem</w:t>
-      </w:r>
-      <w:proofErr w:type="spellEnd"/>
-      <w:r>
-        <w:t xml:space="preserve">. It exposes priority information that the </w:t>
-      </w:r>
-      <w:proofErr w:type="spellStart"/>
-      <w:r>
-        <w:t>AssignmentStrategy</w:t>
-      </w:r>
-      <w:proofErr w:type="spellEnd"/>
-      <w:r>
-        <w:t xml:space="preserve"> can consider when selecting a participant, and the Builder can apply the decorator when constructing the </w:t>
-      </w:r>
-      <w:proofErr w:type="spellStart"/>
-      <w:r>
-        <w:t>WorkflowDefinition</w:t>
-      </w:r>
-      <w:proofErr w:type="spellEnd"/>
-      <w:r>
-        <w:t>.</w:t>
+      <w:r>
+        <w:t>PriorityDecorator uses the same WorkflowComponent interface as the wrapped WorkItem. It exposes priority information that the AssignmentStrategy can consider when selecting a participant, and the Builder can apply the decorator when constructing the WorkflowDefinition.</w:t>
       </w:r>
     </w:p>
     <w:p>
@@ -5291,74 +4612,18 @@
     </w:p>
     <w:p>
       <w:r>
-        <w:t xml:space="preserve">The patterns above form one connected engine rather than eleven separate demonstrations. The Builder assembles a </w:t>
-      </w:r>
-      <w:proofErr w:type="spellStart"/>
-      <w:r>
-        <w:t>WorkflowDefinition</w:t>
-      </w:r>
-      <w:proofErr w:type="spellEnd"/>
-      <w:r>
-        <w:t xml:space="preserve"> containing a Composite structure of work, an </w:t>
-      </w:r>
-      <w:proofErr w:type="spellStart"/>
-      <w:r>
-        <w:t>AssignmentStrategy</w:t>
-      </w:r>
-      <w:proofErr w:type="spellEnd"/>
-      <w:r>
-        <w:t xml:space="preserve">, </w:t>
-      </w:r>
-      <w:r>
-        <w:t xml:space="preserve">an escalation Chain of Responsibility and a </w:t>
-      </w:r>
-      <w:proofErr w:type="spellStart"/>
-      <w:r>
-        <w:t>PriorityDecorator</w:t>
-      </w:r>
-      <w:proofErr w:type="spellEnd"/>
-      <w:r>
-        <w:t xml:space="preserve"> where required</w:t>
-      </w:r>
-      <w:r>
-        <w:t xml:space="preserve">. When a workflow is run, the definition is used to create an independent </w:t>
-      </w:r>
-      <w:proofErr w:type="spellStart"/>
-      <w:r>
-        <w:t>WorkflowInstance</w:t>
-      </w:r>
-      <w:proofErr w:type="spellEnd"/>
-      <w:r>
-        <w:t>, which is governed by the State pattern.</w:t>
-      </w:r>
-    </w:p>
-    <w:p>
-      <w:r>
-        <w:t xml:space="preserve">Every action on a running instance is represented as a Command. Before a reversible action, the Command can create a Memento, and execution may change the state of the </w:t>
-      </w:r>
-      <w:proofErr w:type="spellStart"/>
-      <w:r>
-        <w:t>WorkflowInstance</w:t>
-      </w:r>
-      <w:proofErr w:type="spellEnd"/>
-      <w:r>
-        <w:t xml:space="preserve">. State changes can notify Observers such as the history recorder, notification system and next-work-item activator. When routing is needed, the </w:t>
-      </w:r>
-      <w:proofErr w:type="spellStart"/>
-      <w:r>
-        <w:t>AssignmentStrategy</w:t>
-      </w:r>
-      <w:proofErr w:type="spellEnd"/>
-      <w:r>
-        <w:t xml:space="preserve"> is used, and when escalation is needed, the Chain of Responsibility is used. External communication is handled through the Adapter pattern, while the </w:t>
-      </w:r>
-      <w:proofErr w:type="spellStart"/>
-      <w:r>
-        <w:t>TIVIDYFacade</w:t>
-      </w:r>
-      <w:proofErr w:type="spellEnd"/>
-      <w:r>
-        <w:t xml:space="preserve"> provides the main interface to the system.</w:t>
+        <w:t xml:space="preserve">The patterns above form one connected engine rather than eleven separate demonstrations. The Builder assembles a WorkflowDefinition containing a Composite structure of work, an AssignmentStrategy, </w:t>
+      </w:r>
+      <w:r>
+        <w:t>an escalation Chain of Responsibility and a PriorityDecorator where required</w:t>
+      </w:r>
+      <w:r>
+        <w:t>. When a workflow is run, the definition is used to create an independent WorkflowInstance, which is governed by the State pattern.</w:t>
+      </w:r>
+    </w:p>
+    <w:p>
+      <w:r>
+        <w:t>Every action on a running instance is represented as a Command. Before a reversible action, the Command can create a Memento, and execution may change the state of the WorkflowInstance. State changes can notify Observers such as the history recorder, notification system and next-work-item activator. When routing is needed, the AssignmentStrategy is used, and when escalation is needed, the Chain of Responsibility is used. External communication is handled through the Adapter pattern, while the TIVIDYFacade provides the main interface to the system.</w:t>
       </w:r>
     </w:p>
     <w:p>
@@ -5602,79 +4867,7 @@
         <w:jc w:val="both"/>
       </w:pPr>
       <w:r>
-        <w:t xml:space="preserve">This sequence diagram illustrates how TIVIDY processes the completion of a </w:t>
-      </w:r>
-      <w:proofErr w:type="spellStart"/>
-      <w:r>
-        <w:t>WorkItem</w:t>
-      </w:r>
-      <w:proofErr w:type="spellEnd"/>
-      <w:r>
-        <w:t xml:space="preserve"> and determines what happens next in the workflow. A staff member completes the work item through the </w:t>
-      </w:r>
-      <w:proofErr w:type="spellStart"/>
-      <w:r>
-        <w:t>TIVIDYFacade</w:t>
-      </w:r>
-      <w:proofErr w:type="spellEnd"/>
-      <w:r>
-        <w:t xml:space="preserve">, which creates and executes a </w:t>
-      </w:r>
-      <w:proofErr w:type="spellStart"/>
-      <w:r>
-        <w:t>CompleteWorkCommand</w:t>
-      </w:r>
-      <w:proofErr w:type="spellEnd"/>
-      <w:r>
-        <w:t xml:space="preserve">. The command completes the </w:t>
-      </w:r>
-      <w:proofErr w:type="spellStart"/>
-      <w:r>
-        <w:t>WorkItem</w:t>
-      </w:r>
-      <w:proofErr w:type="spellEnd"/>
-      <w:r>
-        <w:t xml:space="preserve"> and then notifies the </w:t>
-      </w:r>
-      <w:proofErr w:type="spellStart"/>
-      <w:r>
-        <w:t>WorkflowInstance</w:t>
-      </w:r>
-      <w:proofErr w:type="spellEnd"/>
-      <w:r>
-        <w:t xml:space="preserve"> that the work item has been completed. The </w:t>
-      </w:r>
-      <w:proofErr w:type="spellStart"/>
-      <w:r>
-        <w:t>WorkflowInstance</w:t>
-      </w:r>
-      <w:proofErr w:type="spellEnd"/>
-      <w:r>
-        <w:t xml:space="preserve"> consults the </w:t>
-      </w:r>
-      <w:proofErr w:type="spellStart"/>
-      <w:r>
-        <w:t>WorkflowDefinition</w:t>
-      </w:r>
-      <w:proofErr w:type="spellEnd"/>
-      <w:r>
-        <w:t xml:space="preserve"> to determine the next work item and checks whether its dependencies have been satisfied. If the dependencies are satisfied, the next work item is made available and the </w:t>
-      </w:r>
-      <w:proofErr w:type="spellStart"/>
-      <w:r>
-        <w:t>AssignmentStrategy</w:t>
-      </w:r>
-      <w:proofErr w:type="spellEnd"/>
-      <w:r>
-        <w:t xml:space="preserve"> selects an appropriate participant. The </w:t>
-      </w:r>
-      <w:proofErr w:type="spellStart"/>
-      <w:r>
-        <w:t>NotificationObserver</w:t>
-      </w:r>
-      <w:proofErr w:type="spellEnd"/>
-      <w:r>
-        <w:t xml:space="preserve"> is then notified of the assignment. If the dependencies are not satisfied, the workflow remains waiting and the event is recorded. This demonstrates the collaboration between the </w:t>
+        <w:t xml:space="preserve">This sequence diagram illustrates how TIVIDY processes the completion of a WorkItem and determines what happens next in the workflow. A staff member completes the work item through the TIVIDYFacade, which creates and executes a CompleteWorkCommand. The command completes the WorkItem and then notifies the WorkflowInstance that the work item has been completed. The WorkflowInstance consults the WorkflowDefinition to determine the next work item and checks whether its dependencies have been satisfied. If the dependencies are satisfied, the next work item is made available and the AssignmentStrategy selects an appropriate participant. The NotificationObserver is then notified of the assignment. If the dependencies are not satisfied, the workflow remains waiting and the event is recorded. This demonstrates the collaboration between the </w:t>
       </w:r>
       <w:r>
         <w:rPr>
@@ -5840,143 +5033,7 @@
         </w:sectPr>
       </w:pPr>
       <w:r>
-        <w:t xml:space="preserve">This sequence diagram illustrates how TIVIDY processes the escalation of a complaint that cannot be resolved at the current level. A staff member calls </w:t>
-      </w:r>
-      <w:proofErr w:type="spellStart"/>
-      <w:r>
-        <w:t>escalateWork</w:t>
-      </w:r>
-      <w:proofErr w:type="spellEnd"/>
-      <w:r>
-        <w:t xml:space="preserve">() on the </w:t>
-      </w:r>
-      <w:proofErr w:type="spellStart"/>
-      <w:r>
-        <w:t>TIVIDYFacade</w:t>
-      </w:r>
-      <w:proofErr w:type="spellEnd"/>
-      <w:r>
-        <w:t xml:space="preserve">, which creates and executes an </w:t>
-      </w:r>
-      <w:proofErr w:type="spellStart"/>
-      <w:r>
-        <w:t>EscalateWorkCommand</w:t>
-      </w:r>
-      <w:proofErr w:type="spellEnd"/>
-      <w:r>
-        <w:t xml:space="preserve">. Before anything changes, the command asks the </w:t>
-      </w:r>
-      <w:proofErr w:type="spellStart"/>
-      <w:r>
-        <w:t>WorkflowInstance</w:t>
-      </w:r>
-      <w:proofErr w:type="spellEnd"/>
-      <w:r>
-        <w:t xml:space="preserve"> for a </w:t>
-      </w:r>
-      <w:proofErr w:type="spellStart"/>
-      <w:r>
-        <w:t>WorkflowMemento</w:t>
-      </w:r>
-      <w:proofErr w:type="spellEnd"/>
-      <w:r>
-        <w:t xml:space="preserve"> and stores it in the </w:t>
-      </w:r>
-      <w:proofErr w:type="spellStart"/>
-      <w:r>
-        <w:t>WorkflowHistory</w:t>
-      </w:r>
-      <w:proofErr w:type="spellEnd"/>
-      <w:r>
-        <w:t xml:space="preserve"> so the escalation can be undone. The command then asks the </w:t>
-      </w:r>
-      <w:proofErr w:type="spellStart"/>
-      <w:r>
-        <w:t>WorkflowInstance</w:t>
-      </w:r>
-      <w:proofErr w:type="spellEnd"/>
-      <w:r>
-        <w:t xml:space="preserve"> to escalate, and the </w:t>
-      </w:r>
-      <w:proofErr w:type="spellStart"/>
-      <w:r>
-        <w:t>InProgressState</w:t>
-      </w:r>
-      <w:proofErr w:type="spellEnd"/>
-      <w:r>
-        <w:t xml:space="preserve"> replaces itself with an </w:t>
-      </w:r>
-      <w:proofErr w:type="spellStart"/>
-      <w:r>
-        <w:t>EscalatedState</w:t>
-      </w:r>
-      <w:proofErr w:type="spellEnd"/>
-      <w:r>
-        <w:t xml:space="preserve">. Entering the </w:t>
-      </w:r>
-      <w:proofErr w:type="spellStart"/>
-      <w:r>
-        <w:t>EscalatedState</w:t>
-      </w:r>
-      <w:proofErr w:type="spellEnd"/>
-      <w:r>
-        <w:t xml:space="preserve"> starts the escalation chain: the </w:t>
-      </w:r>
-      <w:proofErr w:type="spellStart"/>
-      <w:r>
-        <w:t>CoordinatorHandler</w:t>
-      </w:r>
-      <w:proofErr w:type="spellEnd"/>
-      <w:r>
-        <w:t xml:space="preserve"> cannot handle the request and passes it on, and the </w:t>
-      </w:r>
-      <w:proofErr w:type="spellStart"/>
-      <w:r>
-        <w:t>DepartmentHeadHandler</w:t>
-      </w:r>
-      <w:proofErr w:type="spellEnd"/>
-      <w:r>
-        <w:t xml:space="preserve"> accepts it, so the Department Head is assigned. The </w:t>
-      </w:r>
-      <w:proofErr w:type="spellStart"/>
-      <w:r>
-        <w:t>WorkflowInstance</w:t>
-      </w:r>
-      <w:proofErr w:type="spellEnd"/>
-      <w:r>
-        <w:t xml:space="preserve"> then notifies its observers: the </w:t>
-      </w:r>
-      <w:proofErr w:type="spellStart"/>
-      <w:r>
-        <w:t>WorkflowHistory</w:t>
-      </w:r>
-      <w:proofErr w:type="spellEnd"/>
-      <w:r>
-        <w:t xml:space="preserve"> records the change from In Progress to Escalated, and the </w:t>
-      </w:r>
-      <w:proofErr w:type="spellStart"/>
-      <w:r>
-        <w:t>NotificationObserver</w:t>
-      </w:r>
-      <w:proofErr w:type="spellEnd"/>
-      <w:r>
-        <w:t xml:space="preserve"> asks the </w:t>
-      </w:r>
-      <w:proofErr w:type="spellStart"/>
-      <w:r>
-        <w:t>EmailAdapter</w:t>
-      </w:r>
-      <w:proofErr w:type="spellEnd"/>
-      <w:r>
-        <w:t xml:space="preserve"> to email the Department Head through the </w:t>
-      </w:r>
-      <w:proofErr w:type="spellStart"/>
-      <w:r>
-        <w:t>ExternalEmailService</w:t>
-      </w:r>
-      <w:proofErr w:type="spellEnd"/>
-      <w:r>
-        <w:t xml:space="preserve">. If the email fails, the failure is recorded in the history and the escalation still stands. This demonstrates the collaboration between the </w:t>
+        <w:t xml:space="preserve">This sequence diagram illustrates how TIVIDY processes the escalation of a complaint that cannot be resolved at the current level. A staff member calls escalateWork() on the TIVIDYFacade, which creates and executes an EscalateWorkCommand. Before anything changes, the command asks the WorkflowInstance for a WorkflowMemento and stores it in the WorkflowHistory so the escalation can be undone. The command then asks the WorkflowInstance to escalate, and the InProgressState replaces itself with an EscalatedState. Entering the EscalatedState starts the escalation chain: the CoordinatorHandler cannot handle the request and passes it on, and the DepartmentHeadHandler accepts it, so the Department Head is assigned. The WorkflowInstance then notifies its observers: the WorkflowHistory records the change from In Progress to Escalated, and the NotificationObserver asks the EmailAdapter to email the Department Head through the ExternalEmailService. If the email fails, the failure is recorded in the history and the escalation still stands. This demonstrates the collaboration between the </w:t>
       </w:r>
       <w:r>
         <w:rPr>
@@ -6006,27 +5063,7 @@
           <w:szCs w:val="22"/>
         </w:rPr>
         <w:lastRenderedPageBreak/>
-        <w:t xml:space="preserve">State diagram: </w:t>
-      </w:r>
-      <w:proofErr w:type="spellStart"/>
-      <w:r>
-        <w:rPr>
-          <w:b/>
-          <w:bCs/>
-          <w:sz w:val="22"/>
-          <w:szCs w:val="22"/>
-        </w:rPr>
-        <w:t>WorkItem</w:t>
-      </w:r>
-      <w:proofErr w:type="spellEnd"/>
-      <w:r>
-        <w:rPr>
-          <w:b/>
-          <w:bCs/>
-          <w:sz w:val="22"/>
-          <w:szCs w:val="22"/>
-        </w:rPr>
-        <w:t xml:space="preserve"> State Lifecycle</w:t>
+        <w:t>State diagram: WorkItem State Lifecycle</w:t>
       </w:r>
     </w:p>
     <w:p>
@@ -6095,15 +5132,7 @@
         <w:jc w:val="both"/>
       </w:pPr>
       <w:r>
-        <w:t xml:space="preserve">This state diagram illustrates the lifecycle of a TIVIDY </w:t>
-      </w:r>
-      <w:proofErr w:type="spellStart"/>
-      <w:r>
-        <w:t>WorkflowInstance</w:t>
-      </w:r>
-      <w:proofErr w:type="spellEnd"/>
-      <w:r>
-        <w:t xml:space="preserve"> from submission to completion. A workflow progresses through the states </w:t>
+        <w:t xml:space="preserve">This state diagram illustrates the lifecycle of a TIVIDY WorkflowInstance from submission to completion. A workflow progresses through the states </w:t>
       </w:r>
       <w:r>
         <w:rPr>
@@ -6257,39 +5286,8 @@
           <w:sz w:val="22"/>
           <w:szCs w:val="22"/>
         </w:rPr>
-        <w:t xml:space="preserve">1. State Pattern Changed from </w:t>
-      </w:r>
-      <w:proofErr w:type="spellStart"/>
-      <w:r>
-        <w:rPr>
-          <w:b/>
-          <w:bCs/>
-          <w:sz w:val="22"/>
-          <w:szCs w:val="22"/>
-        </w:rPr>
-        <w:t>WorkItem</w:t>
-      </w:r>
-      <w:proofErr w:type="spellEnd"/>
-      <w:r>
-        <w:rPr>
-          <w:b/>
-          <w:bCs/>
-          <w:sz w:val="22"/>
-          <w:szCs w:val="22"/>
-        </w:rPr>
-        <w:t xml:space="preserve"> to </w:t>
-      </w:r>
-      <w:proofErr w:type="spellStart"/>
-      <w:r>
-        <w:rPr>
-          <w:b/>
-          <w:bCs/>
-          <w:sz w:val="22"/>
-          <w:szCs w:val="22"/>
-        </w:rPr>
-        <w:t>WorkflowInstance</w:t>
-      </w:r>
-      <w:proofErr w:type="spellEnd"/>
+        <w:t>1. State Pattern Changed from WorkItem to WorkflowInstance</w:t>
+      </w:r>
     </w:p>
     <w:p>
       <w:r>
@@ -6310,15 +5308,7 @@
         <w:br/>
       </w:r>
       <w:r>
-        <w:t xml:space="preserve">The original design applied the State pattern to individual </w:t>
-      </w:r>
-      <w:proofErr w:type="spellStart"/>
-      <w:r>
-        <w:t>WorkItem</w:t>
-      </w:r>
-      <w:proofErr w:type="spellEnd"/>
-      <w:r>
-        <w:t xml:space="preserve"> objects. States such as Created, Available, Assigned, In Progress, Escalated, Resolved and Closed were initially considered as work-item states.</w:t>
+        <w:t>The original design applied the State pattern to individual WorkItem objects. States such as Created, Available, Assigned, In Progress, Escalated, Resolved and Closed were initially considered as work-item states.</w:t>
       </w:r>
     </w:p>
     <w:p>
@@ -6334,22 +5324,7 @@
       </w:r>
       <w:r>
         <w:br/>
-      </w:r>
-      <w:proofErr w:type="spellStart"/>
-      <w:r>
-        <w:t>WorkItem</w:t>
-      </w:r>
-      <w:proofErr w:type="spellEnd"/>
-      <w:r>
-        <w:t xml:space="preserve"> stored a </w:t>
-      </w:r>
-      <w:proofErr w:type="spellStart"/>
-      <w:r>
-        <w:t>WorkItemState</w:t>
-      </w:r>
-      <w:proofErr w:type="spellEnd"/>
-      <w:r>
-        <w:t>, with separate concrete state classes controlling the behaviour of each individual task.</w:t>
+        <w:t>WorkItem stored a WorkItemState, with separate concrete state classes controlling the behaviour of each individual task.</w:t>
       </w:r>
     </w:p>
     <w:p>
@@ -6365,23 +5340,7 @@
       </w:r>
       <w:r>
         <w:br/>
-        <w:t xml:space="preserve">The State pattern was moved from </w:t>
-      </w:r>
-      <w:proofErr w:type="spellStart"/>
-      <w:r>
-        <w:t>WorkItem</w:t>
-      </w:r>
-      <w:proofErr w:type="spellEnd"/>
-      <w:r>
-        <w:t xml:space="preserve"> to </w:t>
-      </w:r>
-      <w:proofErr w:type="spellStart"/>
-      <w:r>
-        <w:t>WorkflowInstance</w:t>
-      </w:r>
-      <w:proofErr w:type="spellEnd"/>
-      <w:r>
-        <w:t>.</w:t>
+        <w:t>The State pattern was moved from WorkItem to WorkflowInstance.</w:t>
       </w:r>
     </w:p>
     <w:p>
@@ -6396,11 +5355,9 @@
           <w:numId w:val="40"/>
         </w:numPr>
       </w:pPr>
-      <w:proofErr w:type="spellStart"/>
       <w:r>
         <w:t>SubmittedState</w:t>
       </w:r>
-      <w:proofErr w:type="spellEnd"/>
     </w:p>
     <w:p>
       <w:pPr>
@@ -6409,11 +5366,9 @@
           <w:numId w:val="40"/>
         </w:numPr>
       </w:pPr>
-      <w:proofErr w:type="spellStart"/>
       <w:r>
         <w:t>ActiveState</w:t>
       </w:r>
-      <w:proofErr w:type="spellEnd"/>
     </w:p>
     <w:p>
       <w:pPr>
@@ -6422,11 +5377,9 @@
           <w:numId w:val="40"/>
         </w:numPr>
       </w:pPr>
-      <w:proofErr w:type="spellStart"/>
       <w:r>
         <w:t>InProgressState</w:t>
       </w:r>
-      <w:proofErr w:type="spellEnd"/>
     </w:p>
     <w:p>
       <w:pPr>
@@ -6435,11 +5388,9 @@
           <w:numId w:val="40"/>
         </w:numPr>
       </w:pPr>
-      <w:proofErr w:type="spellStart"/>
       <w:r>
         <w:t>ResolvedState</w:t>
       </w:r>
-      <w:proofErr w:type="spellEnd"/>
     </w:p>
     <w:p>
       <w:pPr>
@@ -6448,11 +5399,9 @@
           <w:numId w:val="40"/>
         </w:numPr>
       </w:pPr>
-      <w:proofErr w:type="spellStart"/>
       <w:r>
         <w:t>ClosedState</w:t>
       </w:r>
-      <w:proofErr w:type="spellEnd"/>
     </w:p>
     <w:p>
       <w:r>
@@ -6467,15 +5416,7 @@
       </w:r>
       <w:r>
         <w:br/>
-        <w:t xml:space="preserve">States such as Submitted, Resolved and Closed describe the lifecycle of the entire running case rather than one individual work item. Applying State to </w:t>
-      </w:r>
-      <w:proofErr w:type="spellStart"/>
-      <w:r>
-        <w:t>WorkflowInstance</w:t>
-      </w:r>
-      <w:proofErr w:type="spellEnd"/>
-      <w:r>
-        <w:t xml:space="preserve"> therefore represented the case-processing workflow more accurately and simplified the overall design.</w:t>
+        <w:t>States such as Submitted, Resolved and Closed describe the lifecycle of the entire running case rather than one individual work item. Applying State to WorkflowInstance therefore represented the case-processing workflow more accurately and simplified the overall design.</w:t>
       </w:r>
     </w:p>
     <w:p>
@@ -6491,39 +5432,7 @@
       </w:r>
       <w:r>
         <w:br/>
-        <w:t xml:space="preserve">The association between </w:t>
-      </w:r>
-      <w:proofErr w:type="spellStart"/>
-      <w:r>
-        <w:t>WorkItem</w:t>
-      </w:r>
-      <w:proofErr w:type="spellEnd"/>
-      <w:r>
-        <w:t xml:space="preserve"> and </w:t>
-      </w:r>
-      <w:proofErr w:type="spellStart"/>
-      <w:r>
-        <w:t>WorkItemState</w:t>
-      </w:r>
-      <w:proofErr w:type="spellEnd"/>
-      <w:r>
-        <w:t xml:space="preserve"> was removed. </w:t>
-      </w:r>
-      <w:proofErr w:type="spellStart"/>
-      <w:r>
-        <w:t>WorkflowInstance</w:t>
-      </w:r>
-      <w:proofErr w:type="spellEnd"/>
-      <w:r>
-        <w:t xml:space="preserve"> was instead associated with the abstract </w:t>
-      </w:r>
-      <w:proofErr w:type="spellStart"/>
-      <w:r>
-        <w:t>WorkflowState</w:t>
-      </w:r>
-      <w:proofErr w:type="spellEnd"/>
-      <w:r>
-        <w:t xml:space="preserve"> class and its concrete states.</w:t>
+        <w:t>The association between WorkItem and WorkItemState was removed. WorkflowInstance was instead associated with the abstract WorkflowState class and its concrete states.</w:t>
       </w:r>
     </w:p>
     <w:p/>
@@ -6543,27 +5452,7 @@
           <w:sz w:val="22"/>
           <w:szCs w:val="22"/>
         </w:rPr>
-        <w:t xml:space="preserve">2. </w:t>
-      </w:r>
-      <w:proofErr w:type="spellStart"/>
-      <w:r>
-        <w:rPr>
-          <w:b/>
-          <w:bCs/>
-          <w:sz w:val="22"/>
-          <w:szCs w:val="22"/>
-        </w:rPr>
-        <w:t>EscalatedState</w:t>
-      </w:r>
-      <w:proofErr w:type="spellEnd"/>
-      <w:r>
-        <w:rPr>
-          <w:b/>
-          <w:bCs/>
-          <w:sz w:val="22"/>
-          <w:szCs w:val="22"/>
-        </w:rPr>
-        <w:t xml:space="preserve"> Removed</w:t>
+        <w:t>2. EscalatedState Removed</w:t>
       </w:r>
     </w:p>
     <w:p>
@@ -6579,31 +5468,7 @@
       </w:r>
       <w:r>
         <w:br/>
-        <w:t xml:space="preserve">The original design treated escalation as a separate workflow state. This resulted in the workflow moving from </w:t>
-      </w:r>
-      <w:proofErr w:type="spellStart"/>
-      <w:r>
-        <w:t>InProgressState</w:t>
-      </w:r>
-      <w:proofErr w:type="spellEnd"/>
-      <w:r>
-        <w:t xml:space="preserve"> to </w:t>
-      </w:r>
-      <w:proofErr w:type="spellStart"/>
-      <w:r>
-        <w:t>EscalatedState</w:t>
-      </w:r>
-      <w:proofErr w:type="spellEnd"/>
-      <w:r>
-        <w:t xml:space="preserve"> and then back to </w:t>
-      </w:r>
-      <w:proofErr w:type="spellStart"/>
-      <w:r>
-        <w:t>InProgressState</w:t>
-      </w:r>
-      <w:proofErr w:type="spellEnd"/>
-      <w:r>
-        <w:t xml:space="preserve"> once a higher-level participant accepted the case.</w:t>
+        <w:t>The original design treated escalation as a separate workflow state. This resulted in the workflow moving from InProgressState to EscalatedState and then back to InProgressState once a higher-level participant accepted the case.</w:t>
       </w:r>
     </w:p>
     <w:p>
@@ -6626,27 +5491,9 @@
       </w:r>
     </w:p>
     <w:p>
-      <w:proofErr w:type="spellStart"/>
-      <w:r>
-        <w:t>InProgressState</w:t>
-      </w:r>
-      <w:proofErr w:type="spellEnd"/>
-      <w:r>
-        <w:t xml:space="preserve"> -&gt; </w:t>
-      </w:r>
-      <w:proofErr w:type="spellStart"/>
-      <w:r>
-        <w:t>EscalatedState</w:t>
-      </w:r>
-      <w:proofErr w:type="spellEnd"/>
-      <w:r>
-        <w:t xml:space="preserve"> -&gt; </w:t>
-      </w:r>
-      <w:proofErr w:type="spellStart"/>
-      <w:r>
-        <w:t>InProgressState</w:t>
-      </w:r>
-      <w:proofErr w:type="spellEnd"/>
+      <w:r>
+        <w:t>InProgressState -&gt; EscalatedState -&gt; InProgressState</w:t>
+      </w:r>
     </w:p>
     <w:p>
       <w:r>
@@ -6661,22 +5508,7 @@
       </w:r>
       <w:r>
         <w:br/>
-      </w:r>
-      <w:proofErr w:type="spellStart"/>
-      <w:r>
-        <w:t>EscalatedState</w:t>
-      </w:r>
-      <w:proofErr w:type="spellEnd"/>
-      <w:r>
-        <w:t xml:space="preserve"> was removed. Escalation now takes place while the workflow remains in </w:t>
-      </w:r>
-      <w:proofErr w:type="spellStart"/>
-      <w:r>
-        <w:t>InProgressState</w:t>
-      </w:r>
-      <w:proofErr w:type="spellEnd"/>
-      <w:r>
-        <w:t>.</w:t>
+        <w:t>EscalatedState was removed. Escalation now takes place while the workflow remains in InProgressState.</w:t>
       </w:r>
     </w:p>
     <w:p>
@@ -6698,15 +5530,7 @@
       </w:r>
       <w:r>
         <w:br/>
-        <w:t xml:space="preserve">Escalation does not necessarily represent a new stage in the lifecycle of the case. The case is still being processed, but responsibility has moved to a higher-authority participant. Keeping the workflow in </w:t>
-      </w:r>
-      <w:proofErr w:type="spellStart"/>
-      <w:r>
-        <w:t>InProgressState</w:t>
-      </w:r>
-      <w:proofErr w:type="spellEnd"/>
-      <w:r>
-        <w:t xml:space="preserve"> separates the state of the case from the authority of the person currently handling it.</w:t>
+        <w:t>Escalation does not necessarily represent a new stage in the lifecycle of the case. The case is still being processed, but responsibility has moved to a higher-authority participant. Keeping the workflow in InProgressState separates the state of the case from the authority of the person currently handling it.</w:t>
       </w:r>
     </w:p>
     <w:p>
@@ -6727,22 +5551,7 @@
       </w:r>
       <w:r>
         <w:br/>
-      </w:r>
-      <w:proofErr w:type="spellStart"/>
-      <w:r>
-        <w:t>EscalatedState</w:t>
-      </w:r>
-      <w:proofErr w:type="spellEnd"/>
-      <w:r>
-        <w:t xml:space="preserve"> was removed from the State hierarchy and the State Diagram. Escalation is now represented as an action from </w:t>
-      </w:r>
-      <w:proofErr w:type="spellStart"/>
-      <w:r>
-        <w:t>InProgressState</w:t>
-      </w:r>
-      <w:proofErr w:type="spellEnd"/>
-      <w:r>
-        <w:t xml:space="preserve"> that changes the current handler while remaining in the same workflow state.</w:t>
+        <w:t>EscalatedState was removed from the State hierarchy and the State Diagram. Escalation is now represented as an action from InProgressState that changes the current handler while remaining in the same workflow state.</w:t>
       </w:r>
     </w:p>
     <w:p>
@@ -6845,15 +5654,7 @@
     </w:p>
     <w:p>
       <w:r>
-        <w:t xml:space="preserve">A templated </w:t>
-      </w:r>
-      <w:proofErr w:type="spellStart"/>
-      <w:r>
-        <w:t>configureRole</w:t>
-      </w:r>
-      <w:proofErr w:type="spellEnd"/>
-      <w:r>
-        <w:t>&lt;T&gt;() concept is used to configure the authority and responsibilities associated with the selected role level.</w:t>
+        <w:t>A templated configureRole&lt;T&gt;() concept is used to configure the authority and responsibilities associated with the selected role level.</w:t>
       </w:r>
     </w:p>
     <w:p>
@@ -6920,15 +5721,7 @@
       </w:r>
       <w:proofErr w:type="gramEnd"/>
       <w:r>
-        <w:t xml:space="preserve"> could be configured with an intermediate authority level, while a </w:t>
-      </w:r>
-      <w:proofErr w:type="gramStart"/>
-      <w:r>
-        <w:t>Principal</w:t>
-      </w:r>
-      <w:proofErr w:type="gramEnd"/>
-      <w:r>
-        <w:t xml:space="preserve"> could be configured with a senior authority level.</w:t>
+        <w:t xml:space="preserve"> could be configured with an intermediate authority level, while a Principal could be configured with a senior authority level.</w:t>
       </w:r>
     </w:p>
     <w:p>
@@ -6970,10 +5763,121 @@
       <w:pPr>
         <w:jc w:val="both"/>
         <w:rPr>
-          <w:sz w:val="24"/>
-          <w:szCs w:val="24"/>
-        </w:rPr>
-      </w:pPr>
+          <w:b/>
+          <w:bCs/>
+          <w:sz w:val="22"/>
+          <w:szCs w:val="22"/>
+        </w:rPr>
+      </w:pPr>
+      <w:r>
+        <w:rPr>
+          <w:b/>
+          <w:bCs/>
+          <w:sz w:val="22"/>
+          <w:szCs w:val="22"/>
+        </w:rPr>
+        <w:t>5. Activity Diagrams 2 and 3 Workflow realignment</w:t>
+      </w:r>
+    </w:p>
+    <w:p>
+      <w:pPr>
+        <w:jc w:val="both"/>
+        <w:rPr>
+          <w:b/>
+          <w:bCs/>
+          <w:sz w:val="22"/>
+          <w:szCs w:val="22"/>
+          <w:u w:val="single"/>
+        </w:rPr>
+      </w:pPr>
+      <w:r>
+        <w:rPr>
+          <w:b/>
+          <w:bCs/>
+          <w:sz w:val="22"/>
+          <w:szCs w:val="22"/>
+          <w:u w:val="single"/>
+        </w:rPr>
+        <w:t>Problem/Question:</w:t>
+      </w:r>
+    </w:p>
+    <w:p>
+      <w:pPr>
+        <w:jc w:val="both"/>
+      </w:pPr>
+      <w:r>
+        <w:t xml:space="preserve">The activity diagrams originally contained workflow paths and decision nodes that matched the old design assumptions, specifically individual work-item state transitions, direct transitions into a separate EscalatedState, and a basic Role model without configurable authority levels. </w:t>
+      </w:r>
+    </w:p>
+    <w:p>
+      <w:pPr>
+        <w:jc w:val="both"/>
+        <w:rPr>
+          <w:b/>
+          <w:bCs/>
+          <w:u w:val="single"/>
+        </w:rPr>
+      </w:pPr>
+      <w:r>
+        <w:rPr>
+          <w:b/>
+          <w:bCs/>
+          <w:u w:val="single"/>
+        </w:rPr>
+        <w:t>Changes Made:</w:t>
+      </w:r>
+    </w:p>
+    <w:p>
+      <w:pPr>
+        <w:pStyle w:val="ListParagraph"/>
+        <w:numPr>
+          <w:ilvl w:val="0"/>
+          <w:numId w:val="44"/>
+        </w:numPr>
+        <w:jc w:val="both"/>
+      </w:pPr>
+      <w:r>
+        <w:t>Updated activity diagram control flows to reflect that the lifecycle is managed at the WorkflowInstance level rather than per WorkItem.</w:t>
+      </w:r>
+    </w:p>
+    <w:p>
+      <w:pPr>
+        <w:pStyle w:val="ListParagraph"/>
+        <w:numPr>
+          <w:ilvl w:val="0"/>
+          <w:numId w:val="44"/>
+        </w:numPr>
+        <w:jc w:val="both"/>
+      </w:pPr>
+      <w:r>
+        <w:t>Removed the EscalatedState activity node. Escalation is now represented as an in-line activity within the in-progress flow that triggers the Chain of Responsibility to assign a higher-authority participant.</w:t>
+      </w:r>
+    </w:p>
+    <w:p>
+      <w:pPr>
+        <w:jc w:val="both"/>
+        <w:rPr>
+          <w:b/>
+          <w:bCs/>
+          <w:u w:val="single"/>
+        </w:rPr>
+      </w:pPr>
+      <w:r>
+        <w:rPr>
+          <w:b/>
+          <w:bCs/>
+          <w:u w:val="single"/>
+        </w:rPr>
+        <w:t>Reason for Change:</w:t>
+      </w:r>
+    </w:p>
+    <w:p>
+      <w:pPr>
+        <w:jc w:val="both"/>
+      </w:pPr>
+      <w:r>
+        <w:t>Aligning the activity diagrams with the updated structural designs ensures consistency between the behavioural models and class relationships. Updated diagrams now match the current updated structures.</w:t>
+      </w:r>
     </w:p>
     <w:p>
       <w:pPr>
@@ -7177,15 +6081,7 @@
         <w:jc w:val="both"/>
       </w:pPr>
       <w:r>
-        <w:t xml:space="preserve">Kristy Heesen, Musa Msibi and Lindokuhle Skosana worked on identifying and justifying the </w:t>
-      </w:r>
-      <w:proofErr w:type="spellStart"/>
-      <w:r>
-        <w:t>GoF</w:t>
-      </w:r>
-      <w:proofErr w:type="spellEnd"/>
-      <w:r>
-        <w:t xml:space="preserve"> design patterns used in TIVIDY. This included defining the design problems, pattern participants, collaborations, variation points and how the patterns work together within the workflow management system.</w:t>
+        <w:t>Kristy Heesen, Musa Msibi and Lindokuhle Skosana worked on identifying and justifying the GoF design patterns used in TIVIDY. This included defining the design problems, pattern participants, collaborations, variation points and how the patterns work together within the workflow management system.</w:t>
       </w:r>
     </w:p>
     <w:p>
@@ -7277,23 +6173,7 @@
         <w:jc w:val="both"/>
       </w:pPr>
       <w:r>
-        <w:t xml:space="preserve">LM Kabongo and Musa Msibi worked on the UML runtime behaviour diagrams. LM Kabongo developed the sequence diagram showing the completion of a </w:t>
-      </w:r>
-      <w:proofErr w:type="spellStart"/>
-      <w:r>
-        <w:t>WorkItem</w:t>
-      </w:r>
-      <w:proofErr w:type="spellEnd"/>
-      <w:r>
-        <w:t xml:space="preserve"> and determining what happens next, as well as the </w:t>
-      </w:r>
-      <w:proofErr w:type="spellStart"/>
-      <w:r>
-        <w:t>WorkflowInstance</w:t>
-      </w:r>
-      <w:proofErr w:type="spellEnd"/>
-      <w:r>
-        <w:t xml:space="preserve"> State Diagram. Musa Msibi developed the sequence diagram showing the escalation process.</w:t>
+        <w:t>LM Kabongo and Musa Msibi worked on the UML runtime behaviour diagrams. LM Kabongo developed the sequence diagram showing the completion of a WorkItem and determining what happens next, as well as the WorkflowInstance State Diagram. Musa Msibi developed the sequence diagram showing the escalation process.</w:t>
       </w:r>
     </w:p>
     <w:p>
@@ -7410,7 +6290,7 @@
 </file>
 
 <file path=word/endnotes.xml><?xml version="1.0" encoding="utf-8"?>
-<w:endnotes xmlns:wpc="http://schemas.microsoft.com/office/word/2010/wordprocessingCanvas" xmlns:cx="http://schemas.microsoft.com/office/drawing/2014/chartex" xmlns:cx1="http://schemas.microsoft.com/office/drawing/2015/9/8/chartex" xmlns:cx2="http://schemas.microsoft.com/office/drawing/2015/10/21/chartex" xmlns:cx3="http://schemas.microsoft.com/office/drawing/2016/5/9/chartex" xmlns:cx4="http://schemas.microsoft.com/office/drawing/2016/5/10/chartex" xmlns:cx5="http://schemas.microsoft.com/office/drawing/2016/5/11/chartex" xmlns:cx6="http://schemas.microsoft.com/office/drawing/2016/5/12/chartex" xmlns:cx7="http://schemas.microsoft.com/office/drawing/2016/5/13/chartex" xmlns:cx8="http://schemas.microsoft.com/office/drawing/2016/5/14/chartex" xmlns:mc="http://schemas.openxmlformats.org/markup-compatibility/2006" xmlns:aink="http://schemas.microsoft.com/office/drawing/2016/ink" xmlns:am3d="http://schemas.microsoft.com/office/drawing/2017/model3d" xmlns:o="urn:schemas-microsoft-com:office:office" xmlns:oel="http://schemas.microsoft.com/office/2019/extlst" xmlns:r="http://schemas.openxmlformats.org/officeDocument/2006/relationships" xmlns:m="http://schemas.openxmlformats.org/officeDocument/2006/math" xmlns:v="urn:schemas-microsoft-com:vml" xmlns:wp14="http://schemas.microsoft.com/office/word/2010/wordprocessingDrawing" xmlns:wp="http://schemas.openxmlformats.org/drawingml/2006/wordprocessingDrawing" xmlns:w10="urn:schemas-microsoft-com:office:word" xmlns:w="http://schemas.openxmlformats.org/wordprocessingml/2006/main" xmlns:w14="http://schemas.microsoft.com/office/word/2010/wordml" xmlns:w15="http://schemas.microsoft.com/office/word/2012/wordml" xmlns:w16cex="http://schemas.microsoft.com/office/word/2018/wordml/cex" xmlns:w16cid="http://schemas.microsoft.com/office/word/2016/wordml/cid" xmlns:w16="http://schemas.microsoft.com/office/word/2018/wordml" xmlns:w16du="http://schemas.microsoft.com/office/word/2023/wordml/word16du" xmlns:w16sdtdh="http://schemas.microsoft.com/office/word/2020/wordml/sdtdatahash" xmlns:w16sdtfl="http://schemas.microsoft.com/office/word/2024/wordml/sdtformatlock" xmlns:w16se="http://schemas.microsoft.com/office/word/2015/wordml/symex" xmlns:wpg="http://schemas.microsoft.com/office/word/2010/wordprocessingGroup" xmlns:wpi="http://schemas.microsoft.com/office/word/2010/wordprocessingInk" xmlns:wne="http://schemas.microsoft.com/office/word/2006/wordml" xmlns:wps="http://schemas.microsoft.com/office/word/2010/wordprocessingShape" mc:Ignorable="w14 w15 w16se w16cid w16 w16cex w16sdtdh w16sdtfl w16du wp14">
+<w:endnotes xmlns:wpc="http://schemas.microsoft.com/office/word/2010/wordprocessingCanvas" xmlns:cx="http://schemas.microsoft.com/office/drawing/2014/chartex" xmlns:cx1="http://schemas.microsoft.com/office/drawing/2015/9/8/chartex" xmlns:cx2="http://schemas.microsoft.com/office/drawing/2015/10/21/chartex" xmlns:cx3="http://schemas.microsoft.com/office/drawing/2016/5/9/chartex" xmlns:cx4="http://schemas.microsoft.com/office/drawing/2016/5/10/chartex" xmlns:cx5="http://schemas.microsoft.com/office/drawing/2016/5/11/chartex" xmlns:cx6="http://schemas.microsoft.com/office/drawing/2016/5/12/chartex" xmlns:cx7="http://schemas.microsoft.com/office/drawing/2016/5/13/chartex" xmlns:cx8="http://schemas.microsoft.com/office/drawing/2016/5/14/chartex" xmlns:mc="http://schemas.openxmlformats.org/markup-compatibility/2006" xmlns:aink="http://schemas.microsoft.com/office/drawing/2016/ink" xmlns:am3d="http://schemas.microsoft.com/office/drawing/2017/model3d" xmlns:o="urn:schemas-microsoft-com:office:office" xmlns:oel="http://schemas.microsoft.com/office/2019/extlst" xmlns:r="http://schemas.openxmlformats.org/officeDocument/2006/relationships" xmlns:m="http://schemas.openxmlformats.org/officeDocument/2006/math" xmlns:v="urn:schemas-microsoft-com:vml" xmlns:wp14="http://schemas.microsoft.com/office/word/2010/wordprocessingDrawing" xmlns:wp="http://schemas.openxmlformats.org/drawingml/2006/wordprocessingDrawing" xmlns:w10="urn:schemas-microsoft-com:office:word" xmlns:w="http://schemas.openxmlformats.org/wordprocessingml/2006/main" xmlns:w14="http://schemas.microsoft.com/office/word/2010/wordml" xmlns:w15="http://schemas.microsoft.com/office/word/2012/wordml" xmlns:w16cex="http://schemas.microsoft.com/office/word/2018/wordml/cex" xmlns:w16cid="http://schemas.microsoft.com/office/word/2016/wordml/cid" xmlns:w16="http://schemas.microsoft.com/office/word/2018/wordml" xmlns:w16sdtdh="http://schemas.microsoft.com/office/word/2020/wordml/sdtdatahash" xmlns:w16se="http://schemas.microsoft.com/office/word/2015/wordml/symex" xmlns:wpg="http://schemas.microsoft.com/office/word/2010/wordprocessingGroup" xmlns:wpi="http://schemas.microsoft.com/office/word/2010/wordprocessingInk" xmlns:wne="http://schemas.microsoft.com/office/word/2006/wordml" xmlns:wps="http://schemas.microsoft.com/office/word/2010/wordprocessingShape" mc:Ignorable="w14 w15 w16se w16cid w16 w16cex w16sdtdh wp14">
   <w:endnote w:type="separator" w:id="-1">
     <w:p>
       <w:pPr>
@@ -7435,7 +6315,7 @@
 </file>
 
 <file path=word/footnotes.xml><?xml version="1.0" encoding="utf-8"?>
-<w:footnotes xmlns:wpc="http://schemas.microsoft.com/office/word/2010/wordprocessingCanvas" xmlns:cx="http://schemas.microsoft.com/office/drawing/2014/chartex" xmlns:cx1="http://schemas.microsoft.com/office/drawing/2015/9/8/chartex" xmlns:cx2="http://schemas.microsoft.com/office/drawing/2015/10/21/chartex" xmlns:cx3="http://schemas.microsoft.com/office/drawing/2016/5/9/chartex" xmlns:cx4="http://schemas.microsoft.com/office/drawing/2016/5/10/chartex" xmlns:cx5="http://schemas.microsoft.com/office/drawing/2016/5/11/chartex" xmlns:cx6="http://schemas.microsoft.com/office/drawing/2016/5/12/chartex" xmlns:cx7="http://schemas.microsoft.com/office/drawing/2016/5/13/chartex" xmlns:cx8="http://schemas.microsoft.com/office/drawing/2016/5/14/chartex" xmlns:mc="http://schemas.openxmlformats.org/markup-compatibility/2006" xmlns:aink="http://schemas.microsoft.com/office/drawing/2016/ink" xmlns:am3d="http://schemas.microsoft.com/office/drawing/2017/model3d" xmlns:o="urn:schemas-microsoft-com:office:office" xmlns:oel="http://schemas.microsoft.com/office/2019/extlst" xmlns:r="http://schemas.openxmlformats.org/officeDocument/2006/relationships" xmlns:m="http://schemas.openxmlformats.org/officeDocument/2006/math" xmlns:v="urn:schemas-microsoft-com:vml" xmlns:wp14="http://schemas.microsoft.com/office/word/2010/wordprocessingDrawing" xmlns:wp="http://schemas.openxmlformats.org/drawingml/2006/wordprocessingDrawing" xmlns:w10="urn:schemas-microsoft-com:office:word" xmlns:w="http://schemas.openxmlformats.org/wordprocessingml/2006/main" xmlns:w14="http://schemas.microsoft.com/office/word/2010/wordml" xmlns:w15="http://schemas.microsoft.com/office/word/2012/wordml" xmlns:w16cex="http://schemas.microsoft.com/office/word/2018/wordml/cex" xmlns:w16cid="http://schemas.microsoft.com/office/word/2016/wordml/cid" xmlns:w16="http://schemas.microsoft.com/office/word/2018/wordml" xmlns:w16du="http://schemas.microsoft.com/office/word/2023/wordml/word16du" xmlns:w16sdtdh="http://schemas.microsoft.com/office/word/2020/wordml/sdtdatahash" xmlns:w16sdtfl="http://schemas.microsoft.com/office/word/2024/wordml/sdtformatlock" xmlns:w16se="http://schemas.microsoft.com/office/word/2015/wordml/symex" xmlns:wpg="http://schemas.microsoft.com/office/word/2010/wordprocessingGroup" xmlns:wpi="http://schemas.microsoft.com/office/word/2010/wordprocessingInk" xmlns:wne="http://schemas.microsoft.com/office/word/2006/wordml" xmlns:wps="http://schemas.microsoft.com/office/word/2010/wordprocessingShape" mc:Ignorable="w14 w15 w16se w16cid w16 w16cex w16sdtdh w16sdtfl w16du wp14">
+<w:footnotes xmlns:wpc="http://schemas.microsoft.com/office/word/2010/wordprocessingCanvas" xmlns:cx="http://schemas.microsoft.com/office/drawing/2014/chartex" xmlns:cx1="http://schemas.microsoft.com/office/drawing/2015/9/8/chartex" xmlns:cx2="http://schemas.microsoft.com/office/drawing/2015/10/21/chartex" xmlns:cx3="http://schemas.microsoft.com/office/drawing/2016/5/9/chartex" xmlns:cx4="http://schemas.microsoft.com/office/drawing/2016/5/10/chartex" xmlns:cx5="http://schemas.microsoft.com/office/drawing/2016/5/11/chartex" xmlns:cx6="http://schemas.microsoft.com/office/drawing/2016/5/12/chartex" xmlns:cx7="http://schemas.microsoft.com/office/drawing/2016/5/13/chartex" xmlns:cx8="http://schemas.microsoft.com/office/drawing/2016/5/14/chartex" xmlns:mc="http://schemas.openxmlformats.org/markup-compatibility/2006" xmlns:aink="http://schemas.microsoft.com/office/drawing/2016/ink" xmlns:am3d="http://schemas.microsoft.com/office/drawing/2017/model3d" xmlns:o="urn:schemas-microsoft-com:office:office" xmlns:oel="http://schemas.microsoft.com/office/2019/extlst" xmlns:r="http://schemas.openxmlformats.org/officeDocument/2006/relationships" xmlns:m="http://schemas.openxmlformats.org/officeDocument/2006/math" xmlns:v="urn:schemas-microsoft-com:vml" xmlns:wp14="http://schemas.microsoft.com/office/word/2010/wordprocessingDrawing" xmlns:wp="http://schemas.openxmlformats.org/drawingml/2006/wordprocessingDrawing" xmlns:w10="urn:schemas-microsoft-com:office:word" xmlns:w="http://schemas.openxmlformats.org/wordprocessingml/2006/main" xmlns:w14="http://schemas.microsoft.com/office/word/2010/wordml" xmlns:w15="http://schemas.microsoft.com/office/word/2012/wordml" xmlns:w16cex="http://schemas.microsoft.com/office/word/2018/wordml/cex" xmlns:w16cid="http://schemas.microsoft.com/office/word/2016/wordml/cid" xmlns:w16="http://schemas.microsoft.com/office/word/2018/wordml" xmlns:w16sdtdh="http://schemas.microsoft.com/office/word/2020/wordml/sdtdatahash" xmlns:w16se="http://schemas.microsoft.com/office/word/2015/wordml/symex" xmlns:wpg="http://schemas.microsoft.com/office/word/2010/wordprocessingGroup" xmlns:wpi="http://schemas.microsoft.com/office/word/2010/wordprocessingInk" xmlns:wne="http://schemas.microsoft.com/office/word/2006/wordml" xmlns:wps="http://schemas.microsoft.com/office/word/2010/wordprocessingShape" mc:Ignorable="w14 w15 w16se w16cid w16 w16cex w16sdtdh wp14">
   <w:footnote w:type="separator" w:id="-1">
     <w:p>
       <w:pPr>
@@ -7460,7 +6340,7 @@
 </file>
 
 <file path=word/header1.xml><?xml version="1.0" encoding="utf-8"?>
-<w:hdr xmlns:wpc="http://schemas.microsoft.com/office/word/2010/wordprocessingCanvas" xmlns:cx="http://schemas.microsoft.com/office/drawing/2014/chartex" xmlns:cx1="http://schemas.microsoft.com/office/drawing/2015/9/8/chartex" xmlns:cx2="http://schemas.microsoft.com/office/drawing/2015/10/21/chartex" xmlns:cx3="http://schemas.microsoft.com/office/drawing/2016/5/9/chartex" xmlns:cx4="http://schemas.microsoft.com/office/drawing/2016/5/10/chartex" xmlns:cx5="http://schemas.microsoft.com/office/drawing/2016/5/11/chartex" xmlns:cx6="http://schemas.microsoft.com/office/drawing/2016/5/12/chartex" xmlns:cx7="http://schemas.microsoft.com/office/drawing/2016/5/13/chartex" xmlns:cx8="http://schemas.microsoft.com/office/drawing/2016/5/14/chartex" xmlns:mc="http://schemas.openxmlformats.org/markup-compatibility/2006" xmlns:aink="http://schemas.microsoft.com/office/drawing/2016/ink" xmlns:am3d="http://schemas.microsoft.com/office/drawing/2017/model3d" xmlns:o="urn:schemas-microsoft-com:office:office" xmlns:oel="http://schemas.microsoft.com/office/2019/extlst" xmlns:r="http://schemas.openxmlformats.org/officeDocument/2006/relationships" xmlns:m="http://schemas.openxmlformats.org/officeDocument/2006/math" xmlns:v="urn:schemas-microsoft-com:vml" xmlns:wp14="http://schemas.microsoft.com/office/word/2010/wordprocessingDrawing" xmlns:wp="http://schemas.openxmlformats.org/drawingml/2006/wordprocessingDrawing" xmlns:w10="urn:schemas-microsoft-com:office:word" xmlns:w="http://schemas.openxmlformats.org/wordprocessingml/2006/main" xmlns:w14="http://schemas.microsoft.com/office/word/2010/wordml" xmlns:w15="http://schemas.microsoft.com/office/word/2012/wordml" xmlns:w16cex="http://schemas.microsoft.com/office/word/2018/wordml/cex" xmlns:w16cid="http://schemas.microsoft.com/office/word/2016/wordml/cid" xmlns:w16="http://schemas.microsoft.com/office/word/2018/wordml" xmlns:w16du="http://schemas.microsoft.com/office/word/2023/wordml/word16du" xmlns:w16sdtdh="http://schemas.microsoft.com/office/word/2020/wordml/sdtdatahash" xmlns:w16sdtfl="http://schemas.microsoft.com/office/word/2024/wordml/sdtformatlock" xmlns:w16se="http://schemas.microsoft.com/office/word/2015/wordml/symex" xmlns:wpg="http://schemas.microsoft.com/office/word/2010/wordprocessingGroup" xmlns:wpi="http://schemas.microsoft.com/office/word/2010/wordprocessingInk" xmlns:wne="http://schemas.microsoft.com/office/word/2006/wordml" xmlns:wps="http://schemas.microsoft.com/office/word/2010/wordprocessingShape" mc:Ignorable="w14 w15 w16se w16cid w16 w16cex w16sdtdh w16sdtfl w16du wp14">
+<w:hdr xmlns:wpc="http://schemas.microsoft.com/office/word/2010/wordprocessingCanvas" xmlns:cx="http://schemas.microsoft.com/office/drawing/2014/chartex" xmlns:cx1="http://schemas.microsoft.com/office/drawing/2015/9/8/chartex" xmlns:cx2="http://schemas.microsoft.com/office/drawing/2015/10/21/chartex" xmlns:cx3="http://schemas.microsoft.com/office/drawing/2016/5/9/chartex" xmlns:cx4="http://schemas.microsoft.com/office/drawing/2016/5/10/chartex" xmlns:cx5="http://schemas.microsoft.com/office/drawing/2016/5/11/chartex" xmlns:cx6="http://schemas.microsoft.com/office/drawing/2016/5/12/chartex" xmlns:cx7="http://schemas.microsoft.com/office/drawing/2016/5/13/chartex" xmlns:cx8="http://schemas.microsoft.com/office/drawing/2016/5/14/chartex" xmlns:mc="http://schemas.openxmlformats.org/markup-compatibility/2006" xmlns:aink="http://schemas.microsoft.com/office/drawing/2016/ink" xmlns:am3d="http://schemas.microsoft.com/office/drawing/2017/model3d" xmlns:o="urn:schemas-microsoft-com:office:office" xmlns:oel="http://schemas.microsoft.com/office/2019/extlst" xmlns:r="http://schemas.openxmlformats.org/officeDocument/2006/relationships" xmlns:m="http://schemas.openxmlformats.org/officeDocument/2006/math" xmlns:v="urn:schemas-microsoft-com:vml" xmlns:wp14="http://schemas.microsoft.com/office/word/2010/wordprocessingDrawing" xmlns:wp="http://schemas.openxmlformats.org/drawingml/2006/wordprocessingDrawing" xmlns:w10="urn:schemas-microsoft-com:office:word" xmlns:w="http://schemas.openxmlformats.org/wordprocessingml/2006/main" xmlns:w14="http://schemas.microsoft.com/office/word/2010/wordml" xmlns:w15="http://schemas.microsoft.com/office/word/2012/wordml" xmlns:w16cex="http://schemas.microsoft.com/office/word/2018/wordml/cex" xmlns:w16cid="http://schemas.microsoft.com/office/word/2016/wordml/cid" xmlns:w16="http://schemas.microsoft.com/office/word/2018/wordml" xmlns:w16sdtdh="http://schemas.microsoft.com/office/word/2020/wordml/sdtdatahash" xmlns:w16se="http://schemas.microsoft.com/office/word/2015/wordml/symex" xmlns:wpg="http://schemas.microsoft.com/office/word/2010/wordprocessingGroup" xmlns:wpi="http://schemas.microsoft.com/office/word/2010/wordprocessingInk" xmlns:wne="http://schemas.microsoft.com/office/word/2006/wordml" xmlns:wps="http://schemas.microsoft.com/office/word/2010/wordprocessingShape" mc:Ignorable="w14 w15 w16se w16cid w16 w16cex w16sdtdh wp14">
   <w:p>
     <w:pPr>
       <w:pStyle w:val="Header"/>
@@ -7638,7 +6518,7 @@
 </file>
 
 <file path=word/numbering.xml><?xml version="1.0" encoding="utf-8"?>
-<w:numbering xmlns:wpc="http://schemas.microsoft.com/office/word/2010/wordprocessingCanvas" xmlns:cx="http://schemas.microsoft.com/office/drawing/2014/chartex" xmlns:cx1="http://schemas.microsoft.com/office/drawing/2015/9/8/chartex" xmlns:cx2="http://schemas.microsoft.com/office/drawing/2015/10/21/chartex" xmlns:cx3="http://schemas.microsoft.com/office/drawing/2016/5/9/chartex" xmlns:cx4="http://schemas.microsoft.com/office/drawing/2016/5/10/chartex" xmlns:cx5="http://schemas.microsoft.com/office/drawing/2016/5/11/chartex" xmlns:cx6="http://schemas.microsoft.com/office/drawing/2016/5/12/chartex" xmlns:cx7="http://schemas.microsoft.com/office/drawing/2016/5/13/chartex" xmlns:cx8="http://schemas.microsoft.com/office/drawing/2016/5/14/chartex" xmlns:mc="http://schemas.openxmlformats.org/markup-compatibility/2006" xmlns:aink="http://schemas.microsoft.com/office/drawing/2016/ink" xmlns:am3d="http://schemas.microsoft.com/office/drawing/2017/model3d" xmlns:o="urn:schemas-microsoft-com:office:office" xmlns:oel="http://schemas.microsoft.com/office/2019/extlst" xmlns:r="http://schemas.openxmlformats.org/officeDocument/2006/relationships" xmlns:m="http://schemas.openxmlformats.org/officeDocument/2006/math" xmlns:v="urn:schemas-microsoft-com:vml" xmlns:wp14="http://schemas.microsoft.com/office/word/2010/wordprocessingDrawing" xmlns:wp="http://schemas.openxmlformats.org/drawingml/2006/wordprocessingDrawing" xmlns:w10="urn:schemas-microsoft-com:office:word" xmlns:w="http://schemas.openxmlformats.org/wordprocessingml/2006/main" xmlns:w14="http://schemas.microsoft.com/office/word/2010/wordml" xmlns:w15="http://schemas.microsoft.com/office/word/2012/wordml" xmlns:w16cex="http://schemas.microsoft.com/office/word/2018/wordml/cex" xmlns:w16cid="http://schemas.microsoft.com/office/word/2016/wordml/cid" xmlns:w16="http://schemas.microsoft.com/office/word/2018/wordml" xmlns:w16du="http://schemas.microsoft.com/office/word/2023/wordml/word16du" xmlns:w16sdtdh="http://schemas.microsoft.com/office/word/2020/wordml/sdtdatahash" xmlns:w16sdtfl="http://schemas.microsoft.com/office/word/2024/wordml/sdtformatlock" xmlns:w16se="http://schemas.microsoft.com/office/word/2015/wordml/symex" xmlns:wpg="http://schemas.microsoft.com/office/word/2010/wordprocessingGroup" xmlns:wpi="http://schemas.microsoft.com/office/word/2010/wordprocessingInk" xmlns:wne="http://schemas.microsoft.com/office/word/2006/wordml" xmlns:wps="http://schemas.microsoft.com/office/word/2010/wordprocessingShape" mc:Ignorable="w14 w15 w16se w16cid w16 w16cex w16sdtdh w16sdtfl w16du wp14">
+<w:numbering xmlns:wpc="http://schemas.microsoft.com/office/word/2010/wordprocessingCanvas" xmlns:cx="http://schemas.microsoft.com/office/drawing/2014/chartex" xmlns:cx1="http://schemas.microsoft.com/office/drawing/2015/9/8/chartex" xmlns:cx2="http://schemas.microsoft.com/office/drawing/2015/10/21/chartex" xmlns:cx3="http://schemas.microsoft.com/office/drawing/2016/5/9/chartex" xmlns:cx4="http://schemas.microsoft.com/office/drawing/2016/5/10/chartex" xmlns:cx5="http://schemas.microsoft.com/office/drawing/2016/5/11/chartex" xmlns:cx6="http://schemas.microsoft.com/office/drawing/2016/5/12/chartex" xmlns:cx7="http://schemas.microsoft.com/office/drawing/2016/5/13/chartex" xmlns:cx8="http://schemas.microsoft.com/office/drawing/2016/5/14/chartex" xmlns:mc="http://schemas.openxmlformats.org/markup-compatibility/2006" xmlns:aink="http://schemas.microsoft.com/office/drawing/2016/ink" xmlns:am3d="http://schemas.microsoft.com/office/drawing/2017/model3d" xmlns:o="urn:schemas-microsoft-com:office:office" xmlns:oel="http://schemas.microsoft.com/office/2019/extlst" xmlns:r="http://schemas.openxmlformats.org/officeDocument/2006/relationships" xmlns:m="http://schemas.openxmlformats.org/officeDocument/2006/math" xmlns:v="urn:schemas-microsoft-com:vml" xmlns:wp14="http://schemas.microsoft.com/office/word/2010/wordprocessingDrawing" xmlns:wp="http://schemas.openxmlformats.org/drawingml/2006/wordprocessingDrawing" xmlns:w10="urn:schemas-microsoft-com:office:word" xmlns:w="http://schemas.openxmlformats.org/wordprocessingml/2006/main" xmlns:w14="http://schemas.microsoft.com/office/word/2010/wordml" xmlns:w15="http://schemas.microsoft.com/office/word/2012/wordml" xmlns:w16cex="http://schemas.microsoft.com/office/word/2018/wordml/cex" xmlns:w16cid="http://schemas.microsoft.com/office/word/2016/wordml/cid" xmlns:w16="http://schemas.microsoft.com/office/word/2018/wordml" xmlns:w16sdtdh="http://schemas.microsoft.com/office/word/2020/wordml/sdtdatahash" xmlns:w16se="http://schemas.microsoft.com/office/word/2015/wordml/symex" xmlns:wpg="http://schemas.microsoft.com/office/word/2010/wordprocessingGroup" xmlns:wpi="http://schemas.microsoft.com/office/word/2010/wordprocessingInk" xmlns:wne="http://schemas.microsoft.com/office/word/2006/wordml" xmlns:wps="http://schemas.microsoft.com/office/word/2010/wordprocessingShape" mc:Ignorable="w14 w15 w16se w16cid w16 w16cex w16sdtdh wp14">
   <w:abstractNum w:abstractNumId="0" w15:restartNumberingAfterBreak="0">
     <w:nsid w:val="036205D6"/>
     <w:multiLevelType w:val="multilevel"/>
@@ -11559,6 +10439,119 @@
     </w:lvl>
   </w:abstractNum>
   <w:abstractNum w:abstractNumId="32" w15:restartNumberingAfterBreak="0">
+    <w:nsid w:val="6CCB0484"/>
+    <w:multiLevelType w:val="hybridMultilevel"/>
+    <w:tmpl w:val="9E3E2228"/>
+    <w:lvl w:ilvl="0" w:tplc="E6F24E42">
+      <w:start w:val="5"/>
+      <w:numFmt w:val="bullet"/>
+      <w:lvlText w:val="-"/>
+      <w:lvlJc w:val="left"/>
+      <w:pPr>
+        <w:ind w:left="720" w:hanging="360"/>
+      </w:pPr>
+      <w:rPr>
+        <w:rFonts w:ascii="Century Gothic" w:eastAsiaTheme="minorEastAsia" w:hAnsi="Century Gothic" w:cstheme="minorBidi" w:hint="default"/>
+      </w:rPr>
+    </w:lvl>
+    <w:lvl w:ilvl="1" w:tplc="1C090003" w:tentative="1">
+      <w:start w:val="1"/>
+      <w:numFmt w:val="bullet"/>
+      <w:lvlText w:val="o"/>
+      <w:lvlJc w:val="left"/>
+      <w:pPr>
+        <w:ind w:left="1440" w:hanging="360"/>
+      </w:pPr>
+      <w:rPr>
+        <w:rFonts w:ascii="Courier New" w:hAnsi="Courier New" w:cs="Courier New" w:hint="default"/>
+      </w:rPr>
+    </w:lvl>
+    <w:lvl w:ilvl="2" w:tplc="1C090005" w:tentative="1">
+      <w:start w:val="1"/>
+      <w:numFmt w:val="bullet"/>
+      <w:lvlText w:val=""/>
+      <w:lvlJc w:val="left"/>
+      <w:pPr>
+        <w:ind w:left="2160" w:hanging="360"/>
+      </w:pPr>
+      <w:rPr>
+        <w:rFonts w:ascii="Wingdings" w:hAnsi="Wingdings" w:hint="default"/>
+      </w:rPr>
+    </w:lvl>
+    <w:lvl w:ilvl="3" w:tplc="1C090001" w:tentative="1">
+      <w:start w:val="1"/>
+      <w:numFmt w:val="bullet"/>
+      <w:lvlText w:val=""/>
+      <w:lvlJc w:val="left"/>
+      <w:pPr>
+        <w:ind w:left="2880" w:hanging="360"/>
+      </w:pPr>
+      <w:rPr>
+        <w:rFonts w:ascii="Symbol" w:hAnsi="Symbol" w:hint="default"/>
+      </w:rPr>
+    </w:lvl>
+    <w:lvl w:ilvl="4" w:tplc="1C090003" w:tentative="1">
+      <w:start w:val="1"/>
+      <w:numFmt w:val="bullet"/>
+      <w:lvlText w:val="o"/>
+      <w:lvlJc w:val="left"/>
+      <w:pPr>
+        <w:ind w:left="3600" w:hanging="360"/>
+      </w:pPr>
+      <w:rPr>
+        <w:rFonts w:ascii="Courier New" w:hAnsi="Courier New" w:cs="Courier New" w:hint="default"/>
+      </w:rPr>
+    </w:lvl>
+    <w:lvl w:ilvl="5" w:tplc="1C090005" w:tentative="1">
+      <w:start w:val="1"/>
+      <w:numFmt w:val="bullet"/>
+      <w:lvlText w:val=""/>
+      <w:lvlJc w:val="left"/>
+      <w:pPr>
+        <w:ind w:left="4320" w:hanging="360"/>
+      </w:pPr>
+      <w:rPr>
+        <w:rFonts w:ascii="Wingdings" w:hAnsi="Wingdings" w:hint="default"/>
+      </w:rPr>
+    </w:lvl>
+    <w:lvl w:ilvl="6" w:tplc="1C090001" w:tentative="1">
+      <w:start w:val="1"/>
+      <w:numFmt w:val="bullet"/>
+      <w:lvlText w:val=""/>
+      <w:lvlJc w:val="left"/>
+      <w:pPr>
+        <w:ind w:left="5040" w:hanging="360"/>
+      </w:pPr>
+      <w:rPr>
+        <w:rFonts w:ascii="Symbol" w:hAnsi="Symbol" w:hint="default"/>
+      </w:rPr>
+    </w:lvl>
+    <w:lvl w:ilvl="7" w:tplc="1C090003" w:tentative="1">
+      <w:start w:val="1"/>
+      <w:numFmt w:val="bullet"/>
+      <w:lvlText w:val="o"/>
+      <w:lvlJc w:val="left"/>
+      <w:pPr>
+        <w:ind w:left="5760" w:hanging="360"/>
+      </w:pPr>
+      <w:rPr>
+        <w:rFonts w:ascii="Courier New" w:hAnsi="Courier New" w:cs="Courier New" w:hint="default"/>
+      </w:rPr>
+    </w:lvl>
+    <w:lvl w:ilvl="8" w:tplc="1C090005" w:tentative="1">
+      <w:start w:val="1"/>
+      <w:numFmt w:val="bullet"/>
+      <w:lvlText w:val=""/>
+      <w:lvlJc w:val="left"/>
+      <w:pPr>
+        <w:ind w:left="6480" w:hanging="360"/>
+      </w:pPr>
+      <w:rPr>
+        <w:rFonts w:ascii="Wingdings" w:hAnsi="Wingdings" w:hint="default"/>
+      </w:rPr>
+    </w:lvl>
+  </w:abstractNum>
+  <w:abstractNum w:abstractNumId="33" w15:restartNumberingAfterBreak="0">
     <w:nsid w:val="6D187D40"/>
     <w:multiLevelType w:val="hybridMultilevel"/>
     <w:tmpl w:val="88A0D6BA"/>
@@ -11671,7 +10664,7 @@
       </w:rPr>
     </w:lvl>
   </w:abstractNum>
-  <w:abstractNum w:abstractNumId="33" w15:restartNumberingAfterBreak="0">
+  <w:abstractNum w:abstractNumId="34" w15:restartNumberingAfterBreak="0">
     <w:nsid w:val="6F4B66BE"/>
     <w:multiLevelType w:val="hybridMultilevel"/>
     <w:tmpl w:val="81BC6822"/>
@@ -11784,7 +10777,7 @@
       </w:rPr>
     </w:lvl>
   </w:abstractNum>
-  <w:abstractNum w:abstractNumId="34" w15:restartNumberingAfterBreak="0">
+  <w:abstractNum w:abstractNumId="35" w15:restartNumberingAfterBreak="0">
     <w:nsid w:val="74650835"/>
     <w:multiLevelType w:val="multilevel"/>
     <w:tmpl w:val="FEC43A56"/>
@@ -11933,7 +10926,7 @@
       </w:rPr>
     </w:lvl>
   </w:abstractNum>
-  <w:abstractNum w:abstractNumId="35" w15:restartNumberingAfterBreak="0">
+  <w:abstractNum w:abstractNumId="36" w15:restartNumberingAfterBreak="0">
     <w:nsid w:val="75422585"/>
     <w:multiLevelType w:val="hybridMultilevel"/>
     <w:tmpl w:val="AFEA1AFE"/>
@@ -12045,7 +11038,7 @@
       </w:rPr>
     </w:lvl>
   </w:abstractNum>
-  <w:abstractNum w:abstractNumId="36" w15:restartNumberingAfterBreak="0">
+  <w:abstractNum w:abstractNumId="37" w15:restartNumberingAfterBreak="0">
     <w:nsid w:val="761C6238"/>
     <w:multiLevelType w:val="multilevel"/>
     <w:tmpl w:val="A888F022"/>
@@ -12194,7 +11187,7 @@
       </w:rPr>
     </w:lvl>
   </w:abstractNum>
-  <w:abstractNum w:abstractNumId="37" w15:restartNumberingAfterBreak="0">
+  <w:abstractNum w:abstractNumId="38" w15:restartNumberingAfterBreak="0">
     <w:nsid w:val="766D0BCD"/>
     <w:multiLevelType w:val="hybridMultilevel"/>
     <w:tmpl w:val="D16A84D4"/>
@@ -12307,7 +11300,7 @@
       </w:rPr>
     </w:lvl>
   </w:abstractNum>
-  <w:abstractNum w:abstractNumId="38" w15:restartNumberingAfterBreak="0">
+  <w:abstractNum w:abstractNumId="39" w15:restartNumberingAfterBreak="0">
     <w:nsid w:val="76D22E25"/>
     <w:multiLevelType w:val="hybridMultilevel"/>
     <w:tmpl w:val="09763A0E"/>
@@ -12420,7 +11413,7 @@
       </w:rPr>
     </w:lvl>
   </w:abstractNum>
-  <w:abstractNum w:abstractNumId="39" w15:restartNumberingAfterBreak="0">
+  <w:abstractNum w:abstractNumId="40" w15:restartNumberingAfterBreak="0">
     <w:nsid w:val="780C3A60"/>
     <w:multiLevelType w:val="hybridMultilevel"/>
     <w:tmpl w:val="7D188D74"/>
@@ -12506,7 +11499,7 @@
       </w:pPr>
     </w:lvl>
   </w:abstractNum>
-  <w:abstractNum w:abstractNumId="40" w15:restartNumberingAfterBreak="0">
+  <w:abstractNum w:abstractNumId="41" w15:restartNumberingAfterBreak="0">
     <w:nsid w:val="78B349EF"/>
     <w:multiLevelType w:val="multilevel"/>
     <w:tmpl w:val="55C26242"/>
@@ -12655,7 +11648,7 @@
       </w:rPr>
     </w:lvl>
   </w:abstractNum>
-  <w:abstractNum w:abstractNumId="41" w15:restartNumberingAfterBreak="0">
+  <w:abstractNum w:abstractNumId="42" w15:restartNumberingAfterBreak="0">
     <w:nsid w:val="7B8D2FAB"/>
     <w:multiLevelType w:val="hybridMultilevel"/>
     <w:tmpl w:val="D05E61CC"/>
@@ -12768,7 +11761,7 @@
       </w:rPr>
     </w:lvl>
   </w:abstractNum>
-  <w:abstractNum w:abstractNumId="42" w15:restartNumberingAfterBreak="0">
+  <w:abstractNum w:abstractNumId="43" w15:restartNumberingAfterBreak="0">
     <w:nsid w:val="7F617035"/>
     <w:multiLevelType w:val="multilevel"/>
     <w:tmpl w:val="0216734C"/>
@@ -12918,7 +11911,7 @@
     </w:lvl>
   </w:abstractNum>
   <w:num w:numId="1" w16cid:durableId="1124885034">
-    <w:abstractNumId w:val="35"/>
+    <w:abstractNumId w:val="36"/>
   </w:num>
   <w:num w:numId="2" w16cid:durableId="1078286140">
     <w:abstractNumId w:val="31"/>
@@ -12954,7 +11947,7 @@
     <w:abstractNumId w:val="24"/>
   </w:num>
   <w:num w:numId="13" w16cid:durableId="1853764828">
-    <w:abstractNumId w:val="40"/>
+    <w:abstractNumId w:val="41"/>
   </w:num>
   <w:num w:numId="14" w16cid:durableId="879898953">
     <w:abstractNumId w:val="27"/>
@@ -12963,7 +11956,7 @@
     <w:abstractNumId w:val="1"/>
   </w:num>
   <w:num w:numId="16" w16cid:durableId="1040784751">
-    <w:abstractNumId w:val="34"/>
+    <w:abstractNumId w:val="35"/>
   </w:num>
   <w:num w:numId="17" w16cid:durableId="709691325">
     <w:abstractNumId w:val="2"/>
@@ -12975,13 +11968,13 @@
     <w:abstractNumId w:val="18"/>
   </w:num>
   <w:num w:numId="20" w16cid:durableId="86924542">
-    <w:abstractNumId w:val="36"/>
+    <w:abstractNumId w:val="37"/>
   </w:num>
   <w:num w:numId="21" w16cid:durableId="523595216">
     <w:abstractNumId w:val="16"/>
   </w:num>
   <w:num w:numId="22" w16cid:durableId="846753958">
-    <w:abstractNumId w:val="33"/>
+    <w:abstractNumId w:val="34"/>
   </w:num>
   <w:num w:numId="23" w16cid:durableId="1383552108">
     <w:abstractNumId w:val="4"/>
@@ -12993,13 +11986,13 @@
     <w:abstractNumId w:val="28"/>
   </w:num>
   <w:num w:numId="26" w16cid:durableId="1320035129">
-    <w:abstractNumId w:val="32"/>
+    <w:abstractNumId w:val="33"/>
   </w:num>
   <w:num w:numId="27" w16cid:durableId="1663045335">
     <w:abstractNumId w:val="5"/>
   </w:num>
   <w:num w:numId="28" w16cid:durableId="1181967262">
-    <w:abstractNumId w:val="37"/>
+    <w:abstractNumId w:val="38"/>
   </w:num>
   <w:num w:numId="29" w16cid:durableId="669024030">
     <w:abstractNumId w:val="3"/>
@@ -13026,13 +12019,13 @@
     <w:abstractNumId w:val="29"/>
   </w:num>
   <w:num w:numId="37" w16cid:durableId="1183133334">
-    <w:abstractNumId w:val="41"/>
+    <w:abstractNumId w:val="42"/>
   </w:num>
   <w:num w:numId="38" w16cid:durableId="1454009777">
-    <w:abstractNumId w:val="39"/>
+    <w:abstractNumId w:val="40"/>
   </w:num>
   <w:num w:numId="39" w16cid:durableId="175771861">
-    <w:abstractNumId w:val="38"/>
+    <w:abstractNumId w:val="39"/>
   </w:num>
   <w:num w:numId="40" w16cid:durableId="102580993">
     <w:abstractNumId w:val="13"/>
@@ -13041,16 +12034,19 @@
     <w:abstractNumId w:val="23"/>
   </w:num>
   <w:num w:numId="42" w16cid:durableId="1153446902">
-    <w:abstractNumId w:val="42"/>
+    <w:abstractNumId w:val="43"/>
   </w:num>
   <w:num w:numId="43" w16cid:durableId="469906689">
     <w:abstractNumId w:val="8"/>
+  </w:num>
+  <w:num w:numId="44" w16cid:durableId="1521165473">
+    <w:abstractNumId w:val="32"/>
   </w:num>
 </w:numbering>
 </file>
 
 <file path=word/styles.xml><?xml version="1.0" encoding="utf-8"?>
-<w:styles xmlns:mc="http://schemas.openxmlformats.org/markup-compatibility/2006" xmlns:r="http://schemas.openxmlformats.org/officeDocument/2006/relationships" xmlns:w="http://schemas.openxmlformats.org/wordprocessingml/2006/main" xmlns:w14="http://schemas.microsoft.com/office/word/2010/wordml" xmlns:w15="http://schemas.microsoft.com/office/word/2012/wordml" xmlns:w16cex="http://schemas.microsoft.com/office/word/2018/wordml/cex" xmlns:w16cid="http://schemas.microsoft.com/office/word/2016/wordml/cid" xmlns:w16="http://schemas.microsoft.com/office/word/2018/wordml" xmlns:w16du="http://schemas.microsoft.com/office/word/2023/wordml/word16du" xmlns:w16sdtdh="http://schemas.microsoft.com/office/word/2020/wordml/sdtdatahash" xmlns:w16sdtfl="http://schemas.microsoft.com/office/word/2024/wordml/sdtformatlock" xmlns:w16se="http://schemas.microsoft.com/office/word/2015/wordml/symex" mc:Ignorable="w14 w15 w16se w16cid w16 w16cex w16sdtdh w16sdtfl w16du">
+<w:styles xmlns:mc="http://schemas.openxmlformats.org/markup-compatibility/2006" xmlns:r="http://schemas.openxmlformats.org/officeDocument/2006/relationships" xmlns:w="http://schemas.openxmlformats.org/wordprocessingml/2006/main" xmlns:w14="http://schemas.microsoft.com/office/word/2010/wordml" xmlns:w15="http://schemas.microsoft.com/office/word/2012/wordml" xmlns:w16cex="http://schemas.microsoft.com/office/word/2018/wordml/cex" xmlns:w16cid="http://schemas.microsoft.com/office/word/2016/wordml/cid" xmlns:w16="http://schemas.microsoft.com/office/word/2018/wordml" xmlns:w16sdtdh="http://schemas.microsoft.com/office/word/2020/wordml/sdtdatahash" xmlns:w16se="http://schemas.microsoft.com/office/word/2015/wordml/symex" mc:Ignorable="w14 w15 w16se w16cid w16 w16cex w16sdtdh">
   <w:docDefaults>
     <w:rPrDefault>
       <w:rPr>

</xml_diff>

<commit_message>
Update workflow instance state diagram
</commit_message>
<xml_diff>
--- a/docs/214 PDF document.docx
+++ b/docs/214 PDF document.docx
@@ -6129,14 +6129,12 @@
       <w:r>
         <w:rPr>
           <w:noProof/>
-          <w:sz w:val="28"/>
-          <w:szCs w:val="28"/>
         </w:rPr>
         <w:drawing>
-          <wp:inline distT="0" distB="0" distL="0" distR="0" wp14:anchorId="695722AA" wp14:editId="4ED9CC64">
-            <wp:extent cx="5731510" cy="2834640"/>
-            <wp:effectExtent l="0" t="0" r="2540" b="3810"/>
-            <wp:docPr id="112777972" name="Picture 1"/>
+          <wp:inline distT="0" distB="0" distL="0" distR="0" wp14:anchorId="6D929231" wp14:editId="49329371">
+            <wp:extent cx="5731510" cy="1736090"/>
+            <wp:effectExtent l="0" t="0" r="2540" b="0"/>
+            <wp:docPr id="1140706120" name="Picture 2"/>
             <wp:cNvGraphicFramePr>
               <a:graphicFrameLocks xmlns:a="http://schemas.openxmlformats.org/drawingml/2006/main" noChangeAspect="1"/>
             </wp:cNvGraphicFramePr>
@@ -6144,23 +6142,36 @@
               <a:graphicData uri="http://schemas.openxmlformats.org/drawingml/2006/picture">
                 <pic:pic xmlns:pic="http://schemas.openxmlformats.org/drawingml/2006/picture">
                   <pic:nvPicPr>
-                    <pic:cNvPr id="112777972" name=""/>
-                    <pic:cNvPicPr/>
+                    <pic:cNvPr id="0" name="Picture 1"/>
+                    <pic:cNvPicPr>
+                      <a:picLocks noChangeAspect="1" noChangeArrowheads="1"/>
+                    </pic:cNvPicPr>
                   </pic:nvPicPr>
                   <pic:blipFill>
-                    <a:blip r:embed="rId15"/>
+                    <a:blip r:embed="rId15" cstate="print">
+                      <a:extLst>
+                        <a:ext uri="{28A0092B-C50C-407E-A947-70E740481C1C}">
+                          <a14:useLocalDpi xmlns:a14="http://schemas.microsoft.com/office/drawing/2010/main" val="0"/>
+                        </a:ext>
+                      </a:extLst>
+                    </a:blip>
+                    <a:srcRect/>
                     <a:stretch>
                       <a:fillRect/>
                     </a:stretch>
                   </pic:blipFill>
-                  <pic:spPr>
+                  <pic:spPr bwMode="auto">
                     <a:xfrm>
                       <a:off x="0" y="0"/>
-                      <a:ext cx="5731510" cy="2834640"/>
+                      <a:ext cx="5731510" cy="1736090"/>
                     </a:xfrm>
                     <a:prstGeom prst="rect">
                       <a:avLst/>
                     </a:prstGeom>
+                    <a:noFill/>
+                    <a:ln>
+                      <a:noFill/>
+                    </a:ln>
                   </pic:spPr>
                 </pic:pic>
               </a:graphicData>
@@ -6214,39 +6225,7 @@
           <w:sz w:val="24"/>
           <w:szCs w:val="24"/>
         </w:rPr>
-        <w:t xml:space="preserve"> as the case is processed. If the case cannot be handled at the current level, it enters the </w:t>
-      </w:r>
-      <w:r>
-        <w:rPr>
-          <w:b/>
-          <w:bCs/>
-          <w:sz w:val="24"/>
-          <w:szCs w:val="24"/>
-        </w:rPr>
-        <w:t>Escalated</w:t>
-      </w:r>
-      <w:r>
-        <w:rPr>
-          <w:sz w:val="24"/>
-          <w:szCs w:val="24"/>
-        </w:rPr>
-        <w:t xml:space="preserve"> state and returns to </w:t>
-      </w:r>
-      <w:r>
-        <w:rPr>
-          <w:b/>
-          <w:bCs/>
-          <w:sz w:val="24"/>
-          <w:szCs w:val="24"/>
-        </w:rPr>
-        <w:t>In Progress</w:t>
-      </w:r>
-      <w:r>
-        <w:rPr>
-          <w:sz w:val="24"/>
-          <w:szCs w:val="24"/>
-        </w:rPr>
-        <w:t xml:space="preserve"> when a handler accepts it. From In Progress, the workflow can either become </w:t>
+        <w:t xml:space="preserve"> as the case is processed.  From In Progress, the workflow can either become </w:t>
       </w:r>
       <w:r>
         <w:rPr>
@@ -6481,15 +6460,47 @@
           <w:sz w:val="24"/>
           <w:szCs w:val="24"/>
         </w:rPr>
+        <w:t>Contributor:</w:t>
+      </w:r>
+      <w:r>
+        <w:rPr>
+          <w:sz w:val="24"/>
+          <w:szCs w:val="24"/>
+        </w:rPr>
+        <w:t xml:space="preserve"> Kristy Heesen</w:t>
+      </w:r>
+    </w:p>
+    <w:p>
+      <w:pPr>
+        <w:jc w:val="both"/>
+        <w:rPr>
+          <w:sz w:val="24"/>
+          <w:szCs w:val="24"/>
+        </w:rPr>
+      </w:pPr>
+    </w:p>
+    <w:p>
+      <w:pPr>
+        <w:jc w:val="both"/>
+        <w:rPr>
+          <w:sz w:val="24"/>
+          <w:szCs w:val="24"/>
+        </w:rPr>
+      </w:pPr>
+      <w:r>
+        <w:rPr>
+          <w:sz w:val="24"/>
+          <w:szCs w:val="24"/>
+        </w:rPr>
+        <w:t xml:space="preserve">Kristy Heesen developed the initial scope of TIVIDY and defined the selected University Student Complaint Management scenario. This included distinguishing workflow definitions from running workflow instances and </w:t>
+      </w:r>
+      <w:r>
+        <w:rPr>
+          <w:sz w:val="24"/>
+          <w:szCs w:val="24"/>
+        </w:rPr>
         <w:lastRenderedPageBreak/>
-        <w:t>Contributor:</w:t>
-      </w:r>
-      <w:r>
-        <w:rPr>
-          <w:sz w:val="24"/>
-          <w:szCs w:val="24"/>
-        </w:rPr>
-        <w:t xml:space="preserve"> Kristy Heesen</w:t>
+        <w:t>establishing the responsibilities and boundaries of the generic workflow management system.</w:t>
       </w:r>
     </w:p>
     <w:p>
@@ -6511,10 +6522,30 @@
       </w:pPr>
       <w:r>
         <w:rPr>
-          <w:sz w:val="24"/>
-          <w:szCs w:val="24"/>
-        </w:rPr>
-        <w:t>Kristy Heesen developed the initial scope of TIVIDY and defined the selected University Student Complaint Management scenario. This included distinguishing workflow definitions from running workflow instances and establishing the responsibilities and boundaries of the generic workflow management system.</w:t>
+          <w:b/>
+          <w:bCs/>
+          <w:sz w:val="24"/>
+          <w:szCs w:val="24"/>
+        </w:rPr>
+        <w:t>Task 3</w:t>
+      </w:r>
+      <w:r>
+        <w:rPr>
+          <w:b/>
+          <w:bCs/>
+          <w:sz w:val="24"/>
+          <w:szCs w:val="24"/>
+        </w:rPr>
+        <w:t xml:space="preserve">: </w:t>
+      </w:r>
+      <w:r>
+        <w:rPr>
+          <w:b/>
+          <w:bCs/>
+          <w:sz w:val="24"/>
+          <w:szCs w:val="24"/>
+        </w:rPr>
+        <w:t>UML Activity Diagrams</w:t>
       </w:r>
     </w:p>
     <w:p>
@@ -6525,6 +6556,22 @@
           <w:szCs w:val="24"/>
         </w:rPr>
       </w:pPr>
+      <w:r>
+        <w:rPr>
+          <w:b/>
+          <w:bCs/>
+          <w:sz w:val="24"/>
+          <w:szCs w:val="24"/>
+        </w:rPr>
+        <w:t>Contributors:</w:t>
+      </w:r>
+      <w:r>
+        <w:rPr>
+          <w:sz w:val="24"/>
+          <w:szCs w:val="24"/>
+        </w:rPr>
+        <w:t xml:space="preserve"> Lindokuhle Skosana, Joshua Peter</w:t>
+      </w:r>
     </w:p>
     <w:p>
       <w:pPr>
@@ -6534,14 +6581,48 @@
           <w:szCs w:val="24"/>
         </w:rPr>
       </w:pPr>
-      <w:r>
-        <w:rPr>
-          <w:b/>
-          <w:bCs/>
-          <w:sz w:val="24"/>
-          <w:szCs w:val="24"/>
-        </w:rPr>
-        <w:t>Task 3</w:t>
+    </w:p>
+    <w:p>
+      <w:pPr>
+        <w:jc w:val="both"/>
+        <w:rPr>
+          <w:sz w:val="24"/>
+          <w:szCs w:val="24"/>
+        </w:rPr>
+      </w:pPr>
+      <w:r>
+        <w:rPr>
+          <w:sz w:val="24"/>
+          <w:szCs w:val="24"/>
+        </w:rPr>
+        <w:t>Lindokuhle Skosana and Joshua Peter worked on the UML Activity Diagrams for the generic TIVIDY workflows and the selected University Student Complaint Management scenario.</w:t>
+      </w:r>
+    </w:p>
+    <w:p>
+      <w:pPr>
+        <w:jc w:val="both"/>
+        <w:rPr>
+          <w:sz w:val="24"/>
+          <w:szCs w:val="24"/>
+        </w:rPr>
+      </w:pPr>
+    </w:p>
+    <w:p>
+      <w:pPr>
+        <w:jc w:val="both"/>
+        <w:rPr>
+          <w:sz w:val="24"/>
+          <w:szCs w:val="24"/>
+        </w:rPr>
+      </w:pPr>
+      <w:r>
+        <w:rPr>
+          <w:b/>
+          <w:bCs/>
+          <w:sz w:val="24"/>
+          <w:szCs w:val="24"/>
+        </w:rPr>
+        <w:t>Task 4</w:t>
       </w:r>
       <w:r>
         <w:rPr>
@@ -6559,7 +6640,7 @@
           <w:sz w:val="24"/>
           <w:szCs w:val="24"/>
         </w:rPr>
-        <w:t>UML Activity Diagrams</w:t>
+        <w:t>Design Patterns</w:t>
       </w:r>
     </w:p>
     <w:p>
@@ -6584,7 +6665,7 @@
           <w:sz w:val="24"/>
           <w:szCs w:val="24"/>
         </w:rPr>
-        <w:t xml:space="preserve"> Lindokuhle Skosana, Joshua Peter</w:t>
+        <w:t xml:space="preserve"> Kristy Heesen, Musa Msibi, Lindokuhle Skosana</w:t>
       </w:r>
     </w:p>
     <w:p>
@@ -6609,7 +6690,23 @@
           <w:sz w:val="24"/>
           <w:szCs w:val="24"/>
         </w:rPr>
-        <w:t>Lindokuhle Skosana and Joshua Peter worked on the UML Activity Diagrams for the generic TIVIDY workflows and the selected University Student Complaint Management scenario.</w:t>
+        <w:t xml:space="preserve">Kristy Heesen, Musa Msibi and Lindokuhle Skosana worked on identifying and justifying the </w:t>
+      </w:r>
+      <w:proofErr w:type="spellStart"/>
+      <w:r>
+        <w:rPr>
+          <w:sz w:val="24"/>
+          <w:szCs w:val="24"/>
+        </w:rPr>
+        <w:t>GoF</w:t>
+      </w:r>
+      <w:proofErr w:type="spellEnd"/>
+      <w:r>
+        <w:rPr>
+          <w:sz w:val="24"/>
+          <w:szCs w:val="24"/>
+        </w:rPr>
+        <w:t xml:space="preserve"> design patterns used in TIVIDY. This included defining the design problems, pattern participants, collaborations, variation points and how the patterns work together within the workflow management system.</w:t>
       </w:r>
     </w:p>
     <w:p>
@@ -6636,7 +6733,7 @@
           <w:sz w:val="24"/>
           <w:szCs w:val="24"/>
         </w:rPr>
-        <w:t>Task 4</w:t>
+        <w:t>Task 5</w:t>
       </w:r>
       <w:r>
         <w:rPr>
@@ -6654,7 +6751,7 @@
           <w:sz w:val="24"/>
           <w:szCs w:val="24"/>
         </w:rPr>
-        <w:t>Design Patterns</w:t>
+        <w:t>UML Class Diagram</w:t>
       </w:r>
     </w:p>
     <w:p>
@@ -6679,7 +6776,14 @@
           <w:sz w:val="24"/>
           <w:szCs w:val="24"/>
         </w:rPr>
-        <w:t xml:space="preserve"> Kristy Heesen, Musa Msibi, Lindokuhle Skosana</w:t>
+        <w:t xml:space="preserve"> </w:t>
+      </w:r>
+      <w:r>
+        <w:rPr>
+          <w:sz w:val="24"/>
+          <w:szCs w:val="24"/>
+        </w:rPr>
+        <w:t>Kristy Heesen</w:t>
       </w:r>
     </w:p>
     <w:p>
@@ -6704,23 +6808,14 @@
           <w:sz w:val="24"/>
           <w:szCs w:val="24"/>
         </w:rPr>
-        <w:t xml:space="preserve">Kristy Heesen, Musa Msibi and Lindokuhle Skosana worked on identifying and justifying the </w:t>
-      </w:r>
-      <w:proofErr w:type="spellStart"/>
-      <w:r>
-        <w:rPr>
-          <w:sz w:val="24"/>
-          <w:szCs w:val="24"/>
-        </w:rPr>
-        <w:t>GoF</w:t>
-      </w:r>
-      <w:proofErr w:type="spellEnd"/>
-      <w:r>
-        <w:rPr>
-          <w:sz w:val="24"/>
-          <w:szCs w:val="24"/>
-        </w:rPr>
-        <w:t xml:space="preserve"> design patterns used in TIVIDY. This included defining the design problems, pattern participants, collaborations, variation points and how the patterns work together within the workflow management system.</w:t>
+        <w:t xml:space="preserve">Kristy Heesen </w:t>
+      </w:r>
+      <w:r>
+        <w:rPr>
+          <w:sz w:val="24"/>
+          <w:szCs w:val="24"/>
+        </w:rPr>
+        <w:t>worked on developing the complete UML Class Diagram for TIVIDY. This included the main classes, relationships, multiplicities, attributes, operations, ownership relationships and the collaborations between the different design patterns and subsystems.</w:t>
       </w:r>
     </w:p>
     <w:p>
@@ -6747,7 +6842,7 @@
           <w:sz w:val="24"/>
           <w:szCs w:val="24"/>
         </w:rPr>
-        <w:t>Task 5</w:t>
+        <w:t>Task 6</w:t>
       </w:r>
       <w:r>
         <w:rPr>
@@ -6765,7 +6860,7 @@
           <w:sz w:val="24"/>
           <w:szCs w:val="24"/>
         </w:rPr>
-        <w:t>UML Class Diagram</w:t>
+        <w:t>Runtime Behaviour Diagrams</w:t>
       </w:r>
     </w:p>
     <w:p>
@@ -6790,14 +6885,7 @@
           <w:sz w:val="24"/>
           <w:szCs w:val="24"/>
         </w:rPr>
-        <w:t xml:space="preserve"> </w:t>
-      </w:r>
-      <w:r>
-        <w:rPr>
-          <w:sz w:val="24"/>
-          <w:szCs w:val="24"/>
-        </w:rPr>
-        <w:t>Kristy Heesen</w:t>
+        <w:t xml:space="preserve"> LM Kabongo, Musa Msibi</w:t>
       </w:r>
     </w:p>
     <w:p>
@@ -6822,14 +6910,39 @@
           <w:sz w:val="24"/>
           <w:szCs w:val="24"/>
         </w:rPr>
-        <w:t xml:space="preserve">Kristy Heesen </w:t>
-      </w:r>
-      <w:r>
-        <w:rPr>
-          <w:sz w:val="24"/>
-          <w:szCs w:val="24"/>
-        </w:rPr>
-        <w:t>worked on developing the complete UML Class Diagram for TIVIDY. This included the main classes, relationships, multiplicities, attributes, operations, ownership relationships and the collaborations between the different design patterns and subsystems.</w:t>
+        <w:t xml:space="preserve">LM Kabongo and Musa Msibi worked on the UML runtime behaviour diagrams. LM Kabongo developed the sequence diagram showing the completion of a </w:t>
+      </w:r>
+      <w:proofErr w:type="spellStart"/>
+      <w:r>
+        <w:rPr>
+          <w:sz w:val="24"/>
+          <w:szCs w:val="24"/>
+        </w:rPr>
+        <w:t>WorkItem</w:t>
+      </w:r>
+      <w:proofErr w:type="spellEnd"/>
+      <w:r>
+        <w:rPr>
+          <w:sz w:val="24"/>
+          <w:szCs w:val="24"/>
+        </w:rPr>
+        <w:t xml:space="preserve"> and determining what happens next, as well as the </w:t>
+      </w:r>
+      <w:proofErr w:type="spellStart"/>
+      <w:r>
+        <w:rPr>
+          <w:sz w:val="24"/>
+          <w:szCs w:val="24"/>
+        </w:rPr>
+        <w:t>WorkflowInstance</w:t>
+      </w:r>
+      <w:proofErr w:type="spellEnd"/>
+      <w:r>
+        <w:rPr>
+          <w:sz w:val="24"/>
+          <w:szCs w:val="24"/>
+        </w:rPr>
+        <w:t xml:space="preserve"> State Diagram. Musa Msibi developed the sequence diagram showing the escalation process.</w:t>
       </w:r>
     </w:p>
     <w:p>
@@ -6856,134 +6969,7 @@
           <w:sz w:val="24"/>
           <w:szCs w:val="24"/>
         </w:rPr>
-        <w:t>Task 6</w:t>
-      </w:r>
-      <w:r>
-        <w:rPr>
-          <w:b/>
-          <w:bCs/>
-          <w:sz w:val="24"/>
-          <w:szCs w:val="24"/>
-        </w:rPr>
-        <w:t xml:space="preserve">: </w:t>
-      </w:r>
-      <w:r>
-        <w:rPr>
-          <w:b/>
-          <w:bCs/>
-          <w:sz w:val="24"/>
-          <w:szCs w:val="24"/>
-        </w:rPr>
-        <w:t>Runtime Behaviour Diagrams</w:t>
-      </w:r>
-    </w:p>
-    <w:p>
-      <w:pPr>
-        <w:jc w:val="both"/>
-        <w:rPr>
-          <w:sz w:val="24"/>
-          <w:szCs w:val="24"/>
-        </w:rPr>
-      </w:pPr>
-      <w:r>
-        <w:rPr>
-          <w:b/>
-          <w:bCs/>
-          <w:sz w:val="24"/>
-          <w:szCs w:val="24"/>
-        </w:rPr>
-        <w:t>Contributors:</w:t>
-      </w:r>
-      <w:r>
-        <w:rPr>
-          <w:sz w:val="24"/>
-          <w:szCs w:val="24"/>
-        </w:rPr>
-        <w:t xml:space="preserve"> LM Kabongo, Musa Msibi</w:t>
-      </w:r>
-    </w:p>
-    <w:p>
-      <w:pPr>
-        <w:jc w:val="both"/>
-        <w:rPr>
-          <w:sz w:val="24"/>
-          <w:szCs w:val="24"/>
-        </w:rPr>
-      </w:pPr>
-    </w:p>
-    <w:p>
-      <w:pPr>
-        <w:jc w:val="both"/>
-        <w:rPr>
-          <w:sz w:val="24"/>
-          <w:szCs w:val="24"/>
-        </w:rPr>
-      </w:pPr>
-      <w:r>
-        <w:rPr>
-          <w:sz w:val="24"/>
-          <w:szCs w:val="24"/>
-        </w:rPr>
         <w:lastRenderedPageBreak/>
-        <w:t xml:space="preserve">LM Kabongo and Musa Msibi worked on the UML runtime behaviour diagrams. LM Kabongo developed the sequence diagram showing the completion of a </w:t>
-      </w:r>
-      <w:proofErr w:type="spellStart"/>
-      <w:r>
-        <w:rPr>
-          <w:sz w:val="24"/>
-          <w:szCs w:val="24"/>
-        </w:rPr>
-        <w:t>WorkItem</w:t>
-      </w:r>
-      <w:proofErr w:type="spellEnd"/>
-      <w:r>
-        <w:rPr>
-          <w:sz w:val="24"/>
-          <w:szCs w:val="24"/>
-        </w:rPr>
-        <w:t xml:space="preserve"> and determining what happens next, as well as the </w:t>
-      </w:r>
-      <w:proofErr w:type="spellStart"/>
-      <w:r>
-        <w:rPr>
-          <w:sz w:val="24"/>
-          <w:szCs w:val="24"/>
-        </w:rPr>
-        <w:t>WorkflowInstance</w:t>
-      </w:r>
-      <w:proofErr w:type="spellEnd"/>
-      <w:r>
-        <w:rPr>
-          <w:sz w:val="24"/>
-          <w:szCs w:val="24"/>
-        </w:rPr>
-        <w:t xml:space="preserve"> State Diagram. Musa Msibi developed the sequence diagram showing the escalation process.</w:t>
-      </w:r>
-    </w:p>
-    <w:p>
-      <w:pPr>
-        <w:jc w:val="both"/>
-        <w:rPr>
-          <w:sz w:val="24"/>
-          <w:szCs w:val="24"/>
-        </w:rPr>
-      </w:pPr>
-    </w:p>
-    <w:p>
-      <w:pPr>
-        <w:jc w:val="both"/>
-        <w:rPr>
-          <w:sz w:val="24"/>
-          <w:szCs w:val="24"/>
-        </w:rPr>
-      </w:pPr>
-      <w:r>
-        <w:rPr>
-          <w:b/>
-          <w:bCs/>
-          <w:sz w:val="24"/>
-          <w:szCs w:val="24"/>
-        </w:rPr>
         <w:t>Task 7</w:t>
       </w:r>
       <w:r>

</xml_diff>